<commit_message>
feat: add resumable full Drive index rollout
</commit_message>
<xml_diff>
--- a/packages/kairali/homework/EVERYONE-ELSE-AI-HUMAN-HOMEWORK-GUIDE.docx
+++ b/packages/kairali/homework/EVERYONE-ELSE-AI-HUMAN-HOMEWORK-GUIDE.docx
@@ -215,20 +215,49 @@
     </w:p>
     <w:p>
       <w:pPr>
-        <w:spacing w:before="0" w:after="120" w:line="300" w:lineRule="auto"/>
+        <w:spacing w:before="0" w:after="120" w:line="288" w:lineRule="auto"/>
       </w:pPr>
       <w:r>
         <w:rPr>
           <w:rFonts w:ascii="Calibri" w:hAnsi="Calibri" w:eastAsia="Calibri" w:cs="Calibri"/>
           <w:color w:val="1F2937"/>
-          <w:sz w:val="22"/>
+          <w:sz w:val="21"/>
         </w:rPr>
         <w:t>Use this guide only if you attended the meeting and do not already have a named start or homework page.</w:t>
       </w:r>
     </w:p>
     <w:p>
       <w:pPr>
-        <w:spacing w:before="80" w:after="180" w:line="300" w:lineRule="auto"/>
+        <w:spacing w:before="0" w:after="120" w:line="288" w:lineRule="auto"/>
+      </w:pPr>
+      <w:r>
+        <w:rPr>
+          <w:rFonts w:ascii="Calibri" w:hAnsi="Calibri" w:eastAsia="Calibri" w:cs="Calibri"/>
+          <w:color w:val="1F2937"/>
+          <w:sz w:val="21"/>
+        </w:rPr>
+        <w:t xml:space="preserve">This homework is part of the protected public </w:t>
+      </w:r>
+      <w:r>
+        <w:rPr>
+          <w:rFonts w:ascii="Menlo" w:hAnsi="Menlo" w:eastAsia="Menlo" w:cs="Menlo"/>
+          <w:color w:val="1F4D78"/>
+          <w:sz w:val="19"/>
+        </w:rPr>
+        <w:t>kairali-digital/ai-human-workspace</w:t>
+      </w:r>
+      <w:r>
+        <w:rPr>
+          <w:rFonts w:ascii="Calibri" w:hAnsi="Calibri" w:eastAsia="Calibri" w:cs="Calibri"/>
+          <w:color w:val="1F2937"/>
+          <w:sz w:val="21"/>
+        </w:rPr>
+        <w:t xml:space="preserve"> v1.2.0 company kit. The public kit is the clean setup and update source; it contains no live company work or secrets, so no GitHub invitation or collaborator seat is needed. Ask the Setup Helper to obtain and verify the kit. Then copy the Email and Drive starters into separate local work folders. Do not use the public distribution repository as a work project.</w:t>
+      </w:r>
+    </w:p>
+    <w:p>
+      <w:pPr>
+        <w:spacing w:before="80" w:after="180" w:line="288" w:lineRule="auto"/>
         <w:ind w:left="259" w:right="259"/>
         <w:shd w:fill="E8EEF5"/>
       </w:pPr>
@@ -236,20 +265,20 @@
         <w:rPr>
           <w:rFonts w:ascii="Calibri" w:hAnsi="Calibri" w:eastAsia="Calibri" w:cs="Calibri"/>
           <w:color w:val="0B2545"/>
-          <w:sz w:val="22"/>
+          <w:sz w:val="21"/>
         </w:rPr>
         <w:t>You are learning to wear Codex like an Iron Man suit. You provide the mission and judgment. Codex performs approved work through a controlled autonomous loop.</w:t>
       </w:r>
     </w:p>
     <w:p>
       <w:pPr>
-        <w:spacing w:before="0" w:after="120" w:line="300" w:lineRule="auto"/>
+        <w:spacing w:before="0" w:after="120" w:line="288" w:lineRule="auto"/>
       </w:pPr>
       <w:r>
         <w:rPr>
           <w:rFonts w:ascii="Calibri" w:hAnsi="Calibri" w:eastAsia="Calibri" w:cs="Calibri"/>
           <w:color w:val="1F2937"/>
-          <w:sz w:val="22"/>
+          <w:sz w:val="21"/>
         </w:rPr>
         <w:t>You will make two small workers:</w:t>
       </w:r>
@@ -260,14 +289,14 @@
           <w:ilvl w:val="0"/>
           <w:numId w:val="11"/>
         </w:numPr>
-        <w:spacing w:before="0" w:after="80" w:line="300" w:lineRule="auto"/>
+        <w:spacing w:before="0" w:after="80" w:line="288" w:lineRule="auto"/>
       </w:pPr>
       <w:r>
         <w:rPr>
           <w:rFonts w:ascii="Calibri" w:hAnsi="Calibri" w:eastAsia="Calibri" w:cs="Calibri"/>
           <w:b/>
           <w:color w:val="1F2937"/>
-          <w:sz w:val="22"/>
+          <w:sz w:val="21"/>
         </w:rPr>
         <w:t>Email Triage AI Human</w:t>
       </w:r>
@@ -275,7 +304,7 @@
         <w:rPr>
           <w:rFonts w:ascii="Calibri" w:hAnsi="Calibri" w:eastAsia="Calibri" w:cs="Calibri"/>
           <w:color w:val="1F2937"/>
-          <w:sz w:val="22"/>
+          <w:sz w:val="21"/>
         </w:rPr>
         <w:t xml:space="preserve"> - reads up to 25 inbox messages and makes a local review list. It does not change your mailbox.</w:t>
       </w:r>
@@ -286,24 +315,24 @@
           <w:ilvl w:val="0"/>
           <w:numId w:val="11"/>
         </w:numPr>
-        <w:spacing w:before="0" w:after="80" w:line="300" w:lineRule="auto"/>
+        <w:spacing w:before="0" w:after="80" w:line="288" w:lineRule="auto"/>
       </w:pPr>
       <w:r>
         <w:rPr>
           <w:rFonts w:ascii="Calibri" w:hAnsi="Calibri" w:eastAsia="Calibri" w:cs="Calibri"/>
           <w:b/>
           <w:color w:val="1F2937"/>
-          <w:sz w:val="22"/>
-        </w:rPr>
-        <w:t>Drive Inventory AI Human</w:t>
+          <w:sz w:val="21"/>
+        </w:rPr>
+        <w:t>Drive Index AI Human</w:t>
       </w:r>
       <w:r>
         <w:rPr>
           <w:rFonts w:ascii="Calibri" w:hAnsi="Calibri" w:eastAsia="Calibri" w:cs="Calibri"/>
           <w:color w:val="1F2937"/>
-          <w:sz w:val="22"/>
-        </w:rPr>
-        <w:t xml:space="preserve"> - reads metadata for up to 25 Drive items and makes a local inventory. It does not open or change the files.</w:t>
+          <w:sz w:val="21"/>
+        </w:rPr>
+        <w:t xml:space="preserve"> - choose a 25-item test or index every connector-visible Drive item in checkpointed batches of 25. It does not open file contents or change Drive.</w:t>
       </w:r>
     </w:p>
     <w:p>
@@ -312,14 +341,14 @@
           <w:ilvl w:val="0"/>
           <w:numId w:val="11"/>
         </w:numPr>
-        <w:spacing w:before="0" w:after="80" w:line="300" w:lineRule="auto"/>
+        <w:spacing w:before="0" w:after="80" w:line="288" w:lineRule="auto"/>
       </w:pPr>
       <w:r>
         <w:rPr>
           <w:rFonts w:ascii="Calibri" w:hAnsi="Calibri" w:eastAsia="Calibri" w:cs="Calibri"/>
           <w:b/>
           <w:color w:val="1F2937"/>
-          <w:sz w:val="22"/>
+          <w:sz w:val="21"/>
         </w:rPr>
         <w:t>Optional LinkedIn Draft AI Human</w:t>
       </w:r>
@@ -327,20 +356,20 @@
         <w:rPr>
           <w:rFonts w:ascii="Calibri" w:hAnsi="Calibri" w:eastAsia="Calibri" w:cs="Calibri"/>
           <w:color w:val="1F2937"/>
-          <w:sz w:val="22"/>
+          <w:sz w:val="21"/>
         </w:rPr>
         <w:t xml:space="preserve"> - makes a local draft from facts you supply. It does not open LinkedIn or publish anything.</w:t>
       </w:r>
     </w:p>
     <w:p>
       <w:pPr>
-        <w:spacing w:before="0" w:after="120" w:line="300" w:lineRule="auto"/>
+        <w:spacing w:before="0" w:after="120" w:line="288" w:lineRule="auto"/>
       </w:pPr>
       <w:r>
         <w:rPr>
           <w:rFonts w:ascii="Calibri" w:hAnsi="Calibri" w:eastAsia="Calibri" w:cs="Calibri"/>
           <w:color w:val="1F2937"/>
-          <w:sz w:val="22"/>
+          <w:sz w:val="21"/>
         </w:rPr>
         <w:t>An AI human is one folder with one job. Each worker gets a separate folder so their instructions, state and proof never mix.</w:t>
       </w:r>
@@ -364,15 +393,15 @@
           <w:ilvl w:val="0"/>
           <w:numId w:val="13"/>
         </w:numPr>
-        <w:spacing w:before="0" w:after="80" w:line="300" w:lineRule="auto"/>
+        <w:spacing w:before="0" w:after="80" w:line="288" w:lineRule="auto"/>
       </w:pPr>
       <w:r>
         <w:rPr>
           <w:rFonts w:ascii="Calibri" w:hAnsi="Calibri" w:eastAsia="Calibri" w:cs="Calibri"/>
           <w:color w:val="1F2937"/>
-          <w:sz w:val="22"/>
-        </w:rPr>
-        <w:t>Find the homework pack on your screen.</w:t>
+          <w:sz w:val="21"/>
+        </w:rPr>
+        <w:t>Ask the Setup Helper to find the verified public v1.2.0 company kit on your screen.</w:t>
       </w:r>
     </w:p>
     <w:p>
@@ -381,13 +410,13 @@
           <w:ilvl w:val="0"/>
           <w:numId w:val="13"/>
         </w:numPr>
-        <w:spacing w:before="0" w:after="80" w:line="300" w:lineRule="auto"/>
+        <w:spacing w:before="0" w:after="80" w:line="288" w:lineRule="auto"/>
       </w:pPr>
       <w:r>
         <w:rPr>
           <w:rFonts w:ascii="Calibri" w:hAnsi="Calibri" w:eastAsia="Calibri" w:cs="Calibri"/>
           <w:color w:val="1F2937"/>
-          <w:sz w:val="22"/>
+          <w:sz w:val="21"/>
         </w:rPr>
         <w:t xml:space="preserve">Make an </w:t>
       </w:r>
@@ -395,7 +424,7 @@
         <w:rPr>
           <w:rFonts w:ascii="Menlo" w:hAnsi="Menlo" w:eastAsia="Menlo" w:cs="Menlo"/>
           <w:color w:val="1F4D78"/>
-          <w:sz w:val="20"/>
+          <w:sz w:val="19"/>
         </w:rPr>
         <w:t>AI Humans</w:t>
       </w:r>
@@ -403,7 +432,7 @@
         <w:rPr>
           <w:rFonts w:ascii="Calibri" w:hAnsi="Calibri" w:eastAsia="Calibri" w:cs="Calibri"/>
           <w:color w:val="1F2937"/>
-          <w:sz w:val="22"/>
+          <w:sz w:val="21"/>
         </w:rPr>
         <w:t xml:space="preserve"> folder inside Documents.</w:t>
       </w:r>
@@ -414,13 +443,13 @@
           <w:ilvl w:val="0"/>
           <w:numId w:val="13"/>
         </w:numPr>
-        <w:spacing w:before="0" w:after="80" w:line="300" w:lineRule="auto"/>
+        <w:spacing w:before="0" w:after="80" w:line="288" w:lineRule="auto"/>
       </w:pPr>
       <w:r>
         <w:rPr>
           <w:rFonts w:ascii="Calibri" w:hAnsi="Calibri" w:eastAsia="Calibri" w:cs="Calibri"/>
           <w:color w:val="1F2937"/>
-          <w:sz w:val="22"/>
+          <w:sz w:val="21"/>
         </w:rPr>
         <w:t>Copy the Email and Drive starter folders into it.</w:t>
       </w:r>
@@ -431,13 +460,13 @@
           <w:ilvl w:val="0"/>
           <w:numId w:val="13"/>
         </w:numPr>
-        <w:spacing w:before="0" w:after="80" w:line="300" w:lineRule="auto"/>
+        <w:spacing w:before="0" w:after="80" w:line="288" w:lineRule="auto"/>
       </w:pPr>
       <w:r>
         <w:rPr>
           <w:rFonts w:ascii="Calibri" w:hAnsi="Calibri" w:eastAsia="Calibri" w:cs="Calibri"/>
           <w:color w:val="1F2937"/>
-          <w:sz w:val="22"/>
+          <w:sz w:val="21"/>
         </w:rPr>
         <w:t>Open one starter folder as a local project in the ChatGPT desktop app.</w:t>
       </w:r>
@@ -448,13 +477,13 @@
           <w:ilvl w:val="0"/>
           <w:numId w:val="13"/>
         </w:numPr>
-        <w:spacing w:before="0" w:after="80" w:line="300" w:lineRule="auto"/>
+        <w:spacing w:before="0" w:after="80" w:line="288" w:lineRule="auto"/>
       </w:pPr>
       <w:r>
         <w:rPr>
           <w:rFonts w:ascii="Calibri" w:hAnsi="Calibri" w:eastAsia="Calibri" w:cs="Calibri"/>
           <w:color w:val="1F2937"/>
-          <w:sz w:val="22"/>
+          <w:sz w:val="21"/>
         </w:rPr>
         <w:t>Connect only the app that project needs.</w:t>
       </w:r>
@@ -465,13 +494,13 @@
           <w:ilvl w:val="0"/>
           <w:numId w:val="13"/>
         </w:numPr>
-        <w:spacing w:before="0" w:after="80" w:line="300" w:lineRule="auto"/>
+        <w:spacing w:before="0" w:after="80" w:line="288" w:lineRule="auto"/>
       </w:pPr>
       <w:r>
         <w:rPr>
           <w:rFonts w:ascii="Calibri" w:hAnsi="Calibri" w:eastAsia="Calibri" w:cs="Calibri"/>
           <w:color w:val="1F2937"/>
-          <w:sz w:val="22"/>
+          <w:sz w:val="21"/>
         </w:rPr>
         <w:t>Paste the exact prompt.</w:t>
       </w:r>
@@ -482,13 +511,13 @@
           <w:ilvl w:val="0"/>
           <w:numId w:val="13"/>
         </w:numPr>
-        <w:spacing w:before="0" w:after="80" w:line="300" w:lineRule="auto"/>
+        <w:spacing w:before="0" w:after="80" w:line="288" w:lineRule="auto"/>
       </w:pPr>
       <w:r>
         <w:rPr>
           <w:rFonts w:ascii="Calibri" w:hAnsi="Calibri" w:eastAsia="Calibri" w:cs="Calibri"/>
           <w:color w:val="1F2937"/>
-          <w:sz w:val="22"/>
+          <w:sz w:val="21"/>
         </w:rPr>
         <w:t xml:space="preserve">Stop at the visible </w:t>
       </w:r>
@@ -496,7 +525,7 @@
         <w:rPr>
           <w:rFonts w:ascii="Menlo" w:hAnsi="Menlo" w:eastAsia="Menlo" w:cs="Menlo"/>
           <w:color w:val="1F4D78"/>
-          <w:sz w:val="20"/>
+          <w:sz w:val="19"/>
         </w:rPr>
         <w:t>DONE WHEN</w:t>
       </w:r>
@@ -504,7 +533,7 @@
         <w:rPr>
           <w:rFonts w:ascii="Calibri" w:hAnsi="Calibri" w:eastAsia="Calibri" w:cs="Calibri"/>
           <w:color w:val="1F2937"/>
-          <w:sz w:val="22"/>
+          <w:sz w:val="21"/>
         </w:rPr>
         <w:t xml:space="preserve"> result.</w:t>
       </w:r>
@@ -515,26 +544,26 @@
           <w:ilvl w:val="0"/>
           <w:numId w:val="13"/>
         </w:numPr>
-        <w:spacing w:before="0" w:after="80" w:line="300" w:lineRule="auto"/>
+        <w:spacing w:before="0" w:after="80" w:line="288" w:lineRule="auto"/>
       </w:pPr>
       <w:r>
         <w:rPr>
           <w:rFonts w:ascii="Calibri" w:hAnsi="Calibri" w:eastAsia="Calibri" w:cs="Calibri"/>
           <w:color w:val="1F2937"/>
-          <w:sz w:val="22"/>
+          <w:sz w:val="21"/>
         </w:rPr>
         <w:t>Repeat with the second folder.</w:t>
       </w:r>
     </w:p>
     <w:p>
       <w:pPr>
-        <w:spacing w:before="0" w:after="120" w:line="300" w:lineRule="auto"/>
+        <w:spacing w:before="0" w:after="120" w:line="288" w:lineRule="auto"/>
       </w:pPr>
       <w:r>
         <w:rPr>
           <w:rFonts w:ascii="Calibri" w:hAnsi="Calibri" w:eastAsia="Calibri" w:cs="Calibri"/>
           <w:color w:val="1F2937"/>
-          <w:sz w:val="22"/>
+          <w:sz w:val="21"/>
         </w:rPr>
         <w:t>This is a standalone local-project path. It does not need GitHub or GitHub Desktop.</w:t>
       </w:r>
@@ -554,13 +583,13 @@
     </w:p>
     <w:p>
       <w:pPr>
-        <w:spacing w:before="0" w:after="120" w:line="300" w:lineRule="auto"/>
+        <w:spacing w:before="0" w:after="120" w:line="288" w:lineRule="auto"/>
       </w:pPr>
       <w:r>
         <w:rPr>
           <w:rFonts w:ascii="Calibri" w:hAnsi="Calibri" w:eastAsia="Calibri" w:cs="Calibri"/>
           <w:color w:val="1F2937"/>
-          <w:sz w:val="22"/>
+          <w:sz w:val="21"/>
         </w:rPr>
         <w:t>Start a new normal ChatGPT chat. Paste the complete message below. Do not shorten it.</w:t>
       </w:r>
@@ -808,7 +837,7 @@
     </w:p>
     <w:p>
       <w:pPr>
-        <w:spacing w:before="60" w:after="180" w:line="300" w:lineRule="auto"/>
+        <w:spacing w:before="60" w:after="180" w:line="288" w:lineRule="auto"/>
         <w:ind w:left="173"/>
         <w:shd w:fill="FFF8E8"/>
       </w:pPr>
@@ -817,7 +846,7 @@
           <w:rFonts w:ascii="Calibri" w:hAnsi="Calibri" w:eastAsia="Calibri" w:cs="Calibri"/>
           <w:b/>
           <w:color w:val="0B2545"/>
-          <w:sz w:val="22"/>
+          <w:sz w:val="21"/>
         </w:rPr>
         <w:t>DONE WHEN:</w:t>
       </w:r>
@@ -825,7 +854,7 @@
         <w:rPr>
           <w:rFonts w:ascii="Calibri" w:hAnsi="Calibri" w:eastAsia="Calibri" w:cs="Calibri"/>
           <w:color w:val="0B2545"/>
-          <w:sz w:val="22"/>
+          <w:sz w:val="21"/>
         </w:rPr>
         <w:t xml:space="preserve"> The helper shows only one next action, waits, and verifies it before showing another.</w:t>
       </w:r>
@@ -840,26 +869,42 @@
           <w:color w:val="2E74B5"/>
           <w:sz w:val="32"/>
         </w:rPr>
-        <w:t>Step 1 - find and open the homework pack</w:t>
+        <w:t>Step 1 - find and open the verified company kit</w:t>
       </w:r>
     </w:p>
     <w:p>
       <w:pPr>
-        <w:spacing w:before="0" w:after="120" w:line="300" w:lineRule="auto"/>
+        <w:spacing w:before="0" w:after="120" w:line="288" w:lineRule="auto"/>
       </w:pPr>
       <w:r>
         <w:rPr>
           <w:rFonts w:ascii="Calibri" w:hAnsi="Calibri" w:eastAsia="Calibri" w:cs="Calibri"/>
           <w:color w:val="1F2937"/>
-          <w:sz w:val="22"/>
-        </w:rPr>
-        <w:t xml:space="preserve">The file is named </w:t>
+          <w:sz w:val="21"/>
+        </w:rPr>
+        <w:t xml:space="preserve">The preferred file is named </w:t>
       </w:r>
       <w:r>
         <w:rPr>
           <w:rFonts w:ascii="Menlo" w:hAnsi="Menlo" w:eastAsia="Menlo" w:cs="Menlo"/>
           <w:color w:val="1F4D78"/>
-          <w:sz w:val="20"/>
+          <w:sz w:val="19"/>
+        </w:rPr>
+        <w:t>kairali-company-rollout-1.2.0.zip</w:t>
+      </w:r>
+      <w:r>
+        <w:rPr>
+          <w:rFonts w:ascii="Calibri" w:hAnsi="Calibri" w:eastAsia="Calibri" w:cs="Calibri"/>
+          <w:color w:val="1F2937"/>
+          <w:sz w:val="21"/>
+        </w:rPr>
+        <w:t xml:space="preserve">. If your facilitator gave you the smaller homework-only file, it is named </w:t>
+      </w:r>
+      <w:r>
+        <w:rPr>
+          <w:rFonts w:ascii="Menlo" w:hAnsi="Menlo" w:eastAsia="Menlo" w:cs="Menlo"/>
+          <w:color w:val="1F4D78"/>
+          <w:sz w:val="19"/>
         </w:rPr>
         <w:t>EVERYONE-ELSE-AI-HUMAN-HOMEWORK-PACK.zip</w:t>
       </w:r>
@@ -867,9 +912,9 @@
         <w:rPr>
           <w:rFonts w:ascii="Calibri" w:hAnsi="Calibri" w:eastAsia="Calibri" w:cs="Calibri"/>
           <w:color w:val="1F2937"/>
-          <w:sz w:val="22"/>
-        </w:rPr>
-        <w:t>.</w:t>
+          <w:sz w:val="21"/>
+        </w:rPr>
+        <w:t>. Both routes open this same homework. You do not need a GitHub invitation.</w:t>
       </w:r>
     </w:p>
     <w:p>
@@ -892,13 +937,13 @@
           <w:ilvl w:val="0"/>
           <w:numId w:val="15"/>
         </w:numPr>
-        <w:spacing w:before="0" w:after="80" w:line="300" w:lineRule="auto"/>
+        <w:spacing w:before="0" w:after="80" w:line="288" w:lineRule="auto"/>
       </w:pPr>
       <w:r>
         <w:rPr>
           <w:rFonts w:ascii="Calibri" w:hAnsi="Calibri" w:eastAsia="Calibri" w:cs="Calibri"/>
           <w:color w:val="1F2937"/>
-          <w:sz w:val="22"/>
+          <w:sz w:val="21"/>
         </w:rPr>
         <w:t xml:space="preserve">Click the smiling blue </w:t>
       </w:r>
@@ -907,7 +952,7 @@
           <w:rFonts w:ascii="Calibri" w:hAnsi="Calibri" w:eastAsia="Calibri" w:cs="Calibri"/>
           <w:b/>
           <w:color w:val="1F2937"/>
-          <w:sz w:val="22"/>
+          <w:sz w:val="21"/>
         </w:rPr>
         <w:t>Finder</w:t>
       </w:r>
@@ -915,14 +960,14 @@
         <w:rPr>
           <w:rFonts w:ascii="Calibri" w:hAnsi="Calibri" w:eastAsia="Calibri" w:cs="Calibri"/>
           <w:color w:val="1F2937"/>
-          <w:sz w:val="22"/>
+          <w:sz w:val="21"/>
         </w:rPr>
         <w:t xml:space="preserve"> face in the Dock.</w:t>
       </w:r>
     </w:p>
     <w:p>
       <w:pPr>
-        <w:spacing w:before="60" w:after="180" w:line="300" w:lineRule="auto"/>
+        <w:spacing w:before="60" w:after="180" w:line="288" w:lineRule="auto"/>
         <w:ind w:left="173"/>
         <w:shd w:fill="FFF8E8"/>
       </w:pPr>
@@ -931,7 +976,7 @@
           <w:rFonts w:ascii="Calibri" w:hAnsi="Calibri" w:eastAsia="Calibri" w:cs="Calibri"/>
           <w:b/>
           <w:color w:val="0B2545"/>
-          <w:sz w:val="22"/>
+          <w:sz w:val="21"/>
         </w:rPr>
         <w:t>DONE WHEN:</w:t>
       </w:r>
@@ -939,7 +984,7 @@
         <w:rPr>
           <w:rFonts w:ascii="Calibri" w:hAnsi="Calibri" w:eastAsia="Calibri" w:cs="Calibri"/>
           <w:color w:val="0B2545"/>
-          <w:sz w:val="22"/>
+          <w:sz w:val="21"/>
         </w:rPr>
         <w:t xml:space="preserve"> A Finder window is open.</w:t>
       </w:r>
@@ -951,13 +996,13 @@
           <w:ilvl w:val="0"/>
           <w:numId w:val="17"/>
         </w:numPr>
-        <w:spacing w:before="0" w:after="80" w:line="300" w:lineRule="auto"/>
+        <w:spacing w:before="0" w:after="80" w:line="288" w:lineRule="auto"/>
       </w:pPr>
       <w:r>
         <w:rPr>
           <w:rFonts w:ascii="Calibri" w:hAnsi="Calibri" w:eastAsia="Calibri" w:cs="Calibri"/>
           <w:color w:val="1F2937"/>
-          <w:sz w:val="22"/>
+          <w:sz w:val="21"/>
         </w:rPr>
         <w:t xml:space="preserve">Click </w:t>
       </w:r>
@@ -966,7 +1011,7 @@
           <w:rFonts w:ascii="Calibri" w:hAnsi="Calibri" w:eastAsia="Calibri" w:cs="Calibri"/>
           <w:b/>
           <w:color w:val="1F2937"/>
-          <w:sz w:val="22"/>
+          <w:sz w:val="21"/>
         </w:rPr>
         <w:t>Downloads</w:t>
       </w:r>
@@ -974,14 +1019,14 @@
         <w:rPr>
           <w:rFonts w:ascii="Calibri" w:hAnsi="Calibri" w:eastAsia="Calibri" w:cs="Calibri"/>
           <w:color w:val="1F2937"/>
-          <w:sz w:val="22"/>
-        </w:rPr>
-        <w:t xml:space="preserve"> in the left side.</w:t>
+          <w:sz w:val="21"/>
+        </w:rPr>
+        <w:t xml:space="preserve"> in the left side. Use the exact file the Setup Helper verified.</w:t>
       </w:r>
     </w:p>
     <w:p>
       <w:pPr>
-        <w:spacing w:before="60" w:after="180" w:line="300" w:lineRule="auto"/>
+        <w:spacing w:before="60" w:after="180" w:line="288" w:lineRule="auto"/>
         <w:ind w:left="173"/>
         <w:shd w:fill="FFF8E8"/>
       </w:pPr>
@@ -990,7 +1035,7 @@
           <w:rFonts w:ascii="Calibri" w:hAnsi="Calibri" w:eastAsia="Calibri" w:cs="Calibri"/>
           <w:b/>
           <w:color w:val="0B2545"/>
-          <w:sz w:val="22"/>
+          <w:sz w:val="21"/>
         </w:rPr>
         <w:t>DONE WHEN:</w:t>
       </w:r>
@@ -998,7 +1043,7 @@
         <w:rPr>
           <w:rFonts w:ascii="Calibri" w:hAnsi="Calibri" w:eastAsia="Calibri" w:cs="Calibri"/>
           <w:color w:val="0B2545"/>
-          <w:sz w:val="22"/>
+          <w:sz w:val="21"/>
         </w:rPr>
         <w:t xml:space="preserve"> You can see the ZIP file.</w:t>
       </w:r>
@@ -1010,20 +1055,20 @@
           <w:ilvl w:val="0"/>
           <w:numId w:val="19"/>
         </w:numPr>
-        <w:spacing w:before="0" w:after="80" w:line="300" w:lineRule="auto"/>
+        <w:spacing w:before="0" w:after="80" w:line="288" w:lineRule="auto"/>
       </w:pPr>
       <w:r>
         <w:rPr>
           <w:rFonts w:ascii="Calibri" w:hAnsi="Calibri" w:eastAsia="Calibri" w:cs="Calibri"/>
           <w:color w:val="1F2937"/>
-          <w:sz w:val="22"/>
+          <w:sz w:val="21"/>
         </w:rPr>
         <w:t>Double-click the ZIP file once.</w:t>
       </w:r>
     </w:p>
     <w:p>
       <w:pPr>
-        <w:spacing w:before="60" w:after="180" w:line="300" w:lineRule="auto"/>
+        <w:spacing w:before="60" w:after="180" w:line="288" w:lineRule="auto"/>
         <w:ind w:left="173"/>
         <w:shd w:fill="FFF8E8"/>
       </w:pPr>
@@ -1032,7 +1077,7 @@
           <w:rFonts w:ascii="Calibri" w:hAnsi="Calibri" w:eastAsia="Calibri" w:cs="Calibri"/>
           <w:b/>
           <w:color w:val="0B2545"/>
-          <w:sz w:val="22"/>
+          <w:sz w:val="21"/>
         </w:rPr>
         <w:t>DONE WHEN:</w:t>
       </w:r>
@@ -1040,7 +1085,7 @@
         <w:rPr>
           <w:rFonts w:ascii="Calibri" w:hAnsi="Calibri" w:eastAsia="Calibri" w:cs="Calibri"/>
           <w:color w:val="0B2545"/>
-          <w:sz w:val="22"/>
+          <w:sz w:val="21"/>
         </w:rPr>
         <w:t xml:space="preserve"> A normal folder with the same name appears.</w:t>
       </w:r>
@@ -1052,20 +1097,20 @@
           <w:ilvl w:val="0"/>
           <w:numId w:val="21"/>
         </w:numPr>
-        <w:spacing w:before="0" w:after="80" w:line="300" w:lineRule="auto"/>
+        <w:spacing w:before="0" w:after="80" w:line="288" w:lineRule="auto"/>
       </w:pPr>
       <w:r>
         <w:rPr>
           <w:rFonts w:ascii="Calibri" w:hAnsi="Calibri" w:eastAsia="Calibri" w:cs="Calibri"/>
           <w:color w:val="1F2937"/>
-          <w:sz w:val="22"/>
+          <w:sz w:val="21"/>
         </w:rPr>
         <w:t>Double-click the normal folder.</w:t>
       </w:r>
     </w:p>
     <w:p>
       <w:pPr>
-        <w:spacing w:before="60" w:after="180" w:line="300" w:lineRule="auto"/>
+        <w:spacing w:before="60" w:after="180" w:line="288" w:lineRule="auto"/>
         <w:ind w:left="173"/>
         <w:shd w:fill="FFF8E8"/>
       </w:pPr>
@@ -1074,7 +1119,7 @@
           <w:rFonts w:ascii="Calibri" w:hAnsi="Calibri" w:eastAsia="Calibri" w:cs="Calibri"/>
           <w:b/>
           <w:color w:val="0B2545"/>
-          <w:sz w:val="22"/>
+          <w:sz w:val="21"/>
         </w:rPr>
         <w:t>DONE WHEN:</w:t>
       </w:r>
@@ -1082,7 +1127,7 @@
         <w:rPr>
           <w:rFonts w:ascii="Calibri" w:hAnsi="Calibri" w:eastAsia="Calibri" w:cs="Calibri"/>
           <w:color w:val="0B2545"/>
-          <w:sz w:val="22"/>
+          <w:sz w:val="21"/>
         </w:rPr>
         <w:t xml:space="preserve"> You can see </w:t>
       </w:r>
@@ -1090,7 +1135,7 @@
         <w:rPr>
           <w:rFonts w:ascii="Menlo" w:hAnsi="Menlo" w:eastAsia="Menlo" w:cs="Menlo"/>
           <w:color w:val="1F4D78"/>
-          <w:sz w:val="20"/>
+          <w:sz w:val="19"/>
         </w:rPr>
         <w:t>AI-HUMAN-STARTERS</w:t>
       </w:r>
@@ -1098,7 +1143,7 @@
         <w:rPr>
           <w:rFonts w:ascii="Calibri" w:hAnsi="Calibri" w:eastAsia="Calibri" w:cs="Calibri"/>
           <w:color w:val="0B2545"/>
-          <w:sz w:val="22"/>
+          <w:sz w:val="21"/>
         </w:rPr>
         <w:t xml:space="preserve"> and this guide.</w:t>
       </w:r>
@@ -1123,13 +1168,13 @@
           <w:ilvl w:val="0"/>
           <w:numId w:val="23"/>
         </w:numPr>
-        <w:spacing w:before="0" w:after="80" w:line="300" w:lineRule="auto"/>
+        <w:spacing w:before="0" w:after="80" w:line="288" w:lineRule="auto"/>
       </w:pPr>
       <w:r>
         <w:rPr>
           <w:rFonts w:ascii="Calibri" w:hAnsi="Calibri" w:eastAsia="Calibri" w:cs="Calibri"/>
           <w:color w:val="1F2937"/>
-          <w:sz w:val="22"/>
+          <w:sz w:val="21"/>
         </w:rPr>
         <w:t xml:space="preserve">Click the yellow </w:t>
       </w:r>
@@ -1138,7 +1183,7 @@
           <w:rFonts w:ascii="Calibri" w:hAnsi="Calibri" w:eastAsia="Calibri" w:cs="Calibri"/>
           <w:b/>
           <w:color w:val="1F2937"/>
-          <w:sz w:val="22"/>
+          <w:sz w:val="21"/>
         </w:rPr>
         <w:t>File Explorer</w:t>
       </w:r>
@@ -1146,14 +1191,14 @@
         <w:rPr>
           <w:rFonts w:ascii="Calibri" w:hAnsi="Calibri" w:eastAsia="Calibri" w:cs="Calibri"/>
           <w:color w:val="1F2937"/>
-          <w:sz w:val="22"/>
+          <w:sz w:val="21"/>
         </w:rPr>
         <w:t xml:space="preserve"> folder on the taskbar.</w:t>
       </w:r>
     </w:p>
     <w:p>
       <w:pPr>
-        <w:spacing w:before="60" w:after="180" w:line="300" w:lineRule="auto"/>
+        <w:spacing w:before="60" w:after="180" w:line="288" w:lineRule="auto"/>
         <w:ind w:left="173"/>
         <w:shd w:fill="FFF8E8"/>
       </w:pPr>
@@ -1162,7 +1207,7 @@
           <w:rFonts w:ascii="Calibri" w:hAnsi="Calibri" w:eastAsia="Calibri" w:cs="Calibri"/>
           <w:b/>
           <w:color w:val="0B2545"/>
-          <w:sz w:val="22"/>
+          <w:sz w:val="21"/>
         </w:rPr>
         <w:t>DONE WHEN:</w:t>
       </w:r>
@@ -1170,7 +1215,7 @@
         <w:rPr>
           <w:rFonts w:ascii="Calibri" w:hAnsi="Calibri" w:eastAsia="Calibri" w:cs="Calibri"/>
           <w:color w:val="0B2545"/>
-          <w:sz w:val="22"/>
+          <w:sz w:val="21"/>
         </w:rPr>
         <w:t xml:space="preserve"> A File Explorer window is open.</w:t>
       </w:r>
@@ -1182,13 +1227,13 @@
           <w:ilvl w:val="0"/>
           <w:numId w:val="25"/>
         </w:numPr>
-        <w:spacing w:before="0" w:after="80" w:line="300" w:lineRule="auto"/>
+        <w:spacing w:before="0" w:after="80" w:line="288" w:lineRule="auto"/>
       </w:pPr>
       <w:r>
         <w:rPr>
           <w:rFonts w:ascii="Calibri" w:hAnsi="Calibri" w:eastAsia="Calibri" w:cs="Calibri"/>
           <w:color w:val="1F2937"/>
-          <w:sz w:val="22"/>
+          <w:sz w:val="21"/>
         </w:rPr>
         <w:t xml:space="preserve">Click </w:t>
       </w:r>
@@ -1197,7 +1242,7 @@
           <w:rFonts w:ascii="Calibri" w:hAnsi="Calibri" w:eastAsia="Calibri" w:cs="Calibri"/>
           <w:b/>
           <w:color w:val="1F2937"/>
-          <w:sz w:val="22"/>
+          <w:sz w:val="21"/>
         </w:rPr>
         <w:t>Downloads</w:t>
       </w:r>
@@ -1205,14 +1250,14 @@
         <w:rPr>
           <w:rFonts w:ascii="Calibri" w:hAnsi="Calibri" w:eastAsia="Calibri" w:cs="Calibri"/>
           <w:color w:val="1F2937"/>
-          <w:sz w:val="22"/>
-        </w:rPr>
-        <w:t xml:space="preserve"> on the left.</w:t>
+          <w:sz w:val="21"/>
+        </w:rPr>
+        <w:t xml:space="preserve"> on the left. Use the exact file the Setup Helper verified.</w:t>
       </w:r>
     </w:p>
     <w:p>
       <w:pPr>
-        <w:spacing w:before="60" w:after="180" w:line="300" w:lineRule="auto"/>
+        <w:spacing w:before="60" w:after="180" w:line="288" w:lineRule="auto"/>
         <w:ind w:left="173"/>
         <w:shd w:fill="FFF8E8"/>
       </w:pPr>
@@ -1221,7 +1266,7 @@
           <w:rFonts w:ascii="Calibri" w:hAnsi="Calibri" w:eastAsia="Calibri" w:cs="Calibri"/>
           <w:b/>
           <w:color w:val="0B2545"/>
-          <w:sz w:val="22"/>
+          <w:sz w:val="21"/>
         </w:rPr>
         <w:t>DONE WHEN:</w:t>
       </w:r>
@@ -1229,7 +1274,7 @@
         <w:rPr>
           <w:rFonts w:ascii="Calibri" w:hAnsi="Calibri" w:eastAsia="Calibri" w:cs="Calibri"/>
           <w:color w:val="0B2545"/>
-          <w:sz w:val="22"/>
+          <w:sz w:val="21"/>
         </w:rPr>
         <w:t xml:space="preserve"> You can see the ZIP file.</w:t>
       </w:r>
@@ -1241,13 +1286,13 @@
           <w:ilvl w:val="0"/>
           <w:numId w:val="27"/>
         </w:numPr>
-        <w:spacing w:before="0" w:after="80" w:line="300" w:lineRule="auto"/>
+        <w:spacing w:before="0" w:after="80" w:line="288" w:lineRule="auto"/>
       </w:pPr>
       <w:r>
         <w:rPr>
           <w:rFonts w:ascii="Calibri" w:hAnsi="Calibri" w:eastAsia="Calibri" w:cs="Calibri"/>
           <w:color w:val="1F2937"/>
-          <w:sz w:val="22"/>
+          <w:sz w:val="21"/>
         </w:rPr>
         <w:t xml:space="preserve">Right-click the ZIP file. Click </w:t>
       </w:r>
@@ -1256,7 +1301,7 @@
           <w:rFonts w:ascii="Calibri" w:hAnsi="Calibri" w:eastAsia="Calibri" w:cs="Calibri"/>
           <w:b/>
           <w:color w:val="1F2937"/>
-          <w:sz w:val="22"/>
+          <w:sz w:val="21"/>
         </w:rPr>
         <w:t>Extract All</w:t>
       </w:r>
@@ -1264,7 +1309,7 @@
         <w:rPr>
           <w:rFonts w:ascii="Calibri" w:hAnsi="Calibri" w:eastAsia="Calibri" w:cs="Calibri"/>
           <w:color w:val="1F2937"/>
-          <w:sz w:val="22"/>
+          <w:sz w:val="21"/>
         </w:rPr>
         <w:t xml:space="preserve">. Click </w:t>
       </w:r>
@@ -1273,7 +1318,7 @@
           <w:rFonts w:ascii="Calibri" w:hAnsi="Calibri" w:eastAsia="Calibri" w:cs="Calibri"/>
           <w:b/>
           <w:color w:val="1F2937"/>
-          <w:sz w:val="22"/>
+          <w:sz w:val="21"/>
         </w:rPr>
         <w:t>Extract</w:t>
       </w:r>
@@ -1281,14 +1326,14 @@
         <w:rPr>
           <w:rFonts w:ascii="Calibri" w:hAnsi="Calibri" w:eastAsia="Calibri" w:cs="Calibri"/>
           <w:color w:val="1F2937"/>
-          <w:sz w:val="22"/>
+          <w:sz w:val="21"/>
         </w:rPr>
         <w:t>.</w:t>
       </w:r>
     </w:p>
     <w:p>
       <w:pPr>
-        <w:spacing w:before="60" w:after="180" w:line="300" w:lineRule="auto"/>
+        <w:spacing w:before="60" w:after="180" w:line="288" w:lineRule="auto"/>
         <w:ind w:left="173"/>
         <w:shd w:fill="FFF8E8"/>
       </w:pPr>
@@ -1297,7 +1342,7 @@
           <w:rFonts w:ascii="Calibri" w:hAnsi="Calibri" w:eastAsia="Calibri" w:cs="Calibri"/>
           <w:b/>
           <w:color w:val="0B2545"/>
-          <w:sz w:val="22"/>
+          <w:sz w:val="21"/>
         </w:rPr>
         <w:t>DONE WHEN:</w:t>
       </w:r>
@@ -1305,7 +1350,7 @@
         <w:rPr>
           <w:rFonts w:ascii="Calibri" w:hAnsi="Calibri" w:eastAsia="Calibri" w:cs="Calibri"/>
           <w:color w:val="0B2545"/>
-          <w:sz w:val="22"/>
+          <w:sz w:val="21"/>
         </w:rPr>
         <w:t xml:space="preserve"> A normal folder with the same name opens.</w:t>
       </w:r>
@@ -1317,20 +1362,20 @@
           <w:ilvl w:val="0"/>
           <w:numId w:val="29"/>
         </w:numPr>
-        <w:spacing w:before="0" w:after="80" w:line="300" w:lineRule="auto"/>
+        <w:spacing w:before="0" w:after="80" w:line="288" w:lineRule="auto"/>
       </w:pPr>
       <w:r>
         <w:rPr>
           <w:rFonts w:ascii="Calibri" w:hAnsi="Calibri" w:eastAsia="Calibri" w:cs="Calibri"/>
           <w:color w:val="1F2937"/>
-          <w:sz w:val="22"/>
+          <w:sz w:val="21"/>
         </w:rPr>
         <w:t>Open the normal folder.</w:t>
       </w:r>
     </w:p>
     <w:p>
       <w:pPr>
-        <w:spacing w:before="60" w:after="180" w:line="300" w:lineRule="auto"/>
+        <w:spacing w:before="60" w:after="180" w:line="288" w:lineRule="auto"/>
         <w:ind w:left="173"/>
         <w:shd w:fill="FFF8E8"/>
       </w:pPr>
@@ -1339,7 +1384,7 @@
           <w:rFonts w:ascii="Calibri" w:hAnsi="Calibri" w:eastAsia="Calibri" w:cs="Calibri"/>
           <w:b/>
           <w:color w:val="0B2545"/>
-          <w:sz w:val="22"/>
+          <w:sz w:val="21"/>
         </w:rPr>
         <w:t>DONE WHEN:</w:t>
       </w:r>
@@ -1347,7 +1392,7 @@
         <w:rPr>
           <w:rFonts w:ascii="Calibri" w:hAnsi="Calibri" w:eastAsia="Calibri" w:cs="Calibri"/>
           <w:color w:val="0B2545"/>
-          <w:sz w:val="22"/>
+          <w:sz w:val="21"/>
         </w:rPr>
         <w:t xml:space="preserve"> You can see </w:t>
       </w:r>
@@ -1355,7 +1400,7 @@
         <w:rPr>
           <w:rFonts w:ascii="Menlo" w:hAnsi="Menlo" w:eastAsia="Menlo" w:cs="Menlo"/>
           <w:color w:val="1F4D78"/>
-          <w:sz w:val="20"/>
+          <w:sz w:val="19"/>
         </w:rPr>
         <w:t>AI-HUMAN-STARTERS</w:t>
       </w:r>
@@ -1363,22 +1408,22 @@
         <w:rPr>
           <w:rFonts w:ascii="Calibri" w:hAnsi="Calibri" w:eastAsia="Calibri" w:cs="Calibri"/>
           <w:color w:val="0B2545"/>
-          <w:sz w:val="22"/>
+          <w:sz w:val="21"/>
         </w:rPr>
         <w:t xml:space="preserve"> and this guide.</w:t>
       </w:r>
     </w:p>
     <w:p>
       <w:pPr>
-        <w:spacing w:before="0" w:after="120" w:line="300" w:lineRule="auto"/>
+        <w:spacing w:before="0" w:after="120" w:line="288" w:lineRule="auto"/>
       </w:pPr>
       <w:r>
         <w:rPr>
           <w:rFonts w:ascii="Calibri" w:hAnsi="Calibri" w:eastAsia="Calibri" w:cs="Calibri"/>
           <w:color w:val="1F2937"/>
-          <w:sz w:val="22"/>
-        </w:rPr>
-        <w:t>If the ZIP is not visible, do not search the whole computer. Paste the Setup Helper rescue. The helper should check Downloads and ask Ambuj only if the pack was not given.</w:t>
+          <w:sz w:val="21"/>
+        </w:rPr>
+        <w:t>If the ZIP is not visible, do not search the whole computer. Paste the Setup Helper rescue. The helper checks Downloads, obtains the protected public v1.2.0 kit when safe, and asks Ambuj only if the approved source or access decision is missing.</w:t>
       </w:r>
     </w:p>
     <w:p>
@@ -1414,13 +1459,13 @@
           <w:ilvl w:val="0"/>
           <w:numId w:val="31"/>
         </w:numPr>
-        <w:spacing w:before="0" w:after="80" w:line="300" w:lineRule="auto"/>
+        <w:spacing w:before="0" w:after="80" w:line="288" w:lineRule="auto"/>
       </w:pPr>
       <w:r>
         <w:rPr>
           <w:rFonts w:ascii="Calibri" w:hAnsi="Calibri" w:eastAsia="Calibri" w:cs="Calibri"/>
           <w:color w:val="1F2937"/>
-          <w:sz w:val="22"/>
+          <w:sz w:val="21"/>
         </w:rPr>
         <w:t xml:space="preserve">In Finder, click </w:t>
       </w:r>
@@ -1429,7 +1474,7 @@
           <w:rFonts w:ascii="Calibri" w:hAnsi="Calibri" w:eastAsia="Calibri" w:cs="Calibri"/>
           <w:b/>
           <w:color w:val="1F2937"/>
-          <w:sz w:val="22"/>
+          <w:sz w:val="21"/>
         </w:rPr>
         <w:t>Documents</w:t>
       </w:r>
@@ -1437,14 +1482,14 @@
         <w:rPr>
           <w:rFonts w:ascii="Calibri" w:hAnsi="Calibri" w:eastAsia="Calibri" w:cs="Calibri"/>
           <w:color w:val="1F2937"/>
-          <w:sz w:val="22"/>
+          <w:sz w:val="21"/>
         </w:rPr>
         <w:t xml:space="preserve"> on the left.</w:t>
       </w:r>
     </w:p>
     <w:p>
       <w:pPr>
-        <w:spacing w:before="60" w:after="180" w:line="300" w:lineRule="auto"/>
+        <w:spacing w:before="60" w:after="180" w:line="288" w:lineRule="auto"/>
         <w:ind w:left="173"/>
         <w:shd w:fill="FFF8E8"/>
       </w:pPr>
@@ -1453,7 +1498,7 @@
           <w:rFonts w:ascii="Calibri" w:hAnsi="Calibri" w:eastAsia="Calibri" w:cs="Calibri"/>
           <w:b/>
           <w:color w:val="0B2545"/>
-          <w:sz w:val="22"/>
+          <w:sz w:val="21"/>
         </w:rPr>
         <w:t>DONE WHEN:</w:t>
       </w:r>
@@ -1461,7 +1506,7 @@
         <w:rPr>
           <w:rFonts w:ascii="Calibri" w:hAnsi="Calibri" w:eastAsia="Calibri" w:cs="Calibri"/>
           <w:color w:val="0B2545"/>
-          <w:sz w:val="22"/>
+          <w:sz w:val="21"/>
         </w:rPr>
         <w:t xml:space="preserve"> The word Documents is at the top of the window.</w:t>
       </w:r>
@@ -1473,13 +1518,13 @@
           <w:ilvl w:val="0"/>
           <w:numId w:val="33"/>
         </w:numPr>
-        <w:spacing w:before="0" w:after="80" w:line="300" w:lineRule="auto"/>
+        <w:spacing w:before="0" w:after="80" w:line="288" w:lineRule="auto"/>
       </w:pPr>
       <w:r>
         <w:rPr>
           <w:rFonts w:ascii="Calibri" w:hAnsi="Calibri" w:eastAsia="Calibri" w:cs="Calibri"/>
           <w:color w:val="1F2937"/>
-          <w:sz w:val="22"/>
+          <w:sz w:val="21"/>
         </w:rPr>
         <w:t xml:space="preserve">Click </w:t>
       </w:r>
@@ -1488,7 +1533,7 @@
           <w:rFonts w:ascii="Calibri" w:hAnsi="Calibri" w:eastAsia="Calibri" w:cs="Calibri"/>
           <w:b/>
           <w:color w:val="1F2937"/>
-          <w:sz w:val="22"/>
+          <w:sz w:val="21"/>
         </w:rPr>
         <w:t>File</w:t>
       </w:r>
@@ -1496,7 +1541,7 @@
         <w:rPr>
           <w:rFonts w:ascii="Calibri" w:hAnsi="Calibri" w:eastAsia="Calibri" w:cs="Calibri"/>
           <w:color w:val="1F2937"/>
-          <w:sz w:val="22"/>
+          <w:sz w:val="21"/>
         </w:rPr>
         <w:t xml:space="preserve"> at the top of the screen. Click </w:t>
       </w:r>
@@ -1505,7 +1550,7 @@
           <w:rFonts w:ascii="Calibri" w:hAnsi="Calibri" w:eastAsia="Calibri" w:cs="Calibri"/>
           <w:b/>
           <w:color w:val="1F2937"/>
-          <w:sz w:val="22"/>
+          <w:sz w:val="21"/>
         </w:rPr>
         <w:t>New Folder</w:t>
       </w:r>
@@ -1513,14 +1558,14 @@
         <w:rPr>
           <w:rFonts w:ascii="Calibri" w:hAnsi="Calibri" w:eastAsia="Calibri" w:cs="Calibri"/>
           <w:color w:val="1F2937"/>
-          <w:sz w:val="22"/>
+          <w:sz w:val="21"/>
         </w:rPr>
         <w:t>.</w:t>
       </w:r>
     </w:p>
     <w:p>
       <w:pPr>
-        <w:spacing w:before="60" w:after="180" w:line="300" w:lineRule="auto"/>
+        <w:spacing w:before="60" w:after="180" w:line="288" w:lineRule="auto"/>
         <w:ind w:left="173"/>
         <w:shd w:fill="FFF8E8"/>
       </w:pPr>
@@ -1529,7 +1574,7 @@
           <w:rFonts w:ascii="Calibri" w:hAnsi="Calibri" w:eastAsia="Calibri" w:cs="Calibri"/>
           <w:b/>
           <w:color w:val="0B2545"/>
-          <w:sz w:val="22"/>
+          <w:sz w:val="21"/>
         </w:rPr>
         <w:t>DONE WHEN:</w:t>
       </w:r>
@@ -1537,7 +1582,7 @@
         <w:rPr>
           <w:rFonts w:ascii="Calibri" w:hAnsi="Calibri" w:eastAsia="Calibri" w:cs="Calibri"/>
           <w:color w:val="0B2545"/>
-          <w:sz w:val="22"/>
+          <w:sz w:val="21"/>
         </w:rPr>
         <w:t xml:space="preserve"> A new folder name is selected and ready to type.</w:t>
       </w:r>
@@ -1549,13 +1594,13 @@
           <w:ilvl w:val="0"/>
           <w:numId w:val="35"/>
         </w:numPr>
-        <w:spacing w:before="0" w:after="80" w:line="300" w:lineRule="auto"/>
+        <w:spacing w:before="0" w:after="80" w:line="288" w:lineRule="auto"/>
       </w:pPr>
       <w:r>
         <w:rPr>
           <w:rFonts w:ascii="Calibri" w:hAnsi="Calibri" w:eastAsia="Calibri" w:cs="Calibri"/>
           <w:color w:val="1F2937"/>
-          <w:sz w:val="22"/>
+          <w:sz w:val="21"/>
         </w:rPr>
         <w:t xml:space="preserve">Type </w:t>
       </w:r>
@@ -1563,7 +1608,7 @@
         <w:rPr>
           <w:rFonts w:ascii="Menlo" w:hAnsi="Menlo" w:eastAsia="Menlo" w:cs="Menlo"/>
           <w:color w:val="1F4D78"/>
-          <w:sz w:val="20"/>
+          <w:sz w:val="19"/>
         </w:rPr>
         <w:t>AI Humans</w:t>
       </w:r>
@@ -1571,14 +1616,14 @@
         <w:rPr>
           <w:rFonts w:ascii="Calibri" w:hAnsi="Calibri" w:eastAsia="Calibri" w:cs="Calibri"/>
           <w:color w:val="1F2937"/>
-          <w:sz w:val="22"/>
+          <w:sz w:val="21"/>
         </w:rPr>
         <w:t xml:space="preserve"> and press Return.</w:t>
       </w:r>
     </w:p>
     <w:p>
       <w:pPr>
-        <w:spacing w:before="60" w:after="180" w:line="300" w:lineRule="auto"/>
+        <w:spacing w:before="60" w:after="180" w:line="288" w:lineRule="auto"/>
         <w:ind w:left="173"/>
         <w:shd w:fill="FFF8E8"/>
       </w:pPr>
@@ -1587,7 +1632,7 @@
           <w:rFonts w:ascii="Calibri" w:hAnsi="Calibri" w:eastAsia="Calibri" w:cs="Calibri"/>
           <w:b/>
           <w:color w:val="0B2545"/>
-          <w:sz w:val="22"/>
+          <w:sz w:val="21"/>
         </w:rPr>
         <w:t>DONE WHEN:</w:t>
       </w:r>
@@ -1595,7 +1640,7 @@
         <w:rPr>
           <w:rFonts w:ascii="Calibri" w:hAnsi="Calibri" w:eastAsia="Calibri" w:cs="Calibri"/>
           <w:color w:val="0B2545"/>
-          <w:sz w:val="22"/>
+          <w:sz w:val="21"/>
         </w:rPr>
         <w:t xml:space="preserve"> Documents contains a folder named </w:t>
       </w:r>
@@ -1603,7 +1648,7 @@
         <w:rPr>
           <w:rFonts w:ascii="Menlo" w:hAnsi="Menlo" w:eastAsia="Menlo" w:cs="Menlo"/>
           <w:color w:val="1F4D78"/>
-          <w:sz w:val="20"/>
+          <w:sz w:val="19"/>
         </w:rPr>
         <w:t>AI Humans</w:t>
       </w:r>
@@ -1611,7 +1656,7 @@
         <w:rPr>
           <w:rFonts w:ascii="Calibri" w:hAnsi="Calibri" w:eastAsia="Calibri" w:cs="Calibri"/>
           <w:color w:val="0B2545"/>
-          <w:sz w:val="22"/>
+          <w:sz w:val="21"/>
         </w:rPr>
         <w:t>.</w:t>
       </w:r>
@@ -1623,13 +1668,13 @@
           <w:ilvl w:val="0"/>
           <w:numId w:val="37"/>
         </w:numPr>
-        <w:spacing w:before="0" w:after="80" w:line="300" w:lineRule="auto"/>
+        <w:spacing w:before="0" w:after="80" w:line="288" w:lineRule="auto"/>
       </w:pPr>
       <w:r>
         <w:rPr>
           <w:rFonts w:ascii="Calibri" w:hAnsi="Calibri" w:eastAsia="Calibri" w:cs="Calibri"/>
           <w:color w:val="1F2937"/>
-          <w:sz w:val="22"/>
+          <w:sz w:val="21"/>
         </w:rPr>
         <w:t xml:space="preserve">Go back to the homework pack. Open </w:t>
       </w:r>
@@ -1637,7 +1682,7 @@
         <w:rPr>
           <w:rFonts w:ascii="Menlo" w:hAnsi="Menlo" w:eastAsia="Menlo" w:cs="Menlo"/>
           <w:color w:val="1F4D78"/>
-          <w:sz w:val="20"/>
+          <w:sz w:val="19"/>
         </w:rPr>
         <w:t>AI-HUMAN-STARTERS</w:t>
       </w:r>
@@ -1645,14 +1690,14 @@
         <w:rPr>
           <w:rFonts w:ascii="Calibri" w:hAnsi="Calibri" w:eastAsia="Calibri" w:cs="Calibri"/>
           <w:color w:val="1F2937"/>
-          <w:sz w:val="22"/>
+          <w:sz w:val="21"/>
         </w:rPr>
         <w:t>.</w:t>
       </w:r>
     </w:p>
     <w:p>
       <w:pPr>
-        <w:spacing w:before="60" w:after="180" w:line="300" w:lineRule="auto"/>
+        <w:spacing w:before="60" w:after="180" w:line="288" w:lineRule="auto"/>
         <w:ind w:left="173"/>
         <w:shd w:fill="FFF8E8"/>
       </w:pPr>
@@ -1661,7 +1706,7 @@
           <w:rFonts w:ascii="Calibri" w:hAnsi="Calibri" w:eastAsia="Calibri" w:cs="Calibri"/>
           <w:b/>
           <w:color w:val="0B2545"/>
-          <w:sz w:val="22"/>
+          <w:sz w:val="21"/>
         </w:rPr>
         <w:t>DONE WHEN:</w:t>
       </w:r>
@@ -1669,7 +1714,7 @@
         <w:rPr>
           <w:rFonts w:ascii="Calibri" w:hAnsi="Calibri" w:eastAsia="Calibri" w:cs="Calibri"/>
           <w:color w:val="0B2545"/>
-          <w:sz w:val="22"/>
+          <w:sz w:val="21"/>
         </w:rPr>
         <w:t xml:space="preserve"> You see three numbered starter folders.</w:t>
       </w:r>
@@ -1681,13 +1726,13 @@
           <w:ilvl w:val="0"/>
           <w:numId w:val="39"/>
         </w:numPr>
-        <w:spacing w:before="0" w:after="80" w:line="300" w:lineRule="auto"/>
+        <w:spacing w:before="0" w:after="80" w:line="288" w:lineRule="auto"/>
       </w:pPr>
       <w:r>
         <w:rPr>
           <w:rFonts w:ascii="Calibri" w:hAnsi="Calibri" w:eastAsia="Calibri" w:cs="Calibri"/>
           <w:color w:val="1F2937"/>
-          <w:sz w:val="22"/>
+          <w:sz w:val="21"/>
         </w:rPr>
         <w:t xml:space="preserve">Copy </w:t>
       </w:r>
@@ -1695,7 +1740,7 @@
         <w:rPr>
           <w:rFonts w:ascii="Menlo" w:hAnsi="Menlo" w:eastAsia="Menlo" w:cs="Menlo"/>
           <w:color w:val="1F4D78"/>
-          <w:sz w:val="20"/>
+          <w:sz w:val="19"/>
         </w:rPr>
         <w:t>01-Email-Triage-AI-Human</w:t>
       </w:r>
@@ -1703,14 +1748,14 @@
         <w:rPr>
           <w:rFonts w:ascii="Calibri" w:hAnsi="Calibri" w:eastAsia="Calibri" w:cs="Calibri"/>
           <w:color w:val="1F2937"/>
-          <w:sz w:val="22"/>
+          <w:sz w:val="21"/>
         </w:rPr>
         <w:t xml:space="preserve"> into Documents &gt; AI Humans.</w:t>
       </w:r>
     </w:p>
     <w:p>
       <w:pPr>
-        <w:spacing w:before="60" w:after="180" w:line="300" w:lineRule="auto"/>
+        <w:spacing w:before="60" w:after="180" w:line="288" w:lineRule="auto"/>
         <w:ind w:left="173"/>
         <w:shd w:fill="FFF8E8"/>
       </w:pPr>
@@ -1719,7 +1764,7 @@
           <w:rFonts w:ascii="Calibri" w:hAnsi="Calibri" w:eastAsia="Calibri" w:cs="Calibri"/>
           <w:b/>
           <w:color w:val="0B2545"/>
-          <w:sz w:val="22"/>
+          <w:sz w:val="21"/>
         </w:rPr>
         <w:t>DONE WHEN:</w:t>
       </w:r>
@@ -1727,7 +1772,7 @@
         <w:rPr>
           <w:rFonts w:ascii="Calibri" w:hAnsi="Calibri" w:eastAsia="Calibri" w:cs="Calibri"/>
           <w:color w:val="0B2545"/>
-          <w:sz w:val="22"/>
+          <w:sz w:val="21"/>
         </w:rPr>
         <w:t xml:space="preserve"> The Email folder exists inside </w:t>
       </w:r>
@@ -1735,7 +1780,7 @@
         <w:rPr>
           <w:rFonts w:ascii="Menlo" w:hAnsi="Menlo" w:eastAsia="Menlo" w:cs="Menlo"/>
           <w:color w:val="1F4D78"/>
-          <w:sz w:val="20"/>
+          <w:sz w:val="19"/>
         </w:rPr>
         <w:t>AI Humans</w:t>
       </w:r>
@@ -1743,7 +1788,7 @@
         <w:rPr>
           <w:rFonts w:ascii="Calibri" w:hAnsi="Calibri" w:eastAsia="Calibri" w:cs="Calibri"/>
           <w:color w:val="0B2545"/>
-          <w:sz w:val="22"/>
+          <w:sz w:val="21"/>
         </w:rPr>
         <w:t>.</w:t>
       </w:r>
@@ -1755,13 +1800,13 @@
           <w:ilvl w:val="0"/>
           <w:numId w:val="41"/>
         </w:numPr>
-        <w:spacing w:before="0" w:after="80" w:line="300" w:lineRule="auto"/>
+        <w:spacing w:before="0" w:after="80" w:line="288" w:lineRule="auto"/>
       </w:pPr>
       <w:r>
         <w:rPr>
           <w:rFonts w:ascii="Calibri" w:hAnsi="Calibri" w:eastAsia="Calibri" w:cs="Calibri"/>
           <w:color w:val="1F2937"/>
-          <w:sz w:val="22"/>
+          <w:sz w:val="21"/>
         </w:rPr>
         <w:t xml:space="preserve">Copy </w:t>
       </w:r>
@@ -1769,7 +1814,7 @@
         <w:rPr>
           <w:rFonts w:ascii="Menlo" w:hAnsi="Menlo" w:eastAsia="Menlo" w:cs="Menlo"/>
           <w:color w:val="1F4D78"/>
-          <w:sz w:val="20"/>
+          <w:sz w:val="19"/>
         </w:rPr>
         <w:t>02-Drive-Inventory-AI-Human</w:t>
       </w:r>
@@ -1777,14 +1822,14 @@
         <w:rPr>
           <w:rFonts w:ascii="Calibri" w:hAnsi="Calibri" w:eastAsia="Calibri" w:cs="Calibri"/>
           <w:color w:val="1F2937"/>
-          <w:sz w:val="22"/>
+          <w:sz w:val="21"/>
         </w:rPr>
         <w:t xml:space="preserve"> into Documents &gt; AI Humans.</w:t>
       </w:r>
     </w:p>
     <w:p>
       <w:pPr>
-        <w:spacing w:before="60" w:after="180" w:line="300" w:lineRule="auto"/>
+        <w:spacing w:before="60" w:after="180" w:line="288" w:lineRule="auto"/>
         <w:ind w:left="173"/>
         <w:shd w:fill="FFF8E8"/>
       </w:pPr>
@@ -1793,7 +1838,7 @@
           <w:rFonts w:ascii="Calibri" w:hAnsi="Calibri" w:eastAsia="Calibri" w:cs="Calibri"/>
           <w:b/>
           <w:color w:val="0B2545"/>
-          <w:sz w:val="22"/>
+          <w:sz w:val="21"/>
         </w:rPr>
         <w:t>DONE WHEN:</w:t>
       </w:r>
@@ -1801,7 +1846,7 @@
         <w:rPr>
           <w:rFonts w:ascii="Calibri" w:hAnsi="Calibri" w:eastAsia="Calibri" w:cs="Calibri"/>
           <w:color w:val="0B2545"/>
-          <w:sz w:val="22"/>
+          <w:sz w:val="21"/>
         </w:rPr>
         <w:t xml:space="preserve"> The Drive folder exists beside the Email folder.</w:t>
       </w:r>
@@ -1826,13 +1871,13 @@
           <w:ilvl w:val="0"/>
           <w:numId w:val="43"/>
         </w:numPr>
-        <w:spacing w:before="0" w:after="80" w:line="300" w:lineRule="auto"/>
+        <w:spacing w:before="0" w:after="80" w:line="288" w:lineRule="auto"/>
       </w:pPr>
       <w:r>
         <w:rPr>
           <w:rFonts w:ascii="Calibri" w:hAnsi="Calibri" w:eastAsia="Calibri" w:cs="Calibri"/>
           <w:color w:val="1F2937"/>
-          <w:sz w:val="22"/>
+          <w:sz w:val="21"/>
         </w:rPr>
         <w:t xml:space="preserve">In File Explorer, click </w:t>
       </w:r>
@@ -1841,7 +1886,7 @@
           <w:rFonts w:ascii="Calibri" w:hAnsi="Calibri" w:eastAsia="Calibri" w:cs="Calibri"/>
           <w:b/>
           <w:color w:val="1F2937"/>
-          <w:sz w:val="22"/>
+          <w:sz w:val="21"/>
         </w:rPr>
         <w:t>Documents</w:t>
       </w:r>
@@ -1849,14 +1894,14 @@
         <w:rPr>
           <w:rFonts w:ascii="Calibri" w:hAnsi="Calibri" w:eastAsia="Calibri" w:cs="Calibri"/>
           <w:color w:val="1F2937"/>
-          <w:sz w:val="22"/>
+          <w:sz w:val="21"/>
         </w:rPr>
         <w:t xml:space="preserve"> on the left.</w:t>
       </w:r>
     </w:p>
     <w:p>
       <w:pPr>
-        <w:spacing w:before="60" w:after="180" w:line="300" w:lineRule="auto"/>
+        <w:spacing w:before="60" w:after="180" w:line="288" w:lineRule="auto"/>
         <w:ind w:left="173"/>
         <w:shd w:fill="FFF8E8"/>
       </w:pPr>
@@ -1865,7 +1910,7 @@
           <w:rFonts w:ascii="Calibri" w:hAnsi="Calibri" w:eastAsia="Calibri" w:cs="Calibri"/>
           <w:b/>
           <w:color w:val="0B2545"/>
-          <w:sz w:val="22"/>
+          <w:sz w:val="21"/>
         </w:rPr>
         <w:t>DONE WHEN:</w:t>
       </w:r>
@@ -1873,7 +1918,7 @@
         <w:rPr>
           <w:rFonts w:ascii="Calibri" w:hAnsi="Calibri" w:eastAsia="Calibri" w:cs="Calibri"/>
           <w:color w:val="0B2545"/>
-          <w:sz w:val="22"/>
+          <w:sz w:val="21"/>
         </w:rPr>
         <w:t xml:space="preserve"> Documents is open.</w:t>
       </w:r>
@@ -1885,13 +1930,13 @@
           <w:ilvl w:val="0"/>
           <w:numId w:val="45"/>
         </w:numPr>
-        <w:spacing w:before="0" w:after="80" w:line="300" w:lineRule="auto"/>
+        <w:spacing w:before="0" w:after="80" w:line="288" w:lineRule="auto"/>
       </w:pPr>
       <w:r>
         <w:rPr>
           <w:rFonts w:ascii="Calibri" w:hAnsi="Calibri" w:eastAsia="Calibri" w:cs="Calibri"/>
           <w:color w:val="1F2937"/>
-          <w:sz w:val="22"/>
+          <w:sz w:val="21"/>
         </w:rPr>
         <w:t xml:space="preserve">Click </w:t>
       </w:r>
@@ -1900,7 +1945,7 @@
           <w:rFonts w:ascii="Calibri" w:hAnsi="Calibri" w:eastAsia="Calibri" w:cs="Calibri"/>
           <w:b/>
           <w:color w:val="1F2937"/>
-          <w:sz w:val="22"/>
+          <w:sz w:val="21"/>
         </w:rPr>
         <w:t>New</w:t>
       </w:r>
@@ -1908,7 +1953,7 @@
         <w:rPr>
           <w:rFonts w:ascii="Calibri" w:hAnsi="Calibri" w:eastAsia="Calibri" w:cs="Calibri"/>
           <w:color w:val="1F2937"/>
-          <w:sz w:val="22"/>
+          <w:sz w:val="21"/>
         </w:rPr>
         <w:t xml:space="preserve">, then </w:t>
       </w:r>
@@ -1917,7 +1962,7 @@
           <w:rFonts w:ascii="Calibri" w:hAnsi="Calibri" w:eastAsia="Calibri" w:cs="Calibri"/>
           <w:b/>
           <w:color w:val="1F2937"/>
-          <w:sz w:val="22"/>
+          <w:sz w:val="21"/>
         </w:rPr>
         <w:t>Folder</w:t>
       </w:r>
@@ -1925,14 +1970,14 @@
         <w:rPr>
           <w:rFonts w:ascii="Calibri" w:hAnsi="Calibri" w:eastAsia="Calibri" w:cs="Calibri"/>
           <w:color w:val="1F2937"/>
-          <w:sz w:val="22"/>
+          <w:sz w:val="21"/>
         </w:rPr>
         <w:t>.</w:t>
       </w:r>
     </w:p>
     <w:p>
       <w:pPr>
-        <w:spacing w:before="60" w:after="180" w:line="300" w:lineRule="auto"/>
+        <w:spacing w:before="60" w:after="180" w:line="288" w:lineRule="auto"/>
         <w:ind w:left="173"/>
         <w:shd w:fill="FFF8E8"/>
       </w:pPr>
@@ -1941,7 +1986,7 @@
           <w:rFonts w:ascii="Calibri" w:hAnsi="Calibri" w:eastAsia="Calibri" w:cs="Calibri"/>
           <w:b/>
           <w:color w:val="0B2545"/>
-          <w:sz w:val="22"/>
+          <w:sz w:val="21"/>
         </w:rPr>
         <w:t>DONE WHEN:</w:t>
       </w:r>
@@ -1949,7 +1994,7 @@
         <w:rPr>
           <w:rFonts w:ascii="Calibri" w:hAnsi="Calibri" w:eastAsia="Calibri" w:cs="Calibri"/>
           <w:color w:val="0B2545"/>
-          <w:sz w:val="22"/>
+          <w:sz w:val="21"/>
         </w:rPr>
         <w:t xml:space="preserve"> A new folder name is selected and ready to type.</w:t>
       </w:r>
@@ -1961,13 +2006,13 @@
           <w:ilvl w:val="0"/>
           <w:numId w:val="47"/>
         </w:numPr>
-        <w:spacing w:before="0" w:after="80" w:line="300" w:lineRule="auto"/>
+        <w:spacing w:before="0" w:after="80" w:line="288" w:lineRule="auto"/>
       </w:pPr>
       <w:r>
         <w:rPr>
           <w:rFonts w:ascii="Calibri" w:hAnsi="Calibri" w:eastAsia="Calibri" w:cs="Calibri"/>
           <w:color w:val="1F2937"/>
-          <w:sz w:val="22"/>
+          <w:sz w:val="21"/>
         </w:rPr>
         <w:t xml:space="preserve">Type </w:t>
       </w:r>
@@ -1975,7 +2020,7 @@
         <w:rPr>
           <w:rFonts w:ascii="Menlo" w:hAnsi="Menlo" w:eastAsia="Menlo" w:cs="Menlo"/>
           <w:color w:val="1F4D78"/>
-          <w:sz w:val="20"/>
+          <w:sz w:val="19"/>
         </w:rPr>
         <w:t>AI Humans</w:t>
       </w:r>
@@ -1983,14 +2028,14 @@
         <w:rPr>
           <w:rFonts w:ascii="Calibri" w:hAnsi="Calibri" w:eastAsia="Calibri" w:cs="Calibri"/>
           <w:color w:val="1F2937"/>
-          <w:sz w:val="22"/>
+          <w:sz w:val="21"/>
         </w:rPr>
         <w:t xml:space="preserve"> and press Enter.</w:t>
       </w:r>
     </w:p>
     <w:p>
       <w:pPr>
-        <w:spacing w:before="60" w:after="180" w:line="300" w:lineRule="auto"/>
+        <w:spacing w:before="60" w:after="180" w:line="288" w:lineRule="auto"/>
         <w:ind w:left="173"/>
         <w:shd w:fill="FFF8E8"/>
       </w:pPr>
@@ -1999,7 +2044,7 @@
           <w:rFonts w:ascii="Calibri" w:hAnsi="Calibri" w:eastAsia="Calibri" w:cs="Calibri"/>
           <w:b/>
           <w:color w:val="0B2545"/>
-          <w:sz w:val="22"/>
+          <w:sz w:val="21"/>
         </w:rPr>
         <w:t>DONE WHEN:</w:t>
       </w:r>
@@ -2007,7 +2052,7 @@
         <w:rPr>
           <w:rFonts w:ascii="Calibri" w:hAnsi="Calibri" w:eastAsia="Calibri" w:cs="Calibri"/>
           <w:color w:val="0B2545"/>
-          <w:sz w:val="22"/>
+          <w:sz w:val="21"/>
         </w:rPr>
         <w:t xml:space="preserve"> Documents contains a folder named </w:t>
       </w:r>
@@ -2015,7 +2060,7 @@
         <w:rPr>
           <w:rFonts w:ascii="Menlo" w:hAnsi="Menlo" w:eastAsia="Menlo" w:cs="Menlo"/>
           <w:color w:val="1F4D78"/>
-          <w:sz w:val="20"/>
+          <w:sz w:val="19"/>
         </w:rPr>
         <w:t>AI Humans</w:t>
       </w:r>
@@ -2023,7 +2068,7 @@
         <w:rPr>
           <w:rFonts w:ascii="Calibri" w:hAnsi="Calibri" w:eastAsia="Calibri" w:cs="Calibri"/>
           <w:color w:val="0B2545"/>
-          <w:sz w:val="22"/>
+          <w:sz w:val="21"/>
         </w:rPr>
         <w:t>.</w:t>
       </w:r>
@@ -2035,13 +2080,13 @@
           <w:ilvl w:val="0"/>
           <w:numId w:val="49"/>
         </w:numPr>
-        <w:spacing w:before="0" w:after="80" w:line="300" w:lineRule="auto"/>
+        <w:spacing w:before="0" w:after="80" w:line="288" w:lineRule="auto"/>
       </w:pPr>
       <w:r>
         <w:rPr>
           <w:rFonts w:ascii="Calibri" w:hAnsi="Calibri" w:eastAsia="Calibri" w:cs="Calibri"/>
           <w:color w:val="1F2937"/>
-          <w:sz w:val="22"/>
+          <w:sz w:val="21"/>
         </w:rPr>
         <w:t xml:space="preserve">Go back to the homework pack. Open </w:t>
       </w:r>
@@ -2049,7 +2094,7 @@
         <w:rPr>
           <w:rFonts w:ascii="Menlo" w:hAnsi="Menlo" w:eastAsia="Menlo" w:cs="Menlo"/>
           <w:color w:val="1F4D78"/>
-          <w:sz w:val="20"/>
+          <w:sz w:val="19"/>
         </w:rPr>
         <w:t>AI-HUMAN-STARTERS</w:t>
       </w:r>
@@ -2057,14 +2102,14 @@
         <w:rPr>
           <w:rFonts w:ascii="Calibri" w:hAnsi="Calibri" w:eastAsia="Calibri" w:cs="Calibri"/>
           <w:color w:val="1F2937"/>
-          <w:sz w:val="22"/>
+          <w:sz w:val="21"/>
         </w:rPr>
         <w:t>.</w:t>
       </w:r>
     </w:p>
     <w:p>
       <w:pPr>
-        <w:spacing w:before="60" w:after="180" w:line="300" w:lineRule="auto"/>
+        <w:spacing w:before="60" w:after="180" w:line="288" w:lineRule="auto"/>
         <w:ind w:left="173"/>
         <w:shd w:fill="FFF8E8"/>
       </w:pPr>
@@ -2073,7 +2118,7 @@
           <w:rFonts w:ascii="Calibri" w:hAnsi="Calibri" w:eastAsia="Calibri" w:cs="Calibri"/>
           <w:b/>
           <w:color w:val="0B2545"/>
-          <w:sz w:val="22"/>
+          <w:sz w:val="21"/>
         </w:rPr>
         <w:t>DONE WHEN:</w:t>
       </w:r>
@@ -2081,7 +2126,7 @@
         <w:rPr>
           <w:rFonts w:ascii="Calibri" w:hAnsi="Calibri" w:eastAsia="Calibri" w:cs="Calibri"/>
           <w:color w:val="0B2545"/>
-          <w:sz w:val="22"/>
+          <w:sz w:val="21"/>
         </w:rPr>
         <w:t xml:space="preserve"> You see three numbered starter folders.</w:t>
       </w:r>
@@ -2093,13 +2138,13 @@
           <w:ilvl w:val="0"/>
           <w:numId w:val="51"/>
         </w:numPr>
-        <w:spacing w:before="0" w:after="80" w:line="300" w:lineRule="auto"/>
+        <w:spacing w:before="0" w:after="80" w:line="288" w:lineRule="auto"/>
       </w:pPr>
       <w:r>
         <w:rPr>
           <w:rFonts w:ascii="Calibri" w:hAnsi="Calibri" w:eastAsia="Calibri" w:cs="Calibri"/>
           <w:color w:val="1F2937"/>
-          <w:sz w:val="22"/>
+          <w:sz w:val="21"/>
         </w:rPr>
         <w:t xml:space="preserve">Copy </w:t>
       </w:r>
@@ -2107,7 +2152,7 @@
         <w:rPr>
           <w:rFonts w:ascii="Menlo" w:hAnsi="Menlo" w:eastAsia="Menlo" w:cs="Menlo"/>
           <w:color w:val="1F4D78"/>
-          <w:sz w:val="20"/>
+          <w:sz w:val="19"/>
         </w:rPr>
         <w:t>01-Email-Triage-AI-Human</w:t>
       </w:r>
@@ -2115,14 +2160,14 @@
         <w:rPr>
           <w:rFonts w:ascii="Calibri" w:hAnsi="Calibri" w:eastAsia="Calibri" w:cs="Calibri"/>
           <w:color w:val="1F2937"/>
-          <w:sz w:val="22"/>
+          <w:sz w:val="21"/>
         </w:rPr>
         <w:t xml:space="preserve"> into Documents &gt; AI Humans.</w:t>
       </w:r>
     </w:p>
     <w:p>
       <w:pPr>
-        <w:spacing w:before="60" w:after="180" w:line="300" w:lineRule="auto"/>
+        <w:spacing w:before="60" w:after="180" w:line="288" w:lineRule="auto"/>
         <w:ind w:left="173"/>
         <w:shd w:fill="FFF8E8"/>
       </w:pPr>
@@ -2131,7 +2176,7 @@
           <w:rFonts w:ascii="Calibri" w:hAnsi="Calibri" w:eastAsia="Calibri" w:cs="Calibri"/>
           <w:b/>
           <w:color w:val="0B2545"/>
-          <w:sz w:val="22"/>
+          <w:sz w:val="21"/>
         </w:rPr>
         <w:t>DONE WHEN:</w:t>
       </w:r>
@@ -2139,7 +2184,7 @@
         <w:rPr>
           <w:rFonts w:ascii="Calibri" w:hAnsi="Calibri" w:eastAsia="Calibri" w:cs="Calibri"/>
           <w:color w:val="0B2545"/>
-          <w:sz w:val="22"/>
+          <w:sz w:val="21"/>
         </w:rPr>
         <w:t xml:space="preserve"> The Email folder exists inside </w:t>
       </w:r>
@@ -2147,7 +2192,7 @@
         <w:rPr>
           <w:rFonts w:ascii="Menlo" w:hAnsi="Menlo" w:eastAsia="Menlo" w:cs="Menlo"/>
           <w:color w:val="1F4D78"/>
-          <w:sz w:val="20"/>
+          <w:sz w:val="19"/>
         </w:rPr>
         <w:t>AI Humans</w:t>
       </w:r>
@@ -2155,7 +2200,7 @@
         <w:rPr>
           <w:rFonts w:ascii="Calibri" w:hAnsi="Calibri" w:eastAsia="Calibri" w:cs="Calibri"/>
           <w:color w:val="0B2545"/>
-          <w:sz w:val="22"/>
+          <w:sz w:val="21"/>
         </w:rPr>
         <w:t>.</w:t>
       </w:r>
@@ -2167,13 +2212,13 @@
           <w:ilvl w:val="0"/>
           <w:numId w:val="53"/>
         </w:numPr>
-        <w:spacing w:before="0" w:after="80" w:line="300" w:lineRule="auto"/>
+        <w:spacing w:before="0" w:after="80" w:line="288" w:lineRule="auto"/>
       </w:pPr>
       <w:r>
         <w:rPr>
           <w:rFonts w:ascii="Calibri" w:hAnsi="Calibri" w:eastAsia="Calibri" w:cs="Calibri"/>
           <w:color w:val="1F2937"/>
-          <w:sz w:val="22"/>
+          <w:sz w:val="21"/>
         </w:rPr>
         <w:t xml:space="preserve">Copy </w:t>
       </w:r>
@@ -2181,7 +2226,7 @@
         <w:rPr>
           <w:rFonts w:ascii="Menlo" w:hAnsi="Menlo" w:eastAsia="Menlo" w:cs="Menlo"/>
           <w:color w:val="1F4D78"/>
-          <w:sz w:val="20"/>
+          <w:sz w:val="19"/>
         </w:rPr>
         <w:t>02-Drive-Inventory-AI-Human</w:t>
       </w:r>
@@ -2189,14 +2234,14 @@
         <w:rPr>
           <w:rFonts w:ascii="Calibri" w:hAnsi="Calibri" w:eastAsia="Calibri" w:cs="Calibri"/>
           <w:color w:val="1F2937"/>
-          <w:sz w:val="22"/>
+          <w:sz w:val="21"/>
         </w:rPr>
         <w:t xml:space="preserve"> into Documents &gt; AI Humans.</w:t>
       </w:r>
     </w:p>
     <w:p>
       <w:pPr>
-        <w:spacing w:before="60" w:after="180" w:line="300" w:lineRule="auto"/>
+        <w:spacing w:before="60" w:after="180" w:line="288" w:lineRule="auto"/>
         <w:ind w:left="173"/>
         <w:shd w:fill="FFF8E8"/>
       </w:pPr>
@@ -2205,7 +2250,7 @@
           <w:rFonts w:ascii="Calibri" w:hAnsi="Calibri" w:eastAsia="Calibri" w:cs="Calibri"/>
           <w:b/>
           <w:color w:val="0B2545"/>
-          <w:sz w:val="22"/>
+          <w:sz w:val="21"/>
         </w:rPr>
         <w:t>DONE WHEN:</w:t>
       </w:r>
@@ -2213,20 +2258,20 @@
         <w:rPr>
           <w:rFonts w:ascii="Calibri" w:hAnsi="Calibri" w:eastAsia="Calibri" w:cs="Calibri"/>
           <w:color w:val="0B2545"/>
-          <w:sz w:val="22"/>
+          <w:sz w:val="21"/>
         </w:rPr>
         <w:t xml:space="preserve"> The Drive folder exists beside the Email folder.</w:t>
       </w:r>
     </w:p>
     <w:p>
       <w:pPr>
-        <w:spacing w:before="0" w:after="120" w:line="300" w:lineRule="auto"/>
+        <w:spacing w:before="0" w:after="120" w:line="288" w:lineRule="auto"/>
       </w:pPr>
       <w:r>
         <w:rPr>
           <w:rFonts w:ascii="Calibri" w:hAnsi="Calibri" w:eastAsia="Calibri" w:cs="Calibri"/>
           <w:color w:val="1F2937"/>
-          <w:sz w:val="22"/>
+          <w:sz w:val="21"/>
         </w:rPr>
         <w:t>Keep the downloaded pack untouched. Your two copies are the workers you use.</w:t>
       </w:r>
@@ -2264,13 +2309,13 @@
           <w:ilvl w:val="0"/>
           <w:numId w:val="55"/>
         </w:numPr>
-        <w:spacing w:before="0" w:after="80" w:line="300" w:lineRule="auto"/>
+        <w:spacing w:before="0" w:after="80" w:line="288" w:lineRule="auto"/>
       </w:pPr>
       <w:r>
         <w:rPr>
           <w:rFonts w:ascii="Calibri" w:hAnsi="Calibri" w:eastAsia="Calibri" w:cs="Calibri"/>
           <w:color w:val="1F2937"/>
-          <w:sz w:val="22"/>
+          <w:sz w:val="21"/>
         </w:rPr>
         <w:t xml:space="preserve">Open Finder. Click </w:t>
       </w:r>
@@ -2279,7 +2324,7 @@
           <w:rFonts w:ascii="Calibri" w:hAnsi="Calibri" w:eastAsia="Calibri" w:cs="Calibri"/>
           <w:b/>
           <w:color w:val="1F2937"/>
-          <w:sz w:val="22"/>
+          <w:sz w:val="21"/>
         </w:rPr>
         <w:t>Applications</w:t>
       </w:r>
@@ -2287,7 +2332,7 @@
         <w:rPr>
           <w:rFonts w:ascii="Calibri" w:hAnsi="Calibri" w:eastAsia="Calibri" w:cs="Calibri"/>
           <w:color w:val="1F2937"/>
-          <w:sz w:val="22"/>
+          <w:sz w:val="21"/>
         </w:rPr>
         <w:t xml:space="preserve">. Look for </w:t>
       </w:r>
@@ -2296,7 +2341,7 @@
           <w:rFonts w:ascii="Calibri" w:hAnsi="Calibri" w:eastAsia="Calibri" w:cs="Calibri"/>
           <w:b/>
           <w:color w:val="1F2937"/>
-          <w:sz w:val="22"/>
+          <w:sz w:val="21"/>
         </w:rPr>
         <w:t>ChatGPT</w:t>
       </w:r>
@@ -2304,14 +2349,14 @@
         <w:rPr>
           <w:rFonts w:ascii="Calibri" w:hAnsi="Calibri" w:eastAsia="Calibri" w:cs="Calibri"/>
           <w:color w:val="1F2937"/>
-          <w:sz w:val="22"/>
+          <w:sz w:val="21"/>
         </w:rPr>
         <w:t>.</w:t>
       </w:r>
     </w:p>
     <w:p>
       <w:pPr>
-        <w:spacing w:before="60" w:after="180" w:line="300" w:lineRule="auto"/>
+        <w:spacing w:before="60" w:after="180" w:line="288" w:lineRule="auto"/>
         <w:ind w:left="173"/>
         <w:shd w:fill="FFF8E8"/>
       </w:pPr>
@@ -2320,7 +2365,7 @@
           <w:rFonts w:ascii="Calibri" w:hAnsi="Calibri" w:eastAsia="Calibri" w:cs="Calibri"/>
           <w:b/>
           <w:color w:val="0B2545"/>
-          <w:sz w:val="22"/>
+          <w:sz w:val="21"/>
         </w:rPr>
         <w:t>DONE WHEN:</w:t>
       </w:r>
@@ -2328,7 +2373,7 @@
         <w:rPr>
           <w:rFonts w:ascii="Calibri" w:hAnsi="Calibri" w:eastAsia="Calibri" w:cs="Calibri"/>
           <w:color w:val="0B2545"/>
-          <w:sz w:val="22"/>
+          <w:sz w:val="21"/>
         </w:rPr>
         <w:t xml:space="preserve"> You can see ChatGPT, or you know it is missing.</w:t>
       </w:r>
@@ -2340,20 +2385,20 @@
           <w:ilvl w:val="0"/>
           <w:numId w:val="57"/>
         </w:numPr>
-        <w:spacing w:before="0" w:after="80" w:line="300" w:lineRule="auto"/>
+        <w:spacing w:before="0" w:after="80" w:line="288" w:lineRule="auto"/>
       </w:pPr>
       <w:r>
         <w:rPr>
           <w:rFonts w:ascii="Calibri" w:hAnsi="Calibri" w:eastAsia="Calibri" w:cs="Calibri"/>
           <w:color w:val="1F2937"/>
-          <w:sz w:val="22"/>
+          <w:sz w:val="21"/>
         </w:rPr>
         <w:t>If ChatGPT is present, double-click it. Do not install it again.</w:t>
       </w:r>
     </w:p>
     <w:p>
       <w:pPr>
-        <w:spacing w:before="60" w:after="180" w:line="300" w:lineRule="auto"/>
+        <w:spacing w:before="60" w:after="180" w:line="288" w:lineRule="auto"/>
         <w:ind w:left="173"/>
         <w:shd w:fill="FFF8E8"/>
       </w:pPr>
@@ -2362,7 +2407,7 @@
           <w:rFonts w:ascii="Calibri" w:hAnsi="Calibri" w:eastAsia="Calibri" w:cs="Calibri"/>
           <w:b/>
           <w:color w:val="0B2545"/>
-          <w:sz w:val="22"/>
+          <w:sz w:val="21"/>
         </w:rPr>
         <w:t>DONE WHEN:</w:t>
       </w:r>
@@ -2370,7 +2415,7 @@
         <w:rPr>
           <w:rFonts w:ascii="Calibri" w:hAnsi="Calibri" w:eastAsia="Calibri" w:cs="Calibri"/>
           <w:color w:val="0B2545"/>
-          <w:sz w:val="22"/>
+          <w:sz w:val="21"/>
         </w:rPr>
         <w:t xml:space="preserve"> The ChatGPT desktop app is open.</w:t>
       </w:r>
@@ -2382,13 +2427,13 @@
           <w:ilvl w:val="0"/>
           <w:numId w:val="59"/>
         </w:numPr>
-        <w:spacing w:before="0" w:after="80" w:line="300" w:lineRule="auto"/>
+        <w:spacing w:before="0" w:after="80" w:line="288" w:lineRule="auto"/>
       </w:pPr>
       <w:r>
         <w:rPr>
           <w:rFonts w:ascii="Calibri" w:hAnsi="Calibri" w:eastAsia="Calibri" w:cs="Calibri"/>
           <w:color w:val="1F2937"/>
-          <w:sz w:val="22"/>
+          <w:sz w:val="21"/>
         </w:rPr>
         <w:t xml:space="preserve">If ChatGPT is missing, open a web browser and use the official download link: </w:t>
       </w:r>
@@ -2396,7 +2441,7 @@
         <w:rPr>
           <w:rFonts w:ascii="Menlo" w:hAnsi="Menlo" w:eastAsia="Menlo" w:cs="Menlo"/>
           <w:color w:val="1F4D78"/>
-          <w:sz w:val="20"/>
+          <w:sz w:val="19"/>
         </w:rPr>
         <w:t>https://learn.chatgpt.com/docs/quickstart</w:t>
       </w:r>
@@ -2404,14 +2449,14 @@
         <w:rPr>
           <w:rFonts w:ascii="Calibri" w:hAnsi="Calibri" w:eastAsia="Calibri" w:cs="Calibri"/>
           <w:color w:val="1F2937"/>
-          <w:sz w:val="22"/>
+          <w:sz w:val="21"/>
         </w:rPr>
         <w:t>.</w:t>
       </w:r>
     </w:p>
     <w:p>
       <w:pPr>
-        <w:spacing w:before="60" w:after="180" w:line="300" w:lineRule="auto"/>
+        <w:spacing w:before="60" w:after="180" w:line="288" w:lineRule="auto"/>
         <w:ind w:left="173"/>
         <w:shd w:fill="FFF8E8"/>
       </w:pPr>
@@ -2420,7 +2465,7 @@
           <w:rFonts w:ascii="Calibri" w:hAnsi="Calibri" w:eastAsia="Calibri" w:cs="Calibri"/>
           <w:b/>
           <w:color w:val="0B2545"/>
-          <w:sz w:val="22"/>
+          <w:sz w:val="21"/>
         </w:rPr>
         <w:t>DONE WHEN:</w:t>
       </w:r>
@@ -2428,7 +2473,7 @@
         <w:rPr>
           <w:rFonts w:ascii="Calibri" w:hAnsi="Calibri" w:eastAsia="Calibri" w:cs="Calibri"/>
           <w:color w:val="0B2545"/>
-          <w:sz w:val="22"/>
+          <w:sz w:val="21"/>
         </w:rPr>
         <w:t xml:space="preserve"> The official ChatGPT desktop app is installed and open.</w:t>
       </w:r>
@@ -2453,13 +2498,13 @@
           <w:ilvl w:val="0"/>
           <w:numId w:val="61"/>
         </w:numPr>
-        <w:spacing w:before="0" w:after="80" w:line="300" w:lineRule="auto"/>
+        <w:spacing w:before="0" w:after="80" w:line="288" w:lineRule="auto"/>
       </w:pPr>
       <w:r>
         <w:rPr>
           <w:rFonts w:ascii="Calibri" w:hAnsi="Calibri" w:eastAsia="Calibri" w:cs="Calibri"/>
           <w:color w:val="1F2937"/>
-          <w:sz w:val="22"/>
+          <w:sz w:val="21"/>
         </w:rPr>
         <w:t xml:space="preserve">Click </w:t>
       </w:r>
@@ -2468,7 +2513,7 @@
           <w:rFonts w:ascii="Calibri" w:hAnsi="Calibri" w:eastAsia="Calibri" w:cs="Calibri"/>
           <w:b/>
           <w:color w:val="1F2937"/>
-          <w:sz w:val="22"/>
+          <w:sz w:val="21"/>
         </w:rPr>
         <w:t>Start</w:t>
       </w:r>
@@ -2476,7 +2521,7 @@
         <w:rPr>
           <w:rFonts w:ascii="Calibri" w:hAnsi="Calibri" w:eastAsia="Calibri" w:cs="Calibri"/>
           <w:color w:val="1F2937"/>
-          <w:sz w:val="22"/>
+          <w:sz w:val="21"/>
         </w:rPr>
         <w:t xml:space="preserve">. Type </w:t>
       </w:r>
@@ -2484,7 +2529,7 @@
         <w:rPr>
           <w:rFonts w:ascii="Menlo" w:hAnsi="Menlo" w:eastAsia="Menlo" w:cs="Menlo"/>
           <w:color w:val="1F4D78"/>
-          <w:sz w:val="20"/>
+          <w:sz w:val="19"/>
         </w:rPr>
         <w:t>ChatGPT</w:t>
       </w:r>
@@ -2492,14 +2537,14 @@
         <w:rPr>
           <w:rFonts w:ascii="Calibri" w:hAnsi="Calibri" w:eastAsia="Calibri" w:cs="Calibri"/>
           <w:color w:val="1F2937"/>
-          <w:sz w:val="22"/>
+          <w:sz w:val="21"/>
         </w:rPr>
         <w:t xml:space="preserve"> into the search box.</w:t>
       </w:r>
     </w:p>
     <w:p>
       <w:pPr>
-        <w:spacing w:before="60" w:after="180" w:line="300" w:lineRule="auto"/>
+        <w:spacing w:before="60" w:after="180" w:line="288" w:lineRule="auto"/>
         <w:ind w:left="173"/>
         <w:shd w:fill="FFF8E8"/>
       </w:pPr>
@@ -2508,7 +2553,7 @@
           <w:rFonts w:ascii="Calibri" w:hAnsi="Calibri" w:eastAsia="Calibri" w:cs="Calibri"/>
           <w:b/>
           <w:color w:val="0B2545"/>
-          <w:sz w:val="22"/>
+          <w:sz w:val="21"/>
         </w:rPr>
         <w:t>DONE WHEN:</w:t>
       </w:r>
@@ -2516,7 +2561,7 @@
         <w:rPr>
           <w:rFonts w:ascii="Calibri" w:hAnsi="Calibri" w:eastAsia="Calibri" w:cs="Calibri"/>
           <w:color w:val="0B2545"/>
-          <w:sz w:val="22"/>
+          <w:sz w:val="21"/>
         </w:rPr>
         <w:t xml:space="preserve"> You can see ChatGPT, or Windows says there is no matching app.</w:t>
       </w:r>
@@ -2528,20 +2573,20 @@
           <w:ilvl w:val="0"/>
           <w:numId w:val="63"/>
         </w:numPr>
-        <w:spacing w:before="0" w:after="80" w:line="300" w:lineRule="auto"/>
+        <w:spacing w:before="0" w:after="80" w:line="288" w:lineRule="auto"/>
       </w:pPr>
       <w:r>
         <w:rPr>
           <w:rFonts w:ascii="Calibri" w:hAnsi="Calibri" w:eastAsia="Calibri" w:cs="Calibri"/>
           <w:color w:val="1F2937"/>
-          <w:sz w:val="22"/>
+          <w:sz w:val="21"/>
         </w:rPr>
         <w:t>If ChatGPT is present, click it. Do not install it again.</w:t>
       </w:r>
     </w:p>
     <w:p>
       <w:pPr>
-        <w:spacing w:before="60" w:after="180" w:line="300" w:lineRule="auto"/>
+        <w:spacing w:before="60" w:after="180" w:line="288" w:lineRule="auto"/>
         <w:ind w:left="173"/>
         <w:shd w:fill="FFF8E8"/>
       </w:pPr>
@@ -2550,7 +2595,7 @@
           <w:rFonts w:ascii="Calibri" w:hAnsi="Calibri" w:eastAsia="Calibri" w:cs="Calibri"/>
           <w:b/>
           <w:color w:val="0B2545"/>
-          <w:sz w:val="22"/>
+          <w:sz w:val="21"/>
         </w:rPr>
         <w:t>DONE WHEN:</w:t>
       </w:r>
@@ -2558,7 +2603,7 @@
         <w:rPr>
           <w:rFonts w:ascii="Calibri" w:hAnsi="Calibri" w:eastAsia="Calibri" w:cs="Calibri"/>
           <w:color w:val="0B2545"/>
-          <w:sz w:val="22"/>
+          <w:sz w:val="21"/>
         </w:rPr>
         <w:t xml:space="preserve"> The ChatGPT desktop app is open.</w:t>
       </w:r>
@@ -2570,13 +2615,13 @@
           <w:ilvl w:val="0"/>
           <w:numId w:val="65"/>
         </w:numPr>
-        <w:spacing w:before="0" w:after="80" w:line="300" w:lineRule="auto"/>
+        <w:spacing w:before="0" w:after="80" w:line="288" w:lineRule="auto"/>
       </w:pPr>
       <w:r>
         <w:rPr>
           <w:rFonts w:ascii="Calibri" w:hAnsi="Calibri" w:eastAsia="Calibri" w:cs="Calibri"/>
           <w:color w:val="1F2937"/>
-          <w:sz w:val="22"/>
+          <w:sz w:val="21"/>
         </w:rPr>
         <w:t xml:space="preserve">If ChatGPT is missing, open a web browser and use the official download link: </w:t>
       </w:r>
@@ -2584,7 +2629,7 @@
         <w:rPr>
           <w:rFonts w:ascii="Menlo" w:hAnsi="Menlo" w:eastAsia="Menlo" w:cs="Menlo"/>
           <w:color w:val="1F4D78"/>
-          <w:sz w:val="20"/>
+          <w:sz w:val="19"/>
         </w:rPr>
         <w:t>https://learn.chatgpt.com/docs/quickstart</w:t>
       </w:r>
@@ -2592,14 +2637,14 @@
         <w:rPr>
           <w:rFonts w:ascii="Calibri" w:hAnsi="Calibri" w:eastAsia="Calibri" w:cs="Calibri"/>
           <w:color w:val="1F2937"/>
-          <w:sz w:val="22"/>
+          <w:sz w:val="21"/>
         </w:rPr>
         <w:t>.</w:t>
       </w:r>
     </w:p>
     <w:p>
       <w:pPr>
-        <w:spacing w:before="60" w:after="180" w:line="300" w:lineRule="auto"/>
+        <w:spacing w:before="60" w:after="180" w:line="288" w:lineRule="auto"/>
         <w:ind w:left="173"/>
         <w:shd w:fill="FFF8E8"/>
       </w:pPr>
@@ -2608,7 +2653,7 @@
           <w:rFonts w:ascii="Calibri" w:hAnsi="Calibri" w:eastAsia="Calibri" w:cs="Calibri"/>
           <w:b/>
           <w:color w:val="0B2545"/>
-          <w:sz w:val="22"/>
+          <w:sz w:val="21"/>
         </w:rPr>
         <w:t>DONE WHEN:</w:t>
       </w:r>
@@ -2616,27 +2661,27 @@
         <w:rPr>
           <w:rFonts w:ascii="Calibri" w:hAnsi="Calibri" w:eastAsia="Calibri" w:cs="Calibri"/>
           <w:color w:val="0B2545"/>
-          <w:sz w:val="22"/>
+          <w:sz w:val="21"/>
         </w:rPr>
         <w:t xml:space="preserve"> The official ChatGPT desktop app is installed and open.</w:t>
       </w:r>
     </w:p>
     <w:p>
       <w:pPr>
-        <w:spacing w:before="0" w:after="120" w:line="300" w:lineRule="auto"/>
+        <w:spacing w:before="0" w:after="120" w:line="288" w:lineRule="auto"/>
       </w:pPr>
       <w:r>
         <w:rPr>
           <w:rFonts w:ascii="Calibri" w:hAnsi="Calibri" w:eastAsia="Calibri" w:cs="Calibri"/>
           <w:color w:val="1F2937"/>
-          <w:sz w:val="22"/>
+          <w:sz w:val="21"/>
         </w:rPr>
         <w:t>Sign in with the approved company account. The login screen is handled by the service. Never paste a password or one-time code into a chat.</w:t>
       </w:r>
     </w:p>
     <w:p>
       <w:pPr>
-        <w:spacing w:before="60" w:after="180" w:line="300" w:lineRule="auto"/>
+        <w:spacing w:before="60" w:after="180" w:line="288" w:lineRule="auto"/>
         <w:ind w:left="173"/>
         <w:shd w:fill="FFF8E8"/>
       </w:pPr>
@@ -2645,7 +2690,7 @@
           <w:rFonts w:ascii="Calibri" w:hAnsi="Calibri" w:eastAsia="Calibri" w:cs="Calibri"/>
           <w:b/>
           <w:color w:val="0B2545"/>
-          <w:sz w:val="22"/>
+          <w:sz w:val="21"/>
         </w:rPr>
         <w:t>DONE WHEN:</w:t>
       </w:r>
@@ -2653,7 +2698,7 @@
         <w:rPr>
           <w:rFonts w:ascii="Calibri" w:hAnsi="Calibri" w:eastAsia="Calibri" w:cs="Calibri"/>
           <w:color w:val="0B2545"/>
-          <w:sz w:val="22"/>
+          <w:sz w:val="21"/>
         </w:rPr>
         <w:t xml:space="preserve"> You are inside the ChatGPT desktop app with the approved company account.</w:t>
       </w:r>
@@ -2691,13 +2736,13 @@
           <w:ilvl w:val="0"/>
           <w:numId w:val="67"/>
         </w:numPr>
-        <w:spacing w:before="0" w:after="80" w:line="300" w:lineRule="auto"/>
+        <w:spacing w:before="0" w:after="80" w:line="288" w:lineRule="auto"/>
       </w:pPr>
       <w:r>
         <w:rPr>
           <w:rFonts w:ascii="Calibri" w:hAnsi="Calibri" w:eastAsia="Calibri" w:cs="Calibri"/>
           <w:color w:val="1F2937"/>
-          <w:sz w:val="22"/>
+          <w:sz w:val="21"/>
         </w:rPr>
         <w:t xml:space="preserve">In the ChatGPT desktop app, choose </w:t>
       </w:r>
@@ -2706,7 +2751,7 @@
           <w:rFonts w:ascii="Calibri" w:hAnsi="Calibri" w:eastAsia="Calibri" w:cs="Calibri"/>
           <w:b/>
           <w:color w:val="1F2937"/>
-          <w:sz w:val="22"/>
+          <w:sz w:val="21"/>
         </w:rPr>
         <w:t>Codex</w:t>
       </w:r>
@@ -2714,14 +2759,14 @@
         <w:rPr>
           <w:rFonts w:ascii="Calibri" w:hAnsi="Calibri" w:eastAsia="Calibri" w:cs="Calibri"/>
           <w:color w:val="1F2937"/>
-          <w:sz w:val="22"/>
+          <w:sz w:val="21"/>
         </w:rPr>
         <w:t>.</w:t>
       </w:r>
     </w:p>
     <w:p>
       <w:pPr>
-        <w:spacing w:before="60" w:after="180" w:line="300" w:lineRule="auto"/>
+        <w:spacing w:before="60" w:after="180" w:line="288" w:lineRule="auto"/>
         <w:ind w:left="173"/>
         <w:shd w:fill="FFF8E8"/>
       </w:pPr>
@@ -2730,7 +2775,7 @@
           <w:rFonts w:ascii="Calibri" w:hAnsi="Calibri" w:eastAsia="Calibri" w:cs="Calibri"/>
           <w:b/>
           <w:color w:val="0B2545"/>
-          <w:sz w:val="22"/>
+          <w:sz w:val="21"/>
         </w:rPr>
         <w:t>DONE WHEN:</w:t>
       </w:r>
@@ -2738,7 +2783,7 @@
         <w:rPr>
           <w:rFonts w:ascii="Calibri" w:hAnsi="Calibri" w:eastAsia="Calibri" w:cs="Calibri"/>
           <w:color w:val="0B2545"/>
-          <w:sz w:val="22"/>
+          <w:sz w:val="21"/>
         </w:rPr>
         <w:t xml:space="preserve"> Codex is selected.</w:t>
       </w:r>
@@ -2750,13 +2795,13 @@
           <w:ilvl w:val="0"/>
           <w:numId w:val="69"/>
         </w:numPr>
-        <w:spacing w:before="0" w:after="80" w:line="300" w:lineRule="auto"/>
+        <w:spacing w:before="0" w:after="80" w:line="288" w:lineRule="auto"/>
       </w:pPr>
       <w:r>
         <w:rPr>
           <w:rFonts w:ascii="Calibri" w:hAnsi="Calibri" w:eastAsia="Calibri" w:cs="Calibri"/>
           <w:color w:val="1F2937"/>
-          <w:sz w:val="22"/>
+          <w:sz w:val="21"/>
         </w:rPr>
         <w:t xml:space="preserve">Choose </w:t>
       </w:r>
@@ -2765,7 +2810,7 @@
           <w:rFonts w:ascii="Calibri" w:hAnsi="Calibri" w:eastAsia="Calibri" w:cs="Calibri"/>
           <w:b/>
           <w:color w:val="1F2937"/>
-          <w:sz w:val="22"/>
+          <w:sz w:val="21"/>
         </w:rPr>
         <w:t>Open folder</w:t>
       </w:r>
@@ -2773,7 +2818,7 @@
         <w:rPr>
           <w:rFonts w:ascii="Calibri" w:hAnsi="Calibri" w:eastAsia="Calibri" w:cs="Calibri"/>
           <w:color w:val="1F2937"/>
-          <w:sz w:val="22"/>
+          <w:sz w:val="21"/>
         </w:rPr>
         <w:t xml:space="preserve">, </w:t>
       </w:r>
@@ -2782,7 +2827,7 @@
           <w:rFonts w:ascii="Calibri" w:hAnsi="Calibri" w:eastAsia="Calibri" w:cs="Calibri"/>
           <w:b/>
           <w:color w:val="1F2937"/>
-          <w:sz w:val="22"/>
+          <w:sz w:val="21"/>
         </w:rPr>
         <w:t>Add project</w:t>
       </w:r>
@@ -2790,14 +2835,14 @@
         <w:rPr>
           <w:rFonts w:ascii="Calibri" w:hAnsi="Calibri" w:eastAsia="Calibri" w:cs="Calibri"/>
           <w:color w:val="1F2937"/>
-          <w:sz w:val="22"/>
+          <w:sz w:val="21"/>
         </w:rPr>
         <w:t>, or the visible button that lets you select a folder on this computer.</w:t>
       </w:r>
     </w:p>
     <w:p>
       <w:pPr>
-        <w:spacing w:before="60" w:after="180" w:line="300" w:lineRule="auto"/>
+        <w:spacing w:before="60" w:after="180" w:line="288" w:lineRule="auto"/>
         <w:ind w:left="173"/>
         <w:shd w:fill="FFF8E8"/>
       </w:pPr>
@@ -2806,7 +2851,7 @@
           <w:rFonts w:ascii="Calibri" w:hAnsi="Calibri" w:eastAsia="Calibri" w:cs="Calibri"/>
           <w:b/>
           <w:color w:val="0B2545"/>
-          <w:sz w:val="22"/>
+          <w:sz w:val="21"/>
         </w:rPr>
         <w:t>DONE WHEN:</w:t>
       </w:r>
@@ -2814,7 +2859,7 @@
         <w:rPr>
           <w:rFonts w:ascii="Calibri" w:hAnsi="Calibri" w:eastAsia="Calibri" w:cs="Calibri"/>
           <w:color w:val="0B2545"/>
-          <w:sz w:val="22"/>
+          <w:sz w:val="21"/>
         </w:rPr>
         <w:t xml:space="preserve"> A Finder or File Explorer folder picker opens.</w:t>
       </w:r>
@@ -2826,13 +2871,13 @@
           <w:ilvl w:val="0"/>
           <w:numId w:val="71"/>
         </w:numPr>
-        <w:spacing w:before="0" w:after="80" w:line="300" w:lineRule="auto"/>
+        <w:spacing w:before="0" w:after="80" w:line="288" w:lineRule="auto"/>
       </w:pPr>
       <w:r>
         <w:rPr>
           <w:rFonts w:ascii="Calibri" w:hAnsi="Calibri" w:eastAsia="Calibri" w:cs="Calibri"/>
           <w:color w:val="1F2937"/>
-          <w:sz w:val="22"/>
+          <w:sz w:val="21"/>
         </w:rPr>
         <w:t xml:space="preserve">Choose Documents &gt; AI Humans &gt; </w:t>
       </w:r>
@@ -2840,7 +2885,7 @@
         <w:rPr>
           <w:rFonts w:ascii="Menlo" w:hAnsi="Menlo" w:eastAsia="Menlo" w:cs="Menlo"/>
           <w:color w:val="1F4D78"/>
-          <w:sz w:val="20"/>
+          <w:sz w:val="19"/>
         </w:rPr>
         <w:t>01-Email-Triage-AI-Human</w:t>
       </w:r>
@@ -2848,14 +2893,14 @@
         <w:rPr>
           <w:rFonts w:ascii="Calibri" w:hAnsi="Calibri" w:eastAsia="Calibri" w:cs="Calibri"/>
           <w:color w:val="1F2937"/>
-          <w:sz w:val="22"/>
+          <w:sz w:val="21"/>
         </w:rPr>
         <w:t>.</w:t>
       </w:r>
     </w:p>
     <w:p>
       <w:pPr>
-        <w:spacing w:before="60" w:after="180" w:line="300" w:lineRule="auto"/>
+        <w:spacing w:before="60" w:after="180" w:line="288" w:lineRule="auto"/>
         <w:ind w:left="173"/>
         <w:shd w:fill="FFF8E8"/>
       </w:pPr>
@@ -2864,7 +2909,7 @@
           <w:rFonts w:ascii="Calibri" w:hAnsi="Calibri" w:eastAsia="Calibri" w:cs="Calibri"/>
           <w:b/>
           <w:color w:val="0B2545"/>
-          <w:sz w:val="22"/>
+          <w:sz w:val="21"/>
         </w:rPr>
         <w:t>DONE WHEN:</w:t>
       </w:r>
@@ -2872,7 +2917,7 @@
         <w:rPr>
           <w:rFonts w:ascii="Calibri" w:hAnsi="Calibri" w:eastAsia="Calibri" w:cs="Calibri"/>
           <w:color w:val="0B2545"/>
-          <w:sz w:val="22"/>
+          <w:sz w:val="21"/>
         </w:rPr>
         <w:t xml:space="preserve"> The Email project appears in the app and </w:t>
       </w:r>
@@ -2880,7 +2925,7 @@
         <w:rPr>
           <w:rFonts w:ascii="Menlo" w:hAnsi="Menlo" w:eastAsia="Menlo" w:cs="Menlo"/>
           <w:color w:val="1F4D78"/>
-          <w:sz w:val="20"/>
+          <w:sz w:val="19"/>
         </w:rPr>
         <w:t>AGENTS.md</w:t>
       </w:r>
@@ -2888,7 +2933,7 @@
         <w:rPr>
           <w:rFonts w:ascii="Calibri" w:hAnsi="Calibri" w:eastAsia="Calibri" w:cs="Calibri"/>
           <w:color w:val="0B2545"/>
-          <w:sz w:val="22"/>
+          <w:sz w:val="21"/>
         </w:rPr>
         <w:t xml:space="preserve"> is visible to Codex without uploading it.</w:t>
       </w:r>
@@ -2900,13 +2945,13 @@
           <w:ilvl w:val="0"/>
           <w:numId w:val="73"/>
         </w:numPr>
-        <w:spacing w:before="0" w:after="80" w:line="300" w:lineRule="auto"/>
+        <w:spacing w:before="0" w:after="80" w:line="288" w:lineRule="auto"/>
       </w:pPr>
       <w:r>
         <w:rPr>
           <w:rFonts w:ascii="Calibri" w:hAnsi="Calibri" w:eastAsia="Calibri" w:cs="Calibri"/>
           <w:color w:val="1F2937"/>
-          <w:sz w:val="22"/>
+          <w:sz w:val="21"/>
         </w:rPr>
         <w:t xml:space="preserve">Keep permissions on </w:t>
       </w:r>
@@ -2915,7 +2960,7 @@
           <w:rFonts w:ascii="Calibri" w:hAnsi="Calibri" w:eastAsia="Calibri" w:cs="Calibri"/>
           <w:b/>
           <w:color w:val="1F2937"/>
-          <w:sz w:val="22"/>
+          <w:sz w:val="21"/>
         </w:rPr>
         <w:t>Ask for approval</w:t>
       </w:r>
@@ -2923,7 +2968,7 @@
         <w:rPr>
           <w:rFonts w:ascii="Calibri" w:hAnsi="Calibri" w:eastAsia="Calibri" w:cs="Calibri"/>
           <w:color w:val="1F2937"/>
-          <w:sz w:val="22"/>
+          <w:sz w:val="21"/>
         </w:rPr>
         <w:t xml:space="preserve">. Never choose </w:t>
       </w:r>
@@ -2932,7 +2977,7 @@
           <w:rFonts w:ascii="Calibri" w:hAnsi="Calibri" w:eastAsia="Calibri" w:cs="Calibri"/>
           <w:b/>
           <w:color w:val="1F2937"/>
-          <w:sz w:val="22"/>
+          <w:sz w:val="21"/>
         </w:rPr>
         <w:t>Full access</w:t>
       </w:r>
@@ -2940,14 +2985,14 @@
         <w:rPr>
           <w:rFonts w:ascii="Calibri" w:hAnsi="Calibri" w:eastAsia="Calibri" w:cs="Calibri"/>
           <w:color w:val="1F2937"/>
-          <w:sz w:val="22"/>
+          <w:sz w:val="21"/>
         </w:rPr>
         <w:t>.</w:t>
       </w:r>
     </w:p>
     <w:p>
       <w:pPr>
-        <w:spacing w:before="60" w:after="180" w:line="300" w:lineRule="auto"/>
+        <w:spacing w:before="60" w:after="180" w:line="288" w:lineRule="auto"/>
         <w:ind w:left="173"/>
         <w:shd w:fill="FFF8E8"/>
       </w:pPr>
@@ -2956,7 +3001,7 @@
           <w:rFonts w:ascii="Calibri" w:hAnsi="Calibri" w:eastAsia="Calibri" w:cs="Calibri"/>
           <w:b/>
           <w:color w:val="0B2545"/>
-          <w:sz w:val="22"/>
+          <w:sz w:val="21"/>
         </w:rPr>
         <w:t>DONE WHEN:</w:t>
       </w:r>
@@ -2964,20 +3009,20 @@
         <w:rPr>
           <w:rFonts w:ascii="Calibri" w:hAnsi="Calibri" w:eastAsia="Calibri" w:cs="Calibri"/>
           <w:color w:val="0B2545"/>
-          <w:sz w:val="22"/>
+          <w:sz w:val="21"/>
         </w:rPr>
         <w:t xml:space="preserve"> The Email project is open and approval is still required for actions.</w:t>
       </w:r>
     </w:p>
     <w:p>
       <w:pPr>
-        <w:spacing w:before="0" w:after="120" w:line="300" w:lineRule="auto"/>
+        <w:spacing w:before="0" w:after="120" w:line="288" w:lineRule="auto"/>
       </w:pPr>
       <w:r>
         <w:rPr>
           <w:rFonts w:ascii="Calibri" w:hAnsi="Calibri" w:eastAsia="Calibri" w:cs="Calibri"/>
           <w:color w:val="1F2937"/>
-          <w:sz w:val="22"/>
+          <w:sz w:val="21"/>
         </w:rPr>
         <w:t>If the button wording is different, use the Setup Helper rescue. Do not guess.</w:t>
       </w:r>
@@ -3002,13 +3047,13 @@
           <w:ilvl w:val="0"/>
           <w:numId w:val="75"/>
         </w:numPr>
-        <w:spacing w:before="0" w:after="80" w:line="300" w:lineRule="auto"/>
+        <w:spacing w:before="0" w:after="80" w:line="288" w:lineRule="auto"/>
       </w:pPr>
       <w:r>
         <w:rPr>
           <w:rFonts w:ascii="Calibri" w:hAnsi="Calibri" w:eastAsia="Calibri" w:cs="Calibri"/>
           <w:color w:val="1F2937"/>
-          <w:sz w:val="22"/>
+          <w:sz w:val="21"/>
         </w:rPr>
         <w:t xml:space="preserve">Open the </w:t>
       </w:r>
@@ -3017,7 +3062,7 @@
           <w:rFonts w:ascii="Calibri" w:hAnsi="Calibri" w:eastAsia="Calibri" w:cs="Calibri"/>
           <w:b/>
           <w:color w:val="1F2937"/>
-          <w:sz w:val="22"/>
+          <w:sz w:val="21"/>
         </w:rPr>
         <w:t>Plugins</w:t>
       </w:r>
@@ -3025,14 +3070,14 @@
         <w:rPr>
           <w:rFonts w:ascii="Calibri" w:hAnsi="Calibri" w:eastAsia="Calibri" w:cs="Calibri"/>
           <w:color w:val="1F2937"/>
-          <w:sz w:val="22"/>
+          <w:sz w:val="21"/>
         </w:rPr>
         <w:t xml:space="preserve"> tab in the ChatGPT desktop app.</w:t>
       </w:r>
     </w:p>
     <w:p>
       <w:pPr>
-        <w:spacing w:before="60" w:after="180" w:line="300" w:lineRule="auto"/>
+        <w:spacing w:before="60" w:after="180" w:line="288" w:lineRule="auto"/>
         <w:ind w:left="173"/>
         <w:shd w:fill="FFF8E8"/>
       </w:pPr>
@@ -3041,7 +3086,7 @@
           <w:rFonts w:ascii="Calibri" w:hAnsi="Calibri" w:eastAsia="Calibri" w:cs="Calibri"/>
           <w:b/>
           <w:color w:val="0B2545"/>
-          <w:sz w:val="22"/>
+          <w:sz w:val="21"/>
         </w:rPr>
         <w:t>DONE WHEN:</w:t>
       </w:r>
@@ -3049,7 +3094,7 @@
         <w:rPr>
           <w:rFonts w:ascii="Calibri" w:hAnsi="Calibri" w:eastAsia="Calibri" w:cs="Calibri"/>
           <w:color w:val="0B2545"/>
-          <w:sz w:val="22"/>
+          <w:sz w:val="21"/>
         </w:rPr>
         <w:t xml:space="preserve"> The plugin directory is visible.</w:t>
       </w:r>
@@ -3061,13 +3106,13 @@
           <w:ilvl w:val="0"/>
           <w:numId w:val="77"/>
         </w:numPr>
-        <w:spacing w:before="0" w:after="80" w:line="300" w:lineRule="auto"/>
+        <w:spacing w:before="0" w:after="80" w:line="288" w:lineRule="auto"/>
       </w:pPr>
       <w:r>
         <w:rPr>
           <w:rFonts w:ascii="Calibri" w:hAnsi="Calibri" w:eastAsia="Calibri" w:cs="Calibri"/>
           <w:color w:val="1F2937"/>
-          <w:sz w:val="22"/>
+          <w:sz w:val="21"/>
         </w:rPr>
         <w:t xml:space="preserve">Search for </w:t>
       </w:r>
@@ -3075,7 +3120,7 @@
         <w:rPr>
           <w:rFonts w:ascii="Menlo" w:hAnsi="Menlo" w:eastAsia="Menlo" w:cs="Menlo"/>
           <w:color w:val="1F4D78"/>
-          <w:sz w:val="20"/>
+          <w:sz w:val="19"/>
         </w:rPr>
         <w:t>Gmail</w:t>
       </w:r>
@@ -3083,14 +3128,14 @@
         <w:rPr>
           <w:rFonts w:ascii="Calibri" w:hAnsi="Calibri" w:eastAsia="Calibri" w:cs="Calibri"/>
           <w:color w:val="1F2937"/>
-          <w:sz w:val="22"/>
+          <w:sz w:val="21"/>
         </w:rPr>
         <w:t>.</w:t>
       </w:r>
     </w:p>
     <w:p>
       <w:pPr>
-        <w:spacing w:before="60" w:after="180" w:line="300" w:lineRule="auto"/>
+        <w:spacing w:before="60" w:after="180" w:line="288" w:lineRule="auto"/>
         <w:ind w:left="173"/>
         <w:shd w:fill="FFF8E8"/>
       </w:pPr>
@@ -3099,7 +3144,7 @@
           <w:rFonts w:ascii="Calibri" w:hAnsi="Calibri" w:eastAsia="Calibri" w:cs="Calibri"/>
           <w:b/>
           <w:color w:val="0B2545"/>
-          <w:sz w:val="22"/>
+          <w:sz w:val="21"/>
         </w:rPr>
         <w:t>DONE WHEN:</w:t>
       </w:r>
@@ -3107,7 +3152,7 @@
         <w:rPr>
           <w:rFonts w:ascii="Calibri" w:hAnsi="Calibri" w:eastAsia="Calibri" w:cs="Calibri"/>
           <w:color w:val="0B2545"/>
-          <w:sz w:val="22"/>
+          <w:sz w:val="21"/>
         </w:rPr>
         <w:t xml:space="preserve"> The Gmail plugin is visible as installed or available to install.</w:t>
       </w:r>
@@ -3119,20 +3164,20 @@
           <w:ilvl w:val="0"/>
           <w:numId w:val="79"/>
         </w:numPr>
-        <w:spacing w:before="0" w:after="80" w:line="300" w:lineRule="auto"/>
+        <w:spacing w:before="0" w:after="80" w:line="288" w:lineRule="auto"/>
       </w:pPr>
       <w:r>
         <w:rPr>
           <w:rFonts w:ascii="Calibri" w:hAnsi="Calibri" w:eastAsia="Calibri" w:cs="Calibri"/>
           <w:color w:val="1F2937"/>
-          <w:sz w:val="22"/>
+          <w:sz w:val="21"/>
         </w:rPr>
         <w:t>If it is already installed, do not install it again. Return to the Email project.</w:t>
       </w:r>
     </w:p>
     <w:p>
       <w:pPr>
-        <w:spacing w:before="60" w:after="180" w:line="300" w:lineRule="auto"/>
+        <w:spacing w:before="60" w:after="180" w:line="288" w:lineRule="auto"/>
         <w:ind w:left="173"/>
         <w:shd w:fill="FFF8E8"/>
       </w:pPr>
@@ -3141,7 +3186,7 @@
           <w:rFonts w:ascii="Calibri" w:hAnsi="Calibri" w:eastAsia="Calibri" w:cs="Calibri"/>
           <w:b/>
           <w:color w:val="0B2545"/>
-          <w:sz w:val="22"/>
+          <w:sz w:val="21"/>
         </w:rPr>
         <w:t>DONE WHEN:</w:t>
       </w:r>
@@ -3149,7 +3194,7 @@
         <w:rPr>
           <w:rFonts w:ascii="Calibri" w:hAnsi="Calibri" w:eastAsia="Calibri" w:cs="Calibri"/>
           <w:color w:val="0B2545"/>
-          <w:sz w:val="22"/>
+          <w:sz w:val="21"/>
         </w:rPr>
         <w:t xml:space="preserve"> You are back in the Email project.</w:t>
       </w:r>
@@ -3161,20 +3206,20 @@
           <w:ilvl w:val="0"/>
           <w:numId w:val="81"/>
         </w:numPr>
-        <w:spacing w:before="0" w:after="80" w:line="300" w:lineRule="auto"/>
+        <w:spacing w:before="0" w:after="80" w:line="288" w:lineRule="auto"/>
       </w:pPr>
       <w:r>
         <w:rPr>
           <w:rFonts w:ascii="Calibri" w:hAnsi="Calibri" w:eastAsia="Calibri" w:cs="Calibri"/>
           <w:color w:val="1F2937"/>
-          <w:sz w:val="22"/>
+          <w:sz w:val="21"/>
         </w:rPr>
         <w:t>If it is missing, click its plus or install button.</w:t>
       </w:r>
     </w:p>
     <w:p>
       <w:pPr>
-        <w:spacing w:before="60" w:after="180" w:line="300" w:lineRule="auto"/>
+        <w:spacing w:before="60" w:after="180" w:line="288" w:lineRule="auto"/>
         <w:ind w:left="173"/>
         <w:shd w:fill="FFF8E8"/>
       </w:pPr>
@@ -3183,7 +3228,7 @@
           <w:rFonts w:ascii="Calibri" w:hAnsi="Calibri" w:eastAsia="Calibri" w:cs="Calibri"/>
           <w:b/>
           <w:color w:val="0B2545"/>
-          <w:sz w:val="22"/>
+          <w:sz w:val="21"/>
         </w:rPr>
         <w:t>DONE WHEN:</w:t>
       </w:r>
@@ -3191,7 +3236,7 @@
         <w:rPr>
           <w:rFonts w:ascii="Calibri" w:hAnsi="Calibri" w:eastAsia="Calibri" w:cs="Calibri"/>
           <w:color w:val="0B2545"/>
-          <w:sz w:val="22"/>
+          <w:sz w:val="21"/>
         </w:rPr>
         <w:t xml:space="preserve"> Gmail shows as installed.</w:t>
       </w:r>
@@ -3203,20 +3248,20 @@
           <w:ilvl w:val="0"/>
           <w:numId w:val="83"/>
         </w:numPr>
-        <w:spacing w:before="0" w:after="80" w:line="300" w:lineRule="auto"/>
+        <w:spacing w:before="0" w:after="80" w:line="288" w:lineRule="auto"/>
       </w:pPr>
       <w:r>
         <w:rPr>
           <w:rFonts w:ascii="Calibri" w:hAnsi="Calibri" w:eastAsia="Calibri" w:cs="Calibri"/>
           <w:color w:val="1F2937"/>
-          <w:sz w:val="22"/>
+          <w:sz w:val="21"/>
         </w:rPr>
         <w:t>Start a new chat in the Email project. If asked to connect, choose the approved company account and complete the provider login yourself.</w:t>
       </w:r>
     </w:p>
     <w:p>
       <w:pPr>
-        <w:spacing w:before="60" w:after="180" w:line="300" w:lineRule="auto"/>
+        <w:spacing w:before="60" w:after="180" w:line="288" w:lineRule="auto"/>
         <w:ind w:left="173"/>
         <w:shd w:fill="FFF8E8"/>
       </w:pPr>
@@ -3225,7 +3270,7 @@
           <w:rFonts w:ascii="Calibri" w:hAnsi="Calibri" w:eastAsia="Calibri" w:cs="Calibri"/>
           <w:b/>
           <w:color w:val="0B2545"/>
-          <w:sz w:val="22"/>
+          <w:sz w:val="21"/>
         </w:rPr>
         <w:t>DONE WHEN:</w:t>
       </w:r>
@@ -3233,20 +3278,20 @@
         <w:rPr>
           <w:rFonts w:ascii="Calibri" w:hAnsi="Calibri" w:eastAsia="Calibri" w:cs="Calibri"/>
           <w:color w:val="0B2545"/>
-          <w:sz w:val="22"/>
+          <w:sz w:val="21"/>
         </w:rPr>
         <w:t xml:space="preserve"> Codex can verify Gmail is connected to the approved company account.</w:t>
       </w:r>
     </w:p>
     <w:p>
       <w:pPr>
-        <w:spacing w:before="0" w:after="120" w:line="300" w:lineRule="auto"/>
+        <w:spacing w:before="0" w:after="120" w:line="288" w:lineRule="auto"/>
       </w:pPr>
       <w:r>
         <w:rPr>
           <w:rFonts w:ascii="Calibri" w:hAnsi="Calibri" w:eastAsia="Calibri" w:cs="Calibri"/>
           <w:color w:val="1F2937"/>
-          <w:sz w:val="22"/>
+          <w:sz w:val="21"/>
         </w:rPr>
         <w:t>If installation or company access is blocked, use the Setup Helper. It writes the blocker; it does not ask for your secret information or choose a broader account.</w:t>
       </w:r>
@@ -3266,13 +3311,13 @@
     </w:p>
     <w:p>
       <w:pPr>
-        <w:spacing w:before="0" w:after="120" w:line="300" w:lineRule="auto"/>
+        <w:spacing w:before="0" w:after="120" w:line="288" w:lineRule="auto"/>
       </w:pPr>
       <w:r>
         <w:rPr>
           <w:rFonts w:ascii="Calibri" w:hAnsi="Calibri" w:eastAsia="Calibri" w:cs="Calibri"/>
           <w:color w:val="1F2937"/>
-          <w:sz w:val="22"/>
+          <w:sz w:val="21"/>
         </w:rPr>
         <w:t xml:space="preserve">Open </w:t>
       </w:r>
@@ -3280,7 +3325,7 @@
         <w:rPr>
           <w:rFonts w:ascii="Menlo" w:hAnsi="Menlo" w:eastAsia="Menlo" w:cs="Menlo"/>
           <w:color w:val="1F4D78"/>
-          <w:sz w:val="20"/>
+          <w:sz w:val="19"/>
         </w:rPr>
         <w:t>COPY-PASTE-PROMPTS.txt</w:t>
       </w:r>
@@ -3288,7 +3333,7 @@
         <w:rPr>
           <w:rFonts w:ascii="Calibri" w:hAnsi="Calibri" w:eastAsia="Calibri" w:cs="Calibri"/>
           <w:color w:val="1F2937"/>
-          <w:sz w:val="22"/>
+          <w:sz w:val="21"/>
         </w:rPr>
         <w:t xml:space="preserve">. Copy everything under </w:t>
       </w:r>
@@ -3297,7 +3342,7 @@
           <w:rFonts w:ascii="Calibri" w:hAnsi="Calibri" w:eastAsia="Calibri" w:cs="Calibri"/>
           <w:b/>
           <w:color w:val="1F2937"/>
-          <w:sz w:val="22"/>
+          <w:sz w:val="21"/>
         </w:rPr>
         <w:t>PROMPT 1</w:t>
       </w:r>
@@ -3305,7 +3350,7 @@
         <w:rPr>
           <w:rFonts w:ascii="Calibri" w:hAnsi="Calibri" w:eastAsia="Calibri" w:cs="Calibri"/>
           <w:color w:val="1F2937"/>
-          <w:sz w:val="22"/>
+          <w:sz w:val="21"/>
         </w:rPr>
         <w:t xml:space="preserve">. Replace </w:t>
       </w:r>
@@ -3313,7 +3358,7 @@
         <w:rPr>
           <w:rFonts w:ascii="Menlo" w:hAnsi="Menlo" w:eastAsia="Menlo" w:cs="Menlo"/>
           <w:color w:val="1F4D78"/>
-          <w:sz w:val="20"/>
+          <w:sz w:val="19"/>
         </w:rPr>
         <w:t>[TYPE YOUR NAME]</w:t>
       </w:r>
@@ -3321,14 +3366,14 @@
         <w:rPr>
           <w:rFonts w:ascii="Calibri" w:hAnsi="Calibri" w:eastAsia="Calibri" w:cs="Calibri"/>
           <w:color w:val="1F2937"/>
-          <w:sz w:val="22"/>
+          <w:sz w:val="21"/>
         </w:rPr>
         <w:t xml:space="preserve"> with your name. Paste it into the Email project chat and send it.</w:t>
       </w:r>
     </w:p>
     <w:p>
       <w:pPr>
-        <w:spacing w:before="60" w:after="180" w:line="300" w:lineRule="auto"/>
+        <w:spacing w:before="60" w:after="180" w:line="288" w:lineRule="auto"/>
         <w:ind w:left="173"/>
         <w:shd w:fill="FFF8E8"/>
       </w:pPr>
@@ -3337,7 +3382,7 @@
           <w:rFonts w:ascii="Calibri" w:hAnsi="Calibri" w:eastAsia="Calibri" w:cs="Calibri"/>
           <w:b/>
           <w:color w:val="0B2545"/>
-          <w:sz w:val="22"/>
+          <w:sz w:val="21"/>
         </w:rPr>
         <w:t>DONE WHEN:</w:t>
       </w:r>
@@ -3345,7 +3390,7 @@
         <w:rPr>
           <w:rFonts w:ascii="Calibri" w:hAnsi="Calibri" w:eastAsia="Calibri" w:cs="Calibri"/>
           <w:color w:val="0B2545"/>
-          <w:sz w:val="22"/>
+          <w:sz w:val="21"/>
         </w:rPr>
         <w:t xml:space="preserve"> Codex says the live task is </w:t>
       </w:r>
@@ -3353,7 +3398,7 @@
         <w:rPr>
           <w:rFonts w:ascii="Menlo" w:hAnsi="Menlo" w:eastAsia="Menlo" w:cs="Menlo"/>
           <w:color w:val="1F4D78"/>
-          <w:sz w:val="20"/>
+          <w:sz w:val="19"/>
         </w:rPr>
         <w:t>EMAIL-HW-001</w:t>
       </w:r>
@@ -3361,20 +3406,20 @@
         <w:rPr>
           <w:rFonts w:ascii="Calibri" w:hAnsi="Calibri" w:eastAsia="Calibri" w:cs="Calibri"/>
           <w:color w:val="0B2545"/>
-          <w:sz w:val="22"/>
+          <w:sz w:val="21"/>
         </w:rPr>
         <w:t xml:space="preserve"> and starts with no more than 25 inbox messages.</w:t>
       </w:r>
     </w:p>
     <w:p>
       <w:pPr>
-        <w:spacing w:before="0" w:after="120" w:line="300" w:lineRule="auto"/>
+        <w:spacing w:before="0" w:after="120" w:line="288" w:lineRule="auto"/>
       </w:pPr>
       <w:r>
         <w:rPr>
           <w:rFonts w:ascii="Calibri" w:hAnsi="Calibri" w:eastAsia="Calibri" w:cs="Calibri"/>
           <w:color w:val="1F2937"/>
-          <w:sz w:val="22"/>
+          <w:sz w:val="21"/>
         </w:rPr>
         <w:t xml:space="preserve">The full prompt is also printed in the Email starter's </w:t>
       </w:r>
@@ -3382,7 +3427,7 @@
         <w:rPr>
           <w:rFonts w:ascii="Menlo" w:hAnsi="Menlo" w:eastAsia="Menlo" w:cs="Menlo"/>
           <w:color w:val="1F4D78"/>
-          <w:sz w:val="20"/>
+          <w:sz w:val="19"/>
         </w:rPr>
         <w:t>START-HERE.md</w:t>
       </w:r>
@@ -3390,7 +3435,7 @@
         <w:rPr>
           <w:rFonts w:ascii="Calibri" w:hAnsi="Calibri" w:eastAsia="Calibri" w:cs="Calibri"/>
           <w:color w:val="1F2937"/>
-          <w:sz w:val="22"/>
+          <w:sz w:val="21"/>
         </w:rPr>
         <w:t>. Do not shorten it: the last lines are the rules that stop mailbox changes.</w:t>
       </w:r>
@@ -3410,13 +3455,13 @@
     </w:p>
     <w:p>
       <w:pPr>
-        <w:spacing w:before="0" w:after="120" w:line="300" w:lineRule="auto"/>
+        <w:spacing w:before="0" w:after="120" w:line="288" w:lineRule="auto"/>
       </w:pPr>
       <w:r>
         <w:rPr>
           <w:rFonts w:ascii="Calibri" w:hAnsi="Calibri" w:eastAsia="Calibri" w:cs="Calibri"/>
           <w:color w:val="1F2937"/>
-          <w:sz w:val="22"/>
+          <w:sz w:val="21"/>
         </w:rPr>
         <w:t>Stop when all of these are visible:</w:t>
       </w:r>
@@ -3427,13 +3472,13 @@
           <w:ilvl w:val="0"/>
           <w:numId w:val="85"/>
         </w:numPr>
-        <w:spacing w:before="0" w:after="80" w:line="300" w:lineRule="auto"/>
+        <w:spacing w:before="0" w:after="80" w:line="288" w:lineRule="auto"/>
       </w:pPr>
       <w:r>
         <w:rPr>
           <w:rFonts w:ascii="Menlo" w:hAnsi="Menlo" w:eastAsia="Menlo" w:cs="Menlo"/>
           <w:color w:val="1F4D78"/>
-          <w:sz w:val="20"/>
+          <w:sz w:val="19"/>
         </w:rPr>
         <w:t>EMAIL-TRIAGE-REPORT.md</w:t>
       </w:r>
@@ -3441,7 +3486,7 @@
         <w:rPr>
           <w:rFonts w:ascii="Calibri" w:hAnsi="Calibri" w:eastAsia="Calibri" w:cs="Calibri"/>
           <w:color w:val="1F2937"/>
-          <w:sz w:val="22"/>
+          <w:sz w:val="21"/>
         </w:rPr>
         <w:t xml:space="preserve"> exists.</w:t>
       </w:r>
@@ -3452,13 +3497,13 @@
           <w:ilvl w:val="0"/>
           <w:numId w:val="85"/>
         </w:numPr>
-        <w:spacing w:before="0" w:after="80" w:line="300" w:lineRule="auto"/>
+        <w:spacing w:before="0" w:after="80" w:line="288" w:lineRule="auto"/>
       </w:pPr>
       <w:r>
         <w:rPr>
           <w:rFonts w:ascii="Calibri" w:hAnsi="Calibri" w:eastAsia="Calibri" w:cs="Calibri"/>
           <w:color w:val="1F2937"/>
-          <w:sz w:val="22"/>
+          <w:sz w:val="21"/>
         </w:rPr>
         <w:t>It shows the selection rule and no more than 25 reviewed messages.</w:t>
       </w:r>
@@ -3469,13 +3514,13 @@
           <w:ilvl w:val="0"/>
           <w:numId w:val="85"/>
         </w:numPr>
-        <w:spacing w:before="0" w:after="80" w:line="300" w:lineRule="auto"/>
+        <w:spacing w:before="0" w:after="80" w:line="288" w:lineRule="auto"/>
       </w:pPr>
       <w:r>
         <w:rPr>
           <w:rFonts w:ascii="Calibri" w:hAnsi="Calibri" w:eastAsia="Calibri" w:cs="Calibri"/>
           <w:color w:val="1F2937"/>
-          <w:sz w:val="22"/>
+          <w:sz w:val="21"/>
         </w:rPr>
         <w:t>It uses REPLY, DECISION, READ, LOW PRIORITY and HUMAN REVIEW.</w:t>
       </w:r>
@@ -3486,13 +3531,13 @@
           <w:ilvl w:val="0"/>
           <w:numId w:val="85"/>
         </w:numPr>
-        <w:spacing w:before="0" w:after="80" w:line="300" w:lineRule="auto"/>
+        <w:spacing w:before="0" w:after="80" w:line="288" w:lineRule="auto"/>
       </w:pPr>
       <w:r>
         <w:rPr>
           <w:rFonts w:ascii="Calibri" w:hAnsi="Calibri" w:eastAsia="Calibri" w:cs="Calibri"/>
           <w:color w:val="1F2937"/>
-          <w:sz w:val="22"/>
+          <w:sz w:val="21"/>
         </w:rPr>
         <w:t>Sensitive messages are not quoted.</w:t>
       </w:r>
@@ -3503,13 +3548,13 @@
           <w:ilvl w:val="0"/>
           <w:numId w:val="85"/>
         </w:numPr>
-        <w:spacing w:before="0" w:after="80" w:line="300" w:lineRule="auto"/>
+        <w:spacing w:before="0" w:after="80" w:line="288" w:lineRule="auto"/>
       </w:pPr>
       <w:r>
         <w:rPr>
           <w:rFonts w:ascii="Calibri" w:hAnsi="Calibri" w:eastAsia="Calibri" w:cs="Calibri"/>
           <w:color w:val="1F2937"/>
-          <w:sz w:val="22"/>
+          <w:sz w:val="21"/>
         </w:rPr>
         <w:t>It says no email was sent, drafted, archived, labelled, deleted, moved, marked read or unread, and no attachment was opened.</w:t>
       </w:r>
@@ -3520,20 +3565,20 @@
           <w:ilvl w:val="0"/>
           <w:numId w:val="85"/>
         </w:numPr>
-        <w:spacing w:before="0" w:after="80" w:line="300" w:lineRule="auto"/>
+        <w:spacing w:before="0" w:after="80" w:line="288" w:lineRule="auto"/>
       </w:pPr>
       <w:r>
         <w:rPr>
           <w:rFonts w:ascii="Calibri" w:hAnsi="Calibri" w:eastAsia="Calibri" w:cs="Calibri"/>
           <w:color w:val="1F2937"/>
-          <w:sz w:val="22"/>
+          <w:sz w:val="21"/>
         </w:rPr>
         <w:t>The workspace validator passed.</w:t>
       </w:r>
     </w:p>
     <w:p>
       <w:pPr>
-        <w:spacing w:before="60" w:after="180" w:line="300" w:lineRule="auto"/>
+        <w:spacing w:before="60" w:after="180" w:line="288" w:lineRule="auto"/>
         <w:ind w:left="173"/>
         <w:shd w:fill="FFF8E8"/>
       </w:pPr>
@@ -3542,7 +3587,7 @@
           <w:rFonts w:ascii="Calibri" w:hAnsi="Calibri" w:eastAsia="Calibri" w:cs="Calibri"/>
           <w:b/>
           <w:color w:val="0B2545"/>
-          <w:sz w:val="22"/>
+          <w:sz w:val="21"/>
         </w:rPr>
         <w:t>DONE WHEN:</w:t>
       </w:r>
@@ -3550,7 +3595,7 @@
         <w:rPr>
           <w:rFonts w:ascii="Calibri" w:hAnsi="Calibri" w:eastAsia="Calibri" w:cs="Calibri"/>
           <w:color w:val="0B2545"/>
-          <w:sz w:val="22"/>
+          <w:sz w:val="21"/>
         </w:rPr>
         <w:t xml:space="preserve"> You can show the report on your screen. A connected Gmail account alone is not completion.</w:t>
       </w:r>
@@ -3588,13 +3633,13 @@
           <w:ilvl w:val="0"/>
           <w:numId w:val="87"/>
         </w:numPr>
-        <w:spacing w:before="0" w:after="80" w:line="300" w:lineRule="auto"/>
+        <w:spacing w:before="0" w:after="80" w:line="288" w:lineRule="auto"/>
       </w:pPr>
       <w:r>
         <w:rPr>
           <w:rFonts w:ascii="Calibri" w:hAnsi="Calibri" w:eastAsia="Calibri" w:cs="Calibri"/>
           <w:color w:val="1F2937"/>
-          <w:sz w:val="22"/>
+          <w:sz w:val="21"/>
         </w:rPr>
         <w:t xml:space="preserve">In the ChatGPT desktop app, choose </w:t>
       </w:r>
@@ -3603,7 +3648,7 @@
           <w:rFonts w:ascii="Calibri" w:hAnsi="Calibri" w:eastAsia="Calibri" w:cs="Calibri"/>
           <w:b/>
           <w:color w:val="1F2937"/>
-          <w:sz w:val="22"/>
+          <w:sz w:val="21"/>
         </w:rPr>
         <w:t>Codex</w:t>
       </w:r>
@@ -3611,14 +3656,14 @@
         <w:rPr>
           <w:rFonts w:ascii="Calibri" w:hAnsi="Calibri" w:eastAsia="Calibri" w:cs="Calibri"/>
           <w:color w:val="1F2937"/>
-          <w:sz w:val="22"/>
+          <w:sz w:val="21"/>
         </w:rPr>
         <w:t>.</w:t>
       </w:r>
     </w:p>
     <w:p>
       <w:pPr>
-        <w:spacing w:before="60" w:after="180" w:line="300" w:lineRule="auto"/>
+        <w:spacing w:before="60" w:after="180" w:line="288" w:lineRule="auto"/>
         <w:ind w:left="173"/>
         <w:shd w:fill="FFF8E8"/>
       </w:pPr>
@@ -3627,7 +3672,7 @@
           <w:rFonts w:ascii="Calibri" w:hAnsi="Calibri" w:eastAsia="Calibri" w:cs="Calibri"/>
           <w:b/>
           <w:color w:val="0B2545"/>
-          <w:sz w:val="22"/>
+          <w:sz w:val="21"/>
         </w:rPr>
         <w:t>DONE WHEN:</w:t>
       </w:r>
@@ -3635,7 +3680,7 @@
         <w:rPr>
           <w:rFonts w:ascii="Calibri" w:hAnsi="Calibri" w:eastAsia="Calibri" w:cs="Calibri"/>
           <w:color w:val="0B2545"/>
-          <w:sz w:val="22"/>
+          <w:sz w:val="21"/>
         </w:rPr>
         <w:t xml:space="preserve"> Codex is selected.</w:t>
       </w:r>
@@ -3647,13 +3692,13 @@
           <w:ilvl w:val="0"/>
           <w:numId w:val="89"/>
         </w:numPr>
-        <w:spacing w:before="0" w:after="80" w:line="300" w:lineRule="auto"/>
+        <w:spacing w:before="0" w:after="80" w:line="288" w:lineRule="auto"/>
       </w:pPr>
       <w:r>
         <w:rPr>
           <w:rFonts w:ascii="Calibri" w:hAnsi="Calibri" w:eastAsia="Calibri" w:cs="Calibri"/>
           <w:color w:val="1F2937"/>
-          <w:sz w:val="22"/>
+          <w:sz w:val="21"/>
         </w:rPr>
         <w:t xml:space="preserve">Add another local project. Choose Documents &gt; AI Humans &gt; </w:t>
       </w:r>
@@ -3661,7 +3706,7 @@
         <w:rPr>
           <w:rFonts w:ascii="Menlo" w:hAnsi="Menlo" w:eastAsia="Menlo" w:cs="Menlo"/>
           <w:color w:val="1F4D78"/>
-          <w:sz w:val="20"/>
+          <w:sz w:val="19"/>
         </w:rPr>
         <w:t>02-Drive-Inventory-AI-Human</w:t>
       </w:r>
@@ -3669,14 +3714,14 @@
         <w:rPr>
           <w:rFonts w:ascii="Calibri" w:hAnsi="Calibri" w:eastAsia="Calibri" w:cs="Calibri"/>
           <w:color w:val="1F2937"/>
-          <w:sz w:val="22"/>
+          <w:sz w:val="21"/>
         </w:rPr>
         <w:t>.</w:t>
       </w:r>
     </w:p>
     <w:p>
       <w:pPr>
-        <w:spacing w:before="60" w:after="180" w:line="300" w:lineRule="auto"/>
+        <w:spacing w:before="60" w:after="180" w:line="288" w:lineRule="auto"/>
         <w:ind w:left="173"/>
         <w:shd w:fill="FFF8E8"/>
       </w:pPr>
@@ -3685,7 +3730,7 @@
           <w:rFonts w:ascii="Calibri" w:hAnsi="Calibri" w:eastAsia="Calibri" w:cs="Calibri"/>
           <w:b/>
           <w:color w:val="0B2545"/>
-          <w:sz w:val="22"/>
+          <w:sz w:val="21"/>
         </w:rPr>
         <w:t>DONE WHEN:</w:t>
       </w:r>
@@ -3693,7 +3738,7 @@
         <w:rPr>
           <w:rFonts w:ascii="Calibri" w:hAnsi="Calibri" w:eastAsia="Calibri" w:cs="Calibri"/>
           <w:color w:val="0B2545"/>
-          <w:sz w:val="22"/>
+          <w:sz w:val="21"/>
         </w:rPr>
         <w:t xml:space="preserve"> The Drive project appears separately from the Email project.</w:t>
       </w:r>
@@ -3705,20 +3750,20 @@
           <w:ilvl w:val="0"/>
           <w:numId w:val="91"/>
         </w:numPr>
-        <w:spacing w:before="0" w:after="80" w:line="300" w:lineRule="auto"/>
+        <w:spacing w:before="0" w:after="80" w:line="288" w:lineRule="auto"/>
       </w:pPr>
       <w:r>
         <w:rPr>
           <w:rFonts w:ascii="Calibri" w:hAnsi="Calibri" w:eastAsia="Calibri" w:cs="Calibri"/>
           <w:color w:val="1F2937"/>
-          <w:sz w:val="22"/>
+          <w:sz w:val="21"/>
         </w:rPr>
         <w:t>Start a new chat inside the Drive project.</w:t>
       </w:r>
     </w:p>
     <w:p>
       <w:pPr>
-        <w:spacing w:before="60" w:after="180" w:line="300" w:lineRule="auto"/>
+        <w:spacing w:before="60" w:after="180" w:line="288" w:lineRule="auto"/>
         <w:ind w:left="173"/>
         <w:shd w:fill="FFF8E8"/>
       </w:pPr>
@@ -3727,7 +3772,7 @@
           <w:rFonts w:ascii="Calibri" w:hAnsi="Calibri" w:eastAsia="Calibri" w:cs="Calibri"/>
           <w:b/>
           <w:color w:val="0B2545"/>
-          <w:sz w:val="22"/>
+          <w:sz w:val="21"/>
         </w:rPr>
         <w:t>DONE WHEN:</w:t>
       </w:r>
@@ -3735,20 +3780,20 @@
         <w:rPr>
           <w:rFonts w:ascii="Calibri" w:hAnsi="Calibri" w:eastAsia="Calibri" w:cs="Calibri"/>
           <w:color w:val="0B2545"/>
-          <w:sz w:val="22"/>
+          <w:sz w:val="21"/>
         </w:rPr>
         <w:t xml:space="preserve"> The new chat belongs to the Drive folder, not the Email folder.</w:t>
       </w:r>
     </w:p>
     <w:p>
       <w:pPr>
-        <w:spacing w:before="0" w:after="120" w:line="300" w:lineRule="auto"/>
+        <w:spacing w:before="0" w:after="120" w:line="288" w:lineRule="auto"/>
       </w:pPr>
       <w:r>
         <w:rPr>
           <w:rFonts w:ascii="Calibri" w:hAnsi="Calibri" w:eastAsia="Calibri" w:cs="Calibri"/>
           <w:color w:val="1F2937"/>
-          <w:sz w:val="22"/>
+          <w:sz w:val="21"/>
         </w:rPr>
         <w:t>Do not attach both folders to the same project. Separate folders are what keep the two AI humans from mixing memory or state.</w:t>
       </w:r>
@@ -3773,13 +3818,13 @@
           <w:ilvl w:val="0"/>
           <w:numId w:val="93"/>
         </w:numPr>
-        <w:spacing w:before="0" w:after="80" w:line="300" w:lineRule="auto"/>
+        <w:spacing w:before="0" w:after="80" w:line="288" w:lineRule="auto"/>
       </w:pPr>
       <w:r>
         <w:rPr>
           <w:rFonts w:ascii="Calibri" w:hAnsi="Calibri" w:eastAsia="Calibri" w:cs="Calibri"/>
           <w:color w:val="1F2937"/>
-          <w:sz w:val="22"/>
+          <w:sz w:val="21"/>
         </w:rPr>
         <w:t xml:space="preserve">Open the </w:t>
       </w:r>
@@ -3788,7 +3833,7 @@
           <w:rFonts w:ascii="Calibri" w:hAnsi="Calibri" w:eastAsia="Calibri" w:cs="Calibri"/>
           <w:b/>
           <w:color w:val="1F2937"/>
-          <w:sz w:val="22"/>
+          <w:sz w:val="21"/>
         </w:rPr>
         <w:t>Plugins</w:t>
       </w:r>
@@ -3796,14 +3841,14 @@
         <w:rPr>
           <w:rFonts w:ascii="Calibri" w:hAnsi="Calibri" w:eastAsia="Calibri" w:cs="Calibri"/>
           <w:color w:val="1F2937"/>
-          <w:sz w:val="22"/>
+          <w:sz w:val="21"/>
         </w:rPr>
         <w:t xml:space="preserve"> tab.</w:t>
       </w:r>
     </w:p>
     <w:p>
       <w:pPr>
-        <w:spacing w:before="60" w:after="180" w:line="300" w:lineRule="auto"/>
+        <w:spacing w:before="60" w:after="180" w:line="288" w:lineRule="auto"/>
         <w:ind w:left="173"/>
         <w:shd w:fill="FFF8E8"/>
       </w:pPr>
@@ -3812,7 +3857,7 @@
           <w:rFonts w:ascii="Calibri" w:hAnsi="Calibri" w:eastAsia="Calibri" w:cs="Calibri"/>
           <w:b/>
           <w:color w:val="0B2545"/>
-          <w:sz w:val="22"/>
+          <w:sz w:val="21"/>
         </w:rPr>
         <w:t>DONE WHEN:</w:t>
       </w:r>
@@ -3820,7 +3865,7 @@
         <w:rPr>
           <w:rFonts w:ascii="Calibri" w:hAnsi="Calibri" w:eastAsia="Calibri" w:cs="Calibri"/>
           <w:color w:val="0B2545"/>
-          <w:sz w:val="22"/>
+          <w:sz w:val="21"/>
         </w:rPr>
         <w:t xml:space="preserve"> The plugin directory is visible.</w:t>
       </w:r>
@@ -3832,13 +3877,13 @@
           <w:ilvl w:val="0"/>
           <w:numId w:val="95"/>
         </w:numPr>
-        <w:spacing w:before="0" w:after="80" w:line="300" w:lineRule="auto"/>
+        <w:spacing w:before="0" w:after="80" w:line="288" w:lineRule="auto"/>
       </w:pPr>
       <w:r>
         <w:rPr>
           <w:rFonts w:ascii="Calibri" w:hAnsi="Calibri" w:eastAsia="Calibri" w:cs="Calibri"/>
           <w:color w:val="1F2937"/>
-          <w:sz w:val="22"/>
+          <w:sz w:val="21"/>
         </w:rPr>
         <w:t xml:space="preserve">Search for </w:t>
       </w:r>
@@ -3846,7 +3891,7 @@
         <w:rPr>
           <w:rFonts w:ascii="Menlo" w:hAnsi="Menlo" w:eastAsia="Menlo" w:cs="Menlo"/>
           <w:color w:val="1F4D78"/>
-          <w:sz w:val="20"/>
+          <w:sz w:val="19"/>
         </w:rPr>
         <w:t>Google Drive</w:t>
       </w:r>
@@ -3854,14 +3899,14 @@
         <w:rPr>
           <w:rFonts w:ascii="Calibri" w:hAnsi="Calibri" w:eastAsia="Calibri" w:cs="Calibri"/>
           <w:color w:val="1F2937"/>
-          <w:sz w:val="22"/>
+          <w:sz w:val="21"/>
         </w:rPr>
         <w:t>.</w:t>
       </w:r>
     </w:p>
     <w:p>
       <w:pPr>
-        <w:spacing w:before="60" w:after="180" w:line="300" w:lineRule="auto"/>
+        <w:spacing w:before="60" w:after="180" w:line="288" w:lineRule="auto"/>
         <w:ind w:left="173"/>
         <w:shd w:fill="FFF8E8"/>
       </w:pPr>
@@ -3870,7 +3915,7 @@
           <w:rFonts w:ascii="Calibri" w:hAnsi="Calibri" w:eastAsia="Calibri" w:cs="Calibri"/>
           <w:b/>
           <w:color w:val="0B2545"/>
-          <w:sz w:val="22"/>
+          <w:sz w:val="21"/>
         </w:rPr>
         <w:t>DONE WHEN:</w:t>
       </w:r>
@@ -3878,7 +3923,7 @@
         <w:rPr>
           <w:rFonts w:ascii="Calibri" w:hAnsi="Calibri" w:eastAsia="Calibri" w:cs="Calibri"/>
           <w:color w:val="0B2545"/>
-          <w:sz w:val="22"/>
+          <w:sz w:val="21"/>
         </w:rPr>
         <w:t xml:space="preserve"> The Google Drive plugin is visible as installed or available.</w:t>
       </w:r>
@@ -3890,20 +3935,20 @@
           <w:ilvl w:val="0"/>
           <w:numId w:val="97"/>
         </w:numPr>
-        <w:spacing w:before="0" w:after="80" w:line="300" w:lineRule="auto"/>
+        <w:spacing w:before="0" w:after="80" w:line="288" w:lineRule="auto"/>
       </w:pPr>
       <w:r>
         <w:rPr>
           <w:rFonts w:ascii="Calibri" w:hAnsi="Calibri" w:eastAsia="Calibri" w:cs="Calibri"/>
           <w:color w:val="1F2937"/>
-          <w:sz w:val="22"/>
+          <w:sz w:val="21"/>
         </w:rPr>
         <w:t>If already installed, return to the Drive project. If missing, click its plus or install button, then start a new chat in the Drive project.</w:t>
       </w:r>
     </w:p>
     <w:p>
       <w:pPr>
-        <w:spacing w:before="60" w:after="180" w:line="300" w:lineRule="auto"/>
+        <w:spacing w:before="60" w:after="180" w:line="288" w:lineRule="auto"/>
         <w:ind w:left="173"/>
         <w:shd w:fill="FFF8E8"/>
       </w:pPr>
@@ -3912,7 +3957,7 @@
           <w:rFonts w:ascii="Calibri" w:hAnsi="Calibri" w:eastAsia="Calibri" w:cs="Calibri"/>
           <w:b/>
           <w:color w:val="0B2545"/>
-          <w:sz w:val="22"/>
+          <w:sz w:val="21"/>
         </w:rPr>
         <w:t>DONE WHEN:</w:t>
       </w:r>
@@ -3920,7 +3965,7 @@
         <w:rPr>
           <w:rFonts w:ascii="Calibri" w:hAnsi="Calibri" w:eastAsia="Calibri" w:cs="Calibri"/>
           <w:color w:val="0B2545"/>
-          <w:sz w:val="22"/>
+          <w:sz w:val="21"/>
         </w:rPr>
         <w:t xml:space="preserve"> The Drive project is open in a new chat with the plugin available.</w:t>
       </w:r>
@@ -3932,20 +3977,20 @@
           <w:ilvl w:val="0"/>
           <w:numId w:val="99"/>
         </w:numPr>
-        <w:spacing w:before="0" w:after="80" w:line="300" w:lineRule="auto"/>
+        <w:spacing w:before="0" w:after="80" w:line="288" w:lineRule="auto"/>
       </w:pPr>
       <w:r>
         <w:rPr>
           <w:rFonts w:ascii="Calibri" w:hAnsi="Calibri" w:eastAsia="Calibri" w:cs="Calibri"/>
           <w:color w:val="1F2937"/>
-          <w:sz w:val="22"/>
+          <w:sz w:val="21"/>
         </w:rPr>
         <w:t>If asked to connect, choose the approved company account and complete the provider login yourself.</w:t>
       </w:r>
     </w:p>
     <w:p>
       <w:pPr>
-        <w:spacing w:before="60" w:after="180" w:line="300" w:lineRule="auto"/>
+        <w:spacing w:before="60" w:after="180" w:line="288" w:lineRule="auto"/>
         <w:ind w:left="173"/>
         <w:shd w:fill="FFF8E8"/>
       </w:pPr>
@@ -3954,7 +3999,7 @@
           <w:rFonts w:ascii="Calibri" w:hAnsi="Calibri" w:eastAsia="Calibri" w:cs="Calibri"/>
           <w:b/>
           <w:color w:val="0B2545"/>
-          <w:sz w:val="22"/>
+          <w:sz w:val="21"/>
         </w:rPr>
         <w:t>DONE WHEN:</w:t>
       </w:r>
@@ -3962,7 +4007,7 @@
         <w:rPr>
           <w:rFonts w:ascii="Calibri" w:hAnsi="Calibri" w:eastAsia="Calibri" w:cs="Calibri"/>
           <w:color w:val="0B2545"/>
-          <w:sz w:val="22"/>
+          <w:sz w:val="21"/>
         </w:rPr>
         <w:t xml:space="preserve"> Codex verifies the approved company Drive is connected.</w:t>
       </w:r>
@@ -3982,13 +4027,13 @@
     </w:p>
     <w:p>
       <w:pPr>
-        <w:spacing w:before="0" w:after="120" w:line="300" w:lineRule="auto"/>
+        <w:spacing w:before="0" w:after="120" w:line="288" w:lineRule="auto"/>
       </w:pPr>
       <w:r>
         <w:rPr>
           <w:rFonts w:ascii="Calibri" w:hAnsi="Calibri" w:eastAsia="Calibri" w:cs="Calibri"/>
           <w:color w:val="1F2937"/>
-          <w:sz w:val="22"/>
+          <w:sz w:val="21"/>
         </w:rPr>
         <w:t xml:space="preserve">Open </w:t>
       </w:r>
@@ -3996,7 +4041,7 @@
         <w:rPr>
           <w:rFonts w:ascii="Menlo" w:hAnsi="Menlo" w:eastAsia="Menlo" w:cs="Menlo"/>
           <w:color w:val="1F4D78"/>
-          <w:sz w:val="20"/>
+          <w:sz w:val="19"/>
         </w:rPr>
         <w:t>COPY-PASTE-PROMPTS.txt</w:t>
       </w:r>
@@ -4004,7 +4049,7 @@
         <w:rPr>
           <w:rFonts w:ascii="Calibri" w:hAnsi="Calibri" w:eastAsia="Calibri" w:cs="Calibri"/>
           <w:color w:val="1F2937"/>
-          <w:sz w:val="22"/>
+          <w:sz w:val="21"/>
         </w:rPr>
         <w:t xml:space="preserve">. Copy everything under </w:t>
       </w:r>
@@ -4013,7 +4058,7 @@
           <w:rFonts w:ascii="Calibri" w:hAnsi="Calibri" w:eastAsia="Calibri" w:cs="Calibri"/>
           <w:b/>
           <w:color w:val="1F2937"/>
-          <w:sz w:val="22"/>
+          <w:sz w:val="21"/>
         </w:rPr>
         <w:t>PROMPT 2</w:t>
       </w:r>
@@ -4021,7 +4066,7 @@
         <w:rPr>
           <w:rFonts w:ascii="Calibri" w:hAnsi="Calibri" w:eastAsia="Calibri" w:cs="Calibri"/>
           <w:color w:val="1F2937"/>
-          <w:sz w:val="22"/>
+          <w:sz w:val="21"/>
         </w:rPr>
         <w:t xml:space="preserve">. Replace </w:t>
       </w:r>
@@ -4029,7 +4074,7 @@
         <w:rPr>
           <w:rFonts w:ascii="Menlo" w:hAnsi="Menlo" w:eastAsia="Menlo" w:cs="Menlo"/>
           <w:color w:val="1F4D78"/>
-          <w:sz w:val="20"/>
+          <w:sz w:val="19"/>
         </w:rPr>
         <w:t>[TYPE YOUR NAME]</w:t>
       </w:r>
@@ -4037,14 +4082,14 @@
         <w:rPr>
           <w:rFonts w:ascii="Calibri" w:hAnsi="Calibri" w:eastAsia="Calibri" w:cs="Calibri"/>
           <w:color w:val="1F2937"/>
-          <w:sz w:val="22"/>
+          <w:sz w:val="21"/>
         </w:rPr>
         <w:t xml:space="preserve"> with your name. Paste it into the Drive project chat and send it.</w:t>
       </w:r>
     </w:p>
     <w:p>
       <w:pPr>
-        <w:spacing w:before="60" w:after="180" w:line="300" w:lineRule="auto"/>
+        <w:spacing w:before="60" w:after="180" w:line="288" w:lineRule="auto"/>
         <w:ind w:left="173"/>
         <w:shd w:fill="FFF8E8"/>
       </w:pPr>
@@ -4053,7 +4098,7 @@
           <w:rFonts w:ascii="Calibri" w:hAnsi="Calibri" w:eastAsia="Calibri" w:cs="Calibri"/>
           <w:b/>
           <w:color w:val="0B2545"/>
-          <w:sz w:val="22"/>
+          <w:sz w:val="21"/>
         </w:rPr>
         <w:t>DONE WHEN:</w:t>
       </w:r>
@@ -4061,7 +4106,7 @@
         <w:rPr>
           <w:rFonts w:ascii="Calibri" w:hAnsi="Calibri" w:eastAsia="Calibri" w:cs="Calibri"/>
           <w:color w:val="0B2545"/>
-          <w:sz w:val="22"/>
+          <w:sz w:val="21"/>
         </w:rPr>
         <w:t xml:space="preserve"> Codex says the live task is </w:t>
       </w:r>
@@ -4069,7 +4114,7 @@
         <w:rPr>
           <w:rFonts w:ascii="Menlo" w:hAnsi="Menlo" w:eastAsia="Menlo" w:cs="Menlo"/>
           <w:color w:val="1F4D78"/>
-          <w:sz w:val="20"/>
+          <w:sz w:val="19"/>
         </w:rPr>
         <w:t>DRIVE-HW-001</w:t>
       </w:r>
@@ -4077,9 +4122,41 @@
         <w:rPr>
           <w:rFonts w:ascii="Calibri" w:hAnsi="Calibri" w:eastAsia="Calibri" w:cs="Calibri"/>
           <w:color w:val="0B2545"/>
-          <w:sz w:val="22"/>
-        </w:rPr>
-        <w:t xml:space="preserve"> and reads metadata for no more than 25 items.</w:t>
+          <w:sz w:val="21"/>
+        </w:rPr>
+        <w:t xml:space="preserve">, asks you to choose </w:t>
+      </w:r>
+      <w:r>
+        <w:rPr>
+          <w:rFonts w:ascii="Menlo" w:hAnsi="Menlo" w:eastAsia="Menlo" w:cs="Menlo"/>
+          <w:color w:val="1F4D78"/>
+          <w:sz w:val="19"/>
+        </w:rPr>
+        <w:t>TEST 25</w:t>
+      </w:r>
+      <w:r>
+        <w:rPr>
+          <w:rFonts w:ascii="Calibri" w:hAnsi="Calibri" w:eastAsia="Calibri" w:cs="Calibri"/>
+          <w:color w:val="0B2545"/>
+          <w:sz w:val="21"/>
+        </w:rPr>
+        <w:t xml:space="preserve"> or </w:t>
+      </w:r>
+      <w:r>
+        <w:rPr>
+          <w:rFonts w:ascii="Menlo" w:hAnsi="Menlo" w:eastAsia="Menlo" w:cs="Menlo"/>
+          <w:color w:val="1F4D78"/>
+          <w:sz w:val="19"/>
+        </w:rPr>
+        <w:t>FULL DRIVE INDEX</w:t>
+      </w:r>
+      <w:r>
+        <w:rPr>
+          <w:rFonts w:ascii="Calibri" w:hAnsi="Calibri" w:eastAsia="Calibri" w:cs="Calibri"/>
+          <w:color w:val="0B2545"/>
+          <w:sz w:val="21"/>
+        </w:rPr>
+        <w:t>, and never processes more than 25 items before a checkpoint.</w:t>
       </w:r>
     </w:p>
     <w:p>
@@ -4097,13 +4174,13 @@
     </w:p>
     <w:p>
       <w:pPr>
-        <w:spacing w:before="0" w:after="120" w:line="300" w:lineRule="auto"/>
+        <w:spacing w:before="0" w:after="120" w:line="288" w:lineRule="auto"/>
       </w:pPr>
       <w:r>
         <w:rPr>
           <w:rFonts w:ascii="Calibri" w:hAnsi="Calibri" w:eastAsia="Calibri" w:cs="Calibri"/>
           <w:color w:val="1F2937"/>
-          <w:sz w:val="22"/>
+          <w:sz w:val="21"/>
         </w:rPr>
         <w:t>Stop when all of these are visible:</w:t>
       </w:r>
@@ -4114,23 +4191,55 @@
           <w:ilvl w:val="0"/>
           <w:numId w:val="101"/>
         </w:numPr>
-        <w:spacing w:before="0" w:after="80" w:line="300" w:lineRule="auto"/>
+        <w:spacing w:before="0" w:after="80" w:line="288" w:lineRule="auto"/>
       </w:pPr>
       <w:r>
         <w:rPr>
           <w:rFonts w:ascii="Menlo" w:hAnsi="Menlo" w:eastAsia="Menlo" w:cs="Menlo"/>
           <w:color w:val="1F4D78"/>
-          <w:sz w:val="20"/>
-        </w:rPr>
-        <w:t>DRIVE-INVENTORY.md</w:t>
+          <w:sz w:val="19"/>
+        </w:rPr>
+        <w:t>DRIVE-INDEX.csv</w:t>
       </w:r>
       <w:r>
         <w:rPr>
           <w:rFonts w:ascii="Calibri" w:hAnsi="Calibri" w:eastAsia="Calibri" w:cs="Calibri"/>
           <w:color w:val="1F2937"/>
-          <w:sz w:val="22"/>
-        </w:rPr>
-        <w:t xml:space="preserve"> exists.</w:t>
+          <w:sz w:val="21"/>
+        </w:rPr>
+        <w:t xml:space="preserve">, </w:t>
+      </w:r>
+      <w:r>
+        <w:rPr>
+          <w:rFonts w:ascii="Menlo" w:hAnsi="Menlo" w:eastAsia="Menlo" w:cs="Menlo"/>
+          <w:color w:val="1F4D78"/>
+          <w:sz w:val="19"/>
+        </w:rPr>
+        <w:t>DRIVE-INDEX.md</w:t>
+      </w:r>
+      <w:r>
+        <w:rPr>
+          <w:rFonts w:ascii="Calibri" w:hAnsi="Calibri" w:eastAsia="Calibri" w:cs="Calibri"/>
+          <w:color w:val="1F2937"/>
+          <w:sz w:val="21"/>
+        </w:rPr>
+        <w:t xml:space="preserve"> and </w:t>
+      </w:r>
+      <w:r>
+        <w:rPr>
+          <w:rFonts w:ascii="Menlo" w:hAnsi="Menlo" w:eastAsia="Menlo" w:cs="Menlo"/>
+          <w:color w:val="1F4D78"/>
+          <w:sz w:val="19"/>
+        </w:rPr>
+        <w:t>DRIVE-INDEX-CURSOR.md</w:t>
+      </w:r>
+      <w:r>
+        <w:rPr>
+          <w:rFonts w:ascii="Calibri" w:hAnsi="Calibri" w:eastAsia="Calibri" w:cs="Calibri"/>
+          <w:color w:val="1F2937"/>
+          <w:sz w:val="21"/>
+        </w:rPr>
+        <w:t xml:space="preserve"> exist.</w:t>
       </w:r>
     </w:p>
     <w:p>
@@ -4139,31 +4248,15 @@
           <w:ilvl w:val="0"/>
           <w:numId w:val="101"/>
         </w:numPr>
-        <w:spacing w:before="0" w:after="80" w:line="300" w:lineRule="auto"/>
+        <w:spacing w:before="0" w:after="80" w:line="288" w:lineRule="auto"/>
       </w:pPr>
       <w:r>
         <w:rPr>
           <w:rFonts w:ascii="Calibri" w:hAnsi="Calibri" w:eastAsia="Calibri" w:cs="Calibri"/>
           <w:color w:val="1F2937"/>
-          <w:sz w:val="22"/>
-        </w:rPr>
-        <w:t xml:space="preserve">It says </w:t>
-      </w:r>
-      <w:r>
-        <w:rPr>
-          <w:rFonts w:ascii="Menlo" w:hAnsi="Menlo" w:eastAsia="Menlo" w:cs="Menlo"/>
-          <w:color w:val="1F4D78"/>
-          <w:sz w:val="20"/>
-        </w:rPr>
-        <w:t>First bounded batch</w:t>
-      </w:r>
-      <w:r>
-        <w:rPr>
-          <w:rFonts w:ascii="Calibri" w:hAnsi="Calibri" w:eastAsia="Calibri" w:cs="Calibri"/>
-          <w:color w:val="1F2937"/>
-          <w:sz w:val="22"/>
-        </w:rPr>
-        <w:t>, not complete inventory.</w:t>
+          <w:sz w:val="21"/>
+        </w:rPr>
+        <w:t>Every batch is no more than 25 items and has a durable checkpoint.</w:t>
       </w:r>
     </w:p>
     <w:p>
@@ -4172,15 +4265,39 @@
           <w:ilvl w:val="0"/>
           <w:numId w:val="101"/>
         </w:numPr>
-        <w:spacing w:before="0" w:after="80" w:line="300" w:lineRule="auto"/>
-      </w:pPr>
+        <w:spacing w:before="0" w:after="80" w:line="288" w:lineRule="auto"/>
+      </w:pPr>
+      <w:r>
+        <w:rPr>
+          <w:rFonts w:ascii="Menlo" w:hAnsi="Menlo" w:eastAsia="Menlo" w:cs="Menlo"/>
+          <w:color w:val="1F4D78"/>
+          <w:sz w:val="19"/>
+        </w:rPr>
+        <w:t>TEST 25</w:t>
+      </w:r>
       <w:r>
         <w:rPr>
           <w:rFonts w:ascii="Calibri" w:hAnsi="Calibri" w:eastAsia="Calibri" w:cs="Calibri"/>
           <w:color w:val="1F2937"/>
-          <w:sz w:val="22"/>
-        </w:rPr>
-        <w:t>It shows the selection rule and no more than 25 items.</w:t>
+          <w:sz w:val="21"/>
+        </w:rPr>
+        <w:t xml:space="preserve"> says the full Drive was not indexed. </w:t>
+      </w:r>
+      <w:r>
+        <w:rPr>
+          <w:rFonts w:ascii="Menlo" w:hAnsi="Menlo" w:eastAsia="Menlo" w:cs="Menlo"/>
+          <w:color w:val="1F4D78"/>
+          <w:sz w:val="19"/>
+        </w:rPr>
+        <w:t>FULL DRIVE INDEX</w:t>
+      </w:r>
+      <w:r>
+        <w:rPr>
+          <w:rFonts w:ascii="Calibri" w:hAnsi="Calibri" w:eastAsia="Calibri" w:cs="Calibri"/>
+          <w:color w:val="1F2937"/>
+          <w:sz w:val="21"/>
+        </w:rPr>
+        <w:t xml:space="preserve"> shows each connector-visible source scope has no next page, or names the coverage gap.</w:t>
       </w:r>
     </w:p>
     <w:p>
@@ -4189,15 +4306,15 @@
           <w:ilvl w:val="0"/>
           <w:numId w:val="101"/>
         </w:numPr>
-        <w:spacing w:before="0" w:after="80" w:line="300" w:lineRule="auto"/>
+        <w:spacing w:before="0" w:after="80" w:line="288" w:lineRule="auto"/>
       </w:pPr>
       <w:r>
         <w:rPr>
           <w:rFonts w:ascii="Calibri" w:hAnsi="Calibri" w:eastAsia="Calibri" w:cs="Calibri"/>
           <w:color w:val="1F2937"/>
-          <w:sz w:val="22"/>
-        </w:rPr>
-        <w:t>Missing fields say UNKNOWN; sensitive titles say HUMAN REVIEW.</w:t>
+          <w:sz w:val="21"/>
+        </w:rPr>
+        <w:t>Stable item IDs prevent duplicate rows and let a new session resume.</w:t>
       </w:r>
     </w:p>
     <w:p>
@@ -4206,15 +4323,15 @@
           <w:ilvl w:val="0"/>
           <w:numId w:val="101"/>
         </w:numPr>
-        <w:spacing w:before="0" w:after="80" w:line="300" w:lineRule="auto"/>
+        <w:spacing w:before="0" w:after="80" w:line="288" w:lineRule="auto"/>
       </w:pPr>
       <w:r>
         <w:rPr>
           <w:rFonts w:ascii="Calibri" w:hAnsi="Calibri" w:eastAsia="Calibri" w:cs="Calibri"/>
           <w:color w:val="1F2937"/>
-          <w:sz w:val="22"/>
-        </w:rPr>
-        <w:t>It says no Drive file was opened beyond metadata, downloaded, created, edited, renamed, moved, shared, unshared, deleted or organized.</w:t>
+          <w:sz w:val="21"/>
+        </w:rPr>
+        <w:t>Missing fields say UNKNOWN; sensitive titles say HUMAN REVIEW.</w:t>
       </w:r>
     </w:p>
     <w:p>
@@ -4223,20 +4340,37 @@
           <w:ilvl w:val="0"/>
           <w:numId w:val="101"/>
         </w:numPr>
-        <w:spacing w:before="0" w:after="80" w:line="300" w:lineRule="auto"/>
+        <w:spacing w:before="0" w:after="80" w:line="288" w:lineRule="auto"/>
       </w:pPr>
       <w:r>
         <w:rPr>
           <w:rFonts w:ascii="Calibri" w:hAnsi="Calibri" w:eastAsia="Calibri" w:cs="Calibri"/>
           <w:color w:val="1F2937"/>
-          <w:sz w:val="22"/>
-        </w:rPr>
-        <w:t>The workspace validator passed.</w:t>
+          <w:sz w:val="21"/>
+        </w:rPr>
+        <w:t>It says no Drive file content was opened or downloaded and no Drive item was created, edited, renamed, moved, shared, unshared, deleted or organized.</w:t>
       </w:r>
     </w:p>
     <w:p>
       <w:pPr>
-        <w:spacing w:before="60" w:after="180" w:line="300" w:lineRule="auto"/>
+        <w:numPr>
+          <w:ilvl w:val="0"/>
+          <w:numId w:val="101"/>
+        </w:numPr>
+        <w:spacing w:before="0" w:after="80" w:line="288" w:lineRule="auto"/>
+      </w:pPr>
+      <w:r>
+        <w:rPr>
+          <w:rFonts w:ascii="Calibri" w:hAnsi="Calibri" w:eastAsia="Calibri" w:cs="Calibri"/>
+          <w:color w:val="1F2937"/>
+          <w:sz w:val="21"/>
+        </w:rPr>
+        <w:t>The workspace validator passed.</w:t>
+      </w:r>
+    </w:p>
+    <w:p>
+      <w:pPr>
+        <w:spacing w:before="60" w:after="180" w:line="288" w:lineRule="auto"/>
         <w:ind w:left="173"/>
         <w:shd w:fill="FFF8E8"/>
       </w:pPr>
@@ -4245,7 +4379,7 @@
           <w:rFonts w:ascii="Calibri" w:hAnsi="Calibri" w:eastAsia="Calibri" w:cs="Calibri"/>
           <w:b/>
           <w:color w:val="0B2545"/>
-          <w:sz w:val="22"/>
+          <w:sz w:val="21"/>
         </w:rPr>
         <w:t>DONE WHEN:</w:t>
       </w:r>
@@ -4253,9 +4387,9 @@
         <w:rPr>
           <w:rFonts w:ascii="Calibri" w:hAnsi="Calibri" w:eastAsia="Calibri" w:cs="Calibri"/>
           <w:color w:val="0B2545"/>
-          <w:sz w:val="22"/>
-        </w:rPr>
-        <w:t xml:space="preserve"> You can show the inventory on your screen. A connected Drive account alone is not completion.</w:t>
+          <w:sz w:val="21"/>
+        </w:rPr>
+        <w:t xml:space="preserve"> You can show the index summary and cursor on your screen. A connected Drive account alone is not completion. The index helps Codex find files later, but opening a file later still needs current Drive permission and a new approved task.</w:t>
       </w:r>
     </w:p>
     <w:p>
@@ -4273,13 +4407,13 @@
     </w:p>
     <w:p>
       <w:pPr>
-        <w:spacing w:before="0" w:after="120" w:line="300" w:lineRule="auto"/>
+        <w:spacing w:before="0" w:after="120" w:line="288" w:lineRule="auto"/>
       </w:pPr>
       <w:r>
         <w:rPr>
           <w:rFonts w:ascii="Calibri" w:hAnsi="Calibri" w:eastAsia="Calibri" w:cs="Calibri"/>
           <w:color w:val="1F2937"/>
-          <w:sz w:val="22"/>
+          <w:sz w:val="21"/>
         </w:rPr>
         <w:t>Do this only after both required projects pass.</w:t>
       </w:r>
@@ -4291,13 +4425,13 @@
           <w:ilvl w:val="0"/>
           <w:numId w:val="103"/>
         </w:numPr>
-        <w:spacing w:before="0" w:after="80" w:line="300" w:lineRule="auto"/>
+        <w:spacing w:before="0" w:after="80" w:line="288" w:lineRule="auto"/>
       </w:pPr>
       <w:r>
         <w:rPr>
           <w:rFonts w:ascii="Calibri" w:hAnsi="Calibri" w:eastAsia="Calibri" w:cs="Calibri"/>
           <w:color w:val="1F2937"/>
-          <w:sz w:val="22"/>
+          <w:sz w:val="21"/>
         </w:rPr>
         <w:t xml:space="preserve">Copy </w:t>
       </w:r>
@@ -4305,7 +4439,7 @@
         <w:rPr>
           <w:rFonts w:ascii="Menlo" w:hAnsi="Menlo" w:eastAsia="Menlo" w:cs="Menlo"/>
           <w:color w:val="1F4D78"/>
-          <w:sz w:val="20"/>
+          <w:sz w:val="19"/>
         </w:rPr>
         <w:t>03-LinkedIn-Draft-AI-Human-OPTIONAL</w:t>
       </w:r>
@@ -4313,14 +4447,14 @@
         <w:rPr>
           <w:rFonts w:ascii="Calibri" w:hAnsi="Calibri" w:eastAsia="Calibri" w:cs="Calibri"/>
           <w:color w:val="1F2937"/>
-          <w:sz w:val="22"/>
+          <w:sz w:val="21"/>
         </w:rPr>
         <w:t xml:space="preserve"> from the untouched starter pack into Documents &gt; AI Humans.</w:t>
       </w:r>
     </w:p>
     <w:p>
       <w:pPr>
-        <w:spacing w:before="60" w:after="180" w:line="300" w:lineRule="auto"/>
+        <w:spacing w:before="60" w:after="180" w:line="288" w:lineRule="auto"/>
         <w:ind w:left="173"/>
         <w:shd w:fill="FFF8E8"/>
       </w:pPr>
@@ -4329,7 +4463,7 @@
           <w:rFonts w:ascii="Calibri" w:hAnsi="Calibri" w:eastAsia="Calibri" w:cs="Calibri"/>
           <w:b/>
           <w:color w:val="0B2545"/>
-          <w:sz w:val="22"/>
+          <w:sz w:val="21"/>
         </w:rPr>
         <w:t>DONE WHEN:</w:t>
       </w:r>
@@ -4337,7 +4471,7 @@
         <w:rPr>
           <w:rFonts w:ascii="Calibri" w:hAnsi="Calibri" w:eastAsia="Calibri" w:cs="Calibri"/>
           <w:color w:val="0B2545"/>
-          <w:sz w:val="22"/>
+          <w:sz w:val="21"/>
         </w:rPr>
         <w:t xml:space="preserve"> The optional folder exists beside the other two.</w:t>
       </w:r>
@@ -4349,20 +4483,20 @@
           <w:ilvl w:val="0"/>
           <w:numId w:val="105"/>
         </w:numPr>
-        <w:spacing w:before="0" w:after="80" w:line="300" w:lineRule="auto"/>
+        <w:spacing w:before="0" w:after="80" w:line="288" w:lineRule="auto"/>
       </w:pPr>
       <w:r>
         <w:rPr>
           <w:rFonts w:ascii="Calibri" w:hAnsi="Calibri" w:eastAsia="Calibri" w:cs="Calibri"/>
           <w:color w:val="1F2937"/>
-          <w:sz w:val="22"/>
+          <w:sz w:val="21"/>
         </w:rPr>
         <w:t>Add it as a third, separate local project in Codex.</w:t>
       </w:r>
     </w:p>
     <w:p>
       <w:pPr>
-        <w:spacing w:before="60" w:after="180" w:line="300" w:lineRule="auto"/>
+        <w:spacing w:before="60" w:after="180" w:line="288" w:lineRule="auto"/>
         <w:ind w:left="173"/>
         <w:shd w:fill="FFF8E8"/>
       </w:pPr>
@@ -4371,7 +4505,7 @@
           <w:rFonts w:ascii="Calibri" w:hAnsi="Calibri" w:eastAsia="Calibri" w:cs="Calibri"/>
           <w:b/>
           <w:color w:val="0B2545"/>
-          <w:sz w:val="22"/>
+          <w:sz w:val="21"/>
         </w:rPr>
         <w:t>DONE WHEN:</w:t>
       </w:r>
@@ -4379,7 +4513,7 @@
         <w:rPr>
           <w:rFonts w:ascii="Calibri" w:hAnsi="Calibri" w:eastAsia="Calibri" w:cs="Calibri"/>
           <w:color w:val="0B2545"/>
-          <w:sz w:val="22"/>
+          <w:sz w:val="21"/>
         </w:rPr>
         <w:t xml:space="preserve"> The LinkedIn Draft project is open separately.</w:t>
       </w:r>
@@ -4391,13 +4525,13 @@
           <w:ilvl w:val="0"/>
           <w:numId w:val="107"/>
         </w:numPr>
-        <w:spacing w:before="0" w:after="80" w:line="300" w:lineRule="auto"/>
+        <w:spacing w:before="0" w:after="80" w:line="288" w:lineRule="auto"/>
       </w:pPr>
       <w:r>
         <w:rPr>
           <w:rFonts w:ascii="Calibri" w:hAnsi="Calibri" w:eastAsia="Calibri" w:cs="Calibri"/>
           <w:color w:val="1F2937"/>
-          <w:sz w:val="22"/>
+          <w:sz w:val="21"/>
         </w:rPr>
         <w:t xml:space="preserve">Open </w:t>
       </w:r>
@@ -4405,7 +4539,7 @@
         <w:rPr>
           <w:rFonts w:ascii="Menlo" w:hAnsi="Menlo" w:eastAsia="Menlo" w:cs="Menlo"/>
           <w:color w:val="1F4D78"/>
-          <w:sz w:val="20"/>
+          <w:sz w:val="19"/>
         </w:rPr>
         <w:t>COPY-PASTE-PROMPTS.txt</w:t>
       </w:r>
@@ -4413,7 +4547,7 @@
         <w:rPr>
           <w:rFonts w:ascii="Calibri" w:hAnsi="Calibri" w:eastAsia="Calibri" w:cs="Calibri"/>
           <w:color w:val="1F2937"/>
-          <w:sz w:val="22"/>
+          <w:sz w:val="21"/>
         </w:rPr>
         <w:t xml:space="preserve">. Copy everything under </w:t>
       </w:r>
@@ -4422,7 +4556,7 @@
           <w:rFonts w:ascii="Calibri" w:hAnsi="Calibri" w:eastAsia="Calibri" w:cs="Calibri"/>
           <w:b/>
           <w:color w:val="1F2937"/>
-          <w:sz w:val="22"/>
+          <w:sz w:val="21"/>
         </w:rPr>
         <w:t>PROMPT 3</w:t>
       </w:r>
@@ -4430,7 +4564,7 @@
         <w:rPr>
           <w:rFonts w:ascii="Calibri" w:hAnsi="Calibri" w:eastAsia="Calibri" w:cs="Calibri"/>
           <w:color w:val="1F2937"/>
-          <w:sz w:val="22"/>
+          <w:sz w:val="21"/>
         </w:rPr>
         <w:t xml:space="preserve">. Replace </w:t>
       </w:r>
@@ -4438,7 +4572,7 @@
         <w:rPr>
           <w:rFonts w:ascii="Menlo" w:hAnsi="Menlo" w:eastAsia="Menlo" w:cs="Menlo"/>
           <w:color w:val="1F4D78"/>
-          <w:sz w:val="20"/>
+          <w:sz w:val="19"/>
         </w:rPr>
         <w:t>[TYPE YOUR NAME]</w:t>
       </w:r>
@@ -4446,14 +4580,14 @@
         <w:rPr>
           <w:rFonts w:ascii="Calibri" w:hAnsi="Calibri" w:eastAsia="Calibri" w:cs="Calibri"/>
           <w:color w:val="1F2937"/>
-          <w:sz w:val="22"/>
+          <w:sz w:val="21"/>
         </w:rPr>
         <w:t xml:space="preserve"> with your name. Paste it and answer one question at a time.</w:t>
       </w:r>
     </w:p>
     <w:p>
       <w:pPr>
-        <w:spacing w:before="60" w:after="180" w:line="300" w:lineRule="auto"/>
+        <w:spacing w:before="60" w:after="180" w:line="288" w:lineRule="auto"/>
         <w:ind w:left="173"/>
         <w:shd w:fill="FFF8E8"/>
       </w:pPr>
@@ -4462,7 +4596,7 @@
           <w:rFonts w:ascii="Calibri" w:hAnsi="Calibri" w:eastAsia="Calibri" w:cs="Calibri"/>
           <w:b/>
           <w:color w:val="0B2545"/>
-          <w:sz w:val="22"/>
+          <w:sz w:val="21"/>
         </w:rPr>
         <w:t>DONE WHEN:</w:t>
       </w:r>
@@ -4470,7 +4604,7 @@
         <w:rPr>
           <w:rFonts w:ascii="Calibri" w:hAnsi="Calibri" w:eastAsia="Calibri" w:cs="Calibri"/>
           <w:color w:val="0B2545"/>
-          <w:sz w:val="22"/>
+          <w:sz w:val="21"/>
         </w:rPr>
         <w:t xml:space="preserve"> Codex uses only the safe facts you supplied.</w:t>
       </w:r>
@@ -4482,13 +4616,13 @@
           <w:ilvl w:val="0"/>
           <w:numId w:val="109"/>
         </w:numPr>
-        <w:spacing w:before="0" w:after="80" w:line="300" w:lineRule="auto"/>
+        <w:spacing w:before="0" w:after="80" w:line="288" w:lineRule="auto"/>
       </w:pPr>
       <w:r>
         <w:rPr>
           <w:rFonts w:ascii="Calibri" w:hAnsi="Calibri" w:eastAsia="Calibri" w:cs="Calibri"/>
           <w:color w:val="1F2937"/>
-          <w:sz w:val="22"/>
+          <w:sz w:val="21"/>
         </w:rPr>
         <w:t xml:space="preserve">Stop when </w:t>
       </w:r>
@@ -4496,7 +4630,7 @@
         <w:rPr>
           <w:rFonts w:ascii="Menlo" w:hAnsi="Menlo" w:eastAsia="Menlo" w:cs="Menlo"/>
           <w:color w:val="1F4D78"/>
-          <w:sz w:val="20"/>
+          <w:sz w:val="19"/>
         </w:rPr>
         <w:t>LINKEDIN-DRAFTS.md</w:t>
       </w:r>
@@ -4504,7 +4638,7 @@
         <w:rPr>
           <w:rFonts w:ascii="Calibri" w:hAnsi="Calibri" w:eastAsia="Calibri" w:cs="Calibri"/>
           <w:color w:val="1F2937"/>
-          <w:sz w:val="22"/>
+          <w:sz w:val="21"/>
         </w:rPr>
         <w:t xml:space="preserve"> says </w:t>
       </w:r>
@@ -4512,7 +4646,7 @@
         <w:rPr>
           <w:rFonts w:ascii="Menlo" w:hAnsi="Menlo" w:eastAsia="Menlo" w:cs="Menlo"/>
           <w:color w:val="1F4D78"/>
-          <w:sz w:val="20"/>
+          <w:sz w:val="19"/>
         </w:rPr>
         <w:t>DRAFT - NOT PUBLISHED</w:t>
       </w:r>
@@ -4520,14 +4654,14 @@
         <w:rPr>
           <w:rFonts w:ascii="Calibri" w:hAnsi="Calibri" w:eastAsia="Calibri" w:cs="Calibri"/>
           <w:color w:val="1F2937"/>
-          <w:sz w:val="22"/>
+          <w:sz w:val="21"/>
         </w:rPr>
         <w:t>, lists your supplied facts, gives three headline choices and one About draft, and says no LinkedIn action occurred.</w:t>
       </w:r>
     </w:p>
     <w:p>
       <w:pPr>
-        <w:spacing w:before="60" w:after="180" w:line="300" w:lineRule="auto"/>
+        <w:spacing w:before="60" w:after="180" w:line="288" w:lineRule="auto"/>
         <w:ind w:left="173"/>
         <w:shd w:fill="FFF8E8"/>
       </w:pPr>
@@ -4536,7 +4670,7 @@
           <w:rFonts w:ascii="Calibri" w:hAnsi="Calibri" w:eastAsia="Calibri" w:cs="Calibri"/>
           <w:b/>
           <w:color w:val="0B2545"/>
-          <w:sz w:val="22"/>
+          <w:sz w:val="21"/>
         </w:rPr>
         <w:t>DONE WHEN:</w:t>
       </w:r>
@@ -4544,7 +4678,7 @@
         <w:rPr>
           <w:rFonts w:ascii="Calibri" w:hAnsi="Calibri" w:eastAsia="Calibri" w:cs="Calibri"/>
           <w:color w:val="0B2545"/>
-          <w:sz w:val="22"/>
+          <w:sz w:val="21"/>
         </w:rPr>
         <w:t xml:space="preserve"> You can show the local draft. Nothing was posted or messaged.</w:t>
       </w:r>
@@ -4564,13 +4698,13 @@
     </w:p>
     <w:p>
       <w:pPr>
-        <w:spacing w:before="0" w:after="120" w:line="300" w:lineRule="auto"/>
+        <w:spacing w:before="0" w:after="120" w:line="288" w:lineRule="auto"/>
       </w:pPr>
       <w:r>
         <w:rPr>
           <w:rFonts w:ascii="Calibri" w:hAnsi="Calibri" w:eastAsia="Calibri" w:cs="Calibri"/>
           <w:color w:val="1F2937"/>
-          <w:sz w:val="22"/>
+          <w:sz w:val="21"/>
         </w:rPr>
         <w:t>Bring the laptop or screenshots that show:</w:t>
       </w:r>
@@ -4581,13 +4715,13 @@
           <w:ilvl w:val="0"/>
           <w:numId w:val="111"/>
         </w:numPr>
-        <w:spacing w:before="0" w:after="80" w:line="300" w:lineRule="auto"/>
+        <w:spacing w:before="0" w:after="80" w:line="288" w:lineRule="auto"/>
       </w:pPr>
       <w:r>
         <w:rPr>
           <w:rFonts w:ascii="Calibri" w:hAnsi="Calibri" w:eastAsia="Calibri" w:cs="Calibri"/>
           <w:color w:val="1F2937"/>
-          <w:sz w:val="22"/>
+          <w:sz w:val="21"/>
         </w:rPr>
         <w:t xml:space="preserve">Email project open with </w:t>
       </w:r>
@@ -4595,7 +4729,7 @@
         <w:rPr>
           <w:rFonts w:ascii="Menlo" w:hAnsi="Menlo" w:eastAsia="Menlo" w:cs="Menlo"/>
           <w:color w:val="1F4D78"/>
-          <w:sz w:val="20"/>
+          <w:sz w:val="19"/>
         </w:rPr>
         <w:t>EMAIL-TRIAGE-REPORT.md</w:t>
       </w:r>
@@ -4603,7 +4737,7 @@
         <w:rPr>
           <w:rFonts w:ascii="Calibri" w:hAnsi="Calibri" w:eastAsia="Calibri" w:cs="Calibri"/>
           <w:color w:val="1F2937"/>
-          <w:sz w:val="22"/>
+          <w:sz w:val="21"/>
         </w:rPr>
         <w:t>.</w:t>
       </w:r>
@@ -4614,13 +4748,13 @@
           <w:ilvl w:val="0"/>
           <w:numId w:val="111"/>
         </w:numPr>
-        <w:spacing w:before="0" w:after="80" w:line="300" w:lineRule="auto"/>
+        <w:spacing w:before="0" w:after="80" w:line="288" w:lineRule="auto"/>
       </w:pPr>
       <w:r>
         <w:rPr>
           <w:rFonts w:ascii="Calibri" w:hAnsi="Calibri" w:eastAsia="Calibri" w:cs="Calibri"/>
           <w:color w:val="1F2937"/>
-          <w:sz w:val="22"/>
+          <w:sz w:val="21"/>
         </w:rPr>
         <w:t xml:space="preserve">Drive project open with </w:t>
       </w:r>
@@ -4628,17 +4762,17 @@
         <w:rPr>
           <w:rFonts w:ascii="Menlo" w:hAnsi="Menlo" w:eastAsia="Menlo" w:cs="Menlo"/>
           <w:color w:val="1F4D78"/>
-          <w:sz w:val="20"/>
-        </w:rPr>
-        <w:t>DRIVE-INVENTORY.md</w:t>
+          <w:sz w:val="19"/>
+        </w:rPr>
+        <w:t>DRIVE-INDEX.md</w:t>
       </w:r>
       <w:r>
         <w:rPr>
           <w:rFonts w:ascii="Calibri" w:hAnsi="Calibri" w:eastAsia="Calibri" w:cs="Calibri"/>
           <w:color w:val="1F2937"/>
-          <w:sz w:val="22"/>
-        </w:rPr>
-        <w:t>.</w:t>
+          <w:sz w:val="21"/>
+        </w:rPr>
+        <w:t xml:space="preserve"> and its saved cursor.</w:t>
       </w:r>
     </w:p>
     <w:p>
@@ -4647,13 +4781,13 @@
           <w:ilvl w:val="0"/>
           <w:numId w:val="111"/>
         </w:numPr>
-        <w:spacing w:before="0" w:after="80" w:line="300" w:lineRule="auto"/>
+        <w:spacing w:before="0" w:after="80" w:line="288" w:lineRule="auto"/>
       </w:pPr>
       <w:r>
         <w:rPr>
           <w:rFonts w:ascii="Calibri" w:hAnsi="Calibri" w:eastAsia="Calibri" w:cs="Calibri"/>
           <w:color w:val="1F2937"/>
-          <w:sz w:val="22"/>
+          <w:sz w:val="21"/>
         </w:rPr>
         <w:t>The final evidence row and validator pass in each project.</w:t>
       </w:r>
@@ -4664,13 +4798,13 @@
           <w:ilvl w:val="0"/>
           <w:numId w:val="111"/>
         </w:numPr>
-        <w:spacing w:before="0" w:after="80" w:line="300" w:lineRule="auto"/>
+        <w:spacing w:before="0" w:after="80" w:line="288" w:lineRule="auto"/>
       </w:pPr>
       <w:r>
         <w:rPr>
           <w:rFonts w:ascii="Calibri" w:hAnsi="Calibri" w:eastAsia="Calibri" w:cs="Calibri"/>
           <w:color w:val="1F2937"/>
-          <w:sz w:val="22"/>
+          <w:sz w:val="21"/>
         </w:rPr>
         <w:t xml:space="preserve">Optional: </w:t>
       </w:r>
@@ -4678,7 +4812,7 @@
         <w:rPr>
           <w:rFonts w:ascii="Menlo" w:hAnsi="Menlo" w:eastAsia="Menlo" w:cs="Menlo"/>
           <w:color w:val="1F4D78"/>
-          <w:sz w:val="20"/>
+          <w:sz w:val="19"/>
         </w:rPr>
         <w:t>LINKEDIN-DRAFTS.md</w:t>
       </w:r>
@@ -4686,7 +4820,7 @@
         <w:rPr>
           <w:rFonts w:ascii="Calibri" w:hAnsi="Calibri" w:eastAsia="Calibri" w:cs="Calibri"/>
           <w:color w:val="1F2937"/>
-          <w:sz w:val="22"/>
+          <w:sz w:val="21"/>
         </w:rPr>
         <w:t xml:space="preserve"> marked </w:t>
       </w:r>
@@ -4694,7 +4828,7 @@
         <w:rPr>
           <w:rFonts w:ascii="Menlo" w:hAnsi="Menlo" w:eastAsia="Menlo" w:cs="Menlo"/>
           <w:color w:val="1F4D78"/>
-          <w:sz w:val="20"/>
+          <w:sz w:val="19"/>
         </w:rPr>
         <w:t>DRAFT - NOT PUBLISHED</w:t>
       </w:r>
@@ -4702,20 +4836,20 @@
         <w:rPr>
           <w:rFonts w:ascii="Calibri" w:hAnsi="Calibri" w:eastAsia="Calibri" w:cs="Calibri"/>
           <w:color w:val="1F2937"/>
-          <w:sz w:val="22"/>
+          <w:sz w:val="21"/>
         </w:rPr>
         <w:t>.</w:t>
       </w:r>
     </w:p>
     <w:p>
       <w:pPr>
-        <w:spacing w:before="0" w:after="120" w:line="300" w:lineRule="auto"/>
+        <w:spacing w:before="0" w:after="120" w:line="288" w:lineRule="auto"/>
       </w:pPr>
       <w:r>
         <w:rPr>
           <w:rFonts w:ascii="Calibri" w:hAnsi="Calibri" w:eastAsia="Calibri" w:cs="Calibri"/>
           <w:color w:val="1F2937"/>
-          <w:sz w:val="22"/>
+          <w:sz w:val="21"/>
         </w:rPr>
         <w:t>Do not bring email bodies, passwords, one-time codes, private HR details, banking information, or sensitive Drive content. Show the safe report headings and proof.</w:t>
       </w:r>
@@ -4735,13 +4869,13 @@
     </w:p>
     <w:p>
       <w:pPr>
-        <w:spacing w:before="0" w:after="120" w:line="300" w:lineRule="auto"/>
+        <w:spacing w:before="0" w:after="120" w:line="288" w:lineRule="auto"/>
       </w:pPr>
       <w:r>
         <w:rPr>
           <w:rFonts w:ascii="Calibri" w:hAnsi="Calibri" w:eastAsia="Calibri" w:cs="Calibri"/>
           <w:color w:val="1F2937"/>
-          <w:sz w:val="22"/>
+          <w:sz w:val="21"/>
         </w:rPr>
         <w:t>Stop and use the Setup Helper if:</w:t>
       </w:r>
@@ -4752,13 +4886,13 @@
           <w:ilvl w:val="0"/>
           <w:numId w:val="113"/>
         </w:numPr>
-        <w:spacing w:before="0" w:after="80" w:line="300" w:lineRule="auto"/>
+        <w:spacing w:before="0" w:after="80" w:line="288" w:lineRule="auto"/>
       </w:pPr>
       <w:r>
         <w:rPr>
           <w:rFonts w:ascii="Calibri" w:hAnsi="Calibri" w:eastAsia="Calibri" w:cs="Calibri"/>
           <w:color w:val="1F2937"/>
-          <w:sz w:val="22"/>
+          <w:sz w:val="21"/>
         </w:rPr>
         <w:t>the correct folder is not visible;</w:t>
       </w:r>
@@ -4769,13 +4903,13 @@
           <w:ilvl w:val="0"/>
           <w:numId w:val="113"/>
         </w:numPr>
-        <w:spacing w:before="0" w:after="80" w:line="300" w:lineRule="auto"/>
+        <w:spacing w:before="0" w:after="80" w:line="288" w:lineRule="auto"/>
       </w:pPr>
       <w:r>
         <w:rPr>
           <w:rFonts w:ascii="Calibri" w:hAnsi="Calibri" w:eastAsia="Calibri" w:cs="Calibri"/>
           <w:color w:val="1F2937"/>
-          <w:sz w:val="22"/>
+          <w:sz w:val="21"/>
         </w:rPr>
         <w:t>the app or button names do not match;</w:t>
       </w:r>
@@ -4786,13 +4920,13 @@
           <w:ilvl w:val="0"/>
           <w:numId w:val="113"/>
         </w:numPr>
-        <w:spacing w:before="0" w:after="80" w:line="300" w:lineRule="auto"/>
+        <w:spacing w:before="0" w:after="80" w:line="288" w:lineRule="auto"/>
       </w:pPr>
       <w:r>
         <w:rPr>
           <w:rFonts w:ascii="Calibri" w:hAnsi="Calibri" w:eastAsia="Calibri" w:cs="Calibri"/>
           <w:color w:val="1F2937"/>
-          <w:sz w:val="22"/>
+          <w:sz w:val="21"/>
         </w:rPr>
         <w:t>the company plugin cannot be installed or connected;</w:t>
       </w:r>
@@ -4803,13 +4937,13 @@
           <w:ilvl w:val="0"/>
           <w:numId w:val="113"/>
         </w:numPr>
-        <w:spacing w:before="0" w:after="80" w:line="300" w:lineRule="auto"/>
+        <w:spacing w:before="0" w:after="80" w:line="288" w:lineRule="auto"/>
       </w:pPr>
       <w:r>
         <w:rPr>
           <w:rFonts w:ascii="Calibri" w:hAnsi="Calibri" w:eastAsia="Calibri" w:cs="Calibri"/>
           <w:color w:val="1F2937"/>
-          <w:sz w:val="22"/>
+          <w:sz w:val="21"/>
         </w:rPr>
         <w:t>the wrong account is connected;</w:t>
       </w:r>
@@ -4820,13 +4954,13 @@
           <w:ilvl w:val="0"/>
           <w:numId w:val="113"/>
         </w:numPr>
-        <w:spacing w:before="0" w:after="80" w:line="300" w:lineRule="auto"/>
+        <w:spacing w:before="0" w:after="80" w:line="288" w:lineRule="auto"/>
       </w:pPr>
       <w:r>
         <w:rPr>
           <w:rFonts w:ascii="Calibri" w:hAnsi="Calibri" w:eastAsia="Calibri" w:cs="Calibri"/>
           <w:color w:val="1F2937"/>
-          <w:sz w:val="22"/>
+          <w:sz w:val="21"/>
         </w:rPr>
         <w:t>a permission asks for Full access;</w:t>
       </w:r>
@@ -4837,13 +4971,13 @@
           <w:ilvl w:val="0"/>
           <w:numId w:val="113"/>
         </w:numPr>
-        <w:spacing w:before="0" w:after="80" w:line="300" w:lineRule="auto"/>
+        <w:spacing w:before="0" w:after="80" w:line="288" w:lineRule="auto"/>
       </w:pPr>
       <w:r>
         <w:rPr>
           <w:rFonts w:ascii="Calibri" w:hAnsi="Calibri" w:eastAsia="Calibri" w:cs="Calibri"/>
           <w:color w:val="1F2937"/>
-          <w:sz w:val="22"/>
+          <w:sz w:val="21"/>
         </w:rPr>
         <w:t>the AI asks for a password, one-time code, Terminal, PowerShell, Command Prompt, Python, a CLI, Git or GitHub;</w:t>
       </w:r>
@@ -4854,26 +4988,26 @@
           <w:ilvl w:val="0"/>
           <w:numId w:val="113"/>
         </w:numPr>
-        <w:spacing w:before="0" w:after="80" w:line="300" w:lineRule="auto"/>
+        <w:spacing w:before="0" w:after="80" w:line="288" w:lineRule="auto"/>
       </w:pPr>
       <w:r>
         <w:rPr>
           <w:rFonts w:ascii="Calibri" w:hAnsi="Calibri" w:eastAsia="Calibri" w:cs="Calibri"/>
           <w:color w:val="1F2937"/>
-          <w:sz w:val="22"/>
+          <w:sz w:val="21"/>
         </w:rPr>
         <w:t>the task reaches medical, dosage, certification, legal, spend, credentials, banking, personal HR or another sensitive decision.</w:t>
       </w:r>
     </w:p>
     <w:p>
       <w:pPr>
-        <w:spacing w:before="0" w:after="120" w:line="300" w:lineRule="auto"/>
+        <w:spacing w:before="0" w:after="120" w:line="288" w:lineRule="auto"/>
       </w:pPr>
       <w:r>
         <w:rPr>
           <w:rFonts w:ascii="Calibri" w:hAnsi="Calibri" w:eastAsia="Calibri" w:cs="Calibri"/>
           <w:color w:val="1F2937"/>
-          <w:sz w:val="22"/>
+          <w:sz w:val="21"/>
         </w:rPr>
         <w:t>Setup Helper resolves safe setup. Ambuj receives only an unavoidable company-access problem. Abilash receives owner decisions and every Gate 0 issue.</w:t>
       </w:r>
@@ -4897,13 +5031,13 @@
           <w:ilvl w:val="0"/>
           <w:numId w:val="115"/>
         </w:numPr>
-        <w:spacing w:before="0" w:after="80" w:line="300" w:lineRule="auto"/>
+        <w:spacing w:before="0" w:after="80" w:line="288" w:lineRule="auto"/>
       </w:pPr>
       <w:r>
         <w:rPr>
           <w:rFonts w:ascii="Calibri" w:hAnsi="Calibri" w:eastAsia="Calibri" w:cs="Calibri"/>
           <w:color w:val="1F2937"/>
-          <w:sz w:val="22"/>
+          <w:sz w:val="21"/>
         </w:rPr>
         <w:t>ChatGPT quickstart: https://learn.chatgpt.com/docs/quickstart</w:t>
       </w:r>
@@ -4914,13 +5048,13 @@
           <w:ilvl w:val="0"/>
           <w:numId w:val="115"/>
         </w:numPr>
-        <w:spacing w:before="0" w:after="80" w:line="300" w:lineRule="auto"/>
+        <w:spacing w:before="0" w:after="80" w:line="288" w:lineRule="auto"/>
       </w:pPr>
       <w:r>
         <w:rPr>
           <w:rFonts w:ascii="Calibri" w:hAnsi="Calibri" w:eastAsia="Calibri" w:cs="Calibri"/>
           <w:color w:val="1F2937"/>
-          <w:sz w:val="22"/>
+          <w:sz w:val="21"/>
         </w:rPr>
         <w:t>ChatGPT desktop app: https://learn.chatgpt.com/docs/app</w:t>
       </w:r>
@@ -4931,13 +5065,13 @@
           <w:ilvl w:val="0"/>
           <w:numId w:val="115"/>
         </w:numPr>
-        <w:spacing w:before="0" w:after="80" w:line="300" w:lineRule="auto"/>
+        <w:spacing w:before="0" w:after="80" w:line="288" w:lineRule="auto"/>
       </w:pPr>
       <w:r>
         <w:rPr>
           <w:rFonts w:ascii="Calibri" w:hAnsi="Calibri" w:eastAsia="Calibri" w:cs="Calibri"/>
           <w:color w:val="1F2937"/>
-          <w:sz w:val="22"/>
+          <w:sz w:val="21"/>
         </w:rPr>
         <w:t>Projects and chats: https://learn.chatgpt.com/docs/projects</w:t>
       </w:r>
@@ -4948,13 +5082,13 @@
           <w:ilvl w:val="0"/>
           <w:numId w:val="115"/>
         </w:numPr>
-        <w:spacing w:before="0" w:after="80" w:line="300" w:lineRule="auto"/>
+        <w:spacing w:before="0" w:after="80" w:line="288" w:lineRule="auto"/>
       </w:pPr>
       <w:r>
         <w:rPr>
           <w:rFonts w:ascii="Calibri" w:hAnsi="Calibri" w:eastAsia="Calibri" w:cs="Calibri"/>
           <w:color w:val="1F2937"/>
-          <w:sz w:val="22"/>
+          <w:sz w:val="21"/>
         </w:rPr>
         <w:t>Plugins: https://learn.chatgpt.com/docs/plugins</w:t>
       </w:r>
@@ -4965,28 +5099,15 @@
           <w:ilvl w:val="0"/>
           <w:numId w:val="115"/>
         </w:numPr>
-        <w:spacing w:before="0" w:after="80" w:line="300" w:lineRule="auto"/>
+        <w:spacing w:before="0" w:after="80" w:line="288" w:lineRule="auto"/>
       </w:pPr>
       <w:r>
         <w:rPr>
           <w:rFonts w:ascii="Calibri" w:hAnsi="Calibri" w:eastAsia="Calibri" w:cs="Calibri"/>
           <w:color w:val="1F2937"/>
-          <w:sz w:val="22"/>
+          <w:sz w:val="21"/>
         </w:rPr>
         <w:t>Email inbox use case: https://learn.chatgpt.com/use-cases/manage-your-inbox</w:t>
-      </w:r>
-    </w:p>
-    <w:p>
-      <w:pPr>
-        <w:spacing w:before="0" w:after="120" w:line="300" w:lineRule="auto"/>
-      </w:pPr>
-      <w:r>
-        <w:rPr>
-          <w:rFonts w:ascii="Calibri" w:hAnsi="Calibri" w:eastAsia="Calibri" w:cs="Calibri"/>
-          <w:color w:val="1F2937"/>
-          <w:sz w:val="22"/>
-        </w:rPr>
-        <w:t>Teaching pattern adapted from the owner-shared Outskill document, “Build Your Own Prompts Using Meta Prompts - For Videos”: show the whole loop, give an exact prompt, show what a good result looks like, then repeat the loop.</w:t>
       </w:r>
     </w:p>
     <w:sectPr>
@@ -6504,12 +6625,12 @@
     <w:qFormat/>
     <w:rsid w:val="00FC693F"/>
     <w:pPr>
-      <w:spacing w:before="0" w:after="120" w:line="300" w:lineRule="auto"/>
+      <w:spacing w:before="0" w:after="120" w:line="288" w:lineRule="auto"/>
     </w:pPr>
     <w:rPr>
       <w:rFonts w:ascii="Calibri" w:hAnsi="Calibri"/>
       <w:color w:val="1F2937"/>
-      <w:sz w:val="22"/>
+      <w:sz w:val="21"/>
     </w:rPr>
   </w:style>
   <w:style w:type="paragraph" w:styleId="Header">

</xml_diff>

<commit_message>
Add daily email triage rollout v1.3
</commit_message>
<xml_diff>
--- a/packages/kairali/homework/EVERYONE-ELSE-AI-HUMAN-HOMEWORK-GUIDE.docx
+++ b/packages/kairali/homework/EVERYONE-ELSE-AI-HUMAN-HOMEWORK-GUIDE.docx
@@ -126,10 +126,13 @@
                 <w:color w:val="1F2937"/>
                 <w:sz w:val="20"/>
               </w:rPr>
-              <w:t>Two separate, read-only local projects</w:t>
+              <w:t>Daily Email worker + read-only Drive Index</w:t>
             </w:r>
           </w:p>
         </w:tc>
+        <w:trPr>
+          <w:tblHeader/>
+        </w:trPr>
       </w:tr>
       <w:tr>
         <w:tc>
@@ -252,7 +255,7 @@
           <w:color w:val="1F2937"/>
           <w:sz w:val="21"/>
         </w:rPr>
-        <w:t xml:space="preserve"> v1.2.0 company kit. The public kit is the clean setup and update source; it contains no live company work or secrets, so no GitHub invitation or collaborator seat is needed. Ask the Setup Helper to obtain and verify the kit. Then copy the Email and Drive starters into separate local work folders. Do not use the public distribution repository as a work project.</w:t>
+        <w:t xml:space="preserve"> v1.3.0 company kit. The public kit is the clean setup and update source; it contains no live company work or secrets, so no GitHub invitation or collaborator seat is needed. Ask the Setup Helper to obtain and verify the kit. Then copy the Email and Drive starters into separate local work folders. Do not use the public distribution repository as a work project.</w:t>
       </w:r>
     </w:p>
     <w:p>
@@ -298,7 +301,7 @@
           <w:color w:val="1F2937"/>
           <w:sz w:val="21"/>
         </w:rPr>
-        <w:t>Email Triage AI Human</w:t>
+        <w:t>Daily Email Triage AI Human</w:t>
       </w:r>
       <w:r>
         <w:rPr>
@@ -306,7 +309,7 @@
           <w:color w:val="1F2937"/>
           <w:sz w:val="21"/>
         </w:rPr>
-        <w:t xml:space="preserve"> - reads up to 25 inbox messages and makes a local review list. It does not change your mailbox.</w:t>
+        <w:t xml:space="preserve"> - asks what local time you want the brief, proves a read-only 25-message pilot, then runs a concise daily importance report. You choose whether it is brief-only or may safely label and file clearly low-risk mail.</w:t>
       </w:r>
     </w:p>
     <w:p>
@@ -401,7 +404,7 @@
           <w:color w:val="1F2937"/>
           <w:sz w:val="21"/>
         </w:rPr>
-        <w:t>Ask the Setup Helper to find the verified public v1.2.0 company kit on your screen.</w:t>
+        <w:t>Ask the Setup Helper to find the verified public v1.3.0 company kit on your screen.</w:t>
       </w:r>
     </w:p>
     <w:p>
@@ -503,6 +506,23 @@
           <w:sz w:val="21"/>
         </w:rPr>
         <w:t>Paste the exact prompt.</w:t>
+      </w:r>
+    </w:p>
+    <w:p>
+      <w:pPr>
+        <w:numPr>
+          <w:ilvl w:val="0"/>
+          <w:numId w:val="13"/>
+        </w:numPr>
+        <w:spacing w:before="0" w:after="80" w:line="288" w:lineRule="auto"/>
+      </w:pPr>
+      <w:r>
+        <w:rPr>
+          <w:rFonts w:ascii="Calibri" w:hAnsi="Calibri" w:eastAsia="Calibri" w:cs="Calibri"/>
+          <w:color w:val="1F2937"/>
+          <w:sz w:val="21"/>
+        </w:rPr>
+        <w:t>For Email, choose your daily local time, review the read-only pilot, choose the filing mode and verify the active automation.</w:t>
       </w:r>
     </w:p>
     <w:p>
@@ -828,6 +848,9 @@
             </w:r>
           </w:p>
         </w:tc>
+        <w:trPr>
+          <w:tblHeader/>
+        </w:trPr>
       </w:tr>
     </w:tbl>
     <w:p>
@@ -890,7 +913,7 @@
           <w:color w:val="1F4D78"/>
           <w:sz w:val="19"/>
         </w:rPr>
-        <w:t>kairali-company-rollout-1.2.0.zip</w:t>
+        <w:t>kairali-company-rollout-1.3.0.zip</w:t>
       </w:r>
       <w:r>
         <w:rPr>
@@ -1423,7 +1446,7 @@
           <w:color w:val="1F2937"/>
           <w:sz w:val="21"/>
         </w:rPr>
-        <w:t>If the ZIP is not visible, do not search the whole computer. Paste the Setup Helper rescue. The helper checks Downloads, obtains the protected public v1.2.0 kit when safe, and asks Ambuj only if the approved source or access decision is missing.</w:t>
+        <w:t>If the ZIP is not visible, do not search the whole computer. Paste the Setup Helper rescue. The helper checks Downloads, obtains the protected public v1.3.0 kit when safe, and asks Ambuj only if the approved source or access decision is missing.</w:t>
       </w:r>
     </w:p>
     <w:p>
@@ -3037,7 +3060,7 @@
           <w:color w:val="2E74B5"/>
           <w:sz w:val="26"/>
         </w:rPr>
-        <w:t>Step 5 - connect Gmail only if it is missing</w:t>
+        <w:t>Step 5 - connect Gmail only if it is not already connected</w:t>
       </w:r>
     </w:p>
     <w:p>
@@ -3055,7 +3078,7 @@
           <w:color w:val="1F2937"/>
           <w:sz w:val="21"/>
         </w:rPr>
-        <w:t xml:space="preserve">Open the </w:t>
+        <w:t xml:space="preserve">Open </w:t>
       </w:r>
       <w:r>
         <w:rPr>
@@ -3064,7 +3087,7 @@
           <w:color w:val="1F2937"/>
           <w:sz w:val="21"/>
         </w:rPr>
-        <w:t>Plugins</w:t>
+        <w:t>Settings</w:t>
       </w:r>
       <w:r>
         <w:rPr>
@@ -3072,7 +3095,24 @@
           <w:color w:val="1F2937"/>
           <w:sz w:val="21"/>
         </w:rPr>
-        <w:t xml:space="preserve"> tab in the ChatGPT desktop app.</w:t>
+        <w:t xml:space="preserve">, then </w:t>
+      </w:r>
+      <w:r>
+        <w:rPr>
+          <w:rFonts w:ascii="Calibri" w:hAnsi="Calibri" w:eastAsia="Calibri" w:cs="Calibri"/>
+          <w:b/>
+          <w:color w:val="1F2937"/>
+          <w:sz w:val="21"/>
+        </w:rPr>
+        <w:t>Apps</w:t>
+      </w:r>
+      <w:r>
+        <w:rPr>
+          <w:rFonts w:ascii="Calibri" w:hAnsi="Calibri" w:eastAsia="Calibri" w:cs="Calibri"/>
+          <w:color w:val="1F2937"/>
+          <w:sz w:val="21"/>
+        </w:rPr>
+        <w:t>, in the ChatGPT desktop app.</w:t>
       </w:r>
     </w:p>
     <w:p>
@@ -3096,7 +3136,7 @@
           <w:color w:val="0B2545"/>
           <w:sz w:val="21"/>
         </w:rPr>
-        <w:t xml:space="preserve"> The plugin directory is visible.</w:t>
+        <w:t xml:space="preserve"> The Apps directory is visible.</w:t>
       </w:r>
     </w:p>
     <w:p>
@@ -3154,7 +3194,7 @@
           <w:color w:val="0B2545"/>
           <w:sz w:val="21"/>
         </w:rPr>
-        <w:t xml:space="preserve"> The Gmail plugin is visible as installed or available to install.</w:t>
+        <w:t xml:space="preserve"> The Gmail connector is visible under Apps as connected or available to connect.</w:t>
       </w:r>
     </w:p>
     <w:p>
@@ -3172,7 +3212,7 @@
           <w:color w:val="1F2937"/>
           <w:sz w:val="21"/>
         </w:rPr>
-        <w:t>If it is already installed, do not install it again. Return to the Email project.</w:t>
+        <w:t>If it is already connected to the approved company account, do not connect it again. Return to the Email project.</w:t>
       </w:r>
     </w:p>
     <w:p>
@@ -3214,7 +3254,24 @@
           <w:color w:val="1F2937"/>
           <w:sz w:val="21"/>
         </w:rPr>
-        <w:t>If it is missing, click its plus or install button.</w:t>
+        <w:t xml:space="preserve">If it is available but not connected, click </w:t>
+      </w:r>
+      <w:r>
+        <w:rPr>
+          <w:rFonts w:ascii="Calibri" w:hAnsi="Calibri" w:eastAsia="Calibri" w:cs="Calibri"/>
+          <w:b/>
+          <w:color w:val="1F2937"/>
+          <w:sz w:val="21"/>
+        </w:rPr>
+        <w:t>Connect</w:t>
+      </w:r>
+      <w:r>
+        <w:rPr>
+          <w:rFonts w:ascii="Calibri" w:hAnsi="Calibri" w:eastAsia="Calibri" w:cs="Calibri"/>
+          <w:color w:val="1F2937"/>
+          <w:sz w:val="21"/>
+        </w:rPr>
+        <w:t>.</w:t>
       </w:r>
     </w:p>
     <w:p>
@@ -3238,7 +3295,7 @@
           <w:color w:val="0B2545"/>
           <w:sz w:val="21"/>
         </w:rPr>
-        <w:t xml:space="preserve"> Gmail shows as installed.</w:t>
+        <w:t xml:space="preserve"> The provider login or account-choice screen appears.</w:t>
       </w:r>
     </w:p>
     <w:p>
@@ -3408,7 +3465,7 @@
           <w:color w:val="0B2545"/>
           <w:sz w:val="21"/>
         </w:rPr>
-        <w:t xml:space="preserve"> and starts with no more than 25 inbox messages.</w:t>
+        <w:t>, asks what local time you want the daily brief and starts the read-only pilot with no more than 25 Inbox messages.</w:t>
       </w:r>
     </w:p>
     <w:p>
@@ -3437,7 +3494,105 @@
           <w:color w:val="1F2937"/>
           <w:sz w:val="21"/>
         </w:rPr>
-        <w:t>. Do not shorten it: the last lines are the rules that stop mailbox changes.</w:t>
+        <w:t>. Do not shorten it: the last lines prove the pilot before scheduling and protect your mailbox.</w:t>
+      </w:r>
+    </w:p>
+    <w:p>
+      <w:pPr>
+        <w:spacing w:before="0" w:after="120" w:line="288" w:lineRule="auto"/>
+      </w:pPr>
+      <w:r>
+        <w:rPr>
+          <w:rFonts w:ascii="Calibri" w:hAnsi="Calibri" w:eastAsia="Calibri" w:cs="Calibri"/>
+          <w:color w:val="1F2937"/>
+          <w:sz w:val="21"/>
+        </w:rPr>
+        <w:t xml:space="preserve">After the pilot, Codex reads the report and the exact safe-filing rules to you. Choose </w:t>
+      </w:r>
+      <w:r>
+        <w:rPr>
+          <w:rFonts w:ascii="Menlo" w:hAnsi="Menlo" w:eastAsia="Menlo" w:cs="Menlo"/>
+          <w:color w:val="1F4D78"/>
+          <w:sz w:val="19"/>
+        </w:rPr>
+        <w:t>BRIEF ONLY</w:t>
+      </w:r>
+      <w:r>
+        <w:rPr>
+          <w:rFonts w:ascii="Calibri" w:hAnsi="Calibri" w:eastAsia="Calibri" w:cs="Calibri"/>
+          <w:color w:val="1F2937"/>
+          <w:sz w:val="21"/>
+        </w:rPr>
+        <w:t xml:space="preserve"> or </w:t>
+      </w:r>
+      <w:r>
+        <w:rPr>
+          <w:rFonts w:ascii="Menlo" w:hAnsi="Menlo" w:eastAsia="Menlo" w:cs="Menlo"/>
+          <w:color w:val="1F4D78"/>
+          <w:sz w:val="19"/>
+        </w:rPr>
+        <w:t>BRIEF + SAFE FILING</w:t>
+      </w:r>
+      <w:r>
+        <w:rPr>
+          <w:rFonts w:ascii="Calibri" w:hAnsi="Calibri" w:eastAsia="Calibri" w:cs="Calibri"/>
+          <w:color w:val="1F2937"/>
+          <w:sz w:val="21"/>
+        </w:rPr>
+        <w:t>. Safe filing is limited to the approved AI labels and clearly low-risk mail. It never deletes, sends, unsubscribes or changes a permanent Gmail filter.</w:t>
+      </w:r>
+    </w:p>
+    <w:p>
+      <w:pPr>
+        <w:spacing w:before="60" w:after="180" w:line="288" w:lineRule="auto"/>
+        <w:ind w:left="173"/>
+        <w:shd w:fill="FFF8E8"/>
+      </w:pPr>
+      <w:r>
+        <w:rPr>
+          <w:rFonts w:ascii="Calibri" w:hAnsi="Calibri" w:eastAsia="Calibri" w:cs="Calibri"/>
+          <w:b/>
+          <w:color w:val="0B2545"/>
+          <w:sz w:val="21"/>
+        </w:rPr>
+        <w:t>DONE WHEN:</w:t>
+      </w:r>
+      <w:r>
+        <w:rPr>
+          <w:rFonts w:ascii="Calibri" w:hAnsi="Calibri" w:eastAsia="Calibri" w:cs="Calibri"/>
+          <w:color w:val="0B2545"/>
+          <w:sz w:val="21"/>
+        </w:rPr>
+        <w:t xml:space="preserve"> The daily automation card shows your approved local time and time zone, uses this exact Email project and tells the job to follow </w:t>
+      </w:r>
+      <w:r>
+        <w:rPr>
+          <w:rFonts w:ascii="Menlo" w:hAnsi="Menlo" w:eastAsia="Menlo" w:cs="Menlo"/>
+          <w:color w:val="1F4D78"/>
+          <w:sz w:val="19"/>
+        </w:rPr>
+        <w:t>DAILY-TRIAGE-PROMPT.md</w:t>
+      </w:r>
+      <w:r>
+        <w:rPr>
+          <w:rFonts w:ascii="Calibri" w:hAnsi="Calibri" w:eastAsia="Calibri" w:cs="Calibri"/>
+          <w:color w:val="0B2545"/>
+          <w:sz w:val="21"/>
+        </w:rPr>
+        <w:t>.</w:t>
+      </w:r>
+    </w:p>
+    <w:p>
+      <w:pPr>
+        <w:spacing w:before="0" w:after="120" w:line="288" w:lineRule="auto"/>
+      </w:pPr>
+      <w:r>
+        <w:rPr>
+          <w:rFonts w:ascii="Calibri" w:hAnsi="Calibri" w:eastAsia="Calibri" w:cs="Calibri"/>
+          <w:color w:val="1F2937"/>
+          <w:sz w:val="21"/>
+        </w:rPr>
+        <w:t>This is a local automation. The computer must be awake, ChatGPT must be running and the Email project must remain available at the chosen time.</w:t>
       </w:r>
     </w:p>
     <w:p>
@@ -3505,7 +3660,7 @@
           <w:color w:val="1F2937"/>
           <w:sz w:val="21"/>
         </w:rPr>
-        <w:t>It shows the selection rule and no more than 25 reviewed messages.</w:t>
+        <w:t>It shows the pilot selection rule and no more than 25 reviewed messages.</w:t>
       </w:r>
     </w:p>
     <w:p>
@@ -3522,7 +3677,7 @@
           <w:color w:val="1F2937"/>
           <w:sz w:val="21"/>
         </w:rPr>
-        <w:t>It uses REPLY, DECISION, READ, LOW PRIORITY and HUMAN REVIEW.</w:t>
+        <w:t>It uses NEEDS ACTION, WAITING / FOLLOW UP, WORTH READING, HUMAN REVIEW, FILTER HEALTH and RUN SUMMARY.</w:t>
       </w:r>
     </w:p>
     <w:p>
@@ -3556,7 +3711,7 @@
           <w:color w:val="1F2937"/>
           <w:sz w:val="21"/>
         </w:rPr>
-        <w:t>It says no email was sent, drafted, archived, labelled, deleted, moved, marked read or unread, and no attachment was opened.</w:t>
+        <w:t>The pilot says Gmail was unchanged and no permanent Gmail filter was changed.</w:t>
       </w:r>
     </w:p>
     <w:p>
@@ -3569,6 +3724,64 @@
       </w:pPr>
       <w:r>
         <w:rPr>
+          <w:rFonts w:ascii="Menlo" w:hAnsi="Menlo" w:eastAsia="Menlo" w:cs="Menlo"/>
+          <w:color w:val="1F4D78"/>
+          <w:sz w:val="19"/>
+        </w:rPr>
+        <w:t>PARAMETERS.md</w:t>
+      </w:r>
+      <w:r>
+        <w:rPr>
+          <w:rFonts w:ascii="Calibri" w:hAnsi="Calibri" w:eastAsia="Calibri" w:cs="Calibri"/>
+          <w:color w:val="1F2937"/>
+          <w:sz w:val="21"/>
+        </w:rPr>
+        <w:t xml:space="preserve"> shows your approved daily time, time zone and filing mode.</w:t>
+      </w:r>
+    </w:p>
+    <w:p>
+      <w:pPr>
+        <w:numPr>
+          <w:ilvl w:val="0"/>
+          <w:numId w:val="85"/>
+        </w:numPr>
+        <w:spacing w:before="0" w:after="80" w:line="288" w:lineRule="auto"/>
+      </w:pPr>
+      <w:r>
+        <w:rPr>
+          <w:rFonts w:ascii="Calibri" w:hAnsi="Calibri" w:eastAsia="Calibri" w:cs="Calibri"/>
+          <w:color w:val="1F2937"/>
+          <w:sz w:val="21"/>
+        </w:rPr>
+        <w:t xml:space="preserve">The daily automation card and </w:t>
+      </w:r>
+      <w:r>
+        <w:rPr>
+          <w:rFonts w:ascii="Menlo" w:hAnsi="Menlo" w:eastAsia="Menlo" w:cs="Menlo"/>
+          <w:color w:val="1F4D78"/>
+          <w:sz w:val="19"/>
+        </w:rPr>
+        <w:t>AUTOMATIONS.md</w:t>
+      </w:r>
+      <w:r>
+        <w:rPr>
+          <w:rFonts w:ascii="Calibri" w:hAnsi="Calibri" w:eastAsia="Calibri" w:cs="Calibri"/>
+          <w:color w:val="1F2937"/>
+          <w:sz w:val="21"/>
+        </w:rPr>
+        <w:t xml:space="preserve"> show the same schedule and project.</w:t>
+      </w:r>
+    </w:p>
+    <w:p>
+      <w:pPr>
+        <w:numPr>
+          <w:ilvl w:val="0"/>
+          <w:numId w:val="85"/>
+        </w:numPr>
+        <w:spacing w:before="0" w:after="80" w:line="288" w:lineRule="auto"/>
+      </w:pPr>
+      <w:r>
+        <w:rPr>
           <w:rFonts w:ascii="Calibri" w:hAnsi="Calibri" w:eastAsia="Calibri" w:cs="Calibri"/>
           <w:color w:val="1F2937"/>
           <w:sz w:val="21"/>
@@ -3597,7 +3810,7 @@
           <w:color w:val="0B2545"/>
           <w:sz w:val="21"/>
         </w:rPr>
-        <w:t xml:space="preserve"> You can show the report on your screen. A connected Gmail account alone is not completion.</w:t>
+        <w:t xml:space="preserve"> You can show the report and active daily automation on your screen. A connected Gmail account alone is not completion.</w:t>
       </w:r>
     </w:p>
     <w:p>
@@ -3808,7 +4021,7 @@
           <w:color w:val="2E74B5"/>
           <w:sz w:val="26"/>
         </w:rPr>
-        <w:t>Step 8 - connect Google Drive only if it is missing</w:t>
+        <w:t>Step 8 - connect Google Drive only if it is not already connected</w:t>
       </w:r>
     </w:p>
     <w:p>
@@ -3826,7 +4039,7 @@
           <w:color w:val="1F2937"/>
           <w:sz w:val="21"/>
         </w:rPr>
-        <w:t xml:space="preserve">Open the </w:t>
+        <w:t xml:space="preserve">Open </w:t>
       </w:r>
       <w:r>
         <w:rPr>
@@ -3835,7 +4048,7 @@
           <w:color w:val="1F2937"/>
           <w:sz w:val="21"/>
         </w:rPr>
-        <w:t>Plugins</w:t>
+        <w:t>Settings</w:t>
       </w:r>
       <w:r>
         <w:rPr>
@@ -3843,7 +4056,24 @@
           <w:color w:val="1F2937"/>
           <w:sz w:val="21"/>
         </w:rPr>
-        <w:t xml:space="preserve"> tab.</w:t>
+        <w:t xml:space="preserve">, then </w:t>
+      </w:r>
+      <w:r>
+        <w:rPr>
+          <w:rFonts w:ascii="Calibri" w:hAnsi="Calibri" w:eastAsia="Calibri" w:cs="Calibri"/>
+          <w:b/>
+          <w:color w:val="1F2937"/>
+          <w:sz w:val="21"/>
+        </w:rPr>
+        <w:t>Apps</w:t>
+      </w:r>
+      <w:r>
+        <w:rPr>
+          <w:rFonts w:ascii="Calibri" w:hAnsi="Calibri" w:eastAsia="Calibri" w:cs="Calibri"/>
+          <w:color w:val="1F2937"/>
+          <w:sz w:val="21"/>
+        </w:rPr>
+        <w:t>.</w:t>
       </w:r>
     </w:p>
     <w:p>
@@ -3867,7 +4097,7 @@
           <w:color w:val="0B2545"/>
           <w:sz w:val="21"/>
         </w:rPr>
-        <w:t xml:space="preserve"> The plugin directory is visible.</w:t>
+        <w:t xml:space="preserve"> The Apps directory is visible.</w:t>
       </w:r>
     </w:p>
     <w:p>
@@ -3925,7 +4155,7 @@
           <w:color w:val="0B2545"/>
           <w:sz w:val="21"/>
         </w:rPr>
-        <w:t xml:space="preserve"> The Google Drive plugin is visible as installed or available.</w:t>
+        <w:t xml:space="preserve"> The Google Drive app is visible as connected or available to connect.</w:t>
       </w:r>
     </w:p>
     <w:p>
@@ -3943,7 +4173,24 @@
           <w:color w:val="1F2937"/>
           <w:sz w:val="21"/>
         </w:rPr>
-        <w:t>If already installed, return to the Drive project. If missing, click its plus or install button, then start a new chat in the Drive project.</w:t>
+        <w:t xml:space="preserve">If already connected to the approved company account, return to the Drive project. If available but not connected, click </w:t>
+      </w:r>
+      <w:r>
+        <w:rPr>
+          <w:rFonts w:ascii="Calibri" w:hAnsi="Calibri" w:eastAsia="Calibri" w:cs="Calibri"/>
+          <w:b/>
+          <w:color w:val="1F2937"/>
+          <w:sz w:val="21"/>
+        </w:rPr>
+        <w:t>Connect</w:t>
+      </w:r>
+      <w:r>
+        <w:rPr>
+          <w:rFonts w:ascii="Calibri" w:hAnsi="Calibri" w:eastAsia="Calibri" w:cs="Calibri"/>
+          <w:color w:val="1F2937"/>
+          <w:sz w:val="21"/>
+        </w:rPr>
+        <w:t>, then start a new chat in the Drive project.</w:t>
       </w:r>
     </w:p>
     <w:p>
@@ -3967,7 +4214,7 @@
           <w:color w:val="0B2545"/>
           <w:sz w:val="21"/>
         </w:rPr>
-        <w:t xml:space="preserve"> The Drive project is open in a new chat with the plugin available.</w:t>
+        <w:t xml:space="preserve"> The Drive project is open in a new chat with the app available.</w:t>
       </w:r>
     </w:p>
     <w:p>
@@ -4928,7 +5175,7 @@
           <w:color w:val="1F2937"/>
           <w:sz w:val="21"/>
         </w:rPr>
-        <w:t>the company plugin cannot be installed or connected;</w:t>
+        <w:t>the company app cannot be enabled or connected;</w:t>
       </w:r>
     </w:p>
     <w:p>
@@ -5090,7 +5337,7 @@
           <w:color w:val="1F2937"/>
           <w:sz w:val="21"/>
         </w:rPr>
-        <w:t>Plugins: https://learn.chatgpt.com/docs/plugins</w:t>
+        <w:t>Apps: https://help.openai.com/en/articles/11487775-connectors-in-chatgpt</w:t>
       </w:r>
     </w:p>
     <w:p>

</xml_diff>

<commit_message>
Add v1.4 Saturday LinkedIn message assistant
</commit_message>
<xml_diff>
--- a/packages/kairali/homework/EVERYONE-ELSE-AI-HUMAN-HOMEWORK-GUIDE.docx
+++ b/packages/kairali/homework/EVERYONE-ELSE-AI-HUMAN-HOMEWORK-GUIDE.docx
@@ -40,7 +40,7 @@
           <w:color w:val="555555"/>
           <w:sz w:val="27"/>
         </w:rPr>
-        <w:t>Email Triage + Drive Inventory, with an optional LinkedIn Draft bonus</w:t>
+        <w:t>Email Triage + Drive Inventory, with an optional Saturday LinkedIn Message Assistant</w:t>
       </w:r>
     </w:p>
     <w:tbl>
@@ -56,6 +56,9 @@
         <w:gridCol w:w="4680"/>
       </w:tblGrid>
       <w:tr>
+        <w:trPr>
+          <w:tblHeader w:val="true"/>
+        </w:trPr>
         <w:tc>
           <w:tcPr>
             <w:tcW w:type="dxa" w:w="4680"/>
@@ -130,9 +133,6 @@
             </w:r>
           </w:p>
         </w:tc>
-        <w:trPr>
-          <w:tblHeader/>
-        </w:trPr>
       </w:tr>
       <w:tr>
         <w:tc>
@@ -255,7 +255,7 @@
           <w:color w:val="1F2937"/>
           <w:sz w:val="21"/>
         </w:rPr>
-        <w:t xml:space="preserve"> v1.3.0 company kit. The public kit is the clean setup and update source; it contains no live company work or secrets, so no GitHub invitation or collaborator seat is needed. Ask the Setup Helper to obtain and verify the kit. Then copy the Email and Drive starters into separate local work folders. Do not use the public distribution repository as a work project.</w:t>
+        <w:t xml:space="preserve"> v1.4.0 company kit. The public kit is the clean setup and update source; it contains no live company work or secrets, so no GitHub invitation or collaborator seat is needed. Ask the Setup Helper to obtain and verify the kit. Then copy the Email and Drive starters into separate local work folders. Do not use the public distribution repository as a work project.</w:t>
       </w:r>
     </w:p>
     <w:p>
@@ -353,7 +353,7 @@
           <w:color w:val="1F2937"/>
           <w:sz w:val="21"/>
         </w:rPr>
-        <w:t>Optional LinkedIn Draft AI Human</w:t>
+        <w:t>Optional Weekly LinkedIn Message Assistant</w:t>
       </w:r>
       <w:r>
         <w:rPr>
@@ -361,7 +361,24 @@
           <w:color w:val="1F2937"/>
           <w:sz w:val="21"/>
         </w:rPr>
-        <w:t xml:space="preserve"> - makes a local draft from facts you supply. It does not open LinkedIn or publish anything.</w:t>
+        <w:t xml:space="preserve"> - at your chosen Saturday time, prepares replies from message text you manually paste. It learns from your supplied prior replies, keeps uncertain drafts for your decision, and never accesses or sends through LinkedIn. You review and manually press </w:t>
+      </w:r>
+      <w:r>
+        <w:rPr>
+          <w:rFonts w:ascii="Calibri" w:hAnsi="Calibri" w:eastAsia="Calibri" w:cs="Calibri"/>
+          <w:b/>
+          <w:color w:val="1F2937"/>
+          <w:sz w:val="21"/>
+        </w:rPr>
+        <w:t>Send</w:t>
+      </w:r>
+      <w:r>
+        <w:rPr>
+          <w:rFonts w:ascii="Calibri" w:hAnsi="Calibri" w:eastAsia="Calibri" w:cs="Calibri"/>
+          <w:color w:val="1F2937"/>
+          <w:sz w:val="21"/>
+        </w:rPr>
+        <w:t>.</w:t>
       </w:r>
     </w:p>
     <w:p>
@@ -404,7 +421,7 @@
           <w:color w:val="1F2937"/>
           <w:sz w:val="21"/>
         </w:rPr>
-        <w:t>Ask the Setup Helper to find the verified public v1.3.0 company kit on your screen.</w:t>
+        <w:t>Ask the Setup Helper to find the verified public v1.4.0 company kit on your screen.</w:t>
       </w:r>
     </w:p>
     <w:p>
@@ -626,6 +643,9 @@
         <w:gridCol w:w="9360"/>
       </w:tblGrid>
       <w:tr>
+        <w:trPr>
+          <w:tblHeader w:val="true"/>
+        </w:trPr>
         <w:tc>
           <w:tcPr>
             <w:tcW w:type="dxa" w:w="9360"/>
@@ -848,9 +868,6 @@
             </w:r>
           </w:p>
         </w:tc>
-        <w:trPr>
-          <w:tblHeader/>
-        </w:trPr>
       </w:tr>
     </w:tbl>
     <w:p>
@@ -913,7 +930,7 @@
           <w:color w:val="1F4D78"/>
           <w:sz w:val="19"/>
         </w:rPr>
-        <w:t>kairali-company-rollout-1.3.0.zip</w:t>
+        <w:t>kairali-company-rollout-1.4.0.zip</w:t>
       </w:r>
       <w:r>
         <w:rPr>
@@ -1446,7 +1463,7 @@
           <w:color w:val="1F2937"/>
           <w:sz w:val="21"/>
         </w:rPr>
-        <w:t>If the ZIP is not visible, do not search the whole computer. Paste the Setup Helper rescue. The helper checks Downloads, obtains the protected public v1.3.0 kit when safe, and asks Ambuj only if the approved source or access decision is missing.</w:t>
+        <w:t>If the ZIP is not visible, do not search the whole computer. Paste the Setup Helper rescue. The helper checks Downloads, obtains the protected public v1.4.0 kit when safe, and asks Ambuj only if the approved source or access decision is missing.</w:t>
       </w:r>
     </w:p>
     <w:p>
@@ -4649,7 +4666,7 @@
           <w:color w:val="2E74B5"/>
           <w:sz w:val="32"/>
         </w:rPr>
-        <w:t>Optional bonus - LinkedIn Draft AI Human</w:t>
+        <w:t>Optional bonus — Weekly LinkedIn Message Assistant</w:t>
       </w:r>
     </w:p>
     <w:p>
@@ -4688,7 +4705,7 @@
           <w:color w:val="1F4D78"/>
           <w:sz w:val="19"/>
         </w:rPr>
-        <w:t>03-LinkedIn-Draft-AI-Human-OPTIONAL</w:t>
+        <w:t>03-LinkedIn-Message-Assistant-OPTIONAL</w:t>
       </w:r>
       <w:r>
         <w:rPr>
@@ -4762,7 +4779,7 @@
           <w:color w:val="0B2545"/>
           <w:sz w:val="21"/>
         </w:rPr>
-        <w:t xml:space="preserve"> The LinkedIn Draft project is open separately.</w:t>
+        <w:t xml:space="preserve"> The LinkedIn Message Assistant project is open separately.</w:t>
       </w:r>
     </w:p>
     <w:p>
@@ -4829,7 +4846,7 @@
           <w:color w:val="1F2937"/>
           <w:sz w:val="21"/>
         </w:rPr>
-        <w:t xml:space="preserve"> with your name. Paste it and answer one question at a time.</w:t>
+        <w:t xml:space="preserve"> with your name. Paste it. Choose your Saturday local time and confirm the time zone, one screen action at a time.</w:t>
       </w:r>
     </w:p>
     <w:p>
@@ -4853,7 +4870,7 @@
           <w:color w:val="0B2545"/>
           <w:sz w:val="21"/>
         </w:rPr>
-        <w:t xml:space="preserve"> Codex uses only the safe facts you supplied.</w:t>
+        <w:t xml:space="preserve"> The reminder card opens only this local project at the approved time.</w:t>
       </w:r>
     </w:p>
     <w:p>
@@ -4871,7 +4888,7 @@
           <w:color w:val="1F2937"/>
           <w:sz w:val="21"/>
         </w:rPr>
-        <w:t xml:space="preserve">Stop when </w:t>
+        <w:t xml:space="preserve">If you are allowed to keep them locally, paste up to 25 representative earlier incoming-message and sent-reply pairs into </w:t>
       </w:r>
       <w:r>
         <w:rPr>
@@ -4879,7 +4896,7 @@
           <w:color w:val="1F4D78"/>
           <w:sz w:val="19"/>
         </w:rPr>
-        <w:t>LINKEDIN-DRAFTS.md</w:t>
+        <w:t>LINKEDIN-TONE-AND-PRECEDENTS.md</w:t>
       </w:r>
       <w:r>
         <w:rPr>
@@ -4887,7 +4904,7 @@
           <w:color w:val="1F2937"/>
           <w:sz w:val="21"/>
         </w:rPr>
-        <w:t xml:space="preserve"> says </w:t>
+        <w:t xml:space="preserve">. You may remove names or write </w:t>
       </w:r>
       <w:r>
         <w:rPr>
@@ -4895,7 +4912,7 @@
           <w:color w:val="1F4D78"/>
           <w:sz w:val="19"/>
         </w:rPr>
-        <w:t>DRAFT - NOT PUBLISHED</w:t>
+        <w:t>NONE YET</w:t>
       </w:r>
       <w:r>
         <w:rPr>
@@ -4903,7 +4920,7 @@
           <w:color w:val="1F2937"/>
           <w:sz w:val="21"/>
         </w:rPr>
-        <w:t>, lists your supplied facts, gives three headline choices and one About draft, and says no LinkedIn action occurred.</w:t>
+        <w:t>.</w:t>
       </w:r>
     </w:p>
     <w:p>
@@ -4927,37 +4944,12 @@
           <w:color w:val="0B2545"/>
           <w:sz w:val="21"/>
         </w:rPr>
-        <w:t xml:space="preserve"> You can show the local draft. Nothing was posted or messaged.</w:t>
+        <w:t xml:space="preserve"> Codex records only evidenced tone and routing rules. If there are no examples, it starts with no high-confidence precedents.</w:t>
       </w:r>
     </w:p>
     <w:p>
       <w:pPr>
-        <w:pStyle w:val="Heading1"/>
-      </w:pPr>
-      <w:r>
-        <w:rPr>
-          <w:rFonts w:ascii="Calibri" w:hAnsi="Calibri" w:eastAsia="Calibri" w:cs="Calibri"/>
-          <w:color w:val="2E74B5"/>
-          <w:sz w:val="32"/>
-        </w:rPr>
-        <w:t>What to bring back</w:t>
-      </w:r>
-    </w:p>
-    <w:p>
-      <w:pPr>
-        <w:spacing w:before="0" w:after="120" w:line="288" w:lineRule="auto"/>
-      </w:pPr>
-      <w:r>
-        <w:rPr>
-          <w:rFonts w:ascii="Calibri" w:hAnsi="Calibri" w:eastAsia="Calibri" w:cs="Calibri"/>
-          <w:color w:val="1F2937"/>
-          <w:sz w:val="21"/>
-        </w:rPr>
-        <w:t>Bring the laptop or screenshots that show:</w:t>
-      </w:r>
-    </w:p>
-    <w:p>
-      <w:pPr>
+        <w:keepNext/>
         <w:numPr>
           <w:ilvl w:val="0"/>
           <w:numId w:val="111"/>
@@ -4970,7 +4962,41 @@
           <w:color w:val="1F2937"/>
           <w:sz w:val="21"/>
         </w:rPr>
-        <w:t xml:space="preserve">Email project open with </w:t>
+        <w:t xml:space="preserve">For the supervised pilot, you open LinkedIn yourself, check unread conversations in both </w:t>
+      </w:r>
+      <w:r>
+        <w:rPr>
+          <w:rFonts w:ascii="Calibri" w:hAnsi="Calibri" w:eastAsia="Calibri" w:cs="Calibri"/>
+          <w:b/>
+          <w:color w:val="1F2937"/>
+          <w:sz w:val="21"/>
+        </w:rPr>
+        <w:t>Focused</w:t>
+      </w:r>
+      <w:r>
+        <w:rPr>
+          <w:rFonts w:ascii="Calibri" w:hAnsi="Calibri" w:eastAsia="Calibri" w:cs="Calibri"/>
+          <w:color w:val="1F2937"/>
+          <w:sz w:val="21"/>
+        </w:rPr>
+        <w:t xml:space="preserve"> and </w:t>
+      </w:r>
+      <w:r>
+        <w:rPr>
+          <w:rFonts w:ascii="Calibri" w:hAnsi="Calibri" w:eastAsia="Calibri" w:cs="Calibri"/>
+          <w:b/>
+          <w:color w:val="1F2937"/>
+          <w:sz w:val="21"/>
+        </w:rPr>
+        <w:t>Other</w:t>
+      </w:r>
+      <w:r>
+        <w:rPr>
+          <w:rFonts w:ascii="Calibri" w:hAnsi="Calibri" w:eastAsia="Calibri" w:cs="Calibri"/>
+          <w:color w:val="1F2937"/>
+          <w:sz w:val="21"/>
+        </w:rPr>
+        <w:t xml:space="preserve">, and paste no more than 25 into </w:t>
       </w:r>
       <w:r>
         <w:rPr>
@@ -4978,7 +5004,7 @@
           <w:color w:val="1F4D78"/>
           <w:sz w:val="19"/>
         </w:rPr>
-        <w:t>EMAIL-TRIAGE-REPORT.md</w:t>
+        <w:t>LINKEDIN-INBOX-BATCH.md</w:t>
       </w:r>
       <w:r>
         <w:rPr>
@@ -4986,149 +5012,36 @@
           <w:color w:val="1F2937"/>
           <w:sz w:val="21"/>
         </w:rPr>
-        <w:t>.</w:t>
+        <w:t>. Do not paste passwords, codes, suspicious links, attachments, or sensitive information.</w:t>
       </w:r>
     </w:p>
     <w:p>
       <w:pPr>
-        <w:numPr>
-          <w:ilvl w:val="0"/>
-          <w:numId w:val="111"/>
-        </w:numPr>
-        <w:spacing w:before="0" w:after="80" w:line="288" w:lineRule="auto"/>
-      </w:pPr>
-      <w:r>
-        <w:rPr>
-          <w:rFonts w:ascii="Calibri" w:hAnsi="Calibri" w:eastAsia="Calibri" w:cs="Calibri"/>
-          <w:color w:val="1F2937"/>
-          <w:sz w:val="21"/>
-        </w:rPr>
-        <w:t xml:space="preserve">Drive project open with </w:t>
-      </w:r>
-      <w:r>
-        <w:rPr>
-          <w:rFonts w:ascii="Menlo" w:hAnsi="Menlo" w:eastAsia="Menlo" w:cs="Menlo"/>
-          <w:color w:val="1F4D78"/>
-          <w:sz w:val="19"/>
-        </w:rPr>
-        <w:t>DRIVE-INDEX.md</w:t>
-      </w:r>
-      <w:r>
-        <w:rPr>
-          <w:rFonts w:ascii="Calibri" w:hAnsi="Calibri" w:eastAsia="Calibri" w:cs="Calibri"/>
-          <w:color w:val="1F2937"/>
-          <w:sz w:val="21"/>
-        </w:rPr>
-        <w:t xml:space="preserve"> and its saved cursor.</w:t>
+        <w:spacing w:before="60" w:after="180" w:line="288" w:lineRule="auto"/>
+        <w:ind w:left="173"/>
+        <w:shd w:fill="FFF8E8"/>
+      </w:pPr>
+      <w:r>
+        <w:rPr>
+          <w:rFonts w:ascii="Calibri" w:hAnsi="Calibri" w:eastAsia="Calibri" w:cs="Calibri"/>
+          <w:b/>
+          <w:color w:val="0B2545"/>
+          <w:sz w:val="21"/>
+        </w:rPr>
+        <w:t>DONE WHEN:</w:t>
+      </w:r>
+      <w:r>
+        <w:rPr>
+          <w:rFonts w:ascii="Calibri" w:hAnsi="Calibri" w:eastAsia="Calibri" w:cs="Calibri"/>
+          <w:color w:val="0B2545"/>
+          <w:sz w:val="21"/>
+        </w:rPr>
+        <w:t xml:space="preserve"> Codex processes only the text you pasted. The AI never opens LinkedIn.</w:t>
       </w:r>
     </w:p>
     <w:p>
       <w:pPr>
-        <w:numPr>
-          <w:ilvl w:val="0"/>
-          <w:numId w:val="111"/>
-        </w:numPr>
-        <w:spacing w:before="0" w:after="80" w:line="288" w:lineRule="auto"/>
-      </w:pPr>
-      <w:r>
-        <w:rPr>
-          <w:rFonts w:ascii="Calibri" w:hAnsi="Calibri" w:eastAsia="Calibri" w:cs="Calibri"/>
-          <w:color w:val="1F2937"/>
-          <w:sz w:val="21"/>
-        </w:rPr>
-        <w:t>The final evidence row and validator pass in each project.</w:t>
-      </w:r>
-    </w:p>
-    <w:p>
-      <w:pPr>
-        <w:numPr>
-          <w:ilvl w:val="0"/>
-          <w:numId w:val="111"/>
-        </w:numPr>
-        <w:spacing w:before="0" w:after="80" w:line="288" w:lineRule="auto"/>
-      </w:pPr>
-      <w:r>
-        <w:rPr>
-          <w:rFonts w:ascii="Calibri" w:hAnsi="Calibri" w:eastAsia="Calibri" w:cs="Calibri"/>
-          <w:color w:val="1F2937"/>
-          <w:sz w:val="21"/>
-        </w:rPr>
-        <w:t xml:space="preserve">Optional: </w:t>
-      </w:r>
-      <w:r>
-        <w:rPr>
-          <w:rFonts w:ascii="Menlo" w:hAnsi="Menlo" w:eastAsia="Menlo" w:cs="Menlo"/>
-          <w:color w:val="1F4D78"/>
-          <w:sz w:val="19"/>
-        </w:rPr>
-        <w:t>LINKEDIN-DRAFTS.md</w:t>
-      </w:r>
-      <w:r>
-        <w:rPr>
-          <w:rFonts w:ascii="Calibri" w:hAnsi="Calibri" w:eastAsia="Calibri" w:cs="Calibri"/>
-          <w:color w:val="1F2937"/>
-          <w:sz w:val="21"/>
-        </w:rPr>
-        <w:t xml:space="preserve"> marked </w:t>
-      </w:r>
-      <w:r>
-        <w:rPr>
-          <w:rFonts w:ascii="Menlo" w:hAnsi="Menlo" w:eastAsia="Menlo" w:cs="Menlo"/>
-          <w:color w:val="1F4D78"/>
-          <w:sz w:val="19"/>
-        </w:rPr>
-        <w:t>DRAFT - NOT PUBLISHED</w:t>
-      </w:r>
-      <w:r>
-        <w:rPr>
-          <w:rFonts w:ascii="Calibri" w:hAnsi="Calibri" w:eastAsia="Calibri" w:cs="Calibri"/>
-          <w:color w:val="1F2937"/>
-          <w:sz w:val="21"/>
-        </w:rPr>
-        <w:t>.</w:t>
-      </w:r>
-    </w:p>
-    <w:p>
-      <w:pPr>
-        <w:spacing w:before="0" w:after="120" w:line="288" w:lineRule="auto"/>
-      </w:pPr>
-      <w:r>
-        <w:rPr>
-          <w:rFonts w:ascii="Calibri" w:hAnsi="Calibri" w:eastAsia="Calibri" w:cs="Calibri"/>
-          <w:color w:val="1F2937"/>
-          <w:sz w:val="21"/>
-        </w:rPr>
-        <w:t>Do not bring email bodies, passwords, one-time codes, private HR details, banking information, or sensitive Drive content. Show the safe report headings and proof.</w:t>
-      </w:r>
-    </w:p>
-    <w:p>
-      <w:pPr>
-        <w:pStyle w:val="Heading1"/>
-      </w:pPr>
-      <w:r>
-        <w:rPr>
-          <w:rFonts w:ascii="Calibri" w:hAnsi="Calibri" w:eastAsia="Calibri" w:cs="Calibri"/>
-          <w:color w:val="2E74B5"/>
-          <w:sz w:val="32"/>
-        </w:rPr>
-        <w:t>Stop rules</w:t>
-      </w:r>
-    </w:p>
-    <w:p>
-      <w:pPr>
-        <w:spacing w:before="0" w:after="120" w:line="288" w:lineRule="auto"/>
-      </w:pPr>
-      <w:r>
-        <w:rPr>
-          <w:rFonts w:ascii="Calibri" w:hAnsi="Calibri" w:eastAsia="Calibri" w:cs="Calibri"/>
-          <w:color w:val="1F2937"/>
-          <w:sz w:val="21"/>
-        </w:rPr>
-        <w:t>Stop and use the Setup Helper if:</w:t>
-      </w:r>
-    </w:p>
-    <w:p>
-      <w:pPr>
+        <w:keepNext/>
         <w:numPr>
           <w:ilvl w:val="0"/>
           <w:numId w:val="113"/>
@@ -5141,33 +5054,148 @@
           <w:color w:val="1F2937"/>
           <w:sz w:val="21"/>
         </w:rPr>
-        <w:t>the correct folder is not visible;</w:t>
+        <w:t xml:space="preserve">Review </w:t>
+      </w:r>
+      <w:r>
+        <w:rPr>
+          <w:rFonts w:ascii="Menlo" w:hAnsi="Menlo" w:eastAsia="Menlo" w:cs="Menlo"/>
+          <w:color w:val="1F4D78"/>
+          <w:sz w:val="19"/>
+        </w:rPr>
+        <w:t>LINKEDIN-REPLY-QUEUE.md</w:t>
+      </w:r>
+      <w:r>
+        <w:rPr>
+          <w:rFonts w:ascii="Calibri" w:hAnsi="Calibri" w:eastAsia="Calibri" w:cs="Calibri"/>
+          <w:color w:val="1F2937"/>
+          <w:sz w:val="21"/>
+        </w:rPr>
+        <w:t xml:space="preserve">. </w:t>
+      </w:r>
+      <w:r>
+        <w:rPr>
+          <w:rFonts w:ascii="Menlo" w:hAnsi="Menlo" w:eastAsia="Menlo" w:cs="Menlo"/>
+          <w:color w:val="1F4D78"/>
+          <w:sz w:val="19"/>
+        </w:rPr>
+        <w:t>READY TO SEND</w:t>
+      </w:r>
+      <w:r>
+        <w:rPr>
+          <w:rFonts w:ascii="Calibri" w:hAnsi="Calibri" w:eastAsia="Calibri" w:cs="Calibri"/>
+          <w:color w:val="1F2937"/>
+          <w:sz w:val="21"/>
+        </w:rPr>
+        <w:t xml:space="preserve"> contains routine drafts backed by an evidenced precedent. </w:t>
+      </w:r>
+      <w:r>
+        <w:rPr>
+          <w:rFonts w:ascii="Menlo" w:hAnsi="Menlo" w:eastAsia="Menlo" w:cs="Menlo"/>
+          <w:color w:val="1F4D78"/>
+          <w:sz w:val="19"/>
+        </w:rPr>
+        <w:t>NEEDS YOUR DECISION</w:t>
+      </w:r>
+      <w:r>
+        <w:rPr>
+          <w:rFonts w:ascii="Calibri" w:hAnsi="Calibri" w:eastAsia="Calibri" w:cs="Calibri"/>
+          <w:color w:val="1F2937"/>
+          <w:sz w:val="21"/>
+        </w:rPr>
+        <w:t xml:space="preserve"> contains a stable S.No., sender, date, concise summary, proposed reply, and reason for every uncertain item.</w:t>
       </w:r>
     </w:p>
     <w:p>
       <w:pPr>
-        <w:numPr>
-          <w:ilvl w:val="0"/>
-          <w:numId w:val="113"/>
-        </w:numPr>
-        <w:spacing w:before="0" w:after="80" w:line="288" w:lineRule="auto"/>
-      </w:pPr>
-      <w:r>
-        <w:rPr>
-          <w:rFonts w:ascii="Calibri" w:hAnsi="Calibri" w:eastAsia="Calibri" w:cs="Calibri"/>
-          <w:color w:val="1F2937"/>
-          <w:sz w:val="21"/>
-        </w:rPr>
-        <w:t>the app or button names do not match;</w:t>
+        <w:spacing w:before="60" w:after="180" w:line="288" w:lineRule="auto"/>
+        <w:ind w:left="173"/>
+        <w:shd w:fill="FFF8E8"/>
+      </w:pPr>
+      <w:r>
+        <w:rPr>
+          <w:rFonts w:ascii="Calibri" w:hAnsi="Calibri" w:eastAsia="Calibri" w:cs="Calibri"/>
+          <w:b/>
+          <w:color w:val="0B2545"/>
+          <w:sz w:val="21"/>
+        </w:rPr>
+        <w:t>DONE WHEN:</w:t>
+      </w:r>
+      <w:r>
+        <w:rPr>
+          <w:rFonts w:ascii="Calibri" w:hAnsi="Calibri" w:eastAsia="Calibri" w:cs="Calibri"/>
+          <w:color w:val="0B2545"/>
+          <w:sz w:val="21"/>
+        </w:rPr>
+        <w:t xml:space="preserve"> You review every draft, manually send any reply you approve in LinkedIn, and return to mark each item </w:t>
+      </w:r>
+      <w:r>
+        <w:rPr>
+          <w:rFonts w:ascii="Menlo" w:hAnsi="Menlo" w:eastAsia="Menlo" w:cs="Menlo"/>
+          <w:color w:val="1F4D78"/>
+          <w:sz w:val="19"/>
+        </w:rPr>
+        <w:t>SENT AS WRITTEN</w:t>
+      </w:r>
+      <w:r>
+        <w:rPr>
+          <w:rFonts w:ascii="Calibri" w:hAnsi="Calibri" w:eastAsia="Calibri" w:cs="Calibri"/>
+          <w:color w:val="0B2545"/>
+          <w:sz w:val="21"/>
+        </w:rPr>
+        <w:t xml:space="preserve">, </w:t>
+      </w:r>
+      <w:r>
+        <w:rPr>
+          <w:rFonts w:ascii="Menlo" w:hAnsi="Menlo" w:eastAsia="Menlo" w:cs="Menlo"/>
+          <w:color w:val="1F4D78"/>
+          <w:sz w:val="19"/>
+        </w:rPr>
+        <w:t>EDITED AND SENT</w:t>
+      </w:r>
+      <w:r>
+        <w:rPr>
+          <w:rFonts w:ascii="Calibri" w:hAnsi="Calibri" w:eastAsia="Calibri" w:cs="Calibri"/>
+          <w:color w:val="0B2545"/>
+          <w:sz w:val="21"/>
+        </w:rPr>
+        <w:t xml:space="preserve">, </w:t>
+      </w:r>
+      <w:r>
+        <w:rPr>
+          <w:rFonts w:ascii="Menlo" w:hAnsi="Menlo" w:eastAsia="Menlo" w:cs="Menlo"/>
+          <w:color w:val="1F4D78"/>
+          <w:sz w:val="19"/>
+        </w:rPr>
+        <w:t>SKIPPED</w:t>
+      </w:r>
+      <w:r>
+        <w:rPr>
+          <w:rFonts w:ascii="Calibri" w:hAnsi="Calibri" w:eastAsia="Calibri" w:cs="Calibri"/>
+          <w:color w:val="0B2545"/>
+          <w:sz w:val="21"/>
+        </w:rPr>
+        <w:t xml:space="preserve">, or </w:t>
+      </w:r>
+      <w:r>
+        <w:rPr>
+          <w:rFonts w:ascii="Menlo" w:hAnsi="Menlo" w:eastAsia="Menlo" w:cs="Menlo"/>
+          <w:color w:val="1F4D78"/>
+          <w:sz w:val="19"/>
+        </w:rPr>
+        <w:t>KEEP FOR LATER</w:t>
+      </w:r>
+      <w:r>
+        <w:rPr>
+          <w:rFonts w:ascii="Calibri" w:hAnsi="Calibri" w:eastAsia="Calibri" w:cs="Calibri"/>
+          <w:color w:val="0B2545"/>
+          <w:sz w:val="21"/>
+        </w:rPr>
+        <w:t>. Codex never claims a send without your confirmation.</w:t>
       </w:r>
     </w:p>
     <w:p>
       <w:pPr>
-        <w:numPr>
-          <w:ilvl w:val="0"/>
-          <w:numId w:val="113"/>
-        </w:numPr>
-        <w:spacing w:before="0" w:after="80" w:line="288" w:lineRule="auto"/>
+        <w:spacing w:before="0" w:after="120" w:line="288" w:lineRule="auto"/>
       </w:pPr>
       <w:r>
         <w:rPr>
@@ -5175,33 +5203,25 @@
           <w:color w:val="1F2937"/>
           <w:sz w:val="21"/>
         </w:rPr>
-        <w:t>the company app cannot be enabled or connected;</w:t>
+        <w:t>The weekly reminder works only while the computer is awake, ChatGPT is running and the local project remains available. It reminds and drafts; it does not access LinkedIn.</w:t>
       </w:r>
     </w:p>
     <w:p>
       <w:pPr>
-        <w:numPr>
-          <w:ilvl w:val="0"/>
-          <w:numId w:val="113"/>
-        </w:numPr>
-        <w:spacing w:before="0" w:after="80" w:line="288" w:lineRule="auto"/>
-      </w:pPr>
-      <w:r>
-        <w:rPr>
-          <w:rFonts w:ascii="Calibri" w:hAnsi="Calibri" w:eastAsia="Calibri" w:cs="Calibri"/>
-          <w:color w:val="1F2937"/>
-          <w:sz w:val="21"/>
-        </w:rPr>
-        <w:t>the wrong account is connected;</w:t>
+        <w:pStyle w:val="Heading1"/>
+      </w:pPr>
+      <w:r>
+        <w:rPr>
+          <w:rFonts w:ascii="Calibri" w:hAnsi="Calibri" w:eastAsia="Calibri" w:cs="Calibri"/>
+          <w:color w:val="2E74B5"/>
+          <w:sz w:val="32"/>
+        </w:rPr>
+        <w:t>What to bring back</w:t>
       </w:r>
     </w:p>
     <w:p>
       <w:pPr>
-        <w:numPr>
-          <w:ilvl w:val="0"/>
-          <w:numId w:val="113"/>
-        </w:numPr>
-        <w:spacing w:before="0" w:after="80" w:line="288" w:lineRule="auto"/>
+        <w:spacing w:before="0" w:after="120" w:line="288" w:lineRule="auto"/>
       </w:pPr>
       <w:r>
         <w:rPr>
@@ -5209,67 +5229,7 @@
           <w:color w:val="1F2937"/>
           <w:sz w:val="21"/>
         </w:rPr>
-        <w:t>a permission asks for Full access;</w:t>
-      </w:r>
-    </w:p>
-    <w:p>
-      <w:pPr>
-        <w:numPr>
-          <w:ilvl w:val="0"/>
-          <w:numId w:val="113"/>
-        </w:numPr>
-        <w:spacing w:before="0" w:after="80" w:line="288" w:lineRule="auto"/>
-      </w:pPr>
-      <w:r>
-        <w:rPr>
-          <w:rFonts w:ascii="Calibri" w:hAnsi="Calibri" w:eastAsia="Calibri" w:cs="Calibri"/>
-          <w:color w:val="1F2937"/>
-          <w:sz w:val="21"/>
-        </w:rPr>
-        <w:t>the AI asks for a password, one-time code, Terminal, PowerShell, Command Prompt, Python, a CLI, Git or GitHub;</w:t>
-      </w:r>
-    </w:p>
-    <w:p>
-      <w:pPr>
-        <w:numPr>
-          <w:ilvl w:val="0"/>
-          <w:numId w:val="113"/>
-        </w:numPr>
-        <w:spacing w:before="0" w:after="80" w:line="288" w:lineRule="auto"/>
-      </w:pPr>
-      <w:r>
-        <w:rPr>
-          <w:rFonts w:ascii="Calibri" w:hAnsi="Calibri" w:eastAsia="Calibri" w:cs="Calibri"/>
-          <w:color w:val="1F2937"/>
-          <w:sz w:val="21"/>
-        </w:rPr>
-        <w:t>the task reaches medical, dosage, certification, legal, spend, credentials, banking, personal HR or another sensitive decision.</w:t>
-      </w:r>
-    </w:p>
-    <w:p>
-      <w:pPr>
-        <w:spacing w:before="0" w:after="120" w:line="288" w:lineRule="auto"/>
-      </w:pPr>
-      <w:r>
-        <w:rPr>
-          <w:rFonts w:ascii="Calibri" w:hAnsi="Calibri" w:eastAsia="Calibri" w:cs="Calibri"/>
-          <w:color w:val="1F2937"/>
-          <w:sz w:val="21"/>
-        </w:rPr>
-        <w:t>Setup Helper resolves safe setup. Ambuj receives only an unavoidable company-access problem. Abilash receives owner decisions and every Gate 0 issue.</w:t>
-      </w:r>
-    </w:p>
-    <w:p>
-      <w:pPr>
-        <w:pStyle w:val="Heading1"/>
-      </w:pPr>
-      <w:r>
-        <w:rPr>
-          <w:rFonts w:ascii="Calibri" w:hAnsi="Calibri" w:eastAsia="Calibri" w:cs="Calibri"/>
-          <w:color w:val="2E74B5"/>
-          <w:sz w:val="32"/>
-        </w:rPr>
-        <w:t>Official screen references</w:t>
+        <w:t>Bring the laptop or screenshots that show:</w:t>
       </w:r>
     </w:p>
     <w:p>
@@ -5286,7 +5246,23 @@
           <w:color w:val="1F2937"/>
           <w:sz w:val="21"/>
         </w:rPr>
-        <w:t>ChatGPT quickstart: https://learn.chatgpt.com/docs/quickstart</w:t>
+        <w:t xml:space="preserve">Email project open with </w:t>
+      </w:r>
+      <w:r>
+        <w:rPr>
+          <w:rFonts w:ascii="Menlo" w:hAnsi="Menlo" w:eastAsia="Menlo" w:cs="Menlo"/>
+          <w:color w:val="1F4D78"/>
+          <w:sz w:val="19"/>
+        </w:rPr>
+        <w:t>EMAIL-TRIAGE-REPORT.md</w:t>
+      </w:r>
+      <w:r>
+        <w:rPr>
+          <w:rFonts w:ascii="Calibri" w:hAnsi="Calibri" w:eastAsia="Calibri" w:cs="Calibri"/>
+          <w:color w:val="1F2937"/>
+          <w:sz w:val="21"/>
+        </w:rPr>
+        <w:t>.</w:t>
       </w:r>
     </w:p>
     <w:p>
@@ -5303,7 +5279,23 @@
           <w:color w:val="1F2937"/>
           <w:sz w:val="21"/>
         </w:rPr>
-        <w:t>ChatGPT desktop app: https://learn.chatgpt.com/docs/app</w:t>
+        <w:t xml:space="preserve">Drive project open with </w:t>
+      </w:r>
+      <w:r>
+        <w:rPr>
+          <w:rFonts w:ascii="Menlo" w:hAnsi="Menlo" w:eastAsia="Menlo" w:cs="Menlo"/>
+          <w:color w:val="1F4D78"/>
+          <w:sz w:val="19"/>
+        </w:rPr>
+        <w:t>DRIVE-INDEX.md</w:t>
+      </w:r>
+      <w:r>
+        <w:rPr>
+          <w:rFonts w:ascii="Calibri" w:hAnsi="Calibri" w:eastAsia="Calibri" w:cs="Calibri"/>
+          <w:color w:val="1F2937"/>
+          <w:sz w:val="21"/>
+        </w:rPr>
+        <w:t xml:space="preserve"> and its saved cursor.</w:t>
       </w:r>
     </w:p>
     <w:p>
@@ -5320,7 +5312,7 @@
           <w:color w:val="1F2937"/>
           <w:sz w:val="21"/>
         </w:rPr>
-        <w:t>Projects and chats: https://learn.chatgpt.com/docs/projects</w:t>
+        <w:t>The final evidence row and validator pass in each project.</w:t>
       </w:r>
     </w:p>
     <w:p>
@@ -5337,14 +5329,266 @@
           <w:color w:val="1F2937"/>
           <w:sz w:val="21"/>
         </w:rPr>
-        <w:t>Apps: https://help.openai.com/en/articles/11487775-connectors-in-chatgpt</w:t>
+        <w:t>Optional: approved Saturday schedule, tone/precedent file, numbered reply queue, cursor, employee-confirmed outcomes, and validator pass. Do not show message bodies.</w:t>
       </w:r>
     </w:p>
     <w:p>
       <w:pPr>
+        <w:spacing w:before="0" w:after="120" w:line="288" w:lineRule="auto"/>
+      </w:pPr>
+      <w:r>
+        <w:rPr>
+          <w:rFonts w:ascii="Calibri" w:hAnsi="Calibri" w:eastAsia="Calibri" w:cs="Calibri"/>
+          <w:color w:val="1F2937"/>
+          <w:sz w:val="21"/>
+        </w:rPr>
+        <w:t>Do not bring email bodies, passwords, one-time codes, private HR details, banking information, or sensitive Drive content. Show the safe report headings and proof.</w:t>
+      </w:r>
+    </w:p>
+    <w:p>
+      <w:pPr>
+        <w:pStyle w:val="Heading1"/>
+      </w:pPr>
+      <w:r>
+        <w:rPr>
+          <w:rFonts w:ascii="Calibri" w:hAnsi="Calibri" w:eastAsia="Calibri" w:cs="Calibri"/>
+          <w:color w:val="2E74B5"/>
+          <w:sz w:val="32"/>
+        </w:rPr>
+        <w:t>Stop rules</w:t>
+      </w:r>
+    </w:p>
+    <w:p>
+      <w:pPr>
+        <w:spacing w:before="0" w:after="120" w:line="288" w:lineRule="auto"/>
+      </w:pPr>
+      <w:r>
+        <w:rPr>
+          <w:rFonts w:ascii="Calibri" w:hAnsi="Calibri" w:eastAsia="Calibri" w:cs="Calibri"/>
+          <w:color w:val="1F2937"/>
+          <w:sz w:val="21"/>
+        </w:rPr>
+        <w:t>Stop and use the Setup Helper if:</w:t>
+      </w:r>
+    </w:p>
+    <w:p>
+      <w:pPr>
         <w:numPr>
           <w:ilvl w:val="0"/>
-          <w:numId w:val="115"/>
+          <w:numId w:val="117"/>
+        </w:numPr>
+        <w:spacing w:before="0" w:after="80" w:line="288" w:lineRule="auto"/>
+      </w:pPr>
+      <w:r>
+        <w:rPr>
+          <w:rFonts w:ascii="Calibri" w:hAnsi="Calibri" w:eastAsia="Calibri" w:cs="Calibri"/>
+          <w:color w:val="1F2937"/>
+          <w:sz w:val="21"/>
+        </w:rPr>
+        <w:t>the correct folder is not visible;</w:t>
+      </w:r>
+    </w:p>
+    <w:p>
+      <w:pPr>
+        <w:numPr>
+          <w:ilvl w:val="0"/>
+          <w:numId w:val="117"/>
+        </w:numPr>
+        <w:spacing w:before="0" w:after="80" w:line="288" w:lineRule="auto"/>
+      </w:pPr>
+      <w:r>
+        <w:rPr>
+          <w:rFonts w:ascii="Calibri" w:hAnsi="Calibri" w:eastAsia="Calibri" w:cs="Calibri"/>
+          <w:color w:val="1F2937"/>
+          <w:sz w:val="21"/>
+        </w:rPr>
+        <w:t>the app or button names do not match;</w:t>
+      </w:r>
+    </w:p>
+    <w:p>
+      <w:pPr>
+        <w:numPr>
+          <w:ilvl w:val="0"/>
+          <w:numId w:val="117"/>
+        </w:numPr>
+        <w:spacing w:before="0" w:after="80" w:line="288" w:lineRule="auto"/>
+      </w:pPr>
+      <w:r>
+        <w:rPr>
+          <w:rFonts w:ascii="Calibri" w:hAnsi="Calibri" w:eastAsia="Calibri" w:cs="Calibri"/>
+          <w:color w:val="1F2937"/>
+          <w:sz w:val="21"/>
+        </w:rPr>
+        <w:t>the company app cannot be enabled or connected;</w:t>
+      </w:r>
+    </w:p>
+    <w:p>
+      <w:pPr>
+        <w:numPr>
+          <w:ilvl w:val="0"/>
+          <w:numId w:val="117"/>
+        </w:numPr>
+        <w:spacing w:before="0" w:after="80" w:line="288" w:lineRule="auto"/>
+      </w:pPr>
+      <w:r>
+        <w:rPr>
+          <w:rFonts w:ascii="Calibri" w:hAnsi="Calibri" w:eastAsia="Calibri" w:cs="Calibri"/>
+          <w:color w:val="1F2937"/>
+          <w:sz w:val="21"/>
+        </w:rPr>
+        <w:t>the wrong account is connected;</w:t>
+      </w:r>
+    </w:p>
+    <w:p>
+      <w:pPr>
+        <w:numPr>
+          <w:ilvl w:val="0"/>
+          <w:numId w:val="117"/>
+        </w:numPr>
+        <w:spacing w:before="0" w:after="80" w:line="288" w:lineRule="auto"/>
+      </w:pPr>
+      <w:r>
+        <w:rPr>
+          <w:rFonts w:ascii="Calibri" w:hAnsi="Calibri" w:eastAsia="Calibri" w:cs="Calibri"/>
+          <w:color w:val="1F2937"/>
+          <w:sz w:val="21"/>
+        </w:rPr>
+        <w:t>a permission asks for Full access;</w:t>
+      </w:r>
+    </w:p>
+    <w:p>
+      <w:pPr>
+        <w:numPr>
+          <w:ilvl w:val="0"/>
+          <w:numId w:val="117"/>
+        </w:numPr>
+        <w:spacing w:before="0" w:after="80" w:line="288" w:lineRule="auto"/>
+      </w:pPr>
+      <w:r>
+        <w:rPr>
+          <w:rFonts w:ascii="Calibri" w:hAnsi="Calibri" w:eastAsia="Calibri" w:cs="Calibri"/>
+          <w:color w:val="1F2937"/>
+          <w:sz w:val="21"/>
+        </w:rPr>
+        <w:t>the AI asks for a password, one-time code, Terminal, PowerShell, Command Prompt, Python, a CLI, Git or GitHub;</w:t>
+      </w:r>
+    </w:p>
+    <w:p>
+      <w:pPr>
+        <w:numPr>
+          <w:ilvl w:val="0"/>
+          <w:numId w:val="117"/>
+        </w:numPr>
+        <w:spacing w:before="0" w:after="80" w:line="288" w:lineRule="auto"/>
+      </w:pPr>
+      <w:r>
+        <w:rPr>
+          <w:rFonts w:ascii="Calibri" w:hAnsi="Calibri" w:eastAsia="Calibri" w:cs="Calibri"/>
+          <w:color w:val="1F2937"/>
+          <w:sz w:val="21"/>
+        </w:rPr>
+        <w:t>the task reaches medical, dosage, certification, legal, spend, credentials, banking, personal HR or another sensitive decision.</w:t>
+      </w:r>
+    </w:p>
+    <w:p>
+      <w:pPr>
+        <w:spacing w:before="0" w:after="120" w:line="288" w:lineRule="auto"/>
+      </w:pPr>
+      <w:r>
+        <w:rPr>
+          <w:rFonts w:ascii="Calibri" w:hAnsi="Calibri" w:eastAsia="Calibri" w:cs="Calibri"/>
+          <w:color w:val="1F2937"/>
+          <w:sz w:val="21"/>
+        </w:rPr>
+        <w:t>Setup Helper resolves safe setup. Ambuj receives only an unavoidable company-access problem. Abilash receives owner decisions and every Gate 0 issue.</w:t>
+      </w:r>
+    </w:p>
+    <w:p>
+      <w:pPr>
+        <w:pStyle w:val="Heading1"/>
+      </w:pPr>
+      <w:r>
+        <w:rPr>
+          <w:rFonts w:ascii="Calibri" w:hAnsi="Calibri" w:eastAsia="Calibri" w:cs="Calibri"/>
+          <w:color w:val="2E74B5"/>
+          <w:sz w:val="32"/>
+        </w:rPr>
+        <w:t>Official screen references</w:t>
+      </w:r>
+    </w:p>
+    <w:p>
+      <w:pPr>
+        <w:numPr>
+          <w:ilvl w:val="0"/>
+          <w:numId w:val="119"/>
+        </w:numPr>
+        <w:spacing w:before="0" w:after="80" w:line="288" w:lineRule="auto"/>
+      </w:pPr>
+      <w:r>
+        <w:rPr>
+          <w:rFonts w:ascii="Calibri" w:hAnsi="Calibri" w:eastAsia="Calibri" w:cs="Calibri"/>
+          <w:color w:val="1F2937"/>
+          <w:sz w:val="21"/>
+        </w:rPr>
+        <w:t>ChatGPT quickstart: https://learn.chatgpt.com/docs/quickstart</w:t>
+      </w:r>
+    </w:p>
+    <w:p>
+      <w:pPr>
+        <w:numPr>
+          <w:ilvl w:val="0"/>
+          <w:numId w:val="119"/>
+        </w:numPr>
+        <w:spacing w:before="0" w:after="80" w:line="288" w:lineRule="auto"/>
+      </w:pPr>
+      <w:r>
+        <w:rPr>
+          <w:rFonts w:ascii="Calibri" w:hAnsi="Calibri" w:eastAsia="Calibri" w:cs="Calibri"/>
+          <w:color w:val="1F2937"/>
+          <w:sz w:val="21"/>
+        </w:rPr>
+        <w:t>ChatGPT desktop app: https://learn.chatgpt.com/docs/app</w:t>
+      </w:r>
+    </w:p>
+    <w:p>
+      <w:pPr>
+        <w:numPr>
+          <w:ilvl w:val="0"/>
+          <w:numId w:val="119"/>
+        </w:numPr>
+        <w:spacing w:before="0" w:after="80" w:line="288" w:lineRule="auto"/>
+      </w:pPr>
+      <w:r>
+        <w:rPr>
+          <w:rFonts w:ascii="Calibri" w:hAnsi="Calibri" w:eastAsia="Calibri" w:cs="Calibri"/>
+          <w:color w:val="1F2937"/>
+          <w:sz w:val="21"/>
+        </w:rPr>
+        <w:t>Projects and chats: https://learn.chatgpt.com/docs/projects</w:t>
+      </w:r>
+    </w:p>
+    <w:p>
+      <w:pPr>
+        <w:numPr>
+          <w:ilvl w:val="0"/>
+          <w:numId w:val="119"/>
+        </w:numPr>
+        <w:spacing w:before="0" w:after="80" w:line="288" w:lineRule="auto"/>
+      </w:pPr>
+      <w:r>
+        <w:rPr>
+          <w:rFonts w:ascii="Calibri" w:hAnsi="Calibri" w:eastAsia="Calibri" w:cs="Calibri"/>
+          <w:color w:val="1F2937"/>
+          <w:sz w:val="21"/>
+        </w:rPr>
+        <w:t>Apps: https://help.openai.com/en/articles/11487775-connectors-in-chatgpt</w:t>
+      </w:r>
+    </w:p>
+    <w:p>
+      <w:pPr>
+        <w:numPr>
+          <w:ilvl w:val="0"/>
+          <w:numId w:val="119"/>
         </w:numPr>
         <w:spacing w:before="0" w:after="80" w:line="288" w:lineRule="auto"/>
       </w:pPr>
@@ -6648,9 +6892,9 @@
   <w:abstractNum w:abstractNumId="110">
     <w:multiLevelType w:val="singleLevel"/>
     <w:lvl w:ilvl="0">
-      <w:start w:val="1"/>
-      <w:numFmt w:val="bullet"/>
-      <w:lvlText w:val="•"/>
+      <w:start w:val="5"/>
+      <w:numFmt w:val="decimal"/>
+      <w:lvlText w:val="%1."/>
       <w:suff w:val="tab"/>
       <w:pPr>
         <w:tabs>
@@ -6669,9 +6913,9 @@
   <w:abstractNum w:abstractNumId="112">
     <w:multiLevelType w:val="singleLevel"/>
     <w:lvl w:ilvl="0">
-      <w:start w:val="1"/>
-      <w:numFmt w:val="bullet"/>
-      <w:lvlText w:val="•"/>
+      <w:start w:val="6"/>
+      <w:numFmt w:val="decimal"/>
+      <w:lvlText w:val="%1."/>
       <w:suff w:val="tab"/>
       <w:pPr>
         <w:tabs>
@@ -6707,6 +6951,48 @@
   </w:abstractNum>
   <w:num w:numId="115">
     <w:abstractNumId w:val="114"/>
+  </w:num>
+  <w:abstractNum w:abstractNumId="116">
+    <w:multiLevelType w:val="singleLevel"/>
+    <w:lvl w:ilvl="0">
+      <w:start w:val="1"/>
+      <w:numFmt w:val="bullet"/>
+      <w:lvlText w:val="•"/>
+      <w:suff w:val="tab"/>
+      <w:pPr>
+        <w:tabs>
+          <w:tab w:val="num" w:pos="540"/>
+        </w:tabs>
+        <w:ind w:left="540" w:hanging="270"/>
+      </w:pPr>
+      <w:rPr>
+        <w:rFonts w:ascii="Calibri" w:hAnsi="Calibri"/>
+      </w:rPr>
+    </w:lvl>
+  </w:abstractNum>
+  <w:num w:numId="117">
+    <w:abstractNumId w:val="116"/>
+  </w:num>
+  <w:abstractNum w:abstractNumId="118">
+    <w:multiLevelType w:val="singleLevel"/>
+    <w:lvl w:ilvl="0">
+      <w:start w:val="1"/>
+      <w:numFmt w:val="bullet"/>
+      <w:lvlText w:val="•"/>
+      <w:suff w:val="tab"/>
+      <w:pPr>
+        <w:tabs>
+          <w:tab w:val="num" w:pos="540"/>
+        </w:tabs>
+        <w:ind w:left="540" w:hanging="270"/>
+      </w:pPr>
+      <w:rPr>
+        <w:rFonts w:ascii="Calibri" w:hAnsi="Calibri"/>
+      </w:rPr>
+    </w:lvl>
+  </w:abstractNum>
+  <w:num w:numId="119">
+    <w:abstractNumId w:val="118"/>
   </w:num>
 </w:numbering>
 </file>

</xml_diff>

<commit_message>
Add right-level LinkedIn access handoff
</commit_message>
<xml_diff>
--- a/packages/kairali/homework/EVERYONE-ELSE-AI-HUMAN-HOMEWORK-GUIDE.docx
+++ b/packages/kairali/homework/EVERYONE-ELSE-AI-HUMAN-HOMEWORK-GUIDE.docx
@@ -255,7 +255,7 @@
           <w:color w:val="1F2937"/>
           <w:sz w:val="21"/>
         </w:rPr>
-        <w:t xml:space="preserve"> v1.4.0 company kit. The public kit is the clean setup and update source; it contains no live company work or secrets, so no GitHub invitation or collaborator seat is needed. Ask the Setup Helper to obtain and verify the kit. Then copy the Email and Drive starters into separate local work folders. Do not use the public distribution repository as a work project.</w:t>
+        <w:t xml:space="preserve"> v1.5.0 company kit. The public kit is the clean setup and update source; it contains no live company work or secrets, so no GitHub invitation or collaborator seat is needed. Ask the Setup Helper to obtain and verify the kit. Then copy the Email and Drive starters into separate local work folders. Do not use the public distribution repository as a work project.</w:t>
       </w:r>
     </w:p>
     <w:p>
@@ -361,7 +361,7 @@
           <w:color w:val="1F2937"/>
           <w:sz w:val="21"/>
         </w:rPr>
-        <w:t xml:space="preserve"> - at your chosen Saturday time, prepares replies from message text you manually paste. It learns from your supplied prior replies, keeps uncertain drafts for your decision, and never accesses or sends through LinkedIn. You review and manually press </w:t>
+        <w:t xml:space="preserve"> - at your chosen Saturday time, uses task-scoped Computer control in its local folder, then stops all Computer and Chrome control before LinkedIn appears. It prepares replies from message text you manually paste, learns from your supplied prior replies, and keeps uncertain drafts for your decision. You alone access LinkedIn and manually press </w:t>
       </w:r>
       <w:r>
         <w:rPr>
@@ -421,7 +421,7 @@
           <w:color w:val="1F2937"/>
           <w:sz w:val="21"/>
         </w:rPr>
-        <w:t>Ask the Setup Helper to find the verified public v1.4.0 company kit on your screen.</w:t>
+        <w:t>Ask the Setup Helper to find the verified public v1.5.0 company kit on your screen.</w:t>
       </w:r>
     </w:p>
     <w:p>
@@ -930,7 +930,7 @@
           <w:color w:val="1F4D78"/>
           <w:sz w:val="19"/>
         </w:rPr>
-        <w:t>kairali-company-rollout-1.4.0.zip</w:t>
+        <w:t>kairali-company-rollout-1.5.0.zip</w:t>
       </w:r>
       <w:r>
         <w:rPr>
@@ -1463,7 +1463,7 @@
           <w:color w:val="1F2937"/>
           <w:sz w:val="21"/>
         </w:rPr>
-        <w:t>If the ZIP is not visible, do not search the whole computer. Paste the Setup Helper rescue. The helper checks Downloads, obtains the protected public v1.4.0 kit when safe, and asks Ambuj only if the approved source or access decision is missing.</w:t>
+        <w:t>If the ZIP is not visible, do not search the whole computer. Paste the Setup Helper rescue. The helper checks Downloads, obtains the protected public v1.5.0 kit when safe, and asks Ambuj only if the approved source or access decision is missing.</w:t>
       </w:r>
     </w:p>
     <w:p>
@@ -4888,7 +4888,7 @@
           <w:color w:val="1F2937"/>
           <w:sz w:val="21"/>
         </w:rPr>
-        <w:t xml:space="preserve">If you are allowed to keep them locally, paste up to 25 representative earlier incoming-message and sent-reply pairs into </w:t>
+        <w:t xml:space="preserve">Close every LinkedIn tab and the LinkedIn app. Open </w:t>
       </w:r>
       <w:r>
         <w:rPr>
@@ -4896,7 +4896,7 @@
           <w:color w:val="1F4D78"/>
           <w:sz w:val="19"/>
         </w:rPr>
-        <w:t>LINKEDIN-TONE-AND-PRECEDENTS.md</w:t>
+        <w:t>LINKEDIN-CONTROL-HANDOFF.md</w:t>
       </w:r>
       <w:r>
         <w:rPr>
@@ -4904,7 +4904,7 @@
           <w:color w:val="1F2937"/>
           <w:sz w:val="21"/>
         </w:rPr>
-        <w:t xml:space="preserve">. You may remove names or write </w:t>
+        <w:t xml:space="preserve">. In the local project, start one message with </w:t>
       </w:r>
       <w:r>
         <w:rPr>
@@ -4912,7 +4912,7 @@
           <w:color w:val="1F4D78"/>
           <w:sz w:val="19"/>
         </w:rPr>
-        <w:t>NONE YET</w:t>
+        <w:t>@Computer</w:t>
       </w:r>
       <w:r>
         <w:rPr>
@@ -4920,7 +4920,58 @@
           <w:color w:val="1F2937"/>
           <w:sz w:val="21"/>
         </w:rPr>
-        <w:t>.</w:t>
+        <w:t xml:space="preserve"> and use the exact request printed there. ChatGPT shows the real access prompt. Approve only this visible local project and current task. Keep </w:t>
+      </w:r>
+      <w:r>
+        <w:rPr>
+          <w:rFonts w:ascii="Calibri" w:hAnsi="Calibri" w:eastAsia="Calibri" w:cs="Calibri"/>
+          <w:b/>
+          <w:color w:val="1F2937"/>
+          <w:sz w:val="21"/>
+        </w:rPr>
+        <w:t>Ask for approval</w:t>
+      </w:r>
+      <w:r>
+        <w:rPr>
+          <w:rFonts w:ascii="Calibri" w:hAnsi="Calibri" w:eastAsia="Calibri" w:cs="Calibri"/>
+          <w:color w:val="1F2937"/>
+          <w:sz w:val="21"/>
+        </w:rPr>
+        <w:t xml:space="preserve">. Never choose </w:t>
+      </w:r>
+      <w:r>
+        <w:rPr>
+          <w:rFonts w:ascii="Calibri" w:hAnsi="Calibri" w:eastAsia="Calibri" w:cs="Calibri"/>
+          <w:b/>
+          <w:color w:val="1F2937"/>
+          <w:sz w:val="21"/>
+        </w:rPr>
+        <w:t>Full access</w:t>
+      </w:r>
+      <w:r>
+        <w:rPr>
+          <w:rFonts w:ascii="Calibri" w:hAnsi="Calibri" w:eastAsia="Calibri" w:cs="Calibri"/>
+          <w:color w:val="1F2937"/>
+          <w:sz w:val="21"/>
+        </w:rPr>
+        <w:t xml:space="preserve">, </w:t>
+      </w:r>
+      <w:r>
+        <w:rPr>
+          <w:rFonts w:ascii="Calibri" w:hAnsi="Calibri" w:eastAsia="Calibri" w:cs="Calibri"/>
+          <w:b/>
+          <w:color w:val="1F2937"/>
+          <w:sz w:val="21"/>
+        </w:rPr>
+        <w:t>Always allow</w:t>
+      </w:r>
+      <w:r>
+        <w:rPr>
+          <w:rFonts w:ascii="Calibri" w:hAnsi="Calibri" w:eastAsia="Calibri" w:cs="Calibri"/>
+          <w:color w:val="1F2937"/>
+          <w:sz w:val="21"/>
+        </w:rPr>
+        <w:t>, or your whole computer.</w:t>
       </w:r>
     </w:p>
     <w:p>
@@ -4944,7 +4995,39 @@
           <w:color w:val="0B2545"/>
           <w:sz w:val="21"/>
         </w:rPr>
-        <w:t xml:space="preserve"> Codex records only evidenced tone and routing rules. If there are no examples, it starts with no high-confidence precedents.</w:t>
+        <w:t xml:space="preserve"> Codex can name </w:t>
+      </w:r>
+      <w:r>
+        <w:rPr>
+          <w:rFonts w:ascii="Menlo" w:hAnsi="Menlo" w:eastAsia="Menlo" w:cs="Menlo"/>
+          <w:color w:val="1F4D78"/>
+          <w:sz w:val="19"/>
+        </w:rPr>
+        <w:t>AGENTS.md</w:t>
+      </w:r>
+      <w:r>
+        <w:rPr>
+          <w:rFonts w:ascii="Calibri" w:hAnsi="Calibri" w:eastAsia="Calibri" w:cs="Calibri"/>
+          <w:color w:val="0B2545"/>
+          <w:sz w:val="21"/>
+        </w:rPr>
+        <w:t xml:space="preserve"> and </w:t>
+      </w:r>
+      <w:r>
+        <w:rPr>
+          <w:rFonts w:ascii="Menlo" w:hAnsi="Menlo" w:eastAsia="Menlo" w:cs="Menlo"/>
+          <w:color w:val="1F4D78"/>
+          <w:sz w:val="19"/>
+        </w:rPr>
+        <w:t>LINKEDIN-CONTROL-HANDOFF.md</w:t>
+      </w:r>
+      <w:r>
+        <w:rPr>
+          <w:rFonts w:ascii="Calibri" w:hAnsi="Calibri" w:eastAsia="Calibri" w:cs="Calibri"/>
+          <w:color w:val="0B2545"/>
+          <w:sz w:val="21"/>
+        </w:rPr>
+        <w:t xml:space="preserve"> from the local folder and confirms that LinkedIn is outside the granted task.</w:t>
       </w:r>
     </w:p>
     <w:p>
@@ -4962,41 +5045,7 @@
           <w:color w:val="1F2937"/>
           <w:sz w:val="21"/>
         </w:rPr>
-        <w:t xml:space="preserve">For the supervised pilot, you open LinkedIn yourself, check unread conversations in both </w:t>
-      </w:r>
-      <w:r>
-        <w:rPr>
-          <w:rFonts w:ascii="Calibri" w:hAnsi="Calibri" w:eastAsia="Calibri" w:cs="Calibri"/>
-          <w:b/>
-          <w:color w:val="1F2937"/>
-          <w:sz w:val="21"/>
-        </w:rPr>
-        <w:t>Focused</w:t>
-      </w:r>
-      <w:r>
-        <w:rPr>
-          <w:rFonts w:ascii="Calibri" w:hAnsi="Calibri" w:eastAsia="Calibri" w:cs="Calibri"/>
-          <w:color w:val="1F2937"/>
-          <w:sz w:val="21"/>
-        </w:rPr>
-        <w:t xml:space="preserve"> and </w:t>
-      </w:r>
-      <w:r>
-        <w:rPr>
-          <w:rFonts w:ascii="Calibri" w:hAnsi="Calibri" w:eastAsia="Calibri" w:cs="Calibri"/>
-          <w:b/>
-          <w:color w:val="1F2937"/>
-          <w:sz w:val="21"/>
-        </w:rPr>
-        <w:t>Other</w:t>
-      </w:r>
-      <w:r>
-        <w:rPr>
-          <w:rFonts w:ascii="Calibri" w:hAnsi="Calibri" w:eastAsia="Calibri" w:cs="Calibri"/>
-          <w:color w:val="1F2937"/>
-          <w:sz w:val="21"/>
-        </w:rPr>
-        <w:t xml:space="preserve">, and paste no more than 25 into </w:t>
+        <w:t xml:space="preserve">Use </w:t>
       </w:r>
       <w:r>
         <w:rPr>
@@ -5004,7 +5053,7 @@
           <w:color w:val="1F4D78"/>
           <w:sz w:val="19"/>
         </w:rPr>
-        <w:t>LINKEDIN-INBOX-BATCH.md</w:t>
+        <w:t>@Chrome</w:t>
       </w:r>
       <w:r>
         <w:rPr>
@@ -5012,7 +5061,7 @@
           <w:color w:val="1F2937"/>
           <w:sz w:val="21"/>
         </w:rPr>
-        <w:t>. Do not paste passwords, codes, suspicious links, attachments, or sensitive information.</w:t>
+        <w:t xml:space="preserve"> only if Codex needs one approved non-LinkedIn public setup page. Read and approve the real browser prompt for only that page and task. Stop Chrome control before opening LinkedIn. A portal link is an instruction link; it cannot itself grant mouse, computer or browser control.</w:t>
       </w:r>
     </w:p>
     <w:p>
@@ -5036,7 +5085,7 @@
           <w:color w:val="0B2545"/>
           <w:sz w:val="21"/>
         </w:rPr>
-        <w:t xml:space="preserve"> Codex processes only the text you pasted. The AI never opens LinkedIn.</w:t>
+        <w:t xml:space="preserve"> The approved public page was used and browser control is stopped.</w:t>
       </w:r>
     </w:p>
     <w:p>
@@ -5054,7 +5103,7 @@
           <w:color w:val="1F2937"/>
           <w:sz w:val="21"/>
         </w:rPr>
-        <w:t xml:space="preserve">Review </w:t>
+        <w:t xml:space="preserve">If you are allowed to keep them locally, paste up to 25 representative earlier incoming-message and sent-reply pairs into </w:t>
       </w:r>
       <w:r>
         <w:rPr>
@@ -5062,7 +5111,7 @@
           <w:color w:val="1F4D78"/>
           <w:sz w:val="19"/>
         </w:rPr>
-        <w:t>LINKEDIN-REPLY-QUEUE.md</w:t>
+        <w:t>LINKEDIN-TONE-AND-PRECEDENTS.md</w:t>
       </w:r>
       <w:r>
         <w:rPr>
@@ -5070,7 +5119,7 @@
           <w:color w:val="1F2937"/>
           <w:sz w:val="21"/>
         </w:rPr>
-        <w:t xml:space="preserve">. </w:t>
+        <w:t xml:space="preserve">. You may remove names or write </w:t>
       </w:r>
       <w:r>
         <w:rPr>
@@ -5078,7 +5127,7 @@
           <w:color w:val="1F4D78"/>
           <w:sz w:val="19"/>
         </w:rPr>
-        <w:t>READY TO SEND</w:t>
+        <w:t>NONE YET</w:t>
       </w:r>
       <w:r>
         <w:rPr>
@@ -5086,23 +5135,7 @@
           <w:color w:val="1F2937"/>
           <w:sz w:val="21"/>
         </w:rPr>
-        <w:t xml:space="preserve"> contains routine drafts backed by an evidenced precedent. </w:t>
-      </w:r>
-      <w:r>
-        <w:rPr>
-          <w:rFonts w:ascii="Menlo" w:hAnsi="Menlo" w:eastAsia="Menlo" w:cs="Menlo"/>
-          <w:color w:val="1F4D78"/>
-          <w:sz w:val="19"/>
-        </w:rPr>
-        <w:t>NEEDS YOUR DECISION</w:t>
-      </w:r>
-      <w:r>
-        <w:rPr>
-          <w:rFonts w:ascii="Calibri" w:hAnsi="Calibri" w:eastAsia="Calibri" w:cs="Calibri"/>
-          <w:color w:val="1F2937"/>
-          <w:sz w:val="21"/>
-        </w:rPr>
-        <w:t xml:space="preserve"> contains a stable S.No., sender, date, concise summary, proposed reply, and reason for every uncertain item.</w:t>
+        <w:t>.</w:t>
       </w:r>
     </w:p>
     <w:p>
@@ -5126,114 +5159,12 @@
           <w:color w:val="0B2545"/>
           <w:sz w:val="21"/>
         </w:rPr>
-        <w:t xml:space="preserve"> You review every draft, manually send any reply you approve in LinkedIn, and return to mark each item </w:t>
-      </w:r>
-      <w:r>
-        <w:rPr>
-          <w:rFonts w:ascii="Menlo" w:hAnsi="Menlo" w:eastAsia="Menlo" w:cs="Menlo"/>
-          <w:color w:val="1F4D78"/>
-          <w:sz w:val="19"/>
-        </w:rPr>
-        <w:t>SENT AS WRITTEN</w:t>
-      </w:r>
-      <w:r>
-        <w:rPr>
-          <w:rFonts w:ascii="Calibri" w:hAnsi="Calibri" w:eastAsia="Calibri" w:cs="Calibri"/>
-          <w:color w:val="0B2545"/>
-          <w:sz w:val="21"/>
-        </w:rPr>
-        <w:t xml:space="preserve">, </w:t>
-      </w:r>
-      <w:r>
-        <w:rPr>
-          <w:rFonts w:ascii="Menlo" w:hAnsi="Menlo" w:eastAsia="Menlo" w:cs="Menlo"/>
-          <w:color w:val="1F4D78"/>
-          <w:sz w:val="19"/>
-        </w:rPr>
-        <w:t>EDITED AND SENT</w:t>
-      </w:r>
-      <w:r>
-        <w:rPr>
-          <w:rFonts w:ascii="Calibri" w:hAnsi="Calibri" w:eastAsia="Calibri" w:cs="Calibri"/>
-          <w:color w:val="0B2545"/>
-          <w:sz w:val="21"/>
-        </w:rPr>
-        <w:t xml:space="preserve">, </w:t>
-      </w:r>
-      <w:r>
-        <w:rPr>
-          <w:rFonts w:ascii="Menlo" w:hAnsi="Menlo" w:eastAsia="Menlo" w:cs="Menlo"/>
-          <w:color w:val="1F4D78"/>
-          <w:sz w:val="19"/>
-        </w:rPr>
-        <w:t>SKIPPED</w:t>
-      </w:r>
-      <w:r>
-        <w:rPr>
-          <w:rFonts w:ascii="Calibri" w:hAnsi="Calibri" w:eastAsia="Calibri" w:cs="Calibri"/>
-          <w:color w:val="0B2545"/>
-          <w:sz w:val="21"/>
-        </w:rPr>
-        <w:t xml:space="preserve">, or </w:t>
-      </w:r>
-      <w:r>
-        <w:rPr>
-          <w:rFonts w:ascii="Menlo" w:hAnsi="Menlo" w:eastAsia="Menlo" w:cs="Menlo"/>
-          <w:color w:val="1F4D78"/>
-          <w:sz w:val="19"/>
-        </w:rPr>
-        <w:t>KEEP FOR LATER</w:t>
-      </w:r>
-      <w:r>
-        <w:rPr>
-          <w:rFonts w:ascii="Calibri" w:hAnsi="Calibri" w:eastAsia="Calibri" w:cs="Calibri"/>
-          <w:color w:val="0B2545"/>
-          <w:sz w:val="21"/>
-        </w:rPr>
-        <w:t>. Codex never claims a send without your confirmation.</w:t>
+        <w:t xml:space="preserve"> Codex records only evidenced tone and routing rules. If there are no examples, it starts with no high-confidence precedents.</w:t>
       </w:r>
     </w:p>
     <w:p>
       <w:pPr>
-        <w:spacing w:before="0" w:after="120" w:line="288" w:lineRule="auto"/>
-      </w:pPr>
-      <w:r>
-        <w:rPr>
-          <w:rFonts w:ascii="Calibri" w:hAnsi="Calibri" w:eastAsia="Calibri" w:cs="Calibri"/>
-          <w:color w:val="1F2937"/>
-          <w:sz w:val="21"/>
-        </w:rPr>
-        <w:t>The weekly reminder works only while the computer is awake, ChatGPT is running and the local project remains available. It reminds and drafts; it does not access LinkedIn.</w:t>
-      </w:r>
-    </w:p>
-    <w:p>
-      <w:pPr>
-        <w:pStyle w:val="Heading1"/>
-      </w:pPr>
-      <w:r>
-        <w:rPr>
-          <w:rFonts w:ascii="Calibri" w:hAnsi="Calibri" w:eastAsia="Calibri" w:cs="Calibri"/>
-          <w:color w:val="2E74B5"/>
-          <w:sz w:val="32"/>
-        </w:rPr>
-        <w:t>What to bring back</w:t>
-      </w:r>
-    </w:p>
-    <w:p>
-      <w:pPr>
-        <w:spacing w:before="0" w:after="120" w:line="288" w:lineRule="auto"/>
-      </w:pPr>
-      <w:r>
-        <w:rPr>
-          <w:rFonts w:ascii="Calibri" w:hAnsi="Calibri" w:eastAsia="Calibri" w:cs="Calibri"/>
-          <w:color w:val="1F2937"/>
-          <w:sz w:val="21"/>
-        </w:rPr>
-        <w:t>Bring the laptop or screenshots that show:</w:t>
-      </w:r>
-    </w:p>
-    <w:p>
-      <w:pPr>
+        <w:keepNext/>
         <w:numPr>
           <w:ilvl w:val="0"/>
           <w:numId w:val="115"/>
@@ -5246,7 +5177,7 @@
           <w:color w:val="1F2937"/>
           <w:sz w:val="21"/>
         </w:rPr>
-        <w:t xml:space="preserve">Email project open with </w:t>
+        <w:t xml:space="preserve">For the supervised pilot, Codex must first stop every Computer and Chrome tool and show </w:t>
       </w:r>
       <w:r>
         <w:rPr>
@@ -5254,7 +5185,7 @@
           <w:color w:val="1F4D78"/>
           <w:sz w:val="19"/>
         </w:rPr>
-        <w:t>EMAIL-TRIAGE-REPORT.md</w:t>
+        <w:t>YOUR TURN ON LINKEDIN</w:t>
       </w:r>
       <w:r>
         <w:rPr>
@@ -5262,24 +5193,41 @@
           <w:color w:val="1F2937"/>
           <w:sz w:val="21"/>
         </w:rPr>
-        <w:t>.</w:t>
-      </w:r>
-    </w:p>
-    <w:p>
-      <w:pPr>
-        <w:numPr>
-          <w:ilvl w:val="0"/>
-          <w:numId w:val="115"/>
-        </w:numPr>
-        <w:spacing w:before="0" w:after="80" w:line="288" w:lineRule="auto"/>
-      </w:pPr>
-      <w:r>
-        <w:rPr>
-          <w:rFonts w:ascii="Calibri" w:hAnsi="Calibri" w:eastAsia="Calibri" w:cs="Calibri"/>
+        <w:t xml:space="preserve">. You open LinkedIn yourself, check unread conversations in both </w:t>
+      </w:r>
+      <w:r>
+        <w:rPr>
+          <w:rFonts w:ascii="Calibri" w:hAnsi="Calibri" w:eastAsia="Calibri" w:cs="Calibri"/>
+          <w:b/>
           <w:color w:val="1F2937"/>
           <w:sz w:val="21"/>
         </w:rPr>
-        <w:t xml:space="preserve">Drive project open with </w:t>
+        <w:t>Focused</w:t>
+      </w:r>
+      <w:r>
+        <w:rPr>
+          <w:rFonts w:ascii="Calibri" w:hAnsi="Calibri" w:eastAsia="Calibri" w:cs="Calibri"/>
+          <w:color w:val="1F2937"/>
+          <w:sz w:val="21"/>
+        </w:rPr>
+        <w:t xml:space="preserve"> and </w:t>
+      </w:r>
+      <w:r>
+        <w:rPr>
+          <w:rFonts w:ascii="Calibri" w:hAnsi="Calibri" w:eastAsia="Calibri" w:cs="Calibri"/>
+          <w:b/>
+          <w:color w:val="1F2937"/>
+          <w:sz w:val="21"/>
+        </w:rPr>
+        <w:t>Other</w:t>
+      </w:r>
+      <w:r>
+        <w:rPr>
+          <w:rFonts w:ascii="Calibri" w:hAnsi="Calibri" w:eastAsia="Calibri" w:cs="Calibri"/>
+          <w:color w:val="1F2937"/>
+          <w:sz w:val="21"/>
+        </w:rPr>
+        <w:t xml:space="preserve">, copy no more than 25, close LinkedIn, return to the local project, paste them into </w:t>
       </w:r>
       <w:r>
         <w:rPr>
@@ -5287,7 +5235,7 @@
           <w:color w:val="1F4D78"/>
           <w:sz w:val="19"/>
         </w:rPr>
-        <w:t>DRIVE-INDEX.md</w:t>
+        <w:t>LINKEDIN-INBOX-BATCH.md</w:t>
       </w:r>
       <w:r>
         <w:rPr>
@@ -5295,84 +5243,52 @@
           <w:color w:val="1F2937"/>
           <w:sz w:val="21"/>
         </w:rPr>
-        <w:t xml:space="preserve"> and its saved cursor.</w:t>
+        <w:t xml:space="preserve">, and say </w:t>
+      </w:r>
+      <w:r>
+        <w:rPr>
+          <w:rFonts w:ascii="Menlo" w:hAnsi="Menlo" w:eastAsia="Menlo" w:cs="Menlo"/>
+          <w:color w:val="1F4D78"/>
+          <w:sz w:val="19"/>
+        </w:rPr>
+        <w:t>BATCH READY</w:t>
+      </w:r>
+      <w:r>
+        <w:rPr>
+          <w:rFonts w:ascii="Calibri" w:hAnsi="Calibri" w:eastAsia="Calibri" w:cs="Calibri"/>
+          <w:color w:val="1F2937"/>
+          <w:sz w:val="21"/>
+        </w:rPr>
+        <w:t>. Do not paste passwords, codes, suspicious links, attachments, or sensitive information.</w:t>
       </w:r>
     </w:p>
     <w:p>
       <w:pPr>
-        <w:numPr>
-          <w:ilvl w:val="0"/>
-          <w:numId w:val="115"/>
-        </w:numPr>
-        <w:spacing w:before="0" w:after="80" w:line="288" w:lineRule="auto"/>
-      </w:pPr>
-      <w:r>
-        <w:rPr>
-          <w:rFonts w:ascii="Calibri" w:hAnsi="Calibri" w:eastAsia="Calibri" w:cs="Calibri"/>
-          <w:color w:val="1F2937"/>
-          <w:sz w:val="21"/>
-        </w:rPr>
-        <w:t>The final evidence row and validator pass in each project.</w:t>
+        <w:spacing w:before="60" w:after="180" w:line="288" w:lineRule="auto"/>
+        <w:ind w:left="173"/>
+        <w:shd w:fill="FFF8E8"/>
+      </w:pPr>
+      <w:r>
+        <w:rPr>
+          <w:rFonts w:ascii="Calibri" w:hAnsi="Calibri" w:eastAsia="Calibri" w:cs="Calibri"/>
+          <w:b/>
+          <w:color w:val="0B2545"/>
+          <w:sz w:val="21"/>
+        </w:rPr>
+        <w:t>DONE WHEN:</w:t>
+      </w:r>
+      <w:r>
+        <w:rPr>
+          <w:rFonts w:ascii="Calibri" w:hAnsi="Calibri" w:eastAsia="Calibri" w:cs="Calibri"/>
+          <w:color w:val="0B2545"/>
+          <w:sz w:val="21"/>
+        </w:rPr>
+        <w:t xml:space="preserve"> LinkedIn is closed, Codex processes only the text you pasted, and the AI made no screenshot, mouse, keyboard, browser or page action on LinkedIn.</w:t>
       </w:r>
     </w:p>
     <w:p>
       <w:pPr>
-        <w:numPr>
-          <w:ilvl w:val="0"/>
-          <w:numId w:val="115"/>
-        </w:numPr>
-        <w:spacing w:before="0" w:after="80" w:line="288" w:lineRule="auto"/>
-      </w:pPr>
-      <w:r>
-        <w:rPr>
-          <w:rFonts w:ascii="Calibri" w:hAnsi="Calibri" w:eastAsia="Calibri" w:cs="Calibri"/>
-          <w:color w:val="1F2937"/>
-          <w:sz w:val="21"/>
-        </w:rPr>
-        <w:t>Optional: approved Saturday schedule, tone/precedent file, numbered reply queue, cursor, employee-confirmed outcomes, and validator pass. Do not show message bodies.</w:t>
-      </w:r>
-    </w:p>
-    <w:p>
-      <w:pPr>
-        <w:spacing w:before="0" w:after="120" w:line="288" w:lineRule="auto"/>
-      </w:pPr>
-      <w:r>
-        <w:rPr>
-          <w:rFonts w:ascii="Calibri" w:hAnsi="Calibri" w:eastAsia="Calibri" w:cs="Calibri"/>
-          <w:color w:val="1F2937"/>
-          <w:sz w:val="21"/>
-        </w:rPr>
-        <w:t>Do not bring email bodies, passwords, one-time codes, private HR details, banking information, or sensitive Drive content. Show the safe report headings and proof.</w:t>
-      </w:r>
-    </w:p>
-    <w:p>
-      <w:pPr>
-        <w:pStyle w:val="Heading1"/>
-      </w:pPr>
-      <w:r>
-        <w:rPr>
-          <w:rFonts w:ascii="Calibri" w:hAnsi="Calibri" w:eastAsia="Calibri" w:cs="Calibri"/>
-          <w:color w:val="2E74B5"/>
-          <w:sz w:val="32"/>
-        </w:rPr>
-        <w:t>Stop rules</w:t>
-      </w:r>
-    </w:p>
-    <w:p>
-      <w:pPr>
-        <w:spacing w:before="0" w:after="120" w:line="288" w:lineRule="auto"/>
-      </w:pPr>
-      <w:r>
-        <w:rPr>
-          <w:rFonts w:ascii="Calibri" w:hAnsi="Calibri" w:eastAsia="Calibri" w:cs="Calibri"/>
-          <w:color w:val="1F2937"/>
-          <w:sz w:val="21"/>
-        </w:rPr>
-        <w:t>Stop and use the Setup Helper if:</w:t>
-      </w:r>
-    </w:p>
-    <w:p>
-      <w:pPr>
+        <w:keepNext/>
         <w:numPr>
           <w:ilvl w:val="0"/>
           <w:numId w:val="117"/>
@@ -5385,33 +5301,148 @@
           <w:color w:val="1F2937"/>
           <w:sz w:val="21"/>
         </w:rPr>
-        <w:t>the correct folder is not visible;</w:t>
+        <w:t xml:space="preserve">Review </w:t>
+      </w:r>
+      <w:r>
+        <w:rPr>
+          <w:rFonts w:ascii="Menlo" w:hAnsi="Menlo" w:eastAsia="Menlo" w:cs="Menlo"/>
+          <w:color w:val="1F4D78"/>
+          <w:sz w:val="19"/>
+        </w:rPr>
+        <w:t>LINKEDIN-REPLY-QUEUE.md</w:t>
+      </w:r>
+      <w:r>
+        <w:rPr>
+          <w:rFonts w:ascii="Calibri" w:hAnsi="Calibri" w:eastAsia="Calibri" w:cs="Calibri"/>
+          <w:color w:val="1F2937"/>
+          <w:sz w:val="21"/>
+        </w:rPr>
+        <w:t xml:space="preserve">. </w:t>
+      </w:r>
+      <w:r>
+        <w:rPr>
+          <w:rFonts w:ascii="Menlo" w:hAnsi="Menlo" w:eastAsia="Menlo" w:cs="Menlo"/>
+          <w:color w:val="1F4D78"/>
+          <w:sz w:val="19"/>
+        </w:rPr>
+        <w:t>READY TO SEND</w:t>
+      </w:r>
+      <w:r>
+        <w:rPr>
+          <w:rFonts w:ascii="Calibri" w:hAnsi="Calibri" w:eastAsia="Calibri" w:cs="Calibri"/>
+          <w:color w:val="1F2937"/>
+          <w:sz w:val="21"/>
+        </w:rPr>
+        <w:t xml:space="preserve"> contains routine drafts backed by an evidenced precedent. </w:t>
+      </w:r>
+      <w:r>
+        <w:rPr>
+          <w:rFonts w:ascii="Menlo" w:hAnsi="Menlo" w:eastAsia="Menlo" w:cs="Menlo"/>
+          <w:color w:val="1F4D78"/>
+          <w:sz w:val="19"/>
+        </w:rPr>
+        <w:t>NEEDS YOUR DECISION</w:t>
+      </w:r>
+      <w:r>
+        <w:rPr>
+          <w:rFonts w:ascii="Calibri" w:hAnsi="Calibri" w:eastAsia="Calibri" w:cs="Calibri"/>
+          <w:color w:val="1F2937"/>
+          <w:sz w:val="21"/>
+        </w:rPr>
+        <w:t xml:space="preserve"> contains a stable S.No., sender, date, concise summary, proposed reply, and reason for every uncertain item.</w:t>
       </w:r>
     </w:p>
     <w:p>
       <w:pPr>
-        <w:numPr>
-          <w:ilvl w:val="0"/>
-          <w:numId w:val="117"/>
-        </w:numPr>
-        <w:spacing w:before="0" w:after="80" w:line="288" w:lineRule="auto"/>
-      </w:pPr>
-      <w:r>
-        <w:rPr>
-          <w:rFonts w:ascii="Calibri" w:hAnsi="Calibri" w:eastAsia="Calibri" w:cs="Calibri"/>
-          <w:color w:val="1F2937"/>
-          <w:sz w:val="21"/>
-        </w:rPr>
-        <w:t>the app or button names do not match;</w:t>
+        <w:spacing w:before="60" w:after="180" w:line="288" w:lineRule="auto"/>
+        <w:ind w:left="173"/>
+        <w:shd w:fill="FFF8E8"/>
+      </w:pPr>
+      <w:r>
+        <w:rPr>
+          <w:rFonts w:ascii="Calibri" w:hAnsi="Calibri" w:eastAsia="Calibri" w:cs="Calibri"/>
+          <w:b/>
+          <w:color w:val="0B2545"/>
+          <w:sz w:val="21"/>
+        </w:rPr>
+        <w:t>DONE WHEN:</w:t>
+      </w:r>
+      <w:r>
+        <w:rPr>
+          <w:rFonts w:ascii="Calibri" w:hAnsi="Calibri" w:eastAsia="Calibri" w:cs="Calibri"/>
+          <w:color w:val="0B2545"/>
+          <w:sz w:val="21"/>
+        </w:rPr>
+        <w:t xml:space="preserve"> You review every draft, manually send any reply you approve in LinkedIn, and return to mark each item </w:t>
+      </w:r>
+      <w:r>
+        <w:rPr>
+          <w:rFonts w:ascii="Menlo" w:hAnsi="Menlo" w:eastAsia="Menlo" w:cs="Menlo"/>
+          <w:color w:val="1F4D78"/>
+          <w:sz w:val="19"/>
+        </w:rPr>
+        <w:t>SENT AS WRITTEN</w:t>
+      </w:r>
+      <w:r>
+        <w:rPr>
+          <w:rFonts w:ascii="Calibri" w:hAnsi="Calibri" w:eastAsia="Calibri" w:cs="Calibri"/>
+          <w:color w:val="0B2545"/>
+          <w:sz w:val="21"/>
+        </w:rPr>
+        <w:t xml:space="preserve">, </w:t>
+      </w:r>
+      <w:r>
+        <w:rPr>
+          <w:rFonts w:ascii="Menlo" w:hAnsi="Menlo" w:eastAsia="Menlo" w:cs="Menlo"/>
+          <w:color w:val="1F4D78"/>
+          <w:sz w:val="19"/>
+        </w:rPr>
+        <w:t>EDITED AND SENT</w:t>
+      </w:r>
+      <w:r>
+        <w:rPr>
+          <w:rFonts w:ascii="Calibri" w:hAnsi="Calibri" w:eastAsia="Calibri" w:cs="Calibri"/>
+          <w:color w:val="0B2545"/>
+          <w:sz w:val="21"/>
+        </w:rPr>
+        <w:t xml:space="preserve">, </w:t>
+      </w:r>
+      <w:r>
+        <w:rPr>
+          <w:rFonts w:ascii="Menlo" w:hAnsi="Menlo" w:eastAsia="Menlo" w:cs="Menlo"/>
+          <w:color w:val="1F4D78"/>
+          <w:sz w:val="19"/>
+        </w:rPr>
+        <w:t>SKIPPED</w:t>
+      </w:r>
+      <w:r>
+        <w:rPr>
+          <w:rFonts w:ascii="Calibri" w:hAnsi="Calibri" w:eastAsia="Calibri" w:cs="Calibri"/>
+          <w:color w:val="0B2545"/>
+          <w:sz w:val="21"/>
+        </w:rPr>
+        <w:t xml:space="preserve">, or </w:t>
+      </w:r>
+      <w:r>
+        <w:rPr>
+          <w:rFonts w:ascii="Menlo" w:hAnsi="Menlo" w:eastAsia="Menlo" w:cs="Menlo"/>
+          <w:color w:val="1F4D78"/>
+          <w:sz w:val="19"/>
+        </w:rPr>
+        <w:t>KEEP FOR LATER</w:t>
+      </w:r>
+      <w:r>
+        <w:rPr>
+          <w:rFonts w:ascii="Calibri" w:hAnsi="Calibri" w:eastAsia="Calibri" w:cs="Calibri"/>
+          <w:color w:val="0B2545"/>
+          <w:sz w:val="21"/>
+        </w:rPr>
+        <w:t>. Codex never claims a send without your confirmation.</w:t>
       </w:r>
     </w:p>
     <w:p>
       <w:pPr>
-        <w:numPr>
-          <w:ilvl w:val="0"/>
-          <w:numId w:val="117"/>
-        </w:numPr>
-        <w:spacing w:before="0" w:after="80" w:line="288" w:lineRule="auto"/>
+        <w:spacing w:before="0" w:after="120" w:line="288" w:lineRule="auto"/>
       </w:pPr>
       <w:r>
         <w:rPr>
@@ -5419,33 +5450,25 @@
           <w:color w:val="1F2937"/>
           <w:sz w:val="21"/>
         </w:rPr>
-        <w:t>the company app cannot be enabled or connected;</w:t>
+        <w:t>The weekly reminder works only while the computer is awake, ChatGPT is running and the local project remains available. It may control the approved local worker, then it stops. It does not access LinkedIn.</w:t>
       </w:r>
     </w:p>
     <w:p>
       <w:pPr>
-        <w:numPr>
-          <w:ilvl w:val="0"/>
-          <w:numId w:val="117"/>
-        </w:numPr>
-        <w:spacing w:before="0" w:after="80" w:line="288" w:lineRule="auto"/>
-      </w:pPr>
-      <w:r>
-        <w:rPr>
-          <w:rFonts w:ascii="Calibri" w:hAnsi="Calibri" w:eastAsia="Calibri" w:cs="Calibri"/>
-          <w:color w:val="1F2937"/>
-          <w:sz w:val="21"/>
-        </w:rPr>
-        <w:t>the wrong account is connected;</w:t>
+        <w:pStyle w:val="Heading1"/>
+      </w:pPr>
+      <w:r>
+        <w:rPr>
+          <w:rFonts w:ascii="Calibri" w:hAnsi="Calibri" w:eastAsia="Calibri" w:cs="Calibri"/>
+          <w:color w:val="2E74B5"/>
+          <w:sz w:val="32"/>
+        </w:rPr>
+        <w:t>What to bring back</w:t>
       </w:r>
     </w:p>
     <w:p>
       <w:pPr>
-        <w:numPr>
-          <w:ilvl w:val="0"/>
-          <w:numId w:val="117"/>
-        </w:numPr>
-        <w:spacing w:before="0" w:after="80" w:line="288" w:lineRule="auto"/>
+        <w:spacing w:before="0" w:after="120" w:line="288" w:lineRule="auto"/>
       </w:pPr>
       <w:r>
         <w:rPr>
@@ -5453,67 +5476,7 @@
           <w:color w:val="1F2937"/>
           <w:sz w:val="21"/>
         </w:rPr>
-        <w:t>a permission asks for Full access;</w:t>
-      </w:r>
-    </w:p>
-    <w:p>
-      <w:pPr>
-        <w:numPr>
-          <w:ilvl w:val="0"/>
-          <w:numId w:val="117"/>
-        </w:numPr>
-        <w:spacing w:before="0" w:after="80" w:line="288" w:lineRule="auto"/>
-      </w:pPr>
-      <w:r>
-        <w:rPr>
-          <w:rFonts w:ascii="Calibri" w:hAnsi="Calibri" w:eastAsia="Calibri" w:cs="Calibri"/>
-          <w:color w:val="1F2937"/>
-          <w:sz w:val="21"/>
-        </w:rPr>
-        <w:t>the AI asks for a password, one-time code, Terminal, PowerShell, Command Prompt, Python, a CLI, Git or GitHub;</w:t>
-      </w:r>
-    </w:p>
-    <w:p>
-      <w:pPr>
-        <w:numPr>
-          <w:ilvl w:val="0"/>
-          <w:numId w:val="117"/>
-        </w:numPr>
-        <w:spacing w:before="0" w:after="80" w:line="288" w:lineRule="auto"/>
-      </w:pPr>
-      <w:r>
-        <w:rPr>
-          <w:rFonts w:ascii="Calibri" w:hAnsi="Calibri" w:eastAsia="Calibri" w:cs="Calibri"/>
-          <w:color w:val="1F2937"/>
-          <w:sz w:val="21"/>
-        </w:rPr>
-        <w:t>the task reaches medical, dosage, certification, legal, spend, credentials, banking, personal HR or another sensitive decision.</w:t>
-      </w:r>
-    </w:p>
-    <w:p>
-      <w:pPr>
-        <w:spacing w:before="0" w:after="120" w:line="288" w:lineRule="auto"/>
-      </w:pPr>
-      <w:r>
-        <w:rPr>
-          <w:rFonts w:ascii="Calibri" w:hAnsi="Calibri" w:eastAsia="Calibri" w:cs="Calibri"/>
-          <w:color w:val="1F2937"/>
-          <w:sz w:val="21"/>
-        </w:rPr>
-        <w:t>Setup Helper resolves safe setup. Ambuj receives only an unavoidable company-access problem. Abilash receives owner decisions and every Gate 0 issue.</w:t>
-      </w:r>
-    </w:p>
-    <w:p>
-      <w:pPr>
-        <w:pStyle w:val="Heading1"/>
-      </w:pPr>
-      <w:r>
-        <w:rPr>
-          <w:rFonts w:ascii="Calibri" w:hAnsi="Calibri" w:eastAsia="Calibri" w:cs="Calibri"/>
-          <w:color w:val="2E74B5"/>
-          <w:sz w:val="32"/>
-        </w:rPr>
-        <w:t>Official screen references</w:t>
+        <w:t>Bring the laptop or screenshots that show:</w:t>
       </w:r>
     </w:p>
     <w:p>
@@ -5530,7 +5493,23 @@
           <w:color w:val="1F2937"/>
           <w:sz w:val="21"/>
         </w:rPr>
-        <w:t>ChatGPT quickstart: https://learn.chatgpt.com/docs/quickstart</w:t>
+        <w:t xml:space="preserve">Email project open with </w:t>
+      </w:r>
+      <w:r>
+        <w:rPr>
+          <w:rFonts w:ascii="Menlo" w:hAnsi="Menlo" w:eastAsia="Menlo" w:cs="Menlo"/>
+          <w:color w:val="1F4D78"/>
+          <w:sz w:val="19"/>
+        </w:rPr>
+        <w:t>EMAIL-TRIAGE-REPORT.md</w:t>
+      </w:r>
+      <w:r>
+        <w:rPr>
+          <w:rFonts w:ascii="Calibri" w:hAnsi="Calibri" w:eastAsia="Calibri" w:cs="Calibri"/>
+          <w:color w:val="1F2937"/>
+          <w:sz w:val="21"/>
+        </w:rPr>
+        <w:t>.</w:t>
       </w:r>
     </w:p>
     <w:p>
@@ -5547,7 +5526,23 @@
           <w:color w:val="1F2937"/>
           <w:sz w:val="21"/>
         </w:rPr>
-        <w:t>ChatGPT desktop app: https://learn.chatgpt.com/docs/app</w:t>
+        <w:t xml:space="preserve">Drive project open with </w:t>
+      </w:r>
+      <w:r>
+        <w:rPr>
+          <w:rFonts w:ascii="Menlo" w:hAnsi="Menlo" w:eastAsia="Menlo" w:cs="Menlo"/>
+          <w:color w:val="1F4D78"/>
+          <w:sz w:val="19"/>
+        </w:rPr>
+        <w:t>DRIVE-INDEX.md</w:t>
+      </w:r>
+      <w:r>
+        <w:rPr>
+          <w:rFonts w:ascii="Calibri" w:hAnsi="Calibri" w:eastAsia="Calibri" w:cs="Calibri"/>
+          <w:color w:val="1F2937"/>
+          <w:sz w:val="21"/>
+        </w:rPr>
+        <w:t xml:space="preserve"> and its saved cursor.</w:t>
       </w:r>
     </w:p>
     <w:p>
@@ -5564,7 +5559,7 @@
           <w:color w:val="1F2937"/>
           <w:sz w:val="21"/>
         </w:rPr>
-        <w:t>Projects and chats: https://learn.chatgpt.com/docs/projects</w:t>
+        <w:t>The final evidence row and validator pass in each project.</w:t>
       </w:r>
     </w:p>
     <w:p>
@@ -5581,14 +5576,53 @@
           <w:color w:val="1F2937"/>
           <w:sz w:val="21"/>
         </w:rPr>
-        <w:t>Apps: https://help.openai.com/en/articles/11487775-connectors-in-chatgpt</w:t>
+        <w:t>Optional: approved Saturday schedule, tone/precedent file, numbered reply queue, cursor, employee-confirmed outcomes, and validator pass. Do not show message bodies.</w:t>
       </w:r>
     </w:p>
     <w:p>
       <w:pPr>
+        <w:spacing w:before="0" w:after="120" w:line="288" w:lineRule="auto"/>
+      </w:pPr>
+      <w:r>
+        <w:rPr>
+          <w:rFonts w:ascii="Calibri" w:hAnsi="Calibri" w:eastAsia="Calibri" w:cs="Calibri"/>
+          <w:color w:val="1F2937"/>
+          <w:sz w:val="21"/>
+        </w:rPr>
+        <w:t>Do not bring email bodies, passwords, one-time codes, private HR details, banking information, or sensitive Drive content. Show the safe report headings and proof.</w:t>
+      </w:r>
+    </w:p>
+    <w:p>
+      <w:pPr>
+        <w:pStyle w:val="Heading1"/>
+      </w:pPr>
+      <w:r>
+        <w:rPr>
+          <w:rFonts w:ascii="Calibri" w:hAnsi="Calibri" w:eastAsia="Calibri" w:cs="Calibri"/>
+          <w:color w:val="2E74B5"/>
+          <w:sz w:val="32"/>
+        </w:rPr>
+        <w:t>Stop rules</w:t>
+      </w:r>
+    </w:p>
+    <w:p>
+      <w:pPr>
+        <w:spacing w:before="0" w:after="120" w:line="288" w:lineRule="auto"/>
+      </w:pPr>
+      <w:r>
+        <w:rPr>
+          <w:rFonts w:ascii="Calibri" w:hAnsi="Calibri" w:eastAsia="Calibri" w:cs="Calibri"/>
+          <w:color w:val="1F2937"/>
+          <w:sz w:val="21"/>
+        </w:rPr>
+        <w:t>Stop and use the Setup Helper if:</w:t>
+      </w:r>
+    </w:p>
+    <w:p>
+      <w:pPr>
         <w:numPr>
           <w:ilvl w:val="0"/>
-          <w:numId w:val="119"/>
+          <w:numId w:val="121"/>
         </w:numPr>
         <w:spacing w:before="0" w:after="80" w:line="288" w:lineRule="auto"/>
       </w:pPr>
@@ -5598,7 +5632,271 @@
           <w:color w:val="1F2937"/>
           <w:sz w:val="21"/>
         </w:rPr>
+        <w:t>the correct folder is not visible;</w:t>
+      </w:r>
+    </w:p>
+    <w:p>
+      <w:pPr>
+        <w:numPr>
+          <w:ilvl w:val="0"/>
+          <w:numId w:val="121"/>
+        </w:numPr>
+        <w:spacing w:before="0" w:after="80" w:line="288" w:lineRule="auto"/>
+      </w:pPr>
+      <w:r>
+        <w:rPr>
+          <w:rFonts w:ascii="Calibri" w:hAnsi="Calibri" w:eastAsia="Calibri" w:cs="Calibri"/>
+          <w:color w:val="1F2937"/>
+          <w:sz w:val="21"/>
+        </w:rPr>
+        <w:t>the app or button names do not match;</w:t>
+      </w:r>
+    </w:p>
+    <w:p>
+      <w:pPr>
+        <w:numPr>
+          <w:ilvl w:val="0"/>
+          <w:numId w:val="121"/>
+        </w:numPr>
+        <w:spacing w:before="0" w:after="80" w:line="288" w:lineRule="auto"/>
+      </w:pPr>
+      <w:r>
+        <w:rPr>
+          <w:rFonts w:ascii="Calibri" w:hAnsi="Calibri" w:eastAsia="Calibri" w:cs="Calibri"/>
+          <w:color w:val="1F2937"/>
+          <w:sz w:val="21"/>
+        </w:rPr>
+        <w:t>the company app cannot be enabled or connected;</w:t>
+      </w:r>
+    </w:p>
+    <w:p>
+      <w:pPr>
+        <w:numPr>
+          <w:ilvl w:val="0"/>
+          <w:numId w:val="121"/>
+        </w:numPr>
+        <w:spacing w:before="0" w:after="80" w:line="288" w:lineRule="auto"/>
+      </w:pPr>
+      <w:r>
+        <w:rPr>
+          <w:rFonts w:ascii="Calibri" w:hAnsi="Calibri" w:eastAsia="Calibri" w:cs="Calibri"/>
+          <w:color w:val="1F2937"/>
+          <w:sz w:val="21"/>
+        </w:rPr>
+        <w:t>the wrong account is connected;</w:t>
+      </w:r>
+    </w:p>
+    <w:p>
+      <w:pPr>
+        <w:numPr>
+          <w:ilvl w:val="0"/>
+          <w:numId w:val="121"/>
+        </w:numPr>
+        <w:spacing w:before="0" w:after="80" w:line="288" w:lineRule="auto"/>
+      </w:pPr>
+      <w:r>
+        <w:rPr>
+          <w:rFonts w:ascii="Calibri" w:hAnsi="Calibri" w:eastAsia="Calibri" w:cs="Calibri"/>
+          <w:color w:val="1F2937"/>
+          <w:sz w:val="21"/>
+        </w:rPr>
+        <w:t>a permission asks for Full access;</w:t>
+      </w:r>
+    </w:p>
+    <w:p>
+      <w:pPr>
+        <w:numPr>
+          <w:ilvl w:val="0"/>
+          <w:numId w:val="121"/>
+        </w:numPr>
+        <w:spacing w:before="0" w:after="80" w:line="288" w:lineRule="auto"/>
+      </w:pPr>
+      <w:r>
+        <w:rPr>
+          <w:rFonts w:ascii="Calibri" w:hAnsi="Calibri" w:eastAsia="Calibri" w:cs="Calibri"/>
+          <w:color w:val="1F2937"/>
+          <w:sz w:val="21"/>
+        </w:rPr>
+        <w:t>a permission asks for Always allow, the whole computer or a screen outside this task;</w:t>
+      </w:r>
+    </w:p>
+    <w:p>
+      <w:pPr>
+        <w:numPr>
+          <w:ilvl w:val="0"/>
+          <w:numId w:val="121"/>
+        </w:numPr>
+        <w:spacing w:before="0" w:after="80" w:line="288" w:lineRule="auto"/>
+      </w:pPr>
+      <w:r>
+        <w:rPr>
+          <w:rFonts w:ascii="Calibri" w:hAnsi="Calibri" w:eastAsia="Calibri" w:cs="Calibri"/>
+          <w:color w:val="1F2937"/>
+          <w:sz w:val="21"/>
+        </w:rPr>
+        <w:t>Codex or Chrome remains in control when LinkedIn is about to open;</w:t>
+      </w:r>
+    </w:p>
+    <w:p>
+      <w:pPr>
+        <w:numPr>
+          <w:ilvl w:val="0"/>
+          <w:numId w:val="121"/>
+        </w:numPr>
+        <w:spacing w:before="0" w:after="80" w:line="288" w:lineRule="auto"/>
+      </w:pPr>
+      <w:r>
+        <w:rPr>
+          <w:rFonts w:ascii="Calibri" w:hAnsi="Calibri" w:eastAsia="Calibri" w:cs="Calibri"/>
+          <w:color w:val="1F2937"/>
+          <w:sz w:val="21"/>
+        </w:rPr>
+        <w:t>the AI asks for a password, one-time code, Terminal, PowerShell, Command Prompt, Python, a CLI, Git or GitHub;</w:t>
+      </w:r>
+    </w:p>
+    <w:p>
+      <w:pPr>
+        <w:numPr>
+          <w:ilvl w:val="0"/>
+          <w:numId w:val="121"/>
+        </w:numPr>
+        <w:spacing w:before="0" w:after="80" w:line="288" w:lineRule="auto"/>
+      </w:pPr>
+      <w:r>
+        <w:rPr>
+          <w:rFonts w:ascii="Calibri" w:hAnsi="Calibri" w:eastAsia="Calibri" w:cs="Calibri"/>
+          <w:color w:val="1F2937"/>
+          <w:sz w:val="21"/>
+        </w:rPr>
+        <w:t>the task reaches medical, dosage, certification, legal, spend, credentials, banking, personal HR or another sensitive decision.</w:t>
+      </w:r>
+    </w:p>
+    <w:p>
+      <w:pPr>
+        <w:spacing w:before="0" w:after="120" w:line="288" w:lineRule="auto"/>
+      </w:pPr>
+      <w:r>
+        <w:rPr>
+          <w:rFonts w:ascii="Calibri" w:hAnsi="Calibri" w:eastAsia="Calibri" w:cs="Calibri"/>
+          <w:color w:val="1F2937"/>
+          <w:sz w:val="21"/>
+        </w:rPr>
+        <w:t>Setup Helper resolves safe setup. Ambuj receives only an unavoidable company-access problem. Abilash receives owner decisions and every Gate 0 issue.</w:t>
+      </w:r>
+    </w:p>
+    <w:p>
+      <w:pPr>
+        <w:pStyle w:val="Heading1"/>
+      </w:pPr>
+      <w:r>
+        <w:rPr>
+          <w:rFonts w:ascii="Calibri" w:hAnsi="Calibri" w:eastAsia="Calibri" w:cs="Calibri"/>
+          <w:color w:val="2E74B5"/>
+          <w:sz w:val="32"/>
+        </w:rPr>
+        <w:t>Official screen references</w:t>
+      </w:r>
+    </w:p>
+    <w:p>
+      <w:pPr>
+        <w:numPr>
+          <w:ilvl w:val="0"/>
+          <w:numId w:val="123"/>
+        </w:numPr>
+        <w:spacing w:before="0" w:after="80" w:line="288" w:lineRule="auto"/>
+      </w:pPr>
+      <w:r>
+        <w:rPr>
+          <w:rFonts w:ascii="Calibri" w:hAnsi="Calibri" w:eastAsia="Calibri" w:cs="Calibri"/>
+          <w:color w:val="1F2937"/>
+          <w:sz w:val="21"/>
+        </w:rPr>
+        <w:t>ChatGPT quickstart: https://learn.chatgpt.com/docs/quickstart</w:t>
+      </w:r>
+    </w:p>
+    <w:p>
+      <w:pPr>
+        <w:numPr>
+          <w:ilvl w:val="0"/>
+          <w:numId w:val="123"/>
+        </w:numPr>
+        <w:spacing w:before="0" w:after="80" w:line="288" w:lineRule="auto"/>
+      </w:pPr>
+      <w:r>
+        <w:rPr>
+          <w:rFonts w:ascii="Calibri" w:hAnsi="Calibri" w:eastAsia="Calibri" w:cs="Calibri"/>
+          <w:color w:val="1F2937"/>
+          <w:sz w:val="21"/>
+        </w:rPr>
+        <w:t>ChatGPT desktop app: https://learn.chatgpt.com/docs/app</w:t>
+      </w:r>
+    </w:p>
+    <w:p>
+      <w:pPr>
+        <w:numPr>
+          <w:ilvl w:val="0"/>
+          <w:numId w:val="123"/>
+        </w:numPr>
+        <w:spacing w:before="0" w:after="80" w:line="288" w:lineRule="auto"/>
+      </w:pPr>
+      <w:r>
+        <w:rPr>
+          <w:rFonts w:ascii="Calibri" w:hAnsi="Calibri" w:eastAsia="Calibri" w:cs="Calibri"/>
+          <w:color w:val="1F2937"/>
+          <w:sz w:val="21"/>
+        </w:rPr>
+        <w:t>Projects and chats: https://learn.chatgpt.com/docs/projects</w:t>
+      </w:r>
+    </w:p>
+    <w:p>
+      <w:pPr>
+        <w:numPr>
+          <w:ilvl w:val="0"/>
+          <w:numId w:val="123"/>
+        </w:numPr>
+        <w:spacing w:before="0" w:after="80" w:line="288" w:lineRule="auto"/>
+      </w:pPr>
+      <w:r>
+        <w:rPr>
+          <w:rFonts w:ascii="Calibri" w:hAnsi="Calibri" w:eastAsia="Calibri" w:cs="Calibri"/>
+          <w:color w:val="1F2937"/>
+          <w:sz w:val="21"/>
+        </w:rPr>
+        <w:t>Apps: https://help.openai.com/en/articles/11487775-connectors-in-chatgpt</w:t>
+      </w:r>
+    </w:p>
+    <w:p>
+      <w:pPr>
+        <w:numPr>
+          <w:ilvl w:val="0"/>
+          <w:numId w:val="123"/>
+        </w:numPr>
+        <w:spacing w:before="0" w:after="80" w:line="288" w:lineRule="auto"/>
+      </w:pPr>
+      <w:r>
+        <w:rPr>
+          <w:rFonts w:ascii="Calibri" w:hAnsi="Calibri" w:eastAsia="Calibri" w:cs="Calibri"/>
+          <w:color w:val="1F2937"/>
+          <w:sz w:val="21"/>
+        </w:rPr>
         <w:t>Email inbox use case: https://learn.chatgpt.com/use-cases/manage-your-inbox</w:t>
+      </w:r>
+    </w:p>
+    <w:p>
+      <w:pPr>
+        <w:numPr>
+          <w:ilvl w:val="0"/>
+          <w:numId w:val="123"/>
+        </w:numPr>
+        <w:spacing w:before="0" w:after="80" w:line="288" w:lineRule="auto"/>
+      </w:pPr>
+      <w:r>
+        <w:rPr>
+          <w:rFonts w:ascii="Calibri" w:hAnsi="Calibri" w:eastAsia="Calibri" w:cs="Calibri"/>
+          <w:color w:val="1F2937"/>
+          <w:sz w:val="21"/>
+        </w:rPr>
+        <w:t>Computer Use with Codex: https://learn.chatgpt.com/use-cases/use-your-computer-with-codex</w:t>
       </w:r>
     </w:p>
     <w:sectPr>
@@ -6934,9 +7232,9 @@
   <w:abstractNum w:abstractNumId="114">
     <w:multiLevelType w:val="singleLevel"/>
     <w:lvl w:ilvl="0">
-      <w:start w:val="1"/>
-      <w:numFmt w:val="bullet"/>
-      <w:lvlText w:val="•"/>
+      <w:start w:val="7"/>
+      <w:numFmt w:val="decimal"/>
+      <w:lvlText w:val="%1."/>
       <w:suff w:val="tab"/>
       <w:pPr>
         <w:tabs>
@@ -6955,9 +7253,9 @@
   <w:abstractNum w:abstractNumId="116">
     <w:multiLevelType w:val="singleLevel"/>
     <w:lvl w:ilvl="0">
-      <w:start w:val="1"/>
-      <w:numFmt w:val="bullet"/>
-      <w:lvlText w:val="•"/>
+      <w:start w:val="8"/>
+      <w:numFmt w:val="decimal"/>
+      <w:lvlText w:val="%1."/>
       <w:suff w:val="tab"/>
       <w:pPr>
         <w:tabs>
@@ -6993,6 +7291,48 @@
   </w:abstractNum>
   <w:num w:numId="119">
     <w:abstractNumId w:val="118"/>
+  </w:num>
+  <w:abstractNum w:abstractNumId="120">
+    <w:multiLevelType w:val="singleLevel"/>
+    <w:lvl w:ilvl="0">
+      <w:start w:val="1"/>
+      <w:numFmt w:val="bullet"/>
+      <w:lvlText w:val="•"/>
+      <w:suff w:val="tab"/>
+      <w:pPr>
+        <w:tabs>
+          <w:tab w:val="num" w:pos="540"/>
+        </w:tabs>
+        <w:ind w:left="540" w:hanging="270"/>
+      </w:pPr>
+      <w:rPr>
+        <w:rFonts w:ascii="Calibri" w:hAnsi="Calibri"/>
+      </w:rPr>
+    </w:lvl>
+  </w:abstractNum>
+  <w:num w:numId="121">
+    <w:abstractNumId w:val="120"/>
+  </w:num>
+  <w:abstractNum w:abstractNumId="122">
+    <w:multiLevelType w:val="singleLevel"/>
+    <w:lvl w:ilvl="0">
+      <w:start w:val="1"/>
+      <w:numFmt w:val="bullet"/>
+      <w:lvlText w:val="•"/>
+      <w:suff w:val="tab"/>
+      <w:pPr>
+        <w:tabs>
+          <w:tab w:val="num" w:pos="540"/>
+        </w:tabs>
+        <w:ind w:left="540" w:hanging="270"/>
+      </w:pPr>
+      <w:rPr>
+        <w:rFonts w:ascii="Calibri" w:hAnsi="Calibri"/>
+      </w:rPr>
+    </w:lvl>
+  </w:abstractNum>
+  <w:num w:numId="123">
+    <w:abstractNumId w:val="122"/>
   </w:num>
 </w:numbering>
 </file>

</xml_diff>

<commit_message>
feat: release governed AI-Human workspace v2.0.0
</commit_message>
<xml_diff>
--- a/packages/kairali/homework/EVERYONE-ELSE-AI-HUMAN-HOMEWORK-GUIDE.docx
+++ b/packages/kairali/homework/EVERYONE-ELSE-AI-HUMAN-HOMEWORK-GUIDE.docx
@@ -846,6 +846,32 @@
                 <w:color w:val="1F2937"/>
                 <w:sz w:val="16"/>
               </w:rPr>
+              <w:t>Before installing, ask me one question at a time for the exact company or group, legal entity, operating unit, jurisdictions, purpose, my relationship to the company, and compliance owner. Check current authoritative sources, treat historical charts only as leads, create a separate confirmed Gate 0 profile for each materially different entity or unit, and do not report ACTIVE while compliance questions remain.</w:t>
+            </w:r>
+          </w:p>
+          <w:p>
+            <w:pPr>
+              <w:spacing w:before="0" w:after="0" w:line="240" w:lineRule="auto"/>
+            </w:pPr>
+            <w:r>
+              <w:rPr>
+                <w:rFonts w:ascii="Courier New" w:hAnsi="Courier New" w:eastAsia="Courier New" w:cs="Courier New"/>
+                <w:color w:val="1F2937"/>
+                <w:sz w:val="16"/>
+              </w:rPr>
+              <w:t xml:space="preserve"> </w:t>
+            </w:r>
+          </w:p>
+          <w:p>
+            <w:pPr>
+              <w:spacing w:before="0" w:after="0" w:line="240" w:lineRule="auto"/>
+            </w:pPr>
+            <w:r>
+              <w:rPr>
+                <w:rFonts w:ascii="Courier New" w:hAnsi="Courier New" w:eastAsia="Courier New" w:cs="Courier New"/>
+                <w:color w:val="1F2937"/>
+                <w:sz w:val="16"/>
+              </w:rPr>
               <w:t>1. Work out whether I am on Mac or Windows and check what is already installed before changing anything.</w:t>
             </w:r>
           </w:p>
@@ -963,7 +989,7 @@
                 <w:color w:val="1F2937"/>
                 <w:sz w:val="16"/>
               </w:rPr>
-              <w:t>10. If you cannot continue safely, write one OPEN_REGISTER.md row with the failed step, exact error, what you checked, and the one human access or decision needed. Then tell me whether Ambuj or Abilash must help.</w:t>
+              <w:t>10. If you cannot continue safely, write one OPEN_REGISTER.md row with the failed step, exact error, what you checked, and the one human access or decision needed. Then tell me whether Ambuj or Abhilash must help.</w:t>
             </w:r>
           </w:p>
           <w:p>
@@ -6229,7 +6255,7 @@
           <w:color w:val="1F2937"/>
           <w:sz w:val="21"/>
         </w:rPr>
-        <w:t>the task reaches medical, dosage, certification, legal, spend, credentials, banking, personal HR or another sensitive decision.</w:t>
+        <w:t>the task crosses an active local Gate 0 ID, asks for credentials, touches banking or personal HR, or presents another sensitive decision not covered by the confirmed profile.</w:t>
       </w:r>
     </w:p>
     <w:p>
@@ -6242,7 +6268,7 @@
           <w:color w:val="1F2937"/>
           <w:sz w:val="21"/>
         </w:rPr>
-        <w:t>Setup Helper resolves safe setup. Ambuj receives only an unavoidable company-access problem. Abilash receives owner decisions and every Gate 0 issue.</w:t>
+        <w:t>Setup Helper resolves safe setup. Ambuj receives only an unavoidable company-access problem. The approval owner named beside the crossed gate receives that Gate 0 issue; Abhilash receives the owner decisions assigned to him.</w:t>
       </w:r>
     </w:p>
     <w:p>

</xml_diff>

<commit_message>
Release AI-Human Workspace v2.0.0 (#6)
Ships the owner-approved, independently vetted v2.0.0 public release with separate Kairali and reusable editions, dynamic source-backed Gate 0 profiles, lifecycle controls, adversarial hardening, portal production gates, and cross-platform verification.
</commit_message>
<xml_diff>
--- a/packages/kairali/homework/EVERYONE-ELSE-AI-HUMAN-HOMEWORK-GUIDE.docx
+++ b/packages/kairali/homework/EVERYONE-ELSE-AI-HUMAN-HOMEWORK-GUIDE.docx
@@ -846,6 +846,32 @@
                 <w:color w:val="1F2937"/>
                 <w:sz w:val="16"/>
               </w:rPr>
+              <w:t>Before installing, ask me one question at a time for the exact company or group, legal entity, operating unit, jurisdictions, purpose, my relationship to the company, and compliance owner. Check current authoritative sources, treat historical charts only as leads, create a separate confirmed Gate 0 profile for each materially different entity or unit, and do not report ACTIVE while compliance questions remain.</w:t>
+            </w:r>
+          </w:p>
+          <w:p>
+            <w:pPr>
+              <w:spacing w:before="0" w:after="0" w:line="240" w:lineRule="auto"/>
+            </w:pPr>
+            <w:r>
+              <w:rPr>
+                <w:rFonts w:ascii="Courier New" w:hAnsi="Courier New" w:eastAsia="Courier New" w:cs="Courier New"/>
+                <w:color w:val="1F2937"/>
+                <w:sz w:val="16"/>
+              </w:rPr>
+              <w:t xml:space="preserve"> </w:t>
+            </w:r>
+          </w:p>
+          <w:p>
+            <w:pPr>
+              <w:spacing w:before="0" w:after="0" w:line="240" w:lineRule="auto"/>
+            </w:pPr>
+            <w:r>
+              <w:rPr>
+                <w:rFonts w:ascii="Courier New" w:hAnsi="Courier New" w:eastAsia="Courier New" w:cs="Courier New"/>
+                <w:color w:val="1F2937"/>
+                <w:sz w:val="16"/>
+              </w:rPr>
               <w:t>1. Work out whether I am on Mac or Windows and check what is already installed before changing anything.</w:t>
             </w:r>
           </w:p>
@@ -963,7 +989,7 @@
                 <w:color w:val="1F2937"/>
                 <w:sz w:val="16"/>
               </w:rPr>
-              <w:t>10. If you cannot continue safely, write one OPEN_REGISTER.md row with the failed step, exact error, what you checked, and the one human access or decision needed. Then tell me whether Ambuj or Abilash must help.</w:t>
+              <w:t>10. If you cannot continue safely, write one OPEN_REGISTER.md row with the failed step, exact error, what you checked, and the one human access or decision needed. Then tell me whether Ambuj or Abhilash must help.</w:t>
             </w:r>
           </w:p>
           <w:p>
@@ -6229,7 +6255,7 @@
           <w:color w:val="1F2937"/>
           <w:sz w:val="21"/>
         </w:rPr>
-        <w:t>the task reaches medical, dosage, certification, legal, spend, credentials, banking, personal HR or another sensitive decision.</w:t>
+        <w:t>the task crosses an active local Gate 0 ID, asks for credentials, touches banking or personal HR, or presents another sensitive decision not covered by the confirmed profile.</w:t>
       </w:r>
     </w:p>
     <w:p>
@@ -6242,7 +6268,7 @@
           <w:color w:val="1F2937"/>
           <w:sz w:val="21"/>
         </w:rPr>
-        <w:t>Setup Helper resolves safe setup. Ambuj receives only an unavoidable company-access problem. Abilash receives owner decisions and every Gate 0 issue.</w:t>
+        <w:t>Setup Helper resolves safe setup. Ambuj receives only an unavoidable company-access problem. The approval owner named beside the crossed gate receives that Gate 0 issue; Abhilash receives the owner decisions assigned to him.</w:t>
       </w:r>
     </w:p>
     <w:p>

</xml_diff>

<commit_message>
release: add Drive master register and weekly refresh
</commit_message>
<xml_diff>
--- a/packages/kairali/homework/EVERYONE-ELSE-AI-HUMAN-HOMEWORK-GUIDE.docx
+++ b/packages/kairali/homework/EVERYONE-ELSE-AI-HUMAN-HOMEWORK-GUIDE.docx
@@ -255,7 +255,7 @@
           <w:color w:val="1F2937"/>
           <w:sz w:val="21"/>
         </w:rPr>
-        <w:t xml:space="preserve"> v1.5.1 company kit. The public kit is the clean setup and update source; it contains no live company work or secrets, so no GitHub invitation or collaborator seat is needed. Ask the Setup Helper to obtain and verify the kit. Then copy the Email and Drive starters into separate local work folders. Do not use the public distribution repository as a work project.</w:t>
+        <w:t xml:space="preserve"> v2.1.0 Kairali Employee Edition. The public kit is the clean setup and update source; it contains no live company work or secrets, so no GitHub invitation or collaborator seat is needed. Ask the Setup Helper to obtain and verify the kit. Then copy the Email and Drive starters into separate local work folders. Do not use the public distribution repository as a work project.</w:t>
       </w:r>
     </w:p>
     <w:p>
@@ -335,7 +335,7 @@
           <w:color w:val="1F2937"/>
           <w:sz w:val="21"/>
         </w:rPr>
-        <w:t xml:space="preserve"> - choose a 25-item test or index every connector-visible Drive item in checkpointed batches of 25. It does not open file contents or change Drive.</w:t>
+        <w:t xml:space="preserve"> - choose a 25-item test or index every connector-visible Drive item in checkpointed batches of 25. It creates a fast AI JSONL register and a matching human CSV or approved Google Sheet mirror without opening file contents or changing Drive. After full proof, you may choose a weekly refresh.</w:t>
       </w:r>
     </w:p>
     <w:p>
@@ -467,7 +467,7 @@
           <w:color w:val="1F2937"/>
           <w:sz w:val="21"/>
         </w:rPr>
-        <w:t xml:space="preserve">Full Drive Index is required and is live for you only after every supported scope, output file, final cursor and validator agree. </w:t>
+        <w:t xml:space="preserve">Full Drive Index is required and is live for you only after every supported scope, AI and human registers, relationship counts, receipt, final cursor and validators agree. </w:t>
       </w:r>
       <w:r>
         <w:rPr>
@@ -483,7 +483,7 @@
           <w:color w:val="1F2937"/>
           <w:sz w:val="21"/>
         </w:rPr>
-        <w:t xml:space="preserve"> proves setup only.</w:t>
+        <w:t xml:space="preserve"> proves setup only. Weekly refresh is optional and separate.</w:t>
       </w:r>
     </w:p>
     <w:p>
@@ -546,7 +546,7 @@
           <w:color w:val="1F2937"/>
           <w:sz w:val="21"/>
         </w:rPr>
-        <w:t>Ask the Setup Helper to find the verified public v1.5.1 company kit on your screen.</w:t>
+        <w:t>Ask the Setup Helper to find the verified public v2.1.0 Kairali Employee Edition on your screen.</w:t>
       </w:r>
     </w:p>
     <w:p>
@@ -1274,7 +1274,7 @@
           <w:color w:val="1F4D78"/>
           <w:sz w:val="19"/>
         </w:rPr>
-        <w:t>kairali-company-rollout-1.5.1.zip</w:t>
+        <w:t>KAIRALI-AI-HUMAN-v210-EMPLOYEE-EDITION-PUBLIC-KIT.zip</w:t>
       </w:r>
       <w:r>
         <w:rPr>
@@ -1807,7 +1807,7 @@
           <w:color w:val="1F2937"/>
           <w:sz w:val="21"/>
         </w:rPr>
-        <w:t>If the ZIP is not visible, do not search the whole computer. Paste the Setup Helper rescue. The helper checks Downloads, obtains the protected public v1.5.1 kit when safe, and asks Ambuj only if the approved source or access decision is missing.</w:t>
+        <w:t>If the ZIP is not visible, do not search the whole computer. Paste the Setup Helper rescue. The helper checks Downloads, obtains the protected public v2.1.0 kit when safe, and asks Ambuj only if the approved source or access decision is missing.</w:t>
       </w:r>
     </w:p>
     <w:p>
@@ -4807,7 +4807,7 @@
           <w:color w:val="1F4D78"/>
           <w:sz w:val="19"/>
         </w:rPr>
-        <w:t>DRIVE-INDEX.csv</w:t>
+        <w:t>DRIVE-INDEX.jsonl</w:t>
       </w:r>
       <w:r>
         <w:rPr>
@@ -4823,7 +4823,7 @@
           <w:color w:val="1F4D78"/>
           <w:sz w:val="19"/>
         </w:rPr>
-        <w:t>DRIVE-INDEX.md</w:t>
+        <w:t>DRIVE-REGISTER.csv</w:t>
       </w:r>
       <w:r>
         <w:rPr>
@@ -4831,7 +4831,7 @@
           <w:color w:val="1F2937"/>
           <w:sz w:val="21"/>
         </w:rPr>
-        <w:t xml:space="preserve"> and </w:t>
+        <w:t xml:space="preserve">, </w:t>
       </w:r>
       <w:r>
         <w:rPr>
@@ -4839,7 +4839,7 @@
           <w:color w:val="1F4D78"/>
           <w:sz w:val="19"/>
         </w:rPr>
-        <w:t>DRIVE-INDEX-CURSOR.md</w:t>
+        <w:t>DRIVE-INDEX.md</w:t>
       </w:r>
       <w:r>
         <w:rPr>
@@ -4847,7 +4847,39 @@
           <w:color w:val="1F2937"/>
           <w:sz w:val="21"/>
         </w:rPr>
-        <w:t xml:space="preserve"> exist.</w:t>
+        <w:t xml:space="preserve">, </w:t>
+      </w:r>
+      <w:r>
+        <w:rPr>
+          <w:rFonts w:ascii="Menlo" w:hAnsi="Menlo" w:eastAsia="Menlo" w:cs="Menlo"/>
+          <w:color w:val="1F4D78"/>
+          <w:sz w:val="19"/>
+        </w:rPr>
+        <w:t>DRIVE-INDEX-RECEIPT.json</w:t>
+      </w:r>
+      <w:r>
+        <w:rPr>
+          <w:rFonts w:ascii="Calibri" w:hAnsi="Calibri" w:eastAsia="Calibri" w:cs="Calibri"/>
+          <w:color w:val="1F2937"/>
+          <w:sz w:val="21"/>
+        </w:rPr>
+        <w:t xml:space="preserve"> and </w:t>
+      </w:r>
+      <w:r>
+        <w:rPr>
+          <w:rFonts w:ascii="Menlo" w:hAnsi="Menlo" w:eastAsia="Menlo" w:cs="Menlo"/>
+          <w:color w:val="1F4D78"/>
+          <w:sz w:val="19"/>
+        </w:rPr>
+        <w:t>DRIVE-INDEX-CURSOR.json</w:t>
+      </w:r>
+      <w:r>
+        <w:rPr>
+          <w:rFonts w:ascii="Calibri" w:hAnsi="Calibri" w:eastAsia="Calibri" w:cs="Calibri"/>
+          <w:color w:val="1F2937"/>
+          <w:sz w:val="21"/>
+        </w:rPr>
+        <w:t xml:space="preserve"> exist and reopen.</w:t>
       </w:r>
     </w:p>
     <w:p>
@@ -4864,7 +4896,7 @@
           <w:color w:val="1F2937"/>
           <w:sz w:val="21"/>
         </w:rPr>
-        <w:t>Every batch is no more than 25 items and has a durable checkpoint.</w:t>
+        <w:t>One generation ID and unique-item count match in every output. Unique owned/created, shared-with, shared-by, overlap and unknown counts recalculate correctly.</w:t>
       </w:r>
     </w:p>
     <w:p>
@@ -4877,35 +4909,11 @@
       </w:pPr>
       <w:r>
         <w:rPr>
-          <w:rFonts w:ascii="Menlo" w:hAnsi="Menlo" w:eastAsia="Menlo" w:cs="Menlo"/>
-          <w:color w:val="1F4D78"/>
-          <w:sz w:val="19"/>
-        </w:rPr>
-        <w:t>TEST 25</w:t>
-      </w:r>
-      <w:r>
-        <w:rPr>
           <w:rFonts w:ascii="Calibri" w:hAnsi="Calibri" w:eastAsia="Calibri" w:cs="Calibri"/>
           <w:color w:val="1F2937"/>
           <w:sz w:val="21"/>
         </w:rPr>
-        <w:t xml:space="preserve"> says the full Drive was not indexed. </w:t>
-      </w:r>
-      <w:r>
-        <w:rPr>
-          <w:rFonts w:ascii="Menlo" w:hAnsi="Menlo" w:eastAsia="Menlo" w:cs="Menlo"/>
-          <w:color w:val="1F4D78"/>
-          <w:sz w:val="19"/>
-        </w:rPr>
-        <w:t>FULL DRIVE INDEX</w:t>
-      </w:r>
-      <w:r>
-        <w:rPr>
-          <w:rFonts w:ascii="Calibri" w:hAnsi="Calibri" w:eastAsia="Calibri" w:cs="Calibri"/>
-          <w:color w:val="1F2937"/>
-          <w:sz w:val="21"/>
-        </w:rPr>
-        <w:t xml:space="preserve"> shows each connector-visible source scope has no next page, or names the coverage gap.</w:t>
+        <w:t>If you approved a Google Sheet mirror, its URL, generation ID and data-row count were read back. If Sheets was not connected or you said No, the CSV is the human register.</w:t>
       </w:r>
     </w:p>
     <w:p>
@@ -4922,7 +4930,7 @@
           <w:color w:val="1F2937"/>
           <w:sz w:val="21"/>
         </w:rPr>
-        <w:t>Stable item IDs prevent duplicate rows and let a new session resume.</w:t>
+        <w:t>Every batch is no more than 25 items and has a durable checkpoint.</w:t>
       </w:r>
     </w:p>
     <w:p>
@@ -4935,11 +4943,35 @@
       </w:pPr>
       <w:r>
         <w:rPr>
+          <w:rFonts w:ascii="Menlo" w:hAnsi="Menlo" w:eastAsia="Menlo" w:cs="Menlo"/>
+          <w:color w:val="1F4D78"/>
+          <w:sz w:val="19"/>
+        </w:rPr>
+        <w:t>TEST 25</w:t>
+      </w:r>
+      <w:r>
+        <w:rPr>
           <w:rFonts w:ascii="Calibri" w:hAnsi="Calibri" w:eastAsia="Calibri" w:cs="Calibri"/>
           <w:color w:val="1F2937"/>
           <w:sz w:val="21"/>
         </w:rPr>
-        <w:t>Missing fields say UNKNOWN; sensitive titles say HUMAN REVIEW.</w:t>
+        <w:t xml:space="preserve"> says the full Drive was not indexed. </w:t>
+      </w:r>
+      <w:r>
+        <w:rPr>
+          <w:rFonts w:ascii="Menlo" w:hAnsi="Menlo" w:eastAsia="Menlo" w:cs="Menlo"/>
+          <w:color w:val="1F4D78"/>
+          <w:sz w:val="19"/>
+        </w:rPr>
+        <w:t>FULL DRIVE INDEX</w:t>
+      </w:r>
+      <w:r>
+        <w:rPr>
+          <w:rFonts w:ascii="Calibri" w:hAnsi="Calibri" w:eastAsia="Calibri" w:cs="Calibri"/>
+          <w:color w:val="1F2937"/>
+          <w:sz w:val="21"/>
+        </w:rPr>
+        <w:t xml:space="preserve"> shows each connector-visible source scope has no next page, or names the coverage gap.</w:t>
       </w:r>
     </w:p>
     <w:p>
@@ -4956,7 +4988,7 @@
           <w:color w:val="1F2937"/>
           <w:sz w:val="21"/>
         </w:rPr>
-        <w:t>It says no Drive file content was opened or downloaded and no Drive item was created, edited, renamed, moved, shared, unshared, deleted or organized.</w:t>
+        <w:t>Stable item IDs prevent duplicate rows and let a new session resume.</w:t>
       </w:r>
     </w:p>
     <w:p>
@@ -4973,7 +5005,49 @@
           <w:color w:val="1F2937"/>
           <w:sz w:val="21"/>
         </w:rPr>
-        <w:t>The workspace validator passed.</w:t>
+        <w:t>Missing fields say UNKNOWN; sensitive titles say HUMAN REVIEW.</w:t>
+      </w:r>
+    </w:p>
+    <w:p>
+      <w:pPr>
+        <w:numPr>
+          <w:ilvl w:val="0"/>
+          <w:numId w:val="107"/>
+        </w:numPr>
+        <w:spacing w:before="0" w:after="80" w:line="288" w:lineRule="auto"/>
+      </w:pPr>
+      <w:r>
+        <w:rPr>
+          <w:rFonts w:ascii="Calibri" w:hAnsi="Calibri" w:eastAsia="Calibri" w:cs="Calibri"/>
+          <w:color w:val="1F2937"/>
+          <w:sz w:val="21"/>
+        </w:rPr>
+        <w:t>It says no Drive file content was opened or downloaded and no Drive item was created, edited, renamed, moved, shared, unshared, deleted or organized.</w:t>
+      </w:r>
+    </w:p>
+    <w:p>
+      <w:pPr>
+        <w:numPr>
+          <w:ilvl w:val="0"/>
+          <w:numId w:val="107"/>
+        </w:numPr>
+        <w:spacing w:before="0" w:after="80" w:line="288" w:lineRule="auto"/>
+      </w:pPr>
+      <w:r>
+        <w:rPr>
+          <w:rFonts w:ascii="Menlo" w:hAnsi="Menlo" w:eastAsia="Menlo" w:cs="Menlo"/>
+          <w:color w:val="1F4D78"/>
+          <w:sz w:val="19"/>
+        </w:rPr>
+        <w:t>validate_drive_register.py</w:t>
+      </w:r>
+      <w:r>
+        <w:rPr>
+          <w:rFonts w:ascii="Calibri" w:hAnsi="Calibri" w:eastAsia="Calibri" w:cs="Calibri"/>
+          <w:color w:val="1F2937"/>
+          <w:sz w:val="21"/>
+        </w:rPr>
+        <w:t xml:space="preserve"> and the workspace validator passed.</w:t>
       </w:r>
     </w:p>
     <w:p>
@@ -4997,7 +5071,7 @@
           <w:color w:val="0B2545"/>
           <w:sz w:val="21"/>
         </w:rPr>
-        <w:t xml:space="preserve"> You can show the index summary and cursor on your screen. A connected Drive account alone is not completion. The index helps Codex find files later, but opening a file later still needs current Drive permission and a new approved task.</w:t>
+        <w:t xml:space="preserve"> You can show the human register, AI register, summary, receipt and cursor on your screen. A connected Drive account alone is not completion. The JSONL helps Codex or Claude find metadata later only when this worker is named as an approved source; it is not permission for personal profiling. Opening a file later still needs current Drive permission and a new approved task.</w:t>
       </w:r>
     </w:p>
     <w:p>
@@ -5060,6 +5134,72 @@
           <w:sz w:val="21"/>
         </w:rPr>
         <w:t xml:space="preserve"> finishes every supported scope and the final validator passes.</w:t>
+      </w:r>
+    </w:p>
+    <w:p>
+      <w:pPr>
+        <w:pStyle w:val="Heading2"/>
+      </w:pPr>
+      <w:r>
+        <w:rPr>
+          <w:rFonts w:ascii="Calibri" w:hAnsi="Calibri" w:eastAsia="Calibri" w:cs="Calibri"/>
+          <w:color w:val="2E74B5"/>
+          <w:sz w:val="26"/>
+        </w:rPr>
+        <w:t>Optional weekly Drive refresh</w:t>
+      </w:r>
+    </w:p>
+    <w:p>
+      <w:pPr>
+        <w:spacing w:before="0" w:after="120" w:line="288" w:lineRule="auto"/>
+      </w:pPr>
+      <w:r>
+        <w:rPr>
+          <w:rFonts w:ascii="Calibri" w:hAnsi="Calibri" w:eastAsia="Calibri" w:cs="Calibri"/>
+          <w:color w:val="1F2937"/>
+          <w:sz w:val="21"/>
+        </w:rPr>
+        <w:t xml:space="preserve">After full mode passes, Codex asks whether you want a weekly refresh. Say No to leave it off. If Yes, choose the day and local-time window—Sunday night is suggested, or pick another convenient time—then confirm the time zone. Review the exact approved Drive account, project folder, schedule and metadata-only prompt. Say </w:t>
+      </w:r>
+      <w:r>
+        <w:rPr>
+          <w:rFonts w:ascii="Menlo" w:hAnsi="Menlo" w:eastAsia="Menlo" w:cs="Menlo"/>
+          <w:color w:val="1F4D78"/>
+          <w:sz w:val="19"/>
+        </w:rPr>
+        <w:t>ACTIVATE WEEKLY REFRESH</w:t>
+      </w:r>
+      <w:r>
+        <w:rPr>
+          <w:rFonts w:ascii="Calibri" w:hAnsi="Calibri" w:eastAsia="Calibri" w:cs="Calibri"/>
+          <w:color w:val="1F2937"/>
+          <w:sz w:val="21"/>
+        </w:rPr>
+        <w:t xml:space="preserve"> only when all are correct.</w:t>
+      </w:r>
+    </w:p>
+    <w:p>
+      <w:pPr>
+        <w:spacing w:before="60" w:after="180" w:line="288" w:lineRule="auto"/>
+        <w:ind w:left="173"/>
+        <w:shd w:fill="FFF8E8"/>
+      </w:pPr>
+      <w:r>
+        <w:rPr>
+          <w:rFonts w:ascii="Calibri" w:hAnsi="Calibri" w:eastAsia="Calibri" w:cs="Calibri"/>
+          <w:b/>
+          <w:color w:val="0B2545"/>
+          <w:sz w:val="21"/>
+        </w:rPr>
+        <w:t>DONE WHEN:</w:t>
+      </w:r>
+      <w:r>
+        <w:rPr>
+          <w:rFonts w:ascii="Calibri" w:hAnsi="Calibri" w:eastAsia="Calibri" w:cs="Calibri"/>
+          <w:color w:val="0B2545"/>
+          <w:sz w:val="21"/>
+        </w:rPr>
+        <w:t xml:space="preserve"> ChatGPT desktop Scheduled shows the exact card and next run, and one bounded pilot refresh adds or updates by stable item ID and passes both validators. The computer must be on, ChatGPT desktop running and this project available. A missed or approval-blocked run does not pretend to have updated the register. You can pause, edit or delete the scheduled task without deleting the registers.</w:t>
       </w:r>
     </w:p>
     <w:p>
@@ -5932,7 +6072,7 @@
           <w:color w:val="1F2937"/>
           <w:sz w:val="21"/>
         </w:rPr>
-        <w:t xml:space="preserve">Drive project open with </w:t>
+        <w:t xml:space="preserve">Drive project open with its human register, </w:t>
       </w:r>
       <w:r>
         <w:rPr>
@@ -5948,7 +6088,7 @@
           <w:color w:val="1F2937"/>
           <w:sz w:val="21"/>
         </w:rPr>
-        <w:t xml:space="preserve"> and its saved cursor.</w:t>
+        <w:t>, receipt and saved cursor; optional weekly card only if the employee activated it.</w:t>
       </w:r>
     </w:p>
     <w:p>
@@ -6487,7 +6627,7 @@
           <w:color w:val="1F2937"/>
           <w:sz w:val="21"/>
         </w:rPr>
-        <w:t>ChatGPT quickstart: https://learn.chatgpt.com/docs/quickstart</w:t>
+        <w:t>Setup, desktop and projects: https://learn.chatgpt.com/docs/quickstart · https://learn.chatgpt.com/docs/app · https://learn.chatgpt.com/docs/projects</w:t>
       </w:r>
     </w:p>
     <w:p>
@@ -6504,75 +6644,7 @@
           <w:color w:val="1F2937"/>
           <w:sz w:val="21"/>
         </w:rPr>
-        <w:t>ChatGPT desktop app: https://learn.chatgpt.com/docs/app</w:t>
-      </w:r>
-    </w:p>
-    <w:p>
-      <w:pPr>
-        <w:numPr>
-          <w:ilvl w:val="0"/>
-          <w:numId w:val="131"/>
-        </w:numPr>
-        <w:spacing w:before="0" w:after="80" w:line="288" w:lineRule="auto"/>
-      </w:pPr>
-      <w:r>
-        <w:rPr>
-          <w:rFonts w:ascii="Calibri" w:hAnsi="Calibri" w:eastAsia="Calibri" w:cs="Calibri"/>
-          <w:color w:val="1F2937"/>
-          <w:sz w:val="21"/>
-        </w:rPr>
-        <w:t>Projects and chats: https://learn.chatgpt.com/docs/projects</w:t>
-      </w:r>
-    </w:p>
-    <w:p>
-      <w:pPr>
-        <w:numPr>
-          <w:ilvl w:val="0"/>
-          <w:numId w:val="131"/>
-        </w:numPr>
-        <w:spacing w:before="0" w:after="80" w:line="288" w:lineRule="auto"/>
-      </w:pPr>
-      <w:r>
-        <w:rPr>
-          <w:rFonts w:ascii="Calibri" w:hAnsi="Calibri" w:eastAsia="Calibri" w:cs="Calibri"/>
-          <w:color w:val="1F2937"/>
-          <w:sz w:val="21"/>
-        </w:rPr>
-        <w:t>Apps: https://help.openai.com/en/articles/11487775-connectors-in-chatgpt</w:t>
-      </w:r>
-    </w:p>
-    <w:p>
-      <w:pPr>
-        <w:numPr>
-          <w:ilvl w:val="0"/>
-          <w:numId w:val="131"/>
-        </w:numPr>
-        <w:spacing w:before="0" w:after="80" w:line="288" w:lineRule="auto"/>
-      </w:pPr>
-      <w:r>
-        <w:rPr>
-          <w:rFonts w:ascii="Calibri" w:hAnsi="Calibri" w:eastAsia="Calibri" w:cs="Calibri"/>
-          <w:color w:val="1F2937"/>
-          <w:sz w:val="21"/>
-        </w:rPr>
-        <w:t>Email inbox use case: https://learn.chatgpt.com/use-cases/manage-your-inbox</w:t>
-      </w:r>
-    </w:p>
-    <w:p>
-      <w:pPr>
-        <w:numPr>
-          <w:ilvl w:val="0"/>
-          <w:numId w:val="131"/>
-        </w:numPr>
-        <w:spacing w:before="0" w:after="80" w:line="288" w:lineRule="auto"/>
-      </w:pPr>
-      <w:r>
-        <w:rPr>
-          <w:rFonts w:ascii="Calibri" w:hAnsi="Calibri" w:eastAsia="Calibri" w:cs="Calibri"/>
-          <w:color w:val="1F2937"/>
-          <w:sz w:val="21"/>
-        </w:rPr>
-        <w:t>Computer Use with Codex: https://learn.chatgpt.com/use-cases/use-your-computer-with-codex</w:t>
+        <w:t>Apps and scheduled tasks: https://help.openai.com/en/articles/11487775-connectors-in-chatgpt · https://learn.chatgpt.com/docs/automations?surface=app</w:t>
       </w:r>
     </w:p>
     <w:sectPr>

</xml_diff>

<commit_message>
feat: upgrade personal EA homework
</commit_message>
<xml_diff>
--- a/packages/kairali/homework/EVERYONE-ELSE-AI-HUMAN-HOMEWORK-GUIDE.docx
+++ b/packages/kairali/homework/EVERYONE-ELSE-AI-HUMAN-HOMEWORK-GUIDE.docx
@@ -40,7 +40,7 @@
           <w:color w:val="555555"/>
           <w:sz w:val="27"/>
         </w:rPr>
-        <w:t>Email Triage + Drive Inventory, with an optional Saturday LinkedIn Message Assistant</w:t>
+        <w:t>Personal Work Memory + Daily Email EA + Drive Master Index, with optional Saturday LinkedIn</w:t>
       </w:r>
     </w:p>
     <w:tbl>
@@ -129,7 +129,7 @@
                 <w:color w:val="1F2937"/>
                 <w:sz w:val="20"/>
               </w:rPr>
-              <w:t>Daily Email worker + Full Drive Index</w:t>
+              <w:t>Personal Memory + Email EA + Full Drive Index</w:t>
             </w:r>
           </w:p>
         </w:tc>
@@ -255,7 +255,7 @@
           <w:color w:val="1F2937"/>
           <w:sz w:val="21"/>
         </w:rPr>
-        <w:t xml:space="preserve"> v1.5.1 company kit. The public kit is the clean setup and update source; it contains no live company work or secrets, so no GitHub invitation or collaborator seat is needed. Ask the Setup Helper to obtain and verify the kit. Then copy the Email and Drive starters into separate local work folders. Do not use the public distribution repository as a work project.</w:t>
+        <w:t xml:space="preserve"> v2.1.0 company kit. The public kit is the clean setup and update source; it contains no live company work or secrets, so no GitHub invitation or collaborator seat is needed. Ask the Setup Helper to obtain and verify the kit. Then copy the Email and Drive starters into separate local work folders. Do not use the public distribution repository as a work project.</w:t>
       </w:r>
     </w:p>
     <w:p>
@@ -301,7 +301,7 @@
           <w:color w:val="1F2937"/>
           <w:sz w:val="21"/>
         </w:rPr>
-        <w:t>Daily Email Triage AI Human</w:t>
+        <w:t>Personal Work Memory + Daily Email EA</w:t>
       </w:r>
       <w:r>
         <w:rPr>
@@ -309,7 +309,23 @@
           <w:color w:val="1F2937"/>
           <w:sz w:val="21"/>
         </w:rPr>
-        <w:t xml:space="preserve"> - asks what local time you want the brief, proves a read-only 25-message pilot, then runs a concise daily importance report. You choose whether it is brief-only or may safely label and file clearly low-risk mail.</w:t>
+        <w:t xml:space="preserve"> - asks once for a fixed local time, proves a read-only 25-message pilot, builds a supervised source-backed understanding of your role, priorities, important people, preferences and commitments, then shows a neat daily notification with proposed replies marked </w:t>
+      </w:r>
+      <w:r>
+        <w:rPr>
+          <w:rFonts w:ascii="Menlo" w:hAnsi="Menlo" w:eastAsia="Menlo" w:cs="Menlo"/>
+          <w:color w:val="1F4D78"/>
+          <w:sz w:val="19"/>
+        </w:rPr>
+        <w:t>NOT SENT</w:t>
+      </w:r>
+      <w:r>
+        <w:rPr>
+          <w:rFonts w:ascii="Calibri" w:hAnsi="Calibri" w:eastAsia="Calibri" w:cs="Calibri"/>
+          <w:color w:val="1F2937"/>
+          <w:sz w:val="21"/>
+        </w:rPr>
+        <w:t>. You can inspect, correct, exclude or forget memory. You choose whether the EA is brief-only or may safely label and file clearly low-risk mail.</w:t>
       </w:r>
     </w:p>
     <w:p>
@@ -327,7 +343,7 @@
           <w:color w:val="1F2937"/>
           <w:sz w:val="21"/>
         </w:rPr>
-        <w:t>Drive Index AI Human</w:t>
+        <w:t>Drive Master Index AI Human</w:t>
       </w:r>
       <w:r>
         <w:rPr>
@@ -335,7 +351,7 @@
           <w:color w:val="1F2937"/>
           <w:sz w:val="21"/>
         </w:rPr>
-        <w:t xml:space="preserve"> - choose a 25-item test or index every connector-visible Drive item in checkpointed batches of 25. It does not open file contents or change Drive.</w:t>
+        <w:t xml:space="preserve"> - choose a 25-item test or index every connector-visible Drive item in checkpointed batches of 25. It maintains a normalized JSONL AI file of record and one generated Google Sheet-or-CSV human register, reopens both, and verifies their shared generation and all counts. After full proof, it offers an employee-chosen weekly refresh. It does not open file contents or change Drive, except an explicitly approved register Sheet.</w:t>
       </w:r>
     </w:p>
     <w:p>
@@ -450,7 +466,7 @@
           <w:color w:val="1F2937"/>
           <w:sz w:val="21"/>
         </w:rPr>
-        <w:t>Email is required and is live for you only after its account, schedule, pilot, filing-mode ruling, automation and validator agree.</w:t>
+        <w:t>Personal Memory + Email EA is required and is live for you only after its account, sourced memory baseline and controls, fixed schedule, pilot, filing-mode ruling, automation and validator agree.</w:t>
       </w:r>
     </w:p>
     <w:p>
@@ -467,7 +483,7 @@
           <w:color w:val="1F2937"/>
           <w:sz w:val="21"/>
         </w:rPr>
-        <w:t xml:space="preserve">Full Drive Index is required and is live for you only after every supported scope, output file, final cursor and validator agree. </w:t>
+        <w:t xml:space="preserve">Full Drive Index is required and is live for you only after every supported scope, both reconciled registers, final cursor, schedule decision and validator agree. </w:t>
       </w:r>
       <w:r>
         <w:rPr>
@@ -546,7 +562,7 @@
           <w:color w:val="1F2937"/>
           <w:sz w:val="21"/>
         </w:rPr>
-        <w:t>Ask the Setup Helper to find the verified public v1.5.1 company kit on your screen.</w:t>
+        <w:t>Ask the Setup Helper to find the verified public v2.1.0 company kit on your screen.</w:t>
       </w:r>
     </w:p>
     <w:p>
@@ -664,7 +680,7 @@
           <w:color w:val="1F2937"/>
           <w:sz w:val="21"/>
         </w:rPr>
-        <w:t>For Email, choose your daily local time, review the read-only pilot, choose the filing mode and verify the active automation.</w:t>
+        <w:t>For Email, choose your fixed daily local time, review the read-only pilot, approve the supervised memory baseline, choose the filing mode and verify the active EA automation.</w:t>
       </w:r>
     </w:p>
     <w:p>
@@ -714,7 +730,7 @@
           <w:color w:val="1F2937"/>
           <w:sz w:val="21"/>
         </w:rPr>
-        <w:t>Repeat with the second folder.</w:t>
+        <w:t>Repeat with the second folder, reconcile both Drive registers and choose or decline its offered weekly refresh.</w:t>
       </w:r>
     </w:p>
     <w:p>
@@ -1274,7 +1290,7 @@
           <w:color w:val="1F4D78"/>
           <w:sz w:val="19"/>
         </w:rPr>
-        <w:t>kairali-company-rollout-1.5.1.zip</w:t>
+        <w:t>kairali-company-rollout-2.1.0.zip</w:t>
       </w:r>
       <w:r>
         <w:rPr>
@@ -1807,7 +1823,7 @@
           <w:color w:val="1F2937"/>
           <w:sz w:val="21"/>
         </w:rPr>
-        <w:t>If the ZIP is not visible, do not search the whole computer. Paste the Setup Helper rescue. The helper checks Downloads, obtains the protected public v1.5.1 kit when safe, and asks Ambuj only if the approved source or access decision is missing.</w:t>
+        <w:t>If the ZIP is not visible, do not search the whole computer. Paste the Setup Helper rescue. The helper checks Downloads, obtains the protected public v2.1.0 kit when safe, and asks Ambuj only if the approved source or access decision is missing.</w:t>
       </w:r>
     </w:p>
     <w:p>
@@ -3826,7 +3842,7 @@
           <w:color w:val="0B2545"/>
           <w:sz w:val="21"/>
         </w:rPr>
-        <w:t>, asks what local time you want the daily brief and starts the read-only pilot with no more than 25 Inbox messages.</w:t>
+        <w:t>, asks what fixed local time you want the daily brief and starts the read-only pilot with no more than 25 Inbox messages.</w:t>
       </w:r>
     </w:p>
     <w:p>
@@ -3868,7 +3884,7 @@
           <w:color w:val="1F2937"/>
           <w:sz w:val="21"/>
         </w:rPr>
-        <w:t xml:space="preserve">After the pilot, Codex reads the report and the exact safe-filing rules to you. Choose </w:t>
+        <w:t xml:space="preserve">After the pilot, Codex reads the EA report and exact safe-filing rules to you. Choose </w:t>
       </w:r>
       <w:r>
         <w:rPr>
@@ -3900,7 +3916,68 @@
           <w:color w:val="1F2937"/>
           <w:sz w:val="21"/>
         </w:rPr>
-        <w:t>. Safe filing is limited to the approved AI labels and clearly low-risk mail. It never deletes, sends, unsubscribes or changes a permanent Gmail filter.</w:t>
+        <w:t xml:space="preserve">. Safe filing is limited to the approved AI labels and clearly low-risk mail. Proposed replies remain local and </w:t>
+      </w:r>
+      <w:r>
+        <w:rPr>
+          <w:rFonts w:ascii="Menlo" w:hAnsi="Menlo" w:eastAsia="Menlo" w:cs="Menlo"/>
+          <w:color w:val="1F4D78"/>
+          <w:sz w:val="19"/>
+        </w:rPr>
+        <w:t>NOT SENT</w:t>
+      </w:r>
+      <w:r>
+        <w:rPr>
+          <w:rFonts w:ascii="Calibri" w:hAnsi="Calibri" w:eastAsia="Calibri" w:cs="Calibri"/>
+          <w:color w:val="1F2937"/>
+          <w:sz w:val="21"/>
+        </w:rPr>
+        <w:t>. Sending, unsubscribe and permanent-filter actions need separate approval for the exact action.</w:t>
+      </w:r>
+    </w:p>
+    <w:p>
+      <w:pPr>
+        <w:spacing w:before="0" w:after="120" w:line="288" w:lineRule="auto"/>
+      </w:pPr>
+      <w:r>
+        <w:rPr>
+          <w:rFonts w:ascii="Calibri" w:hAnsi="Calibri" w:eastAsia="Calibri" w:cs="Calibri"/>
+          <w:color w:val="1F2937"/>
+          <w:sz w:val="21"/>
+        </w:rPr>
+        <w:t xml:space="preserve">Codex then asks you to choose </w:t>
+      </w:r>
+      <w:r>
+        <w:rPr>
+          <w:rFonts w:ascii="Menlo" w:hAnsi="Menlo" w:eastAsia="Menlo" w:cs="Menlo"/>
+          <w:color w:val="1F4D78"/>
+          <w:sz w:val="19"/>
+        </w:rPr>
+        <w:t>RECENT WORK 25</w:t>
+      </w:r>
+      <w:r>
+        <w:rPr>
+          <w:rFonts w:ascii="Calibri" w:hAnsi="Calibri" w:eastAsia="Calibri" w:cs="Calibri"/>
+          <w:color w:val="1F2937"/>
+          <w:sz w:val="21"/>
+        </w:rPr>
+        <w:t xml:space="preserve"> or </w:t>
+      </w:r>
+      <w:r>
+        <w:rPr>
+          <w:rFonts w:ascii="Menlo" w:hAnsi="Menlo" w:eastAsia="Menlo" w:cs="Menlo"/>
+          <w:color w:val="1F4D78"/>
+          <w:sz w:val="19"/>
+        </w:rPr>
+        <w:t>CHOOSE WORK PERIOD</w:t>
+      </w:r>
+      <w:r>
+        <w:rPr>
+          <w:rFonts w:ascii="Calibri" w:hAnsi="Calibri" w:eastAsia="Calibri" w:cs="Calibri"/>
+          <w:color w:val="1F2937"/>
+          <w:sz w:val="21"/>
+        </w:rPr>
+        <w:t>. It uses only the approved company Inbox and Sent work-mail scope, in batches of no more than 25, to propose concise memory about your role, priorities, people, preferences, recurring work and commitments. You confirm, correct, keep as observed, exclude, forget or reject each candidate. It never copies a whole mailbox or full conversation into memory.</w:t>
       </w:r>
     </w:p>
     <w:p>
@@ -4038,7 +4115,7 @@
           <w:color w:val="1F2937"/>
           <w:sz w:val="21"/>
         </w:rPr>
-        <w:t>It uses NEEDS ACTION, WAITING / FOLLOW UP, WORTH READING, HUMAN REVIEW, FILTER HEALTH and RUN SUMMARY.</w:t>
+        <w:t>It uses TODAY AT A GLANCE, NEEDS ACTION, PROPOSED REPLIES, WAITING / FOLLOW UP, WORTH READING, HUMAN REVIEW, NEWSLETTERS TO REVIEW, MEMORY LEARNED OR NEEDS CONFIRMATION, FILTER HEALTH and RUN SUMMARY.</w:t>
       </w:r>
     </w:p>
     <w:p>
@@ -4055,7 +4132,23 @@
           <w:color w:val="1F2937"/>
           <w:sz w:val="21"/>
         </w:rPr>
-        <w:t>Sensitive messages are not quoted.</w:t>
+        <w:t xml:space="preserve">Every proposed reply says </w:t>
+      </w:r>
+      <w:r>
+        <w:rPr>
+          <w:rFonts w:ascii="Menlo" w:hAnsi="Menlo" w:eastAsia="Menlo" w:cs="Menlo"/>
+          <w:color w:val="1F4D78"/>
+          <w:sz w:val="19"/>
+        </w:rPr>
+        <w:t>NOT SENT</w:t>
+      </w:r>
+      <w:r>
+        <w:rPr>
+          <w:rFonts w:ascii="Calibri" w:hAnsi="Calibri" w:eastAsia="Calibri" w:cs="Calibri"/>
+          <w:color w:val="1F2937"/>
+          <w:sz w:val="21"/>
+        </w:rPr>
+        <w:t>.</w:t>
       </w:r>
     </w:p>
     <w:p>
@@ -4068,11 +4161,51 @@
       </w:pPr>
       <w:r>
         <w:rPr>
+          <w:rFonts w:ascii="Menlo" w:hAnsi="Menlo" w:eastAsia="Menlo" w:cs="Menlo"/>
+          <w:color w:val="1F4D78"/>
+          <w:sz w:val="19"/>
+        </w:rPr>
+        <w:t>PERSONAL-WORK-MEMORY.md</w:t>
+      </w:r>
+      <w:r>
+        <w:rPr>
           <w:rFonts w:ascii="Calibri" w:hAnsi="Calibri" w:eastAsia="Calibri" w:cs="Calibri"/>
           <w:color w:val="1F2937"/>
           <w:sz w:val="21"/>
         </w:rPr>
-        <w:t>The pilot says Gmail was unchanged and no permanent Gmail filter was changed.</w:t>
+        <w:t xml:space="preserve"> contains only sourced, dated </w:t>
+      </w:r>
+      <w:r>
+        <w:rPr>
+          <w:rFonts w:ascii="Menlo" w:hAnsi="Menlo" w:eastAsia="Menlo" w:cs="Menlo"/>
+          <w:color w:val="1F4D78"/>
+          <w:sz w:val="19"/>
+        </w:rPr>
+        <w:t>CONFIRMED</w:t>
+      </w:r>
+      <w:r>
+        <w:rPr>
+          <w:rFonts w:ascii="Calibri" w:hAnsi="Calibri" w:eastAsia="Calibri" w:cs="Calibri"/>
+          <w:color w:val="1F2937"/>
+          <w:sz w:val="21"/>
+        </w:rPr>
+        <w:t xml:space="preserve"> or </w:t>
+      </w:r>
+      <w:r>
+        <w:rPr>
+          <w:rFonts w:ascii="Menlo" w:hAnsi="Menlo" w:eastAsia="Menlo" w:cs="Menlo"/>
+          <w:color w:val="1F4D78"/>
+          <w:sz w:val="19"/>
+        </w:rPr>
+        <w:t>OBSERVED — VERIFY</w:t>
+      </w:r>
+      <w:r>
+        <w:rPr>
+          <w:rFonts w:ascii="Calibri" w:hAnsi="Calibri" w:eastAsia="Calibri" w:cs="Calibri"/>
+          <w:color w:val="1F2937"/>
+          <w:sz w:val="21"/>
+        </w:rPr>
+        <w:t xml:space="preserve"> items.</w:t>
       </w:r>
     </w:p>
     <w:p>
@@ -4089,7 +4222,7 @@
           <w:color w:val="1F4D78"/>
           <w:sz w:val="19"/>
         </w:rPr>
-        <w:t>PARAMETERS.md</w:t>
+        <w:t>MEMORY-SOURCES.md</w:t>
       </w:r>
       <w:r>
         <w:rPr>
@@ -4097,7 +4230,7 @@
           <w:color w:val="1F2937"/>
           <w:sz w:val="21"/>
         </w:rPr>
-        <w:t xml:space="preserve"> shows your approved daily time, time zone and filing mode.</w:t>
+        <w:t xml:space="preserve"> shows exact approved scope, coverage and freshness.</w:t>
       </w:r>
     </w:p>
     <w:p>
@@ -4114,7 +4247,7 @@
           <w:color w:val="1F2937"/>
           <w:sz w:val="21"/>
         </w:rPr>
-        <w:t xml:space="preserve">The daily automation card and </w:t>
+        <w:t xml:space="preserve">You can use </w:t>
       </w:r>
       <w:r>
         <w:rPr>
@@ -4122,7 +4255,7 @@
           <w:color w:val="1F4D78"/>
           <w:sz w:val="19"/>
         </w:rPr>
-        <w:t>AUTOMATIONS.md</w:t>
+        <w:t>SHOW MY MEMORY</w:t>
       </w:r>
       <w:r>
         <w:rPr>
@@ -4130,7 +4263,71 @@
           <w:color w:val="1F2937"/>
           <w:sz w:val="21"/>
         </w:rPr>
-        <w:t xml:space="preserve"> show the same schedule and project.</w:t>
+        <w:t xml:space="preserve">, </w:t>
+      </w:r>
+      <w:r>
+        <w:rPr>
+          <w:rFonts w:ascii="Menlo" w:hAnsi="Menlo" w:eastAsia="Menlo" w:cs="Menlo"/>
+          <w:color w:val="1F4D78"/>
+          <w:sz w:val="19"/>
+        </w:rPr>
+        <w:t>CORRECT MEMORY &lt;ID&gt;</w:t>
+      </w:r>
+      <w:r>
+        <w:rPr>
+          <w:rFonts w:ascii="Calibri" w:hAnsi="Calibri" w:eastAsia="Calibri" w:cs="Calibri"/>
+          <w:color w:val="1F2937"/>
+          <w:sz w:val="21"/>
+        </w:rPr>
+        <w:t xml:space="preserve">, </w:t>
+      </w:r>
+      <w:r>
+        <w:rPr>
+          <w:rFonts w:ascii="Menlo" w:hAnsi="Menlo" w:eastAsia="Menlo" w:cs="Menlo"/>
+          <w:color w:val="1F4D78"/>
+          <w:sz w:val="19"/>
+        </w:rPr>
+        <w:t>FORGET &lt;ID&gt;</w:t>
+      </w:r>
+      <w:r>
+        <w:rPr>
+          <w:rFonts w:ascii="Calibri" w:hAnsi="Calibri" w:eastAsia="Calibri" w:cs="Calibri"/>
+          <w:color w:val="1F2937"/>
+          <w:sz w:val="21"/>
+        </w:rPr>
+        <w:t xml:space="preserve">, </w:t>
+      </w:r>
+      <w:r>
+        <w:rPr>
+          <w:rFonts w:ascii="Menlo" w:hAnsi="Menlo" w:eastAsia="Menlo" w:cs="Menlo"/>
+          <w:color w:val="1F4D78"/>
+          <w:sz w:val="19"/>
+        </w:rPr>
+        <w:t>EXCLUDE &lt;topic or person&gt;</w:t>
+      </w:r>
+      <w:r>
+        <w:rPr>
+          <w:rFonts w:ascii="Calibri" w:hAnsi="Calibri" w:eastAsia="Calibri" w:cs="Calibri"/>
+          <w:color w:val="1F2937"/>
+          <w:sz w:val="21"/>
+        </w:rPr>
+        <w:t xml:space="preserve"> and </w:t>
+      </w:r>
+      <w:r>
+        <w:rPr>
+          <w:rFonts w:ascii="Menlo" w:hAnsi="Menlo" w:eastAsia="Menlo" w:cs="Menlo"/>
+          <w:color w:val="1F4D78"/>
+          <w:sz w:val="19"/>
+        </w:rPr>
+        <w:t>REFRESH MEMORY</w:t>
+      </w:r>
+      <w:r>
+        <w:rPr>
+          <w:rFonts w:ascii="Calibri" w:hAnsi="Calibri" w:eastAsia="Calibri" w:cs="Calibri"/>
+          <w:color w:val="1F2937"/>
+          <w:sz w:val="21"/>
+        </w:rPr>
+        <w:t>.</w:t>
       </w:r>
     </w:p>
     <w:p>
@@ -4147,6 +4344,98 @@
           <w:color w:val="1F2937"/>
           <w:sz w:val="21"/>
         </w:rPr>
+        <w:t>Sensitive messages are not quoted.</w:t>
+      </w:r>
+    </w:p>
+    <w:p>
+      <w:pPr>
+        <w:numPr>
+          <w:ilvl w:val="0"/>
+          <w:numId w:val="91"/>
+        </w:numPr>
+        <w:spacing w:before="0" w:after="80" w:line="288" w:lineRule="auto"/>
+      </w:pPr>
+      <w:r>
+        <w:rPr>
+          <w:rFonts w:ascii="Calibri" w:hAnsi="Calibri" w:eastAsia="Calibri" w:cs="Calibri"/>
+          <w:color w:val="1F2937"/>
+          <w:sz w:val="21"/>
+        </w:rPr>
+        <w:t>The pilot says Gmail was unchanged; no send, unsubscribe or permanent-filter action occurred without separate exact approval and recovery proof.</w:t>
+      </w:r>
+    </w:p>
+    <w:p>
+      <w:pPr>
+        <w:numPr>
+          <w:ilvl w:val="0"/>
+          <w:numId w:val="91"/>
+        </w:numPr>
+        <w:spacing w:before="0" w:after="80" w:line="288" w:lineRule="auto"/>
+      </w:pPr>
+      <w:r>
+        <w:rPr>
+          <w:rFonts w:ascii="Menlo" w:hAnsi="Menlo" w:eastAsia="Menlo" w:cs="Menlo"/>
+          <w:color w:val="1F4D78"/>
+          <w:sz w:val="19"/>
+        </w:rPr>
+        <w:t>PARAMETERS.md</w:t>
+      </w:r>
+      <w:r>
+        <w:rPr>
+          <w:rFonts w:ascii="Calibri" w:hAnsi="Calibri" w:eastAsia="Calibri" w:cs="Calibri"/>
+          <w:color w:val="1F2937"/>
+          <w:sz w:val="21"/>
+        </w:rPr>
+        <w:t xml:space="preserve"> shows your approved daily time, time zone and filing mode.</w:t>
+      </w:r>
+    </w:p>
+    <w:p>
+      <w:pPr>
+        <w:numPr>
+          <w:ilvl w:val="0"/>
+          <w:numId w:val="91"/>
+        </w:numPr>
+        <w:spacing w:before="0" w:after="80" w:line="288" w:lineRule="auto"/>
+      </w:pPr>
+      <w:r>
+        <w:rPr>
+          <w:rFonts w:ascii="Calibri" w:hAnsi="Calibri" w:eastAsia="Calibri" w:cs="Calibri"/>
+          <w:color w:val="1F2937"/>
+          <w:sz w:val="21"/>
+        </w:rPr>
+        <w:t xml:space="preserve">The daily automation card and </w:t>
+      </w:r>
+      <w:r>
+        <w:rPr>
+          <w:rFonts w:ascii="Menlo" w:hAnsi="Menlo" w:eastAsia="Menlo" w:cs="Menlo"/>
+          <w:color w:val="1F4D78"/>
+          <w:sz w:val="19"/>
+        </w:rPr>
+        <w:t>AUTOMATIONS.md</w:t>
+      </w:r>
+      <w:r>
+        <w:rPr>
+          <w:rFonts w:ascii="Calibri" w:hAnsi="Calibri" w:eastAsia="Calibri" w:cs="Calibri"/>
+          <w:color w:val="1F2937"/>
+          <w:sz w:val="21"/>
+        </w:rPr>
+        <w:t xml:space="preserve"> show the same schedule and project.</w:t>
+      </w:r>
+    </w:p>
+    <w:p>
+      <w:pPr>
+        <w:numPr>
+          <w:ilvl w:val="0"/>
+          <w:numId w:val="91"/>
+        </w:numPr>
+        <w:spacing w:before="0" w:after="80" w:line="288" w:lineRule="auto"/>
+      </w:pPr>
+      <w:r>
+        <w:rPr>
+          <w:rFonts w:ascii="Calibri" w:hAnsi="Calibri" w:eastAsia="Calibri" w:cs="Calibri"/>
+          <w:color w:val="1F2937"/>
+          <w:sz w:val="21"/>
+        </w:rPr>
         <w:t>The workspace validator passed.</w:t>
       </w:r>
     </w:p>
@@ -4184,7 +4473,7 @@
           <w:color w:val="2E74B5"/>
           <w:sz w:val="32"/>
         </w:rPr>
-        <w:t>Project 2 - Drive Inventory AI Human</w:t>
+        <w:t>Project 2 - Drive Master Index AI Human</w:t>
       </w:r>
     </w:p>
     <w:p>
@@ -4732,7 +5021,7 @@
           <w:color w:val="0B2545"/>
           <w:sz w:val="21"/>
         </w:rPr>
-        <w:t xml:space="preserve">, asks you to choose </w:t>
+        <w:t xml:space="preserve">, visibly asks you to choose </w:t>
       </w:r>
       <w:r>
         <w:rPr>
@@ -4765,6 +5054,123 @@
           <w:sz w:val="21"/>
         </w:rPr>
         <w:t>, and never processes more than 25 items before a checkpoint.</w:t>
+      </w:r>
+    </w:p>
+    <w:p>
+      <w:pPr>
+        <w:spacing w:before="0" w:after="120" w:line="288" w:lineRule="auto"/>
+      </w:pPr>
+      <w:r>
+        <w:rPr>
+          <w:rFonts w:ascii="Calibri" w:hAnsi="Calibri" w:eastAsia="Calibri" w:cs="Calibri"/>
+          <w:color w:val="1F2937"/>
+          <w:sz w:val="21"/>
+        </w:rPr>
+        <w:t xml:space="preserve">If you chose </w:t>
+      </w:r>
+      <w:r>
+        <w:rPr>
+          <w:rFonts w:ascii="Menlo" w:hAnsi="Menlo" w:eastAsia="Menlo" w:cs="Menlo"/>
+          <w:color w:val="1F4D78"/>
+          <w:sz w:val="19"/>
+        </w:rPr>
+        <w:t>FULL DRIVE INDEX</w:t>
+      </w:r>
+      <w:r>
+        <w:rPr>
+          <w:rFonts w:ascii="Calibri" w:hAnsi="Calibri" w:eastAsia="Calibri" w:cs="Calibri"/>
+          <w:color w:val="1F2937"/>
+          <w:sz w:val="21"/>
+        </w:rPr>
+        <w:t xml:space="preserve"> and both registers reconcile, Codex asks whether to </w:t>
+      </w:r>
+      <w:r>
+        <w:rPr>
+          <w:rFonts w:ascii="Menlo" w:hAnsi="Menlo" w:eastAsia="Menlo" w:cs="Menlo"/>
+          <w:color w:val="1F4D78"/>
+          <w:sz w:val="19"/>
+        </w:rPr>
+        <w:t>SET WEEKLY REFRESH</w:t>
+      </w:r>
+      <w:r>
+        <w:rPr>
+          <w:rFonts w:ascii="Calibri" w:hAnsi="Calibri" w:eastAsia="Calibri" w:cs="Calibri"/>
+          <w:color w:val="1F2937"/>
+          <w:sz w:val="21"/>
+        </w:rPr>
+        <w:t xml:space="preserve"> or choose </w:t>
+      </w:r>
+      <w:r>
+        <w:rPr>
+          <w:rFonts w:ascii="Menlo" w:hAnsi="Menlo" w:eastAsia="Menlo" w:cs="Menlo"/>
+          <w:color w:val="1F4D78"/>
+          <w:sz w:val="19"/>
+        </w:rPr>
+        <w:t>NOT NOW</w:t>
+      </w:r>
+      <w:r>
+        <w:rPr>
+          <w:rFonts w:ascii="Calibri" w:hAnsi="Calibri" w:eastAsia="Calibri" w:cs="Calibri"/>
+          <w:color w:val="1F2937"/>
+          <w:sz w:val="21"/>
+        </w:rPr>
+        <w:t xml:space="preserve">. If you set it, give the day, exact local time within your preferred window and time zone. Sunday night may be suggested, but Codex must not invent a time. Verify the visible automation card. If you decline, Codex records </w:t>
+      </w:r>
+      <w:r>
+        <w:rPr>
+          <w:rFonts w:ascii="Menlo" w:hAnsi="Menlo" w:eastAsia="Menlo" w:cs="Menlo"/>
+          <w:color w:val="1F4D78"/>
+          <w:sz w:val="19"/>
+        </w:rPr>
+        <w:t>NOT ENABLED BY CHOICE</w:t>
+      </w:r>
+      <w:r>
+        <w:rPr>
+          <w:rFonts w:ascii="Calibri" w:hAnsi="Calibri" w:eastAsia="Calibri" w:cs="Calibri"/>
+          <w:color w:val="1F2937"/>
+          <w:sz w:val="21"/>
+        </w:rPr>
+        <w:t>; you may add it later.</w:t>
+      </w:r>
+    </w:p>
+    <w:p>
+      <w:pPr>
+        <w:spacing w:before="60" w:after="180" w:line="288" w:lineRule="auto"/>
+        <w:ind w:left="173"/>
+        <w:shd w:fill="FFF8E8"/>
+      </w:pPr>
+      <w:r>
+        <w:rPr>
+          <w:rFonts w:ascii="Calibri" w:hAnsi="Calibri" w:eastAsia="Calibri" w:cs="Calibri"/>
+          <w:b/>
+          <w:color w:val="0B2545"/>
+          <w:sz w:val="21"/>
+        </w:rPr>
+        <w:t>DONE WHEN:</w:t>
+      </w:r>
+      <w:r>
+        <w:rPr>
+          <w:rFonts w:ascii="Calibri" w:hAnsi="Calibri" w:eastAsia="Calibri" w:cs="Calibri"/>
+          <w:color w:val="0B2545"/>
+          <w:sz w:val="21"/>
+        </w:rPr>
+        <w:t xml:space="preserve"> The card's day, time, time zone, Drive project and </w:t>
+      </w:r>
+      <w:r>
+        <w:rPr>
+          <w:rFonts w:ascii="Menlo" w:hAnsi="Menlo" w:eastAsia="Menlo" w:cs="Menlo"/>
+          <w:color w:val="1F4D78"/>
+          <w:sz w:val="19"/>
+        </w:rPr>
+        <w:t>WEEKLY-DRIVE-REFRESH-PROMPT.md</w:t>
+      </w:r>
+      <w:r>
+        <w:rPr>
+          <w:rFonts w:ascii="Calibri" w:hAnsi="Calibri" w:eastAsia="Calibri" w:cs="Calibri"/>
+          <w:color w:val="0B2545"/>
+          <w:sz w:val="21"/>
+        </w:rPr>
+        <w:t xml:space="preserve"> agree, or the decline is visible.</w:t>
       </w:r>
     </w:p>
     <w:p>
@@ -4807,7 +5213,7 @@
           <w:color w:val="1F4D78"/>
           <w:sz w:val="19"/>
         </w:rPr>
-        <w:t>DRIVE-INDEX.csv</w:t>
+        <w:t>DRIVE-INDEX.jsonl</w:t>
       </w:r>
       <w:r>
         <w:rPr>
@@ -4831,7 +5237,7 @@
           <w:color w:val="1F2937"/>
           <w:sz w:val="21"/>
         </w:rPr>
-        <w:t xml:space="preserve"> and </w:t>
+        <w:t xml:space="preserve">, </w:t>
       </w:r>
       <w:r>
         <w:rPr>
@@ -4847,7 +5253,23 @@
           <w:color w:val="1F2937"/>
           <w:sz w:val="21"/>
         </w:rPr>
-        <w:t xml:space="preserve"> exist.</w:t>
+        <w:t xml:space="preserve"> and exactly one human register exist: an explicitly approved Google Sheet or otherwise </w:t>
+      </w:r>
+      <w:r>
+        <w:rPr>
+          <w:rFonts w:ascii="Menlo" w:hAnsi="Menlo" w:eastAsia="Menlo" w:cs="Menlo"/>
+          <w:color w:val="1F4D78"/>
+          <w:sz w:val="19"/>
+        </w:rPr>
+        <w:t>DRIVE-REGISTER.csv</w:t>
+      </w:r>
+      <w:r>
+        <w:rPr>
+          <w:rFonts w:ascii="Calibri" w:hAnsi="Calibri" w:eastAsia="Calibri" w:cs="Calibri"/>
+          <w:color w:val="1F2937"/>
+          <w:sz w:val="21"/>
+        </w:rPr>
+        <w:t>.</w:t>
       </w:r>
     </w:p>
     <w:p>
@@ -4864,7 +5286,7 @@
           <w:color w:val="1F2937"/>
           <w:sz w:val="21"/>
         </w:rPr>
-        <w:t>Every batch is no more than 25 items and has a durable checkpoint.</w:t>
+        <w:t>JSONL and the human register were reopened; their generation ID, JSONL object/unique-ID count, human data-row count, and unique, owned-or-created, shared-with, shared-by, overlap, unknown and refresh totals agree with summary and cursor.</w:t>
       </w:r>
     </w:p>
     <w:p>
@@ -4877,35 +5299,11 @@
       </w:pPr>
       <w:r>
         <w:rPr>
-          <w:rFonts w:ascii="Menlo" w:hAnsi="Menlo" w:eastAsia="Menlo" w:cs="Menlo"/>
-          <w:color w:val="1F4D78"/>
-          <w:sz w:val="19"/>
-        </w:rPr>
-        <w:t>TEST 25</w:t>
-      </w:r>
-      <w:r>
-        <w:rPr>
           <w:rFonts w:ascii="Calibri" w:hAnsi="Calibri" w:eastAsia="Calibri" w:cs="Calibri"/>
           <w:color w:val="1F2937"/>
           <w:sz w:val="21"/>
         </w:rPr>
-        <w:t xml:space="preserve"> says the full Drive was not indexed. </w:t>
-      </w:r>
-      <w:r>
-        <w:rPr>
-          <w:rFonts w:ascii="Menlo" w:hAnsi="Menlo" w:eastAsia="Menlo" w:cs="Menlo"/>
-          <w:color w:val="1F4D78"/>
-          <w:sz w:val="19"/>
-        </w:rPr>
-        <w:t>FULL DRIVE INDEX</w:t>
-      </w:r>
-      <w:r>
-        <w:rPr>
-          <w:rFonts w:ascii="Calibri" w:hAnsi="Calibri" w:eastAsia="Calibri" w:cs="Calibri"/>
-          <w:color w:val="1F2937"/>
-          <w:sz w:val="21"/>
-        </w:rPr>
-        <w:t xml:space="preserve"> shows each connector-visible source scope has no next page, or names the coverage gap.</w:t>
+        <w:t>Every batch is no more than 25 items and has a durable checkpoint.</w:t>
       </w:r>
     </w:p>
     <w:p>
@@ -4918,11 +5316,35 @@
       </w:pPr>
       <w:r>
         <w:rPr>
+          <w:rFonts w:ascii="Menlo" w:hAnsi="Menlo" w:eastAsia="Menlo" w:cs="Menlo"/>
+          <w:color w:val="1F4D78"/>
+          <w:sz w:val="19"/>
+        </w:rPr>
+        <w:t>TEST 25</w:t>
+      </w:r>
+      <w:r>
+        <w:rPr>
           <w:rFonts w:ascii="Calibri" w:hAnsi="Calibri" w:eastAsia="Calibri" w:cs="Calibri"/>
           <w:color w:val="1F2937"/>
           <w:sz w:val="21"/>
         </w:rPr>
-        <w:t>Stable item IDs prevent duplicate rows and let a new session resume.</w:t>
+        <w:t xml:space="preserve"> says the full Drive was not indexed. </w:t>
+      </w:r>
+      <w:r>
+        <w:rPr>
+          <w:rFonts w:ascii="Menlo" w:hAnsi="Menlo" w:eastAsia="Menlo" w:cs="Menlo"/>
+          <w:color w:val="1F4D78"/>
+          <w:sz w:val="19"/>
+        </w:rPr>
+        <w:t>FULL DRIVE INDEX</w:t>
+      </w:r>
+      <w:r>
+        <w:rPr>
+          <w:rFonts w:ascii="Calibri" w:hAnsi="Calibri" w:eastAsia="Calibri" w:cs="Calibri"/>
+          <w:color w:val="1F2937"/>
+          <w:sz w:val="21"/>
+        </w:rPr>
+        <w:t xml:space="preserve"> shows each connector-visible source scope has no next page, or names the coverage gap.</w:t>
       </w:r>
     </w:p>
     <w:p>
@@ -4939,7 +5361,7 @@
           <w:color w:val="1F2937"/>
           <w:sz w:val="21"/>
         </w:rPr>
-        <w:t>Missing fields say UNKNOWN; sensitive titles say HUMAN REVIEW.</w:t>
+        <w:t>Stable item IDs prevent duplicate rows and let a new session resume.</w:t>
       </w:r>
     </w:p>
     <w:p>
@@ -4956,7 +5378,74 @@
           <w:color w:val="1F2937"/>
           <w:sz w:val="21"/>
         </w:rPr>
-        <w:t>It says no Drive file content was opened or downloaded and no Drive item was created, edited, renamed, moved, shared, unshared, deleted or organized.</w:t>
+        <w:t>Missing fields say UNKNOWN; sensitive titles say HUMAN REVIEW.</w:t>
+      </w:r>
+    </w:p>
+    <w:p>
+      <w:pPr>
+        <w:numPr>
+          <w:ilvl w:val="0"/>
+          <w:numId w:val="107"/>
+        </w:numPr>
+        <w:spacing w:before="0" w:after="80" w:line="288" w:lineRule="auto"/>
+      </w:pPr>
+      <w:r>
+        <w:rPr>
+          <w:rFonts w:ascii="Calibri" w:hAnsi="Calibri" w:eastAsia="Calibri" w:cs="Calibri"/>
+          <w:color w:val="1F2937"/>
+          <w:sz w:val="21"/>
+        </w:rPr>
+        <w:t>It says no Drive file content was opened or downloaded and no Drive item was created, edited, renamed, moved, shared, unshared, deleted or organized, except an explicitly approved human-register Sheet.</w:t>
+      </w:r>
+    </w:p>
+    <w:p>
+      <w:pPr>
+        <w:numPr>
+          <w:ilvl w:val="0"/>
+          <w:numId w:val="107"/>
+        </w:numPr>
+        <w:spacing w:before="0" w:after="80" w:line="288" w:lineRule="auto"/>
+      </w:pPr>
+      <w:r>
+        <w:rPr>
+          <w:rFonts w:ascii="Calibri" w:hAnsi="Calibri" w:eastAsia="Calibri" w:cs="Calibri"/>
+          <w:color w:val="1F2937"/>
+          <w:sz w:val="21"/>
+        </w:rPr>
+        <w:t xml:space="preserve">After full proof, the optional weekly refresh has a verified employee-chosen day, exact local time and time zone, or the decision says </w:t>
+      </w:r>
+      <w:r>
+        <w:rPr>
+          <w:rFonts w:ascii="Menlo" w:hAnsi="Menlo" w:eastAsia="Menlo" w:cs="Menlo"/>
+          <w:color w:val="1F4D78"/>
+          <w:sz w:val="19"/>
+        </w:rPr>
+        <w:t>NOT ENABLED BY CHOICE</w:t>
+      </w:r>
+      <w:r>
+        <w:rPr>
+          <w:rFonts w:ascii="Calibri" w:hAnsi="Calibri" w:eastAsia="Calibri" w:cs="Calibri"/>
+          <w:color w:val="1F2937"/>
+          <w:sz w:val="21"/>
+        </w:rPr>
+        <w:t>.</w:t>
+      </w:r>
+    </w:p>
+    <w:p>
+      <w:pPr>
+        <w:numPr>
+          <w:ilvl w:val="0"/>
+          <w:numId w:val="107"/>
+        </w:numPr>
+        <w:spacing w:before="0" w:after="80" w:line="288" w:lineRule="auto"/>
+      </w:pPr>
+      <w:r>
+        <w:rPr>
+          <w:rFonts w:ascii="Calibri" w:hAnsi="Calibri" w:eastAsia="Calibri" w:cs="Calibri"/>
+          <w:color w:val="1F2937"/>
+          <w:sz w:val="21"/>
+        </w:rPr>
+        <w:t>Pause, edit, remove and missed-run recovery are visible; a failed refresh does not advance the last-success cursor.</w:t>
       </w:r>
     </w:p>
     <w:p>
@@ -5848,45 +6337,7 @@
     </w:p>
     <w:p>
       <w:pPr>
-        <w:spacing w:before="0" w:after="120" w:line="288" w:lineRule="auto"/>
-      </w:pPr>
-      <w:r>
-        <w:rPr>
-          <w:rFonts w:ascii="Calibri" w:hAnsi="Calibri" w:eastAsia="Calibri" w:cs="Calibri"/>
-          <w:color w:val="1F2937"/>
-          <w:sz w:val="21"/>
-        </w:rPr>
-        <w:t>The weekly reminder works only while the computer is awake, ChatGPT is running and the local project remains available. It may control the approved local worker, then it stops. It does not access LinkedIn.</w:t>
-      </w:r>
-    </w:p>
-    <w:p>
-      <w:pPr>
-        <w:pStyle w:val="Heading1"/>
-      </w:pPr>
-      <w:r>
-        <w:rPr>
-          <w:rFonts w:ascii="Calibri" w:hAnsi="Calibri" w:eastAsia="Calibri" w:cs="Calibri"/>
-          <w:color w:val="2E74B5"/>
-          <w:sz w:val="32"/>
-        </w:rPr>
-        <w:t>What to bring back</w:t>
-      </w:r>
-    </w:p>
-    <w:p>
-      <w:pPr>
-        <w:spacing w:before="0" w:after="120" w:line="288" w:lineRule="auto"/>
-      </w:pPr>
-      <w:r>
-        <w:rPr>
-          <w:rFonts w:ascii="Calibri" w:hAnsi="Calibri" w:eastAsia="Calibri" w:cs="Calibri"/>
-          <w:color w:val="1F2937"/>
-          <w:sz w:val="21"/>
-        </w:rPr>
-        <w:t>Bring the laptop or screenshots that show:</w:t>
-      </w:r>
-    </w:p>
-    <w:p>
-      <w:pPr>
+        <w:keepNext/>
         <w:numPr>
           <w:ilvl w:val="0"/>
           <w:numId w:val="125"/>
@@ -5899,7 +6350,7 @@
           <w:color w:val="1F2937"/>
           <w:sz w:val="21"/>
         </w:rPr>
-        <w:t xml:space="preserve">Email project open with </w:t>
+        <w:t xml:space="preserve">Review the optional concise learning proposed from your manually supplied examples and confirmed outcomes. Approve only useful work relationship or tone context before it enters </w:t>
       </w:r>
       <w:r>
         <w:rPr>
@@ -5907,7 +6358,7 @@
           <w:color w:val="1F4D78"/>
           <w:sz w:val="19"/>
         </w:rPr>
-        <w:t>EMAIL-TRIAGE-REPORT.md</w:t>
+        <w:t>CONFIRMED-LINKEDIN-LEARNINGS.md</w:t>
       </w:r>
       <w:r>
         <w:rPr>
@@ -5915,24 +6366,7 @@
           <w:color w:val="1F2937"/>
           <w:sz w:val="21"/>
         </w:rPr>
-        <w:t>.</w:t>
-      </w:r>
-    </w:p>
-    <w:p>
-      <w:pPr>
-        <w:numPr>
-          <w:ilvl w:val="0"/>
-          <w:numId w:val="125"/>
-        </w:numPr>
-        <w:spacing w:before="0" w:after="80" w:line="288" w:lineRule="auto"/>
-      </w:pPr>
-      <w:r>
-        <w:rPr>
-          <w:rFonts w:ascii="Calibri" w:hAnsi="Calibri" w:eastAsia="Calibri" w:cs="Calibri"/>
-          <w:color w:val="1F2937"/>
-          <w:sz w:val="21"/>
-        </w:rPr>
-        <w:t xml:space="preserve">Drive project open with </w:t>
+        <w:t xml:space="preserve">. Reject private, sensitive or inferred traits. You may say </w:t>
       </w:r>
       <w:r>
         <w:rPr>
@@ -5940,7 +6374,7 @@
           <w:color w:val="1F4D78"/>
           <w:sz w:val="19"/>
         </w:rPr>
-        <w:t>DRIVE-INDEX.md</w:t>
+        <w:t>CORRECT LINKEDIN LEARNING &lt;ID&gt;</w:t>
       </w:r>
       <w:r>
         <w:rPr>
@@ -5948,58 +6382,7 @@
           <w:color w:val="1F2937"/>
           <w:sz w:val="21"/>
         </w:rPr>
-        <w:t xml:space="preserve"> and its saved cursor.</w:t>
-      </w:r>
-    </w:p>
-    <w:p>
-      <w:pPr>
-        <w:numPr>
-          <w:ilvl w:val="0"/>
-          <w:numId w:val="125"/>
-        </w:numPr>
-        <w:spacing w:before="0" w:after="80" w:line="288" w:lineRule="auto"/>
-      </w:pPr>
-      <w:r>
-        <w:rPr>
-          <w:rFonts w:ascii="Calibri" w:hAnsi="Calibri" w:eastAsia="Calibri" w:cs="Calibri"/>
-          <w:color w:val="1F2937"/>
-          <w:sz w:val="21"/>
-        </w:rPr>
-        <w:t>The final evidence row and validator pass in each project.</w:t>
-      </w:r>
-    </w:p>
-    <w:p>
-      <w:pPr>
-        <w:numPr>
-          <w:ilvl w:val="0"/>
-          <w:numId w:val="125"/>
-        </w:numPr>
-        <w:spacing w:before="0" w:after="80" w:line="288" w:lineRule="auto"/>
-      </w:pPr>
-      <w:r>
-        <w:rPr>
-          <w:rFonts w:ascii="Calibri" w:hAnsi="Calibri" w:eastAsia="Calibri" w:cs="Calibri"/>
-          <w:color w:val="1F2937"/>
-          <w:sz w:val="21"/>
-        </w:rPr>
-        <w:t>Optional: approved Saturday schedule, tone/precedent file, numbered reply queue, cursor, employee-confirmed outcomes, and validator pass. Do not show message bodies.</w:t>
-      </w:r>
-    </w:p>
-    <w:p>
-      <w:pPr>
-        <w:numPr>
-          <w:ilvl w:val="0"/>
-          <w:numId w:val="125"/>
-        </w:numPr>
-        <w:spacing w:before="0" w:after="80" w:line="288" w:lineRule="auto"/>
-      </w:pPr>
-      <w:r>
-        <w:rPr>
-          <w:rFonts w:ascii="Calibri" w:hAnsi="Calibri" w:eastAsia="Calibri" w:cs="Calibri"/>
-          <w:color w:val="1F2937"/>
-          <w:sz w:val="21"/>
-        </w:rPr>
-        <w:t xml:space="preserve">The three-line final readback from </w:t>
+        <w:t xml:space="preserve"> or </w:t>
       </w:r>
       <w:r>
         <w:rPr>
@@ -6007,7 +6390,7 @@
           <w:color w:val="1F4D78"/>
           <w:sz w:val="19"/>
         </w:rPr>
-        <w:t>THREE-WORKER-GO-LIVE-CHECKLIST.md</w:t>
+        <w:t>FORGET LINKEDIN LEARNING &lt;ID&gt;</w:t>
       </w:r>
       <w:r>
         <w:rPr>
@@ -6015,72 +6398,48 @@
           <w:color w:val="1F2937"/>
           <w:sz w:val="21"/>
         </w:rPr>
-        <w:t xml:space="preserve">: Email and Drive are </w:t>
-      </w:r>
-      <w:r>
-        <w:rPr>
-          <w:rFonts w:ascii="Menlo" w:hAnsi="Menlo" w:eastAsia="Menlo" w:cs="Menlo"/>
-          <w:color w:val="1F4D78"/>
-          <w:sz w:val="19"/>
-        </w:rPr>
-        <w:t>LIVE FOR ME</w:t>
-      </w:r>
-      <w:r>
-        <w:rPr>
-          <w:rFonts w:ascii="Calibri" w:hAnsi="Calibri" w:eastAsia="Calibri" w:cs="Calibri"/>
-          <w:color w:val="1F2937"/>
-          <w:sz w:val="21"/>
-        </w:rPr>
-        <w:t xml:space="preserve"> or show an exact blocker; LinkedIn is </w:t>
-      </w:r>
-      <w:r>
-        <w:rPr>
-          <w:rFonts w:ascii="Menlo" w:hAnsi="Menlo" w:eastAsia="Menlo" w:cs="Menlo"/>
-          <w:color w:val="1F4D78"/>
-          <w:sz w:val="19"/>
-        </w:rPr>
-        <w:t>LIVE FOR ME, OPTIONAL</w:t>
-      </w:r>
-      <w:r>
-        <w:rPr>
-          <w:rFonts w:ascii="Calibri" w:hAnsi="Calibri" w:eastAsia="Calibri" w:cs="Calibri"/>
-          <w:color w:val="1F2937"/>
-          <w:sz w:val="21"/>
-        </w:rPr>
-        <w:t xml:space="preserve">, </w:t>
-      </w:r>
-      <w:r>
-        <w:rPr>
-          <w:rFonts w:ascii="Menlo" w:hAnsi="Menlo" w:eastAsia="Menlo" w:cs="Menlo"/>
-          <w:color w:val="1F4D78"/>
-          <w:sz w:val="19"/>
-        </w:rPr>
-        <w:t>NOT ENABLED BY CHOICE</w:t>
-      </w:r>
-      <w:r>
-        <w:rPr>
-          <w:rFonts w:ascii="Calibri" w:hAnsi="Calibri" w:eastAsia="Calibri" w:cs="Calibri"/>
-          <w:color w:val="1F2937"/>
-          <w:sz w:val="21"/>
-        </w:rPr>
-        <w:t>, or shows an exact blocker.</w:t>
+        <w:t xml:space="preserve"> at any time.</w:t>
       </w:r>
     </w:p>
     <w:p>
       <w:pPr>
-        <w:spacing w:before="0" w:after="120" w:line="288" w:lineRule="auto"/>
-      </w:pPr>
-      <w:r>
-        <w:rPr>
-          <w:rFonts w:ascii="Calibri" w:hAnsi="Calibri" w:eastAsia="Calibri" w:cs="Calibri"/>
-          <w:color w:val="1F2937"/>
-          <w:sz w:val="21"/>
-        </w:rPr>
-        <w:t>Do not bring email bodies, passwords, one-time codes, private HR details, banking information, or sensitive Drive content. Show the safe report headings and proof.</w:t>
+        <w:spacing w:before="60" w:after="180" w:line="288" w:lineRule="auto"/>
+        <w:ind w:left="173"/>
+        <w:shd w:fill="FFF8E8"/>
+      </w:pPr>
+      <w:r>
+        <w:rPr>
+          <w:rFonts w:ascii="Calibri" w:hAnsi="Calibri" w:eastAsia="Calibri" w:cs="Calibri"/>
+          <w:b/>
+          <w:color w:val="0B2545"/>
+          <w:sz w:val="21"/>
+        </w:rPr>
+        <w:t>DONE WHEN:</w:t>
+      </w:r>
+      <w:r>
+        <w:rPr>
+          <w:rFonts w:ascii="Calibri" w:hAnsi="Calibri" w:eastAsia="Calibri" w:cs="Calibri"/>
+          <w:color w:val="0B2545"/>
+          <w:sz w:val="21"/>
+        </w:rPr>
+        <w:t xml:space="preserve"> Every saved learning has an ID, source, date and your explicit confirmation; full conversations and hidden profiling are absent.</w:t>
       </w:r>
     </w:p>
     <w:p>
       <w:pPr>
+        <w:spacing w:before="0" w:after="120" w:line="288" w:lineRule="auto"/>
+      </w:pPr>
+      <w:r>
+        <w:rPr>
+          <w:rFonts w:ascii="Calibri" w:hAnsi="Calibri" w:eastAsia="Calibri" w:cs="Calibri"/>
+          <w:color w:val="1F2937"/>
+          <w:sz w:val="21"/>
+        </w:rPr>
+        <w:t>The weekly reminder works only while the computer is awake, ChatGPT is running and the local project remains available. It may control the approved local worker, then it stops. It does not access LinkedIn.</w:t>
+      </w:r>
+    </w:p>
+    <w:p>
+      <w:pPr>
         <w:pStyle w:val="Heading1"/>
       </w:pPr>
       <w:r>
@@ -6089,7 +6448,7 @@
           <w:color w:val="2E74B5"/>
           <w:sz w:val="32"/>
         </w:rPr>
-        <w:t>Stop rules</w:t>
+        <w:t>What to bring back</w:t>
       </w:r>
     </w:p>
     <w:p>
@@ -6102,7 +6461,7 @@
           <w:color w:val="1F2937"/>
           <w:sz w:val="21"/>
         </w:rPr>
-        <w:t>Stop and use the Setup Helper if:</w:t>
+        <w:t>Bring the laptop or screenshots that show:</w:t>
       </w:r>
     </w:p>
     <w:p>
@@ -6119,7 +6478,39 @@
           <w:color w:val="1F2937"/>
           <w:sz w:val="21"/>
         </w:rPr>
-        <w:t>the correct folder is not visible;</w:t>
+        <w:t xml:space="preserve">Email project open with </w:t>
+      </w:r>
+      <w:r>
+        <w:rPr>
+          <w:rFonts w:ascii="Menlo" w:hAnsi="Menlo" w:eastAsia="Menlo" w:cs="Menlo"/>
+          <w:color w:val="1F4D78"/>
+          <w:sz w:val="19"/>
+        </w:rPr>
+        <w:t>EMAIL-TRIAGE-REPORT.md</w:t>
+      </w:r>
+      <w:r>
+        <w:rPr>
+          <w:rFonts w:ascii="Calibri" w:hAnsi="Calibri" w:eastAsia="Calibri" w:cs="Calibri"/>
+          <w:color w:val="1F2937"/>
+          <w:sz w:val="21"/>
+        </w:rPr>
+        <w:t xml:space="preserve">, </w:t>
+      </w:r>
+      <w:r>
+        <w:rPr>
+          <w:rFonts w:ascii="Menlo" w:hAnsi="Menlo" w:eastAsia="Menlo" w:cs="Menlo"/>
+          <w:color w:val="1F4D78"/>
+          <w:sz w:val="19"/>
+        </w:rPr>
+        <w:t>PERSONAL-WORK-MEMORY.md</w:t>
+      </w:r>
+      <w:r>
+        <w:rPr>
+          <w:rFonts w:ascii="Calibri" w:hAnsi="Calibri" w:eastAsia="Calibri" w:cs="Calibri"/>
+          <w:color w:val="1F2937"/>
+          <w:sz w:val="21"/>
+        </w:rPr>
+        <w:t xml:space="preserve"> and the visible show/correct/exclude/forget controls.</w:t>
       </w:r>
     </w:p>
     <w:p>
@@ -6136,7 +6527,23 @@
           <w:color w:val="1F2937"/>
           <w:sz w:val="21"/>
         </w:rPr>
-        <w:t>the app or button names do not match;</w:t>
+        <w:t xml:space="preserve">Drive project open with </w:t>
+      </w:r>
+      <w:r>
+        <w:rPr>
+          <w:rFonts w:ascii="Menlo" w:hAnsi="Menlo" w:eastAsia="Menlo" w:cs="Menlo"/>
+          <w:color w:val="1F4D78"/>
+          <w:sz w:val="19"/>
+        </w:rPr>
+        <w:t>DRIVE-INDEX.md</w:t>
+      </w:r>
+      <w:r>
+        <w:rPr>
+          <w:rFonts w:ascii="Calibri" w:hAnsi="Calibri" w:eastAsia="Calibri" w:cs="Calibri"/>
+          <w:color w:val="1F2937"/>
+          <w:sz w:val="21"/>
+        </w:rPr>
+        <w:t>, its saved cursor, the shared generation ID and the reconciled JSONL-versus-human-register counts.</w:t>
       </w:r>
     </w:p>
     <w:p>
@@ -6153,7 +6560,7 @@
           <w:color w:val="1F2937"/>
           <w:sz w:val="21"/>
         </w:rPr>
-        <w:t>the company app cannot be enabled or connected;</w:t>
+        <w:t>The final evidence row and validator pass in each project.</w:t>
       </w:r>
     </w:p>
     <w:p>
@@ -6170,7 +6577,7 @@
           <w:color w:val="1F2937"/>
           <w:sz w:val="21"/>
         </w:rPr>
-        <w:t>the wrong account is connected;</w:t>
+        <w:t>Optional: approved Saturday schedule, tone/precedent file, numbered reply queue, cursor, employee-confirmed outcomes, confirmed learning IDs and validator pass. Do not show message bodies.</w:t>
       </w:r>
     </w:p>
     <w:p>
@@ -6187,16 +6594,76 @@
           <w:color w:val="1F2937"/>
           <w:sz w:val="21"/>
         </w:rPr>
-        <w:t>a permission asks for Full access;</w:t>
+        <w:t xml:space="preserve">The three-line final readback from </w:t>
+      </w:r>
+      <w:r>
+        <w:rPr>
+          <w:rFonts w:ascii="Menlo" w:hAnsi="Menlo" w:eastAsia="Menlo" w:cs="Menlo"/>
+          <w:color w:val="1F4D78"/>
+          <w:sz w:val="19"/>
+        </w:rPr>
+        <w:t>THREE-WORKER-GO-LIVE-CHECKLIST.md</w:t>
+      </w:r>
+      <w:r>
+        <w:rPr>
+          <w:rFonts w:ascii="Calibri" w:hAnsi="Calibri" w:eastAsia="Calibri" w:cs="Calibri"/>
+          <w:color w:val="1F2937"/>
+          <w:sz w:val="21"/>
+        </w:rPr>
+        <w:t xml:space="preserve">: Personal Memory + Email EA and Drive are </w:t>
+      </w:r>
+      <w:r>
+        <w:rPr>
+          <w:rFonts w:ascii="Menlo" w:hAnsi="Menlo" w:eastAsia="Menlo" w:cs="Menlo"/>
+          <w:color w:val="1F4D78"/>
+          <w:sz w:val="19"/>
+        </w:rPr>
+        <w:t>LIVE FOR ME</w:t>
+      </w:r>
+      <w:r>
+        <w:rPr>
+          <w:rFonts w:ascii="Calibri" w:hAnsi="Calibri" w:eastAsia="Calibri" w:cs="Calibri"/>
+          <w:color w:val="1F2937"/>
+          <w:sz w:val="21"/>
+        </w:rPr>
+        <w:t xml:space="preserve"> or show an exact blocker; LinkedIn is </w:t>
+      </w:r>
+      <w:r>
+        <w:rPr>
+          <w:rFonts w:ascii="Menlo" w:hAnsi="Menlo" w:eastAsia="Menlo" w:cs="Menlo"/>
+          <w:color w:val="1F4D78"/>
+          <w:sz w:val="19"/>
+        </w:rPr>
+        <w:t>LIVE FOR ME, OPTIONAL</w:t>
+      </w:r>
+      <w:r>
+        <w:rPr>
+          <w:rFonts w:ascii="Calibri" w:hAnsi="Calibri" w:eastAsia="Calibri" w:cs="Calibri"/>
+          <w:color w:val="1F2937"/>
+          <w:sz w:val="21"/>
+        </w:rPr>
+        <w:t xml:space="preserve">, </w:t>
+      </w:r>
+      <w:r>
+        <w:rPr>
+          <w:rFonts w:ascii="Menlo" w:hAnsi="Menlo" w:eastAsia="Menlo" w:cs="Menlo"/>
+          <w:color w:val="1F4D78"/>
+          <w:sz w:val="19"/>
+        </w:rPr>
+        <w:t>NOT ENABLED BY CHOICE</w:t>
+      </w:r>
+      <w:r>
+        <w:rPr>
+          <w:rFonts w:ascii="Calibri" w:hAnsi="Calibri" w:eastAsia="Calibri" w:cs="Calibri"/>
+          <w:color w:val="1F2937"/>
+          <w:sz w:val="21"/>
+        </w:rPr>
+        <w:t>, or shows an exact blocker.</w:t>
       </w:r>
     </w:p>
     <w:p>
       <w:pPr>
-        <w:numPr>
-          <w:ilvl w:val="0"/>
-          <w:numId w:val="127"/>
-        </w:numPr>
-        <w:spacing w:before="0" w:after="80" w:line="288" w:lineRule="auto"/>
+        <w:spacing w:before="0" w:after="120" w:line="288" w:lineRule="auto"/>
       </w:pPr>
       <w:r>
         <w:rPr>
@@ -6204,33 +6671,25 @@
           <w:color w:val="1F2937"/>
           <w:sz w:val="21"/>
         </w:rPr>
-        <w:t>a permission asks for Always allow, the whole computer or a screen outside this task;</w:t>
+        <w:t>Do not bring email bodies, passwords, one-time codes, private HR details, banking information, or sensitive Drive content. Show the safe report headings and proof.</w:t>
       </w:r>
     </w:p>
     <w:p>
       <w:pPr>
-        <w:numPr>
-          <w:ilvl w:val="0"/>
-          <w:numId w:val="127"/>
-        </w:numPr>
-        <w:spacing w:before="0" w:after="80" w:line="288" w:lineRule="auto"/>
-      </w:pPr>
-      <w:r>
-        <w:rPr>
-          <w:rFonts w:ascii="Calibri" w:hAnsi="Calibri" w:eastAsia="Calibri" w:cs="Calibri"/>
-          <w:color w:val="1F2937"/>
-          <w:sz w:val="21"/>
-        </w:rPr>
-        <w:t>Codex or Chrome remains in control when LinkedIn is about to open;</w:t>
+        <w:pStyle w:val="Heading1"/>
+      </w:pPr>
+      <w:r>
+        <w:rPr>
+          <w:rFonts w:ascii="Calibri" w:hAnsi="Calibri" w:eastAsia="Calibri" w:cs="Calibri"/>
+          <w:color w:val="2E74B5"/>
+          <w:sz w:val="32"/>
+        </w:rPr>
+        <w:t>Stop rules</w:t>
       </w:r>
     </w:p>
     <w:p>
       <w:pPr>
-        <w:numPr>
-          <w:ilvl w:val="0"/>
-          <w:numId w:val="127"/>
-        </w:numPr>
-        <w:spacing w:before="0" w:after="80" w:line="288" w:lineRule="auto"/>
+        <w:spacing w:before="0" w:after="120" w:line="288" w:lineRule="auto"/>
       </w:pPr>
       <w:r>
         <w:rPr>
@@ -6238,63 +6697,7 @@
           <w:color w:val="1F2937"/>
           <w:sz w:val="21"/>
         </w:rPr>
-        <w:t>the AI asks for a password, one-time code, Terminal, PowerShell, Command Prompt, Python, a CLI, Git or GitHub;</w:t>
-      </w:r>
-    </w:p>
-    <w:p>
-      <w:pPr>
-        <w:numPr>
-          <w:ilvl w:val="0"/>
-          <w:numId w:val="127"/>
-        </w:numPr>
-        <w:spacing w:before="0" w:after="80" w:line="288" w:lineRule="auto"/>
-      </w:pPr>
-      <w:r>
-        <w:rPr>
-          <w:rFonts w:ascii="Calibri" w:hAnsi="Calibri" w:eastAsia="Calibri" w:cs="Calibri"/>
-          <w:color w:val="1F2937"/>
-          <w:sz w:val="21"/>
-        </w:rPr>
-        <w:t>the task crosses an active local Gate 0 ID, asks for credentials, touches banking or personal HR, or presents another sensitive decision not covered by the confirmed profile.</w:t>
-      </w:r>
-    </w:p>
-    <w:p>
-      <w:pPr>
-        <w:spacing w:before="0" w:after="120" w:line="288" w:lineRule="auto"/>
-      </w:pPr>
-      <w:r>
-        <w:rPr>
-          <w:rFonts w:ascii="Calibri" w:hAnsi="Calibri" w:eastAsia="Calibri" w:cs="Calibri"/>
-          <w:color w:val="1F2937"/>
-          <w:sz w:val="21"/>
-        </w:rPr>
-        <w:t>Setup Helper resolves safe setup. Ambuj receives only an unavoidable company-access problem. The approval owner named beside the crossed gate receives that Gate 0 issue; Abhilash receives the owner decisions assigned to him.</w:t>
-      </w:r>
-    </w:p>
-    <w:p>
-      <w:pPr>
-        <w:pStyle w:val="Heading1"/>
-      </w:pPr>
-      <w:r>
-        <w:rPr>
-          <w:rFonts w:ascii="Calibri" w:hAnsi="Calibri" w:eastAsia="Calibri" w:cs="Calibri"/>
-          <w:color w:val="2E74B5"/>
-          <w:sz w:val="32"/>
-        </w:rPr>
-        <w:t>Managed update readback</w:t>
-      </w:r>
-    </w:p>
-    <w:p>
-      <w:pPr>
-        <w:spacing w:before="0" w:after="120" w:line="288" w:lineRule="auto"/>
-      </w:pPr>
-      <w:r>
-        <w:rPr>
-          <w:rFonts w:ascii="Calibri" w:hAnsi="Calibri" w:eastAsia="Calibri" w:cs="Calibri"/>
-          <w:color w:val="1F2937"/>
-          <w:sz w:val="21"/>
-        </w:rPr>
-        <w:t>For an announced release, bring back only this safe proof:</w:t>
+        <w:t>Stop and use the Setup Helper if:</w:t>
       </w:r>
     </w:p>
     <w:p>
@@ -6311,7 +6714,7 @@
           <w:color w:val="1F2937"/>
           <w:sz w:val="21"/>
         </w:rPr>
-        <w:t>announced version: ____________________</w:t>
+        <w:t>the correct folder is not visible;</w:t>
       </w:r>
     </w:p>
     <w:p>
@@ -6328,7 +6731,7 @@
           <w:color w:val="1F2937"/>
           <w:sz w:val="21"/>
         </w:rPr>
-        <w:t>installed version: ____________________</w:t>
+        <w:t>the app or button names do not match;</w:t>
       </w:r>
     </w:p>
     <w:p>
@@ -6345,55 +6748,7 @@
           <w:color w:val="1F2937"/>
           <w:sz w:val="21"/>
         </w:rPr>
-        <w:t xml:space="preserve">update status: </w:t>
-      </w:r>
-      <w:r>
-        <w:rPr>
-          <w:rFonts w:ascii="Menlo" w:hAnsi="Menlo" w:eastAsia="Menlo" w:cs="Menlo"/>
-          <w:color w:val="1F4D78"/>
-          <w:sz w:val="19"/>
-        </w:rPr>
-        <w:t>CURRENT</w:t>
-      </w:r>
-      <w:r>
-        <w:rPr>
-          <w:rFonts w:ascii="Calibri" w:hAnsi="Calibri" w:eastAsia="Calibri" w:cs="Calibri"/>
-          <w:color w:val="1F2937"/>
-          <w:sz w:val="21"/>
-        </w:rPr>
-        <w:t xml:space="preserve">, </w:t>
-      </w:r>
-      <w:r>
-        <w:rPr>
-          <w:rFonts w:ascii="Menlo" w:hAnsi="Menlo" w:eastAsia="Menlo" w:cs="Menlo"/>
-          <w:color w:val="1F4D78"/>
-          <w:sz w:val="19"/>
-        </w:rPr>
-        <w:t>UPDATED</w:t>
-      </w:r>
-      <w:r>
-        <w:rPr>
-          <w:rFonts w:ascii="Calibri" w:hAnsi="Calibri" w:eastAsia="Calibri" w:cs="Calibri"/>
-          <w:color w:val="1F2937"/>
-          <w:sz w:val="21"/>
-        </w:rPr>
-        <w:t xml:space="preserve"> or </w:t>
-      </w:r>
-      <w:r>
-        <w:rPr>
-          <w:rFonts w:ascii="Menlo" w:hAnsi="Menlo" w:eastAsia="Menlo" w:cs="Menlo"/>
-          <w:color w:val="1F4D78"/>
-          <w:sz w:val="19"/>
-        </w:rPr>
-        <w:t>DEFERRED</w:t>
-      </w:r>
-      <w:r>
-        <w:rPr>
-          <w:rFonts w:ascii="Calibri" w:hAnsi="Calibri" w:eastAsia="Calibri" w:cs="Calibri"/>
-          <w:color w:val="1F2937"/>
-          <w:sz w:val="21"/>
-        </w:rPr>
-        <w:t>: ____________________</w:t>
+        <w:t>the company app cannot be enabled or connected;</w:t>
       </w:r>
     </w:p>
     <w:p>
@@ -6410,7 +6765,7 @@
           <w:color w:val="1F2937"/>
           <w:sz w:val="21"/>
         </w:rPr>
-        <w:t>receipt and validation result: ____________________</w:t>
+        <w:t>the wrong account is connected;</w:t>
       </w:r>
     </w:p>
     <w:p>
@@ -6427,7 +6782,7 @@
           <w:color w:val="1F2937"/>
           <w:sz w:val="21"/>
         </w:rPr>
-        <w:t>preserved-state result: ____________________</w:t>
+        <w:t>a permission asks for Full access;</w:t>
       </w:r>
     </w:p>
     <w:p>
@@ -6444,12 +6799,16 @@
           <w:color w:val="1F2937"/>
           <w:sz w:val="21"/>
         </w:rPr>
-        <w:t>recovery location, if updated: ____________________</w:t>
+        <w:t>a permission asks for Always allow, the whole computer or a screen outside this task;</w:t>
       </w:r>
     </w:p>
     <w:p>
       <w:pPr>
-        <w:spacing w:before="0" w:after="120" w:line="288" w:lineRule="auto"/>
+        <w:numPr>
+          <w:ilvl w:val="0"/>
+          <w:numId w:val="129"/>
+        </w:numPr>
+        <w:spacing w:before="0" w:after="80" w:line="288" w:lineRule="auto"/>
       </w:pPr>
       <w:r>
         <w:rPr>
@@ -6457,11 +6816,58 @@
           <w:color w:val="1F2937"/>
           <w:sz w:val="21"/>
         </w:rPr>
-        <w:t>Do not paste employee work, secrets or credentials into a public release, portal or repository. Monitor reads this proof for the announced batch and reports drift; it does not rewrite the worker.</w:t>
+        <w:t>Codex or Chrome remains in control when LinkedIn is about to open;</w:t>
       </w:r>
     </w:p>
     <w:p>
       <w:pPr>
+        <w:numPr>
+          <w:ilvl w:val="0"/>
+          <w:numId w:val="129"/>
+        </w:numPr>
+        <w:spacing w:before="0" w:after="80" w:line="288" w:lineRule="auto"/>
+      </w:pPr>
+      <w:r>
+        <w:rPr>
+          <w:rFonts w:ascii="Calibri" w:hAnsi="Calibri" w:eastAsia="Calibri" w:cs="Calibri"/>
+          <w:color w:val="1F2937"/>
+          <w:sz w:val="21"/>
+        </w:rPr>
+        <w:t>the AI asks for a password, one-time code, Terminal, PowerShell, Command Prompt, Python, a CLI, Git or GitHub;</w:t>
+      </w:r>
+    </w:p>
+    <w:p>
+      <w:pPr>
+        <w:numPr>
+          <w:ilvl w:val="0"/>
+          <w:numId w:val="129"/>
+        </w:numPr>
+        <w:spacing w:before="0" w:after="80" w:line="288" w:lineRule="auto"/>
+      </w:pPr>
+      <w:r>
+        <w:rPr>
+          <w:rFonts w:ascii="Calibri" w:hAnsi="Calibri" w:eastAsia="Calibri" w:cs="Calibri"/>
+          <w:color w:val="1F2937"/>
+          <w:sz w:val="21"/>
+        </w:rPr>
+        <w:t>the task crosses an active local Gate 0 ID, asks for credentials, touches banking or personal HR, or presents another sensitive decision not covered by the confirmed profile.</w:t>
+      </w:r>
+    </w:p>
+    <w:p>
+      <w:pPr>
+        <w:spacing w:before="0" w:after="120" w:line="288" w:lineRule="auto"/>
+      </w:pPr>
+      <w:r>
+        <w:rPr>
+          <w:rFonts w:ascii="Calibri" w:hAnsi="Calibri" w:eastAsia="Calibri" w:cs="Calibri"/>
+          <w:color w:val="1F2937"/>
+          <w:sz w:val="21"/>
+        </w:rPr>
+        <w:t>Setup Helper resolves safe setup. Ambuj receives only an unavoidable company-access problem. The approval owner named beside the crossed gate receives that Gate 0 issue; Abhilash receives the owner decisions assigned to him.</w:t>
+      </w:r>
+    </w:p>
+    <w:p>
+      <w:pPr>
         <w:pStyle w:val="Heading1"/>
       </w:pPr>
       <w:r>
@@ -6470,7 +6876,20 @@
           <w:color w:val="2E74B5"/>
           <w:sz w:val="32"/>
         </w:rPr>
-        <w:t>Official screen references</w:t>
+        <w:t>Managed update readback</w:t>
+      </w:r>
+    </w:p>
+    <w:p>
+      <w:pPr>
+        <w:spacing w:before="0" w:after="120" w:line="288" w:lineRule="auto"/>
+      </w:pPr>
+      <w:r>
+        <w:rPr>
+          <w:rFonts w:ascii="Calibri" w:hAnsi="Calibri" w:eastAsia="Calibri" w:cs="Calibri"/>
+          <w:color w:val="1F2937"/>
+          <w:sz w:val="21"/>
+        </w:rPr>
+        <w:t>For an announced release, bring back only this safe proof:</w:t>
       </w:r>
     </w:p>
     <w:p>
@@ -6487,7 +6906,7 @@
           <w:color w:val="1F2937"/>
           <w:sz w:val="21"/>
         </w:rPr>
-        <w:t>ChatGPT quickstart: https://learn.chatgpt.com/docs/quickstart</w:t>
+        <w:t>announced version: ____________________</w:t>
       </w:r>
     </w:p>
     <w:p>
@@ -6504,7 +6923,7 @@
           <w:color w:val="1F2937"/>
           <w:sz w:val="21"/>
         </w:rPr>
-        <w:t>ChatGPT desktop app: https://learn.chatgpt.com/docs/app</w:t>
+        <w:t>installed version: ____________________</w:t>
       </w:r>
     </w:p>
     <w:p>
@@ -6521,7 +6940,55 @@
           <w:color w:val="1F2937"/>
           <w:sz w:val="21"/>
         </w:rPr>
-        <w:t>Projects and chats: https://learn.chatgpt.com/docs/projects</w:t>
+        <w:t xml:space="preserve">update status: </w:t>
+      </w:r>
+      <w:r>
+        <w:rPr>
+          <w:rFonts w:ascii="Menlo" w:hAnsi="Menlo" w:eastAsia="Menlo" w:cs="Menlo"/>
+          <w:color w:val="1F4D78"/>
+          <w:sz w:val="19"/>
+        </w:rPr>
+        <w:t>CURRENT</w:t>
+      </w:r>
+      <w:r>
+        <w:rPr>
+          <w:rFonts w:ascii="Calibri" w:hAnsi="Calibri" w:eastAsia="Calibri" w:cs="Calibri"/>
+          <w:color w:val="1F2937"/>
+          <w:sz w:val="21"/>
+        </w:rPr>
+        <w:t xml:space="preserve">, </w:t>
+      </w:r>
+      <w:r>
+        <w:rPr>
+          <w:rFonts w:ascii="Menlo" w:hAnsi="Menlo" w:eastAsia="Menlo" w:cs="Menlo"/>
+          <w:color w:val="1F4D78"/>
+          <w:sz w:val="19"/>
+        </w:rPr>
+        <w:t>UPDATED</w:t>
+      </w:r>
+      <w:r>
+        <w:rPr>
+          <w:rFonts w:ascii="Calibri" w:hAnsi="Calibri" w:eastAsia="Calibri" w:cs="Calibri"/>
+          <w:color w:val="1F2937"/>
+          <w:sz w:val="21"/>
+        </w:rPr>
+        <w:t xml:space="preserve"> or </w:t>
+      </w:r>
+      <w:r>
+        <w:rPr>
+          <w:rFonts w:ascii="Menlo" w:hAnsi="Menlo" w:eastAsia="Menlo" w:cs="Menlo"/>
+          <w:color w:val="1F4D78"/>
+          <w:sz w:val="19"/>
+        </w:rPr>
+        <w:t>DEFERRED</w:t>
+      </w:r>
+      <w:r>
+        <w:rPr>
+          <w:rFonts w:ascii="Calibri" w:hAnsi="Calibri" w:eastAsia="Calibri" w:cs="Calibri"/>
+          <w:color w:val="1F2937"/>
+          <w:sz w:val="21"/>
+        </w:rPr>
+        <w:t>: ____________________</w:t>
       </w:r>
     </w:p>
     <w:p>
@@ -6538,7 +7005,7 @@
           <w:color w:val="1F2937"/>
           <w:sz w:val="21"/>
         </w:rPr>
-        <w:t>Apps: https://help.openai.com/en/articles/11487775-connectors-in-chatgpt</w:t>
+        <w:t>receipt and validation result: ____________________</w:t>
       </w:r>
     </w:p>
     <w:p>
@@ -6555,7 +7022,7 @@
           <w:color w:val="1F2937"/>
           <w:sz w:val="21"/>
         </w:rPr>
-        <w:t>Email inbox use case: https://learn.chatgpt.com/use-cases/manage-your-inbox</w:t>
+        <w:t>preserved-state result: ____________________</w:t>
       </w:r>
     </w:p>
     <w:p>
@@ -6563,6 +7030,134 @@
         <w:numPr>
           <w:ilvl w:val="0"/>
           <w:numId w:val="131"/>
+        </w:numPr>
+        <w:spacing w:before="0" w:after="80" w:line="288" w:lineRule="auto"/>
+      </w:pPr>
+      <w:r>
+        <w:rPr>
+          <w:rFonts w:ascii="Calibri" w:hAnsi="Calibri" w:eastAsia="Calibri" w:cs="Calibri"/>
+          <w:color w:val="1F2937"/>
+          <w:sz w:val="21"/>
+        </w:rPr>
+        <w:t>recovery location, if updated: ____________________</w:t>
+      </w:r>
+    </w:p>
+    <w:p>
+      <w:pPr>
+        <w:spacing w:before="0" w:after="120" w:line="288" w:lineRule="auto"/>
+      </w:pPr>
+      <w:r>
+        <w:rPr>
+          <w:rFonts w:ascii="Calibri" w:hAnsi="Calibri" w:eastAsia="Calibri" w:cs="Calibri"/>
+          <w:color w:val="1F2937"/>
+          <w:sz w:val="21"/>
+        </w:rPr>
+        <w:t>Do not paste employee work, secrets or credentials into a public release, portal or repository. Monitor reads this proof for the announced batch and reports drift; it does not rewrite the worker.</w:t>
+      </w:r>
+    </w:p>
+    <w:p>
+      <w:pPr>
+        <w:pStyle w:val="Heading1"/>
+      </w:pPr>
+      <w:r>
+        <w:rPr>
+          <w:rFonts w:ascii="Calibri" w:hAnsi="Calibri" w:eastAsia="Calibri" w:cs="Calibri"/>
+          <w:color w:val="2E74B5"/>
+          <w:sz w:val="32"/>
+        </w:rPr>
+        <w:t>Official screen references</w:t>
+      </w:r>
+    </w:p>
+    <w:p>
+      <w:pPr>
+        <w:numPr>
+          <w:ilvl w:val="0"/>
+          <w:numId w:val="133"/>
+        </w:numPr>
+        <w:spacing w:before="0" w:after="80" w:line="288" w:lineRule="auto"/>
+      </w:pPr>
+      <w:r>
+        <w:rPr>
+          <w:rFonts w:ascii="Calibri" w:hAnsi="Calibri" w:eastAsia="Calibri" w:cs="Calibri"/>
+          <w:color w:val="1F2937"/>
+          <w:sz w:val="21"/>
+        </w:rPr>
+        <w:t>ChatGPT quickstart: https://learn.chatgpt.com/docs/quickstart</w:t>
+      </w:r>
+    </w:p>
+    <w:p>
+      <w:pPr>
+        <w:numPr>
+          <w:ilvl w:val="0"/>
+          <w:numId w:val="133"/>
+        </w:numPr>
+        <w:spacing w:before="0" w:after="80" w:line="288" w:lineRule="auto"/>
+      </w:pPr>
+      <w:r>
+        <w:rPr>
+          <w:rFonts w:ascii="Calibri" w:hAnsi="Calibri" w:eastAsia="Calibri" w:cs="Calibri"/>
+          <w:color w:val="1F2937"/>
+          <w:sz w:val="21"/>
+        </w:rPr>
+        <w:t>ChatGPT desktop app: https://learn.chatgpt.com/docs/app</w:t>
+      </w:r>
+    </w:p>
+    <w:p>
+      <w:pPr>
+        <w:numPr>
+          <w:ilvl w:val="0"/>
+          <w:numId w:val="133"/>
+        </w:numPr>
+        <w:spacing w:before="0" w:after="80" w:line="288" w:lineRule="auto"/>
+      </w:pPr>
+      <w:r>
+        <w:rPr>
+          <w:rFonts w:ascii="Calibri" w:hAnsi="Calibri" w:eastAsia="Calibri" w:cs="Calibri"/>
+          <w:color w:val="1F2937"/>
+          <w:sz w:val="21"/>
+        </w:rPr>
+        <w:t>Projects and chats: https://learn.chatgpt.com/docs/projects</w:t>
+      </w:r>
+    </w:p>
+    <w:p>
+      <w:pPr>
+        <w:numPr>
+          <w:ilvl w:val="0"/>
+          <w:numId w:val="133"/>
+        </w:numPr>
+        <w:spacing w:before="0" w:after="80" w:line="288" w:lineRule="auto"/>
+      </w:pPr>
+      <w:r>
+        <w:rPr>
+          <w:rFonts w:ascii="Calibri" w:hAnsi="Calibri" w:eastAsia="Calibri" w:cs="Calibri"/>
+          <w:color w:val="1F2937"/>
+          <w:sz w:val="21"/>
+        </w:rPr>
+        <w:t>Apps: https://help.openai.com/en/articles/11487775-connectors-in-chatgpt</w:t>
+      </w:r>
+    </w:p>
+    <w:p>
+      <w:pPr>
+        <w:numPr>
+          <w:ilvl w:val="0"/>
+          <w:numId w:val="133"/>
+        </w:numPr>
+        <w:spacing w:before="0" w:after="80" w:line="288" w:lineRule="auto"/>
+      </w:pPr>
+      <w:r>
+        <w:rPr>
+          <w:rFonts w:ascii="Calibri" w:hAnsi="Calibri" w:eastAsia="Calibri" w:cs="Calibri"/>
+          <w:color w:val="1F2937"/>
+          <w:sz w:val="21"/>
+        </w:rPr>
+        <w:t>Email inbox use case: https://learn.chatgpt.com/use-cases/manage-your-inbox</w:t>
+      </w:r>
+    </w:p>
+    <w:p>
+      <w:pPr>
+        <w:numPr>
+          <w:ilvl w:val="0"/>
+          <w:numId w:val="133"/>
         </w:numPr>
         <w:spacing w:before="0" w:after="80" w:line="288" w:lineRule="auto"/>
       </w:pPr>
@@ -8013,9 +8608,9 @@
   <w:abstractNum w:abstractNumId="124">
     <w:multiLevelType w:val="singleLevel"/>
     <w:lvl w:ilvl="0">
-      <w:start w:val="1"/>
-      <w:numFmt w:val="bullet"/>
-      <w:lvlText w:val="•"/>
+      <w:start w:val="9"/>
+      <w:numFmt w:val="decimal"/>
+      <w:lvlText w:val="%1."/>
       <w:suff w:val="tab"/>
       <w:pPr>
         <w:tabs>
@@ -8093,6 +8688,27 @@
   </w:abstractNum>
   <w:num w:numId="131">
     <w:abstractNumId w:val="130"/>
+  </w:num>
+  <w:abstractNum w:abstractNumId="132">
+    <w:multiLevelType w:val="singleLevel"/>
+    <w:lvl w:ilvl="0">
+      <w:start w:val="1"/>
+      <w:numFmt w:val="bullet"/>
+      <w:lvlText w:val="•"/>
+      <w:suff w:val="tab"/>
+      <w:pPr>
+        <w:tabs>
+          <w:tab w:val="num" w:pos="540"/>
+        </w:tabs>
+        <w:ind w:left="540" w:hanging="270"/>
+      </w:pPr>
+      <w:rPr>
+        <w:rFonts w:ascii="Calibri" w:hAnsi="Calibri"/>
+      </w:rPr>
+    </w:lvl>
+  </w:abstractNum>
+  <w:num w:numId="133">
+    <w:abstractNumId w:val="132"/>
   </w:num>
 </w:numbering>
 </file>

</xml_diff>

<commit_message>
Release v2.1.0 Drive master register and weekly refresh (#12)
</commit_message>
<xml_diff>
--- a/packages/kairali/homework/EVERYONE-ELSE-AI-HUMAN-HOMEWORK-GUIDE.docx
+++ b/packages/kairali/homework/EVERYONE-ELSE-AI-HUMAN-HOMEWORK-GUIDE.docx
@@ -255,7 +255,7 @@
           <w:color w:val="1F2937"/>
           <w:sz w:val="21"/>
         </w:rPr>
-        <w:t xml:space="preserve"> v1.5.1 company kit. The public kit is the clean setup and update source; it contains no live company work or secrets, so no GitHub invitation or collaborator seat is needed. Ask the Setup Helper to obtain and verify the kit. Then copy the Email and Drive starters into separate local work folders. Do not use the public distribution repository as a work project.</w:t>
+        <w:t xml:space="preserve"> v2.1.0 Kairali Employee Edition. The public kit is the clean setup and update source; it contains no live company work or secrets, so no GitHub invitation or collaborator seat is needed. Ask the Setup Helper to obtain and verify the kit. Then copy the Email and Drive starters into separate local work folders. Do not use the public distribution repository as a work project.</w:t>
       </w:r>
     </w:p>
     <w:p>
@@ -335,7 +335,7 @@
           <w:color w:val="1F2937"/>
           <w:sz w:val="21"/>
         </w:rPr>
-        <w:t xml:space="preserve"> - choose a 25-item test or index every connector-visible Drive item in checkpointed batches of 25. It does not open file contents or change Drive.</w:t>
+        <w:t xml:space="preserve"> - choose a 25-item test or index every connector-visible Drive item in checkpointed batches of 25. It creates a fast AI JSONL register and a matching human CSV or approved Google Sheet mirror without opening file contents or changing Drive. After full proof, you may choose a weekly refresh.</w:t>
       </w:r>
     </w:p>
     <w:p>
@@ -467,7 +467,7 @@
           <w:color w:val="1F2937"/>
           <w:sz w:val="21"/>
         </w:rPr>
-        <w:t xml:space="preserve">Full Drive Index is required and is live for you only after every supported scope, output file, final cursor and validator agree. </w:t>
+        <w:t xml:space="preserve">Full Drive Index is required and is live for you only after every supported scope, AI and human registers, relationship counts, receipt, final cursor and validators agree. </w:t>
       </w:r>
       <w:r>
         <w:rPr>
@@ -483,7 +483,7 @@
           <w:color w:val="1F2937"/>
           <w:sz w:val="21"/>
         </w:rPr>
-        <w:t xml:space="preserve"> proves setup only.</w:t>
+        <w:t xml:space="preserve"> proves setup only. Weekly refresh is optional and separate.</w:t>
       </w:r>
     </w:p>
     <w:p>
@@ -546,7 +546,7 @@
           <w:color w:val="1F2937"/>
           <w:sz w:val="21"/>
         </w:rPr>
-        <w:t>Ask the Setup Helper to find the verified public v1.5.1 company kit on your screen.</w:t>
+        <w:t>Ask the Setup Helper to find the verified public v2.1.0 Kairali Employee Edition on your screen.</w:t>
       </w:r>
     </w:p>
     <w:p>
@@ -1274,7 +1274,7 @@
           <w:color w:val="1F4D78"/>
           <w:sz w:val="19"/>
         </w:rPr>
-        <w:t>kairali-company-rollout-1.5.1.zip</w:t>
+        <w:t>KAIRALI-AI-HUMAN-v210-EMPLOYEE-EDITION-PUBLIC-KIT.zip</w:t>
       </w:r>
       <w:r>
         <w:rPr>
@@ -1807,7 +1807,7 @@
           <w:color w:val="1F2937"/>
           <w:sz w:val="21"/>
         </w:rPr>
-        <w:t>If the ZIP is not visible, do not search the whole computer. Paste the Setup Helper rescue. The helper checks Downloads, obtains the protected public v1.5.1 kit when safe, and asks Ambuj only if the approved source or access decision is missing.</w:t>
+        <w:t>If the ZIP is not visible, do not search the whole computer. Paste the Setup Helper rescue. The helper checks Downloads, obtains the protected public v2.1.0 kit when safe, and asks Ambuj only if the approved source or access decision is missing.</w:t>
       </w:r>
     </w:p>
     <w:p>
@@ -4807,7 +4807,7 @@
           <w:color w:val="1F4D78"/>
           <w:sz w:val="19"/>
         </w:rPr>
-        <w:t>DRIVE-INDEX.csv</w:t>
+        <w:t>DRIVE-INDEX.jsonl</w:t>
       </w:r>
       <w:r>
         <w:rPr>
@@ -4823,7 +4823,7 @@
           <w:color w:val="1F4D78"/>
           <w:sz w:val="19"/>
         </w:rPr>
-        <w:t>DRIVE-INDEX.md</w:t>
+        <w:t>DRIVE-REGISTER.csv</w:t>
       </w:r>
       <w:r>
         <w:rPr>
@@ -4831,7 +4831,7 @@
           <w:color w:val="1F2937"/>
           <w:sz w:val="21"/>
         </w:rPr>
-        <w:t xml:space="preserve"> and </w:t>
+        <w:t xml:space="preserve">, </w:t>
       </w:r>
       <w:r>
         <w:rPr>
@@ -4839,7 +4839,7 @@
           <w:color w:val="1F4D78"/>
           <w:sz w:val="19"/>
         </w:rPr>
-        <w:t>DRIVE-INDEX-CURSOR.md</w:t>
+        <w:t>DRIVE-INDEX.md</w:t>
       </w:r>
       <w:r>
         <w:rPr>
@@ -4847,7 +4847,39 @@
           <w:color w:val="1F2937"/>
           <w:sz w:val="21"/>
         </w:rPr>
-        <w:t xml:space="preserve"> exist.</w:t>
+        <w:t xml:space="preserve">, </w:t>
+      </w:r>
+      <w:r>
+        <w:rPr>
+          <w:rFonts w:ascii="Menlo" w:hAnsi="Menlo" w:eastAsia="Menlo" w:cs="Menlo"/>
+          <w:color w:val="1F4D78"/>
+          <w:sz w:val="19"/>
+        </w:rPr>
+        <w:t>DRIVE-INDEX-RECEIPT.json</w:t>
+      </w:r>
+      <w:r>
+        <w:rPr>
+          <w:rFonts w:ascii="Calibri" w:hAnsi="Calibri" w:eastAsia="Calibri" w:cs="Calibri"/>
+          <w:color w:val="1F2937"/>
+          <w:sz w:val="21"/>
+        </w:rPr>
+        <w:t xml:space="preserve"> and </w:t>
+      </w:r>
+      <w:r>
+        <w:rPr>
+          <w:rFonts w:ascii="Menlo" w:hAnsi="Menlo" w:eastAsia="Menlo" w:cs="Menlo"/>
+          <w:color w:val="1F4D78"/>
+          <w:sz w:val="19"/>
+        </w:rPr>
+        <w:t>DRIVE-INDEX-CURSOR.json</w:t>
+      </w:r>
+      <w:r>
+        <w:rPr>
+          <w:rFonts w:ascii="Calibri" w:hAnsi="Calibri" w:eastAsia="Calibri" w:cs="Calibri"/>
+          <w:color w:val="1F2937"/>
+          <w:sz w:val="21"/>
+        </w:rPr>
+        <w:t xml:space="preserve"> exist and reopen.</w:t>
       </w:r>
     </w:p>
     <w:p>
@@ -4864,7 +4896,7 @@
           <w:color w:val="1F2937"/>
           <w:sz w:val="21"/>
         </w:rPr>
-        <w:t>Every batch is no more than 25 items and has a durable checkpoint.</w:t>
+        <w:t>One generation ID and unique-item count match in every output. Unique owned/created, shared-with, shared-by, overlap and unknown counts recalculate correctly.</w:t>
       </w:r>
     </w:p>
     <w:p>
@@ -4877,35 +4909,11 @@
       </w:pPr>
       <w:r>
         <w:rPr>
-          <w:rFonts w:ascii="Menlo" w:hAnsi="Menlo" w:eastAsia="Menlo" w:cs="Menlo"/>
-          <w:color w:val="1F4D78"/>
-          <w:sz w:val="19"/>
-        </w:rPr>
-        <w:t>TEST 25</w:t>
-      </w:r>
-      <w:r>
-        <w:rPr>
           <w:rFonts w:ascii="Calibri" w:hAnsi="Calibri" w:eastAsia="Calibri" w:cs="Calibri"/>
           <w:color w:val="1F2937"/>
           <w:sz w:val="21"/>
         </w:rPr>
-        <w:t xml:space="preserve"> says the full Drive was not indexed. </w:t>
-      </w:r>
-      <w:r>
-        <w:rPr>
-          <w:rFonts w:ascii="Menlo" w:hAnsi="Menlo" w:eastAsia="Menlo" w:cs="Menlo"/>
-          <w:color w:val="1F4D78"/>
-          <w:sz w:val="19"/>
-        </w:rPr>
-        <w:t>FULL DRIVE INDEX</w:t>
-      </w:r>
-      <w:r>
-        <w:rPr>
-          <w:rFonts w:ascii="Calibri" w:hAnsi="Calibri" w:eastAsia="Calibri" w:cs="Calibri"/>
-          <w:color w:val="1F2937"/>
-          <w:sz w:val="21"/>
-        </w:rPr>
-        <w:t xml:space="preserve"> shows each connector-visible source scope has no next page, or names the coverage gap.</w:t>
+        <w:t>If you approved a Google Sheet mirror, its URL, generation ID and data-row count were read back. If Sheets was not connected or you said No, the CSV is the human register.</w:t>
       </w:r>
     </w:p>
     <w:p>
@@ -4922,7 +4930,7 @@
           <w:color w:val="1F2937"/>
           <w:sz w:val="21"/>
         </w:rPr>
-        <w:t>Stable item IDs prevent duplicate rows and let a new session resume.</w:t>
+        <w:t>Every batch is no more than 25 items and has a durable checkpoint.</w:t>
       </w:r>
     </w:p>
     <w:p>
@@ -4935,11 +4943,35 @@
       </w:pPr>
       <w:r>
         <w:rPr>
+          <w:rFonts w:ascii="Menlo" w:hAnsi="Menlo" w:eastAsia="Menlo" w:cs="Menlo"/>
+          <w:color w:val="1F4D78"/>
+          <w:sz w:val="19"/>
+        </w:rPr>
+        <w:t>TEST 25</w:t>
+      </w:r>
+      <w:r>
+        <w:rPr>
           <w:rFonts w:ascii="Calibri" w:hAnsi="Calibri" w:eastAsia="Calibri" w:cs="Calibri"/>
           <w:color w:val="1F2937"/>
           <w:sz w:val="21"/>
         </w:rPr>
-        <w:t>Missing fields say UNKNOWN; sensitive titles say HUMAN REVIEW.</w:t>
+        <w:t xml:space="preserve"> says the full Drive was not indexed. </w:t>
+      </w:r>
+      <w:r>
+        <w:rPr>
+          <w:rFonts w:ascii="Menlo" w:hAnsi="Menlo" w:eastAsia="Menlo" w:cs="Menlo"/>
+          <w:color w:val="1F4D78"/>
+          <w:sz w:val="19"/>
+        </w:rPr>
+        <w:t>FULL DRIVE INDEX</w:t>
+      </w:r>
+      <w:r>
+        <w:rPr>
+          <w:rFonts w:ascii="Calibri" w:hAnsi="Calibri" w:eastAsia="Calibri" w:cs="Calibri"/>
+          <w:color w:val="1F2937"/>
+          <w:sz w:val="21"/>
+        </w:rPr>
+        <w:t xml:space="preserve"> shows each connector-visible source scope has no next page, or names the coverage gap.</w:t>
       </w:r>
     </w:p>
     <w:p>
@@ -4956,7 +4988,7 @@
           <w:color w:val="1F2937"/>
           <w:sz w:val="21"/>
         </w:rPr>
-        <w:t>It says no Drive file content was opened or downloaded and no Drive item was created, edited, renamed, moved, shared, unshared, deleted or organized.</w:t>
+        <w:t>Stable item IDs prevent duplicate rows and let a new session resume.</w:t>
       </w:r>
     </w:p>
     <w:p>
@@ -4973,7 +5005,49 @@
           <w:color w:val="1F2937"/>
           <w:sz w:val="21"/>
         </w:rPr>
-        <w:t>The workspace validator passed.</w:t>
+        <w:t>Missing fields say UNKNOWN; sensitive titles say HUMAN REVIEW.</w:t>
+      </w:r>
+    </w:p>
+    <w:p>
+      <w:pPr>
+        <w:numPr>
+          <w:ilvl w:val="0"/>
+          <w:numId w:val="107"/>
+        </w:numPr>
+        <w:spacing w:before="0" w:after="80" w:line="288" w:lineRule="auto"/>
+      </w:pPr>
+      <w:r>
+        <w:rPr>
+          <w:rFonts w:ascii="Calibri" w:hAnsi="Calibri" w:eastAsia="Calibri" w:cs="Calibri"/>
+          <w:color w:val="1F2937"/>
+          <w:sz w:val="21"/>
+        </w:rPr>
+        <w:t>It says no Drive file content was opened or downloaded and no Drive item was created, edited, renamed, moved, shared, unshared, deleted or organized.</w:t>
+      </w:r>
+    </w:p>
+    <w:p>
+      <w:pPr>
+        <w:numPr>
+          <w:ilvl w:val="0"/>
+          <w:numId w:val="107"/>
+        </w:numPr>
+        <w:spacing w:before="0" w:after="80" w:line="288" w:lineRule="auto"/>
+      </w:pPr>
+      <w:r>
+        <w:rPr>
+          <w:rFonts w:ascii="Menlo" w:hAnsi="Menlo" w:eastAsia="Menlo" w:cs="Menlo"/>
+          <w:color w:val="1F4D78"/>
+          <w:sz w:val="19"/>
+        </w:rPr>
+        <w:t>validate_drive_register.py</w:t>
+      </w:r>
+      <w:r>
+        <w:rPr>
+          <w:rFonts w:ascii="Calibri" w:hAnsi="Calibri" w:eastAsia="Calibri" w:cs="Calibri"/>
+          <w:color w:val="1F2937"/>
+          <w:sz w:val="21"/>
+        </w:rPr>
+        <w:t xml:space="preserve"> and the workspace validator passed.</w:t>
       </w:r>
     </w:p>
     <w:p>
@@ -4997,7 +5071,7 @@
           <w:color w:val="0B2545"/>
           <w:sz w:val="21"/>
         </w:rPr>
-        <w:t xml:space="preserve"> You can show the index summary and cursor on your screen. A connected Drive account alone is not completion. The index helps Codex find files later, but opening a file later still needs current Drive permission and a new approved task.</w:t>
+        <w:t xml:space="preserve"> You can show the human register, AI register, summary, receipt and cursor on your screen. A connected Drive account alone is not completion. The JSONL helps Codex or Claude find metadata later only when this worker is named as an approved source; it is not permission for personal profiling. Opening a file later still needs current Drive permission and a new approved task.</w:t>
       </w:r>
     </w:p>
     <w:p>
@@ -5060,6 +5134,72 @@
           <w:sz w:val="21"/>
         </w:rPr>
         <w:t xml:space="preserve"> finishes every supported scope and the final validator passes.</w:t>
+      </w:r>
+    </w:p>
+    <w:p>
+      <w:pPr>
+        <w:pStyle w:val="Heading2"/>
+      </w:pPr>
+      <w:r>
+        <w:rPr>
+          <w:rFonts w:ascii="Calibri" w:hAnsi="Calibri" w:eastAsia="Calibri" w:cs="Calibri"/>
+          <w:color w:val="2E74B5"/>
+          <w:sz w:val="26"/>
+        </w:rPr>
+        <w:t>Optional weekly Drive refresh</w:t>
+      </w:r>
+    </w:p>
+    <w:p>
+      <w:pPr>
+        <w:spacing w:before="0" w:after="120" w:line="288" w:lineRule="auto"/>
+      </w:pPr>
+      <w:r>
+        <w:rPr>
+          <w:rFonts w:ascii="Calibri" w:hAnsi="Calibri" w:eastAsia="Calibri" w:cs="Calibri"/>
+          <w:color w:val="1F2937"/>
+          <w:sz w:val="21"/>
+        </w:rPr>
+        <w:t xml:space="preserve">After full mode passes, Codex asks whether you want a weekly refresh. Say No to leave it off. If Yes, choose the day and local-time window—Sunday night is suggested, or pick another convenient time—then confirm the time zone. Review the exact approved Drive account, project folder, schedule and metadata-only prompt. Say </w:t>
+      </w:r>
+      <w:r>
+        <w:rPr>
+          <w:rFonts w:ascii="Menlo" w:hAnsi="Menlo" w:eastAsia="Menlo" w:cs="Menlo"/>
+          <w:color w:val="1F4D78"/>
+          <w:sz w:val="19"/>
+        </w:rPr>
+        <w:t>ACTIVATE WEEKLY REFRESH</w:t>
+      </w:r>
+      <w:r>
+        <w:rPr>
+          <w:rFonts w:ascii="Calibri" w:hAnsi="Calibri" w:eastAsia="Calibri" w:cs="Calibri"/>
+          <w:color w:val="1F2937"/>
+          <w:sz w:val="21"/>
+        </w:rPr>
+        <w:t xml:space="preserve"> only when all are correct.</w:t>
+      </w:r>
+    </w:p>
+    <w:p>
+      <w:pPr>
+        <w:spacing w:before="60" w:after="180" w:line="288" w:lineRule="auto"/>
+        <w:ind w:left="173"/>
+        <w:shd w:fill="FFF8E8"/>
+      </w:pPr>
+      <w:r>
+        <w:rPr>
+          <w:rFonts w:ascii="Calibri" w:hAnsi="Calibri" w:eastAsia="Calibri" w:cs="Calibri"/>
+          <w:b/>
+          <w:color w:val="0B2545"/>
+          <w:sz w:val="21"/>
+        </w:rPr>
+        <w:t>DONE WHEN:</w:t>
+      </w:r>
+      <w:r>
+        <w:rPr>
+          <w:rFonts w:ascii="Calibri" w:hAnsi="Calibri" w:eastAsia="Calibri" w:cs="Calibri"/>
+          <w:color w:val="0B2545"/>
+          <w:sz w:val="21"/>
+        </w:rPr>
+        <w:t xml:space="preserve"> ChatGPT desktop Scheduled shows the exact card and next run, and one bounded pilot refresh adds or updates by stable item ID and passes both validators. The computer must be on, ChatGPT desktop running and this project available. A missed or approval-blocked run does not pretend to have updated the register. You can pause, edit or delete the scheduled task without deleting the registers.</w:t>
       </w:r>
     </w:p>
     <w:p>
@@ -5932,7 +6072,7 @@
           <w:color w:val="1F2937"/>
           <w:sz w:val="21"/>
         </w:rPr>
-        <w:t xml:space="preserve">Drive project open with </w:t>
+        <w:t xml:space="preserve">Drive project open with its human register, </w:t>
       </w:r>
       <w:r>
         <w:rPr>
@@ -5948,7 +6088,7 @@
           <w:color w:val="1F2937"/>
           <w:sz w:val="21"/>
         </w:rPr>
-        <w:t xml:space="preserve"> and its saved cursor.</w:t>
+        <w:t>, receipt and saved cursor; optional weekly card only if the employee activated it.</w:t>
       </w:r>
     </w:p>
     <w:p>
@@ -6487,7 +6627,7 @@
           <w:color w:val="1F2937"/>
           <w:sz w:val="21"/>
         </w:rPr>
-        <w:t>ChatGPT quickstart: https://learn.chatgpt.com/docs/quickstart</w:t>
+        <w:t>Setup, desktop and projects: https://learn.chatgpt.com/docs/quickstart · https://learn.chatgpt.com/docs/app · https://learn.chatgpt.com/docs/projects</w:t>
       </w:r>
     </w:p>
     <w:p>
@@ -6504,75 +6644,7 @@
           <w:color w:val="1F2937"/>
           <w:sz w:val="21"/>
         </w:rPr>
-        <w:t>ChatGPT desktop app: https://learn.chatgpt.com/docs/app</w:t>
-      </w:r>
-    </w:p>
-    <w:p>
-      <w:pPr>
-        <w:numPr>
-          <w:ilvl w:val="0"/>
-          <w:numId w:val="131"/>
-        </w:numPr>
-        <w:spacing w:before="0" w:after="80" w:line="288" w:lineRule="auto"/>
-      </w:pPr>
-      <w:r>
-        <w:rPr>
-          <w:rFonts w:ascii="Calibri" w:hAnsi="Calibri" w:eastAsia="Calibri" w:cs="Calibri"/>
-          <w:color w:val="1F2937"/>
-          <w:sz w:val="21"/>
-        </w:rPr>
-        <w:t>Projects and chats: https://learn.chatgpt.com/docs/projects</w:t>
-      </w:r>
-    </w:p>
-    <w:p>
-      <w:pPr>
-        <w:numPr>
-          <w:ilvl w:val="0"/>
-          <w:numId w:val="131"/>
-        </w:numPr>
-        <w:spacing w:before="0" w:after="80" w:line="288" w:lineRule="auto"/>
-      </w:pPr>
-      <w:r>
-        <w:rPr>
-          <w:rFonts w:ascii="Calibri" w:hAnsi="Calibri" w:eastAsia="Calibri" w:cs="Calibri"/>
-          <w:color w:val="1F2937"/>
-          <w:sz w:val="21"/>
-        </w:rPr>
-        <w:t>Apps: https://help.openai.com/en/articles/11487775-connectors-in-chatgpt</w:t>
-      </w:r>
-    </w:p>
-    <w:p>
-      <w:pPr>
-        <w:numPr>
-          <w:ilvl w:val="0"/>
-          <w:numId w:val="131"/>
-        </w:numPr>
-        <w:spacing w:before="0" w:after="80" w:line="288" w:lineRule="auto"/>
-      </w:pPr>
-      <w:r>
-        <w:rPr>
-          <w:rFonts w:ascii="Calibri" w:hAnsi="Calibri" w:eastAsia="Calibri" w:cs="Calibri"/>
-          <w:color w:val="1F2937"/>
-          <w:sz w:val="21"/>
-        </w:rPr>
-        <w:t>Email inbox use case: https://learn.chatgpt.com/use-cases/manage-your-inbox</w:t>
-      </w:r>
-    </w:p>
-    <w:p>
-      <w:pPr>
-        <w:numPr>
-          <w:ilvl w:val="0"/>
-          <w:numId w:val="131"/>
-        </w:numPr>
-        <w:spacing w:before="0" w:after="80" w:line="288" w:lineRule="auto"/>
-      </w:pPr>
-      <w:r>
-        <w:rPr>
-          <w:rFonts w:ascii="Calibri" w:hAnsi="Calibri" w:eastAsia="Calibri" w:cs="Calibri"/>
-          <w:color w:val="1F2937"/>
-          <w:sz w:val="21"/>
-        </w:rPr>
-        <w:t>Computer Use with Codex: https://learn.chatgpt.com/use-cases/use-your-computer-with-codex</w:t>
+        <w:t>Apps and scheduled tasks: https://help.openai.com/en/articles/11487775-connectors-in-chatgpt · https://learn.chatgpt.com/docs/automations?surface=app</w:t>
       </w:r>
     </w:p>
     <w:sectPr>

</xml_diff>

<commit_message>
release: move personal EA upgrade to v2.2.0
</commit_message>
<xml_diff>
--- a/packages/kairali/homework/EVERYONE-ELSE-AI-HUMAN-HOMEWORK-GUIDE.docx
+++ b/packages/kairali/homework/EVERYONE-ELSE-AI-HUMAN-HOMEWORK-GUIDE.docx
@@ -255,7 +255,7 @@
           <w:color w:val="1F2937"/>
           <w:sz w:val="21"/>
         </w:rPr>
-        <w:t xml:space="preserve"> v2.1.0 company kit. The public kit is the clean setup and update source; it contains no live company work or secrets, so no GitHub invitation or collaborator seat is needed. Ask the Setup Helper to obtain and verify the kit. Then copy the Email and Drive starters into separate local work folders. Do not use the public distribution repository as a work project.</w:t>
+        <w:t xml:space="preserve"> v2.2.0 company kit. The public kit is the clean setup and update source; it contains no live company work or secrets, so no GitHub invitation or collaborator seat is needed. Ask the Setup Helper to obtain and verify the kit. Then copy the Email and Drive starters into separate local work folders. Do not use the public distribution repository as a work project.</w:t>
       </w:r>
     </w:p>
     <w:p>
@@ -562,7 +562,7 @@
           <w:color w:val="1F2937"/>
           <w:sz w:val="21"/>
         </w:rPr>
-        <w:t>Ask the Setup Helper to find the verified public v2.1.0 company kit on your screen.</w:t>
+        <w:t>Ask the Setup Helper to find the verified public v2.2.0 company kit on your screen.</w:t>
       </w:r>
     </w:p>
     <w:p>
@@ -1290,7 +1290,7 @@
           <w:color w:val="1F4D78"/>
           <w:sz w:val="19"/>
         </w:rPr>
-        <w:t>kairali-company-rollout-2.1.0.zip</w:t>
+        <w:t>kairali-company-rollout-2.2.0.zip</w:t>
       </w:r>
       <w:r>
         <w:rPr>
@@ -1823,7 +1823,7 @@
           <w:color w:val="1F2937"/>
           <w:sz w:val="21"/>
         </w:rPr>
-        <w:t>If the ZIP is not visible, do not search the whole computer. Paste the Setup Helper rescue. The helper checks Downloads, obtains the protected public v2.1.0 kit when safe, and asks Ambuj only if the approved source or access decision is missing.</w:t>
+        <w:t>If the ZIP is not visible, do not search the whole computer. Paste the Setup Helper rescue. The helper checks Downloads, obtains the protected public v2.2.0 kit when safe, and asks Ambuj only if the approved source or access decision is missing.</w:t>
       </w:r>
     </w:p>
     <w:p>

</xml_diff>

<commit_message>
release: finalize v2.2.0 personal EA upgrade
</commit_message>
<xml_diff>
--- a/packages/kairali/homework/EVERYONE-ELSE-AI-HUMAN-HOMEWORK-GUIDE.docx
+++ b/packages/kairali/homework/EVERYONE-ELSE-AI-HUMAN-HOMEWORK-GUIDE.docx
@@ -5245,7 +5245,23 @@
           <w:color w:val="1F4D78"/>
           <w:sz w:val="19"/>
         </w:rPr>
-        <w:t>DRIVE-INDEX-CURSOR.md</w:t>
+        <w:t>DRIVE-INDEX-RECEIPT.json</w:t>
+      </w:r>
+      <w:r>
+        <w:rPr>
+          <w:rFonts w:ascii="Calibri" w:hAnsi="Calibri" w:eastAsia="Calibri" w:cs="Calibri"/>
+          <w:color w:val="1F2937"/>
+          <w:sz w:val="21"/>
+        </w:rPr>
+        <w:t xml:space="preserve">, </w:t>
+      </w:r>
+      <w:r>
+        <w:rPr>
+          <w:rFonts w:ascii="Menlo" w:hAnsi="Menlo" w:eastAsia="Menlo" w:cs="Menlo"/>
+          <w:color w:val="1F4D78"/>
+          <w:sz w:val="19"/>
+        </w:rPr>
+        <w:t>DRIVE-INDEX-CURSOR.json</w:t>
       </w:r>
       <w:r>
         <w:rPr>
@@ -5458,11 +5474,19 @@
       </w:pPr>
       <w:r>
         <w:rPr>
+          <w:rFonts w:ascii="Menlo" w:hAnsi="Menlo" w:eastAsia="Menlo" w:cs="Menlo"/>
+          <w:color w:val="1F4D78"/>
+          <w:sz w:val="19"/>
+        </w:rPr>
+        <w:t>validate_drive_register.py</w:t>
+      </w:r>
+      <w:r>
+        <w:rPr>
           <w:rFonts w:ascii="Calibri" w:hAnsi="Calibri" w:eastAsia="Calibri" w:cs="Calibri"/>
           <w:color w:val="1F2937"/>
           <w:sz w:val="21"/>
         </w:rPr>
-        <w:t>The workspace validator passed.</w:t>
+        <w:t xml:space="preserve"> and the workspace validator passed.</w:t>
       </w:r>
     </w:p>
     <w:p>
@@ -5486,7 +5510,7 @@
           <w:color w:val="0B2545"/>
           <w:sz w:val="21"/>
         </w:rPr>
-        <w:t xml:space="preserve"> You can show the index summary and cursor on your screen. A connected Drive account alone is not completion. The index helps Codex find files later, but opening a file later still needs current Drive permission and a new approved task.</w:t>
+        <w:t xml:space="preserve"> You can show the human register, AI register, summary, receipt and cursor on your screen. A connected Drive account alone is not completion. The JSONL helps Codex or Claude find metadata later only when this worker is named as an approved source; it is not permission for personal profiling. Opening a file later still needs current Drive permission and a new approved task.</w:t>
       </w:r>
     </w:p>
     <w:p>
@@ -5549,6 +5573,72 @@
           <w:sz w:val="21"/>
         </w:rPr>
         <w:t xml:space="preserve"> finishes every supported scope and the final validator passes.</w:t>
+      </w:r>
+    </w:p>
+    <w:p>
+      <w:pPr>
+        <w:pStyle w:val="Heading2"/>
+      </w:pPr>
+      <w:r>
+        <w:rPr>
+          <w:rFonts w:ascii="Calibri" w:hAnsi="Calibri" w:eastAsia="Calibri" w:cs="Calibri"/>
+          <w:color w:val="2E74B5"/>
+          <w:sz w:val="26"/>
+        </w:rPr>
+        <w:t>Optional weekly Drive refresh</w:t>
+      </w:r>
+    </w:p>
+    <w:p>
+      <w:pPr>
+        <w:spacing w:before="0" w:after="120" w:line="288" w:lineRule="auto"/>
+      </w:pPr>
+      <w:r>
+        <w:rPr>
+          <w:rFonts w:ascii="Calibri" w:hAnsi="Calibri" w:eastAsia="Calibri" w:cs="Calibri"/>
+          <w:color w:val="1F2937"/>
+          <w:sz w:val="21"/>
+        </w:rPr>
+        <w:t xml:space="preserve">After full mode passes, Codex asks whether you want a weekly refresh. Say No to leave it off. If Yes, choose the day and local-time window—Sunday night is suggested, or pick another convenient time—then confirm the time zone. Review the exact approved Drive account, project folder, schedule and metadata-only prompt. Say </w:t>
+      </w:r>
+      <w:r>
+        <w:rPr>
+          <w:rFonts w:ascii="Menlo" w:hAnsi="Menlo" w:eastAsia="Menlo" w:cs="Menlo"/>
+          <w:color w:val="1F4D78"/>
+          <w:sz w:val="19"/>
+        </w:rPr>
+        <w:t>ACTIVATE WEEKLY REFRESH</w:t>
+      </w:r>
+      <w:r>
+        <w:rPr>
+          <w:rFonts w:ascii="Calibri" w:hAnsi="Calibri" w:eastAsia="Calibri" w:cs="Calibri"/>
+          <w:color w:val="1F2937"/>
+          <w:sz w:val="21"/>
+        </w:rPr>
+        <w:t xml:space="preserve"> only when all are correct.</w:t>
+      </w:r>
+    </w:p>
+    <w:p>
+      <w:pPr>
+        <w:spacing w:before="60" w:after="180" w:line="288" w:lineRule="auto"/>
+        <w:ind w:left="173"/>
+        <w:shd w:fill="FFF8E8"/>
+      </w:pPr>
+      <w:r>
+        <w:rPr>
+          <w:rFonts w:ascii="Calibri" w:hAnsi="Calibri" w:eastAsia="Calibri" w:cs="Calibri"/>
+          <w:b/>
+          <w:color w:val="0B2545"/>
+          <w:sz w:val="21"/>
+        </w:rPr>
+        <w:t>DONE WHEN:</w:t>
+      </w:r>
+      <w:r>
+        <w:rPr>
+          <w:rFonts w:ascii="Calibri" w:hAnsi="Calibri" w:eastAsia="Calibri" w:cs="Calibri"/>
+          <w:color w:val="0B2545"/>
+          <w:sz w:val="21"/>
+        </w:rPr>
+        <w:t xml:space="preserve"> ChatGPT desktop Scheduled shows the exact card and next run, and one bounded pilot refresh adds or updates by stable item ID and passes both validators. The computer must be on, ChatGPT desktop running and this project available. A missed or approval-blocked run does not pretend to have updated the register. You can pause, edit or delete the scheduled task without deleting the registers.</w:t>
       </w:r>
     </w:p>
     <w:p>
@@ -7082,7 +7172,7 @@
           <w:color w:val="1F2937"/>
           <w:sz w:val="21"/>
         </w:rPr>
-        <w:t>ChatGPT quickstart: https://learn.chatgpt.com/docs/quickstart</w:t>
+        <w:t>Setup, desktop and projects: https://learn.chatgpt.com/docs/quickstart · https://learn.chatgpt.com/docs/app · https://learn.chatgpt.com/docs/projects</w:t>
       </w:r>
     </w:p>
     <w:p>
@@ -7099,75 +7189,7 @@
           <w:color w:val="1F2937"/>
           <w:sz w:val="21"/>
         </w:rPr>
-        <w:t>ChatGPT desktop app: https://learn.chatgpt.com/docs/app</w:t>
-      </w:r>
-    </w:p>
-    <w:p>
-      <w:pPr>
-        <w:numPr>
-          <w:ilvl w:val="0"/>
-          <w:numId w:val="133"/>
-        </w:numPr>
-        <w:spacing w:before="0" w:after="80" w:line="288" w:lineRule="auto"/>
-      </w:pPr>
-      <w:r>
-        <w:rPr>
-          <w:rFonts w:ascii="Calibri" w:hAnsi="Calibri" w:eastAsia="Calibri" w:cs="Calibri"/>
-          <w:color w:val="1F2937"/>
-          <w:sz w:val="21"/>
-        </w:rPr>
-        <w:t>Projects and chats: https://learn.chatgpt.com/docs/projects</w:t>
-      </w:r>
-    </w:p>
-    <w:p>
-      <w:pPr>
-        <w:numPr>
-          <w:ilvl w:val="0"/>
-          <w:numId w:val="133"/>
-        </w:numPr>
-        <w:spacing w:before="0" w:after="80" w:line="288" w:lineRule="auto"/>
-      </w:pPr>
-      <w:r>
-        <w:rPr>
-          <w:rFonts w:ascii="Calibri" w:hAnsi="Calibri" w:eastAsia="Calibri" w:cs="Calibri"/>
-          <w:color w:val="1F2937"/>
-          <w:sz w:val="21"/>
-        </w:rPr>
-        <w:t>Apps: https://help.openai.com/en/articles/11487775-connectors-in-chatgpt</w:t>
-      </w:r>
-    </w:p>
-    <w:p>
-      <w:pPr>
-        <w:numPr>
-          <w:ilvl w:val="0"/>
-          <w:numId w:val="133"/>
-        </w:numPr>
-        <w:spacing w:before="0" w:after="80" w:line="288" w:lineRule="auto"/>
-      </w:pPr>
-      <w:r>
-        <w:rPr>
-          <w:rFonts w:ascii="Calibri" w:hAnsi="Calibri" w:eastAsia="Calibri" w:cs="Calibri"/>
-          <w:color w:val="1F2937"/>
-          <w:sz w:val="21"/>
-        </w:rPr>
-        <w:t>Email inbox use case: https://learn.chatgpt.com/use-cases/manage-your-inbox</w:t>
-      </w:r>
-    </w:p>
-    <w:p>
-      <w:pPr>
-        <w:numPr>
-          <w:ilvl w:val="0"/>
-          <w:numId w:val="133"/>
-        </w:numPr>
-        <w:spacing w:before="0" w:after="80" w:line="288" w:lineRule="auto"/>
-      </w:pPr>
-      <w:r>
-        <w:rPr>
-          <w:rFonts w:ascii="Calibri" w:hAnsi="Calibri" w:eastAsia="Calibri" w:cs="Calibri"/>
-          <w:color w:val="1F2937"/>
-          <w:sz w:val="21"/>
-        </w:rPr>
-        <w:t>Computer Use with Codex: https://learn.chatgpt.com/use-cases/use-your-computer-with-codex</w:t>
+        <w:t>Apps and scheduled tasks: https://help.openai.com/en/articles/11487775-connectors-in-chatgpt · https://learn.chatgpt.com/docs/automations?surface=app</w:t>
       </w:r>
     </w:p>
     <w:sectPr>

</xml_diff>

<commit_message>
Release v2.2.0 personal EA homework (#11)
Publishes the verified Personal Work Memory, fixed-time Email EA, reconciled Drive master index, weekly refresh and confirmed LinkedIn learning upgrade.
</commit_message>
<xml_diff>
--- a/packages/kairali/homework/EVERYONE-ELSE-AI-HUMAN-HOMEWORK-GUIDE.docx
+++ b/packages/kairali/homework/EVERYONE-ELSE-AI-HUMAN-HOMEWORK-GUIDE.docx
@@ -40,7 +40,7 @@
           <w:color w:val="555555"/>
           <w:sz w:val="27"/>
         </w:rPr>
-        <w:t>Email Triage + Drive Inventory, with an optional Saturday LinkedIn Message Assistant</w:t>
+        <w:t>Personal Work Memory + Daily Email EA + Drive Master Index, with optional Saturday LinkedIn</w:t>
       </w:r>
     </w:p>
     <w:tbl>
@@ -129,7 +129,7 @@
                 <w:color w:val="1F2937"/>
                 <w:sz w:val="20"/>
               </w:rPr>
-              <w:t>Daily Email worker + Full Drive Index</w:t>
+              <w:t>Personal Memory + Email EA + Full Drive Index</w:t>
             </w:r>
           </w:p>
         </w:tc>
@@ -255,7 +255,7 @@
           <w:color w:val="1F2937"/>
           <w:sz w:val="21"/>
         </w:rPr>
-        <w:t xml:space="preserve"> v2.1.0 Kairali Employee Edition. The public kit is the clean setup and update source; it contains no live company work or secrets, so no GitHub invitation or collaborator seat is needed. Ask the Setup Helper to obtain and verify the kit. Then copy the Email and Drive starters into separate local work folders. Do not use the public distribution repository as a work project.</w:t>
+        <w:t xml:space="preserve"> v2.2.0 company kit. The public kit is the clean setup and update source; it contains no live company work or secrets, so no GitHub invitation or collaborator seat is needed. Ask the Setup Helper to obtain and verify the kit. Then copy the Email and Drive starters into separate local work folders. Do not use the public distribution repository as a work project.</w:t>
       </w:r>
     </w:p>
     <w:p>
@@ -301,7 +301,7 @@
           <w:color w:val="1F2937"/>
           <w:sz w:val="21"/>
         </w:rPr>
-        <w:t>Daily Email Triage AI Human</w:t>
+        <w:t>Personal Work Memory + Daily Email EA</w:t>
       </w:r>
       <w:r>
         <w:rPr>
@@ -309,7 +309,23 @@
           <w:color w:val="1F2937"/>
           <w:sz w:val="21"/>
         </w:rPr>
-        <w:t xml:space="preserve"> - asks what local time you want the brief, proves a read-only 25-message pilot, then runs a concise daily importance report. You choose whether it is brief-only or may safely label and file clearly low-risk mail.</w:t>
+        <w:t xml:space="preserve"> - asks once for a fixed local time, proves a read-only 25-message pilot, builds a supervised source-backed understanding of your role, priorities, important people, preferences and commitments, then shows a neat daily notification with proposed replies marked </w:t>
+      </w:r>
+      <w:r>
+        <w:rPr>
+          <w:rFonts w:ascii="Menlo" w:hAnsi="Menlo" w:eastAsia="Menlo" w:cs="Menlo"/>
+          <w:color w:val="1F4D78"/>
+          <w:sz w:val="19"/>
+        </w:rPr>
+        <w:t>NOT SENT</w:t>
+      </w:r>
+      <w:r>
+        <w:rPr>
+          <w:rFonts w:ascii="Calibri" w:hAnsi="Calibri" w:eastAsia="Calibri" w:cs="Calibri"/>
+          <w:color w:val="1F2937"/>
+          <w:sz w:val="21"/>
+        </w:rPr>
+        <w:t>. You can inspect, correct, exclude or forget memory. You choose whether the EA is brief-only or may safely label and file clearly low-risk mail.</w:t>
       </w:r>
     </w:p>
     <w:p>
@@ -327,7 +343,7 @@
           <w:color w:val="1F2937"/>
           <w:sz w:val="21"/>
         </w:rPr>
-        <w:t>Drive Index AI Human</w:t>
+        <w:t>Drive Master Index AI Human</w:t>
       </w:r>
       <w:r>
         <w:rPr>
@@ -335,7 +351,7 @@
           <w:color w:val="1F2937"/>
           <w:sz w:val="21"/>
         </w:rPr>
-        <w:t xml:space="preserve"> - choose a 25-item test or index every connector-visible Drive item in checkpointed batches of 25. It creates a fast AI JSONL register and a matching human CSV or approved Google Sheet mirror without opening file contents or changing Drive. After full proof, you may choose a weekly refresh.</w:t>
+        <w:t xml:space="preserve"> - choose a 25-item test or index every connector-visible Drive item in checkpointed batches of 25. It maintains a normalized JSONL AI file of record and one generated Google Sheet-or-CSV human register, reopens both, and verifies their shared generation and all counts. After full proof, it offers an employee-chosen weekly refresh. It does not open file contents or change Drive, except an explicitly approved register Sheet.</w:t>
       </w:r>
     </w:p>
     <w:p>
@@ -450,7 +466,7 @@
           <w:color w:val="1F2937"/>
           <w:sz w:val="21"/>
         </w:rPr>
-        <w:t>Email is required and is live for you only after its account, schedule, pilot, filing-mode ruling, automation and validator agree.</w:t>
+        <w:t>Personal Memory + Email EA is required and is live for you only after its account, sourced memory baseline and controls, fixed schedule, pilot, filing-mode ruling, automation and validator agree.</w:t>
       </w:r>
     </w:p>
     <w:p>
@@ -467,7 +483,7 @@
           <w:color w:val="1F2937"/>
           <w:sz w:val="21"/>
         </w:rPr>
-        <w:t xml:space="preserve">Full Drive Index is required and is live for you only after every supported scope, AI and human registers, relationship counts, receipt, final cursor and validators agree. </w:t>
+        <w:t xml:space="preserve">Full Drive Index is required and is live for you only after every supported scope, both reconciled registers, final cursor, schedule decision and validator agree. </w:t>
       </w:r>
       <w:r>
         <w:rPr>
@@ -483,7 +499,7 @@
           <w:color w:val="1F2937"/>
           <w:sz w:val="21"/>
         </w:rPr>
-        <w:t xml:space="preserve"> proves setup only. Weekly refresh is optional and separate.</w:t>
+        <w:t xml:space="preserve"> proves setup only.</w:t>
       </w:r>
     </w:p>
     <w:p>
@@ -546,7 +562,7 @@
           <w:color w:val="1F2937"/>
           <w:sz w:val="21"/>
         </w:rPr>
-        <w:t>Ask the Setup Helper to find the verified public v2.1.0 Kairali Employee Edition on your screen.</w:t>
+        <w:t>Ask the Setup Helper to find the verified public v2.2.0 company kit on your screen.</w:t>
       </w:r>
     </w:p>
     <w:p>
@@ -664,7 +680,7 @@
           <w:color w:val="1F2937"/>
           <w:sz w:val="21"/>
         </w:rPr>
-        <w:t>For Email, choose your daily local time, review the read-only pilot, choose the filing mode and verify the active automation.</w:t>
+        <w:t>For Email, choose your fixed daily local time, review the read-only pilot, approve the supervised memory baseline, choose the filing mode and verify the active EA automation.</w:t>
       </w:r>
     </w:p>
     <w:p>
@@ -714,7 +730,7 @@
           <w:color w:val="1F2937"/>
           <w:sz w:val="21"/>
         </w:rPr>
-        <w:t>Repeat with the second folder.</w:t>
+        <w:t>Repeat with the second folder, reconcile both Drive registers and choose or decline its offered weekly refresh.</w:t>
       </w:r>
     </w:p>
     <w:p>
@@ -1274,7 +1290,7 @@
           <w:color w:val="1F4D78"/>
           <w:sz w:val="19"/>
         </w:rPr>
-        <w:t>KAIRALI-AI-HUMAN-v210-EMPLOYEE-EDITION-PUBLIC-KIT.zip</w:t>
+        <w:t>kairali-company-rollout-2.2.0.zip</w:t>
       </w:r>
       <w:r>
         <w:rPr>
@@ -1807,7 +1823,7 @@
           <w:color w:val="1F2937"/>
           <w:sz w:val="21"/>
         </w:rPr>
-        <w:t>If the ZIP is not visible, do not search the whole computer. Paste the Setup Helper rescue. The helper checks Downloads, obtains the protected public v2.1.0 kit when safe, and asks Ambuj only if the approved source or access decision is missing.</w:t>
+        <w:t>If the ZIP is not visible, do not search the whole computer. Paste the Setup Helper rescue. The helper checks Downloads, obtains the protected public v2.2.0 kit when safe, and asks Ambuj only if the approved source or access decision is missing.</w:t>
       </w:r>
     </w:p>
     <w:p>
@@ -3826,7 +3842,7 @@
           <w:color w:val="0B2545"/>
           <w:sz w:val="21"/>
         </w:rPr>
-        <w:t>, asks what local time you want the daily brief and starts the read-only pilot with no more than 25 Inbox messages.</w:t>
+        <w:t>, asks what fixed local time you want the daily brief and starts the read-only pilot with no more than 25 Inbox messages.</w:t>
       </w:r>
     </w:p>
     <w:p>
@@ -3868,7 +3884,7 @@
           <w:color w:val="1F2937"/>
           <w:sz w:val="21"/>
         </w:rPr>
-        <w:t xml:space="preserve">After the pilot, Codex reads the report and the exact safe-filing rules to you. Choose </w:t>
+        <w:t xml:space="preserve">After the pilot, Codex reads the EA report and exact safe-filing rules to you. Choose </w:t>
       </w:r>
       <w:r>
         <w:rPr>
@@ -3900,7 +3916,68 @@
           <w:color w:val="1F2937"/>
           <w:sz w:val="21"/>
         </w:rPr>
-        <w:t>. Safe filing is limited to the approved AI labels and clearly low-risk mail. It never deletes, sends, unsubscribes or changes a permanent Gmail filter.</w:t>
+        <w:t xml:space="preserve">. Safe filing is limited to the approved AI labels and clearly low-risk mail. Proposed replies remain local and </w:t>
+      </w:r>
+      <w:r>
+        <w:rPr>
+          <w:rFonts w:ascii="Menlo" w:hAnsi="Menlo" w:eastAsia="Menlo" w:cs="Menlo"/>
+          <w:color w:val="1F4D78"/>
+          <w:sz w:val="19"/>
+        </w:rPr>
+        <w:t>NOT SENT</w:t>
+      </w:r>
+      <w:r>
+        <w:rPr>
+          <w:rFonts w:ascii="Calibri" w:hAnsi="Calibri" w:eastAsia="Calibri" w:cs="Calibri"/>
+          <w:color w:val="1F2937"/>
+          <w:sz w:val="21"/>
+        </w:rPr>
+        <w:t>. Sending, unsubscribe and permanent-filter actions need separate approval for the exact action.</w:t>
+      </w:r>
+    </w:p>
+    <w:p>
+      <w:pPr>
+        <w:spacing w:before="0" w:after="120" w:line="288" w:lineRule="auto"/>
+      </w:pPr>
+      <w:r>
+        <w:rPr>
+          <w:rFonts w:ascii="Calibri" w:hAnsi="Calibri" w:eastAsia="Calibri" w:cs="Calibri"/>
+          <w:color w:val="1F2937"/>
+          <w:sz w:val="21"/>
+        </w:rPr>
+        <w:t xml:space="preserve">Codex then asks you to choose </w:t>
+      </w:r>
+      <w:r>
+        <w:rPr>
+          <w:rFonts w:ascii="Menlo" w:hAnsi="Menlo" w:eastAsia="Menlo" w:cs="Menlo"/>
+          <w:color w:val="1F4D78"/>
+          <w:sz w:val="19"/>
+        </w:rPr>
+        <w:t>RECENT WORK 25</w:t>
+      </w:r>
+      <w:r>
+        <w:rPr>
+          <w:rFonts w:ascii="Calibri" w:hAnsi="Calibri" w:eastAsia="Calibri" w:cs="Calibri"/>
+          <w:color w:val="1F2937"/>
+          <w:sz w:val="21"/>
+        </w:rPr>
+        <w:t xml:space="preserve"> or </w:t>
+      </w:r>
+      <w:r>
+        <w:rPr>
+          <w:rFonts w:ascii="Menlo" w:hAnsi="Menlo" w:eastAsia="Menlo" w:cs="Menlo"/>
+          <w:color w:val="1F4D78"/>
+          <w:sz w:val="19"/>
+        </w:rPr>
+        <w:t>CHOOSE WORK PERIOD</w:t>
+      </w:r>
+      <w:r>
+        <w:rPr>
+          <w:rFonts w:ascii="Calibri" w:hAnsi="Calibri" w:eastAsia="Calibri" w:cs="Calibri"/>
+          <w:color w:val="1F2937"/>
+          <w:sz w:val="21"/>
+        </w:rPr>
+        <w:t>. It uses only the approved company Inbox and Sent work-mail scope, in batches of no more than 25, to propose concise memory about your role, priorities, people, preferences, recurring work and commitments. You confirm, correct, keep as observed, exclude, forget or reject each candidate. It never copies a whole mailbox or full conversation into memory.</w:t>
       </w:r>
     </w:p>
     <w:p>
@@ -4038,7 +4115,7 @@
           <w:color w:val="1F2937"/>
           <w:sz w:val="21"/>
         </w:rPr>
-        <w:t>It uses NEEDS ACTION, WAITING / FOLLOW UP, WORTH READING, HUMAN REVIEW, FILTER HEALTH and RUN SUMMARY.</w:t>
+        <w:t>It uses TODAY AT A GLANCE, NEEDS ACTION, PROPOSED REPLIES, WAITING / FOLLOW UP, WORTH READING, HUMAN REVIEW, NEWSLETTERS TO REVIEW, MEMORY LEARNED OR NEEDS CONFIRMATION, FILTER HEALTH and RUN SUMMARY.</w:t>
       </w:r>
     </w:p>
     <w:p>
@@ -4055,7 +4132,23 @@
           <w:color w:val="1F2937"/>
           <w:sz w:val="21"/>
         </w:rPr>
-        <w:t>Sensitive messages are not quoted.</w:t>
+        <w:t xml:space="preserve">Every proposed reply says </w:t>
+      </w:r>
+      <w:r>
+        <w:rPr>
+          <w:rFonts w:ascii="Menlo" w:hAnsi="Menlo" w:eastAsia="Menlo" w:cs="Menlo"/>
+          <w:color w:val="1F4D78"/>
+          <w:sz w:val="19"/>
+        </w:rPr>
+        <w:t>NOT SENT</w:t>
+      </w:r>
+      <w:r>
+        <w:rPr>
+          <w:rFonts w:ascii="Calibri" w:hAnsi="Calibri" w:eastAsia="Calibri" w:cs="Calibri"/>
+          <w:color w:val="1F2937"/>
+          <w:sz w:val="21"/>
+        </w:rPr>
+        <w:t>.</w:t>
       </w:r>
     </w:p>
     <w:p>
@@ -4068,11 +4161,51 @@
       </w:pPr>
       <w:r>
         <w:rPr>
+          <w:rFonts w:ascii="Menlo" w:hAnsi="Menlo" w:eastAsia="Menlo" w:cs="Menlo"/>
+          <w:color w:val="1F4D78"/>
+          <w:sz w:val="19"/>
+        </w:rPr>
+        <w:t>PERSONAL-WORK-MEMORY.md</w:t>
+      </w:r>
+      <w:r>
+        <w:rPr>
           <w:rFonts w:ascii="Calibri" w:hAnsi="Calibri" w:eastAsia="Calibri" w:cs="Calibri"/>
           <w:color w:val="1F2937"/>
           <w:sz w:val="21"/>
         </w:rPr>
-        <w:t>The pilot says Gmail was unchanged and no permanent Gmail filter was changed.</w:t>
+        <w:t xml:space="preserve"> contains only sourced, dated </w:t>
+      </w:r>
+      <w:r>
+        <w:rPr>
+          <w:rFonts w:ascii="Menlo" w:hAnsi="Menlo" w:eastAsia="Menlo" w:cs="Menlo"/>
+          <w:color w:val="1F4D78"/>
+          <w:sz w:val="19"/>
+        </w:rPr>
+        <w:t>CONFIRMED</w:t>
+      </w:r>
+      <w:r>
+        <w:rPr>
+          <w:rFonts w:ascii="Calibri" w:hAnsi="Calibri" w:eastAsia="Calibri" w:cs="Calibri"/>
+          <w:color w:val="1F2937"/>
+          <w:sz w:val="21"/>
+        </w:rPr>
+        <w:t xml:space="preserve"> or </w:t>
+      </w:r>
+      <w:r>
+        <w:rPr>
+          <w:rFonts w:ascii="Menlo" w:hAnsi="Menlo" w:eastAsia="Menlo" w:cs="Menlo"/>
+          <w:color w:val="1F4D78"/>
+          <w:sz w:val="19"/>
+        </w:rPr>
+        <w:t>OBSERVED — VERIFY</w:t>
+      </w:r>
+      <w:r>
+        <w:rPr>
+          <w:rFonts w:ascii="Calibri" w:hAnsi="Calibri" w:eastAsia="Calibri" w:cs="Calibri"/>
+          <w:color w:val="1F2937"/>
+          <w:sz w:val="21"/>
+        </w:rPr>
+        <w:t xml:space="preserve"> items.</w:t>
       </w:r>
     </w:p>
     <w:p>
@@ -4089,7 +4222,7 @@
           <w:color w:val="1F4D78"/>
           <w:sz w:val="19"/>
         </w:rPr>
-        <w:t>PARAMETERS.md</w:t>
+        <w:t>MEMORY-SOURCES.md</w:t>
       </w:r>
       <w:r>
         <w:rPr>
@@ -4097,7 +4230,7 @@
           <w:color w:val="1F2937"/>
           <w:sz w:val="21"/>
         </w:rPr>
-        <w:t xml:space="preserve"> shows your approved daily time, time zone and filing mode.</w:t>
+        <w:t xml:space="preserve"> shows exact approved scope, coverage and freshness.</w:t>
       </w:r>
     </w:p>
     <w:p>
@@ -4114,7 +4247,7 @@
           <w:color w:val="1F2937"/>
           <w:sz w:val="21"/>
         </w:rPr>
-        <w:t xml:space="preserve">The daily automation card and </w:t>
+        <w:t xml:space="preserve">You can use </w:t>
       </w:r>
       <w:r>
         <w:rPr>
@@ -4122,7 +4255,7 @@
           <w:color w:val="1F4D78"/>
           <w:sz w:val="19"/>
         </w:rPr>
-        <w:t>AUTOMATIONS.md</w:t>
+        <w:t>SHOW MY MEMORY</w:t>
       </w:r>
       <w:r>
         <w:rPr>
@@ -4130,7 +4263,71 @@
           <w:color w:val="1F2937"/>
           <w:sz w:val="21"/>
         </w:rPr>
-        <w:t xml:space="preserve"> show the same schedule and project.</w:t>
+        <w:t xml:space="preserve">, </w:t>
+      </w:r>
+      <w:r>
+        <w:rPr>
+          <w:rFonts w:ascii="Menlo" w:hAnsi="Menlo" w:eastAsia="Menlo" w:cs="Menlo"/>
+          <w:color w:val="1F4D78"/>
+          <w:sz w:val="19"/>
+        </w:rPr>
+        <w:t>CORRECT MEMORY &lt;ID&gt;</w:t>
+      </w:r>
+      <w:r>
+        <w:rPr>
+          <w:rFonts w:ascii="Calibri" w:hAnsi="Calibri" w:eastAsia="Calibri" w:cs="Calibri"/>
+          <w:color w:val="1F2937"/>
+          <w:sz w:val="21"/>
+        </w:rPr>
+        <w:t xml:space="preserve">, </w:t>
+      </w:r>
+      <w:r>
+        <w:rPr>
+          <w:rFonts w:ascii="Menlo" w:hAnsi="Menlo" w:eastAsia="Menlo" w:cs="Menlo"/>
+          <w:color w:val="1F4D78"/>
+          <w:sz w:val="19"/>
+        </w:rPr>
+        <w:t>FORGET &lt;ID&gt;</w:t>
+      </w:r>
+      <w:r>
+        <w:rPr>
+          <w:rFonts w:ascii="Calibri" w:hAnsi="Calibri" w:eastAsia="Calibri" w:cs="Calibri"/>
+          <w:color w:val="1F2937"/>
+          <w:sz w:val="21"/>
+        </w:rPr>
+        <w:t xml:space="preserve">, </w:t>
+      </w:r>
+      <w:r>
+        <w:rPr>
+          <w:rFonts w:ascii="Menlo" w:hAnsi="Menlo" w:eastAsia="Menlo" w:cs="Menlo"/>
+          <w:color w:val="1F4D78"/>
+          <w:sz w:val="19"/>
+        </w:rPr>
+        <w:t>EXCLUDE &lt;topic or person&gt;</w:t>
+      </w:r>
+      <w:r>
+        <w:rPr>
+          <w:rFonts w:ascii="Calibri" w:hAnsi="Calibri" w:eastAsia="Calibri" w:cs="Calibri"/>
+          <w:color w:val="1F2937"/>
+          <w:sz w:val="21"/>
+        </w:rPr>
+        <w:t xml:space="preserve"> and </w:t>
+      </w:r>
+      <w:r>
+        <w:rPr>
+          <w:rFonts w:ascii="Menlo" w:hAnsi="Menlo" w:eastAsia="Menlo" w:cs="Menlo"/>
+          <w:color w:val="1F4D78"/>
+          <w:sz w:val="19"/>
+        </w:rPr>
+        <w:t>REFRESH MEMORY</w:t>
+      </w:r>
+      <w:r>
+        <w:rPr>
+          <w:rFonts w:ascii="Calibri" w:hAnsi="Calibri" w:eastAsia="Calibri" w:cs="Calibri"/>
+          <w:color w:val="1F2937"/>
+          <w:sz w:val="21"/>
+        </w:rPr>
+        <w:t>.</w:t>
       </w:r>
     </w:p>
     <w:p>
@@ -4147,6 +4344,98 @@
           <w:color w:val="1F2937"/>
           <w:sz w:val="21"/>
         </w:rPr>
+        <w:t>Sensitive messages are not quoted.</w:t>
+      </w:r>
+    </w:p>
+    <w:p>
+      <w:pPr>
+        <w:numPr>
+          <w:ilvl w:val="0"/>
+          <w:numId w:val="91"/>
+        </w:numPr>
+        <w:spacing w:before="0" w:after="80" w:line="288" w:lineRule="auto"/>
+      </w:pPr>
+      <w:r>
+        <w:rPr>
+          <w:rFonts w:ascii="Calibri" w:hAnsi="Calibri" w:eastAsia="Calibri" w:cs="Calibri"/>
+          <w:color w:val="1F2937"/>
+          <w:sz w:val="21"/>
+        </w:rPr>
+        <w:t>The pilot says Gmail was unchanged; no send, unsubscribe or permanent-filter action occurred without separate exact approval and recovery proof.</w:t>
+      </w:r>
+    </w:p>
+    <w:p>
+      <w:pPr>
+        <w:numPr>
+          <w:ilvl w:val="0"/>
+          <w:numId w:val="91"/>
+        </w:numPr>
+        <w:spacing w:before="0" w:after="80" w:line="288" w:lineRule="auto"/>
+      </w:pPr>
+      <w:r>
+        <w:rPr>
+          <w:rFonts w:ascii="Menlo" w:hAnsi="Menlo" w:eastAsia="Menlo" w:cs="Menlo"/>
+          <w:color w:val="1F4D78"/>
+          <w:sz w:val="19"/>
+        </w:rPr>
+        <w:t>PARAMETERS.md</w:t>
+      </w:r>
+      <w:r>
+        <w:rPr>
+          <w:rFonts w:ascii="Calibri" w:hAnsi="Calibri" w:eastAsia="Calibri" w:cs="Calibri"/>
+          <w:color w:val="1F2937"/>
+          <w:sz w:val="21"/>
+        </w:rPr>
+        <w:t xml:space="preserve"> shows your approved daily time, time zone and filing mode.</w:t>
+      </w:r>
+    </w:p>
+    <w:p>
+      <w:pPr>
+        <w:numPr>
+          <w:ilvl w:val="0"/>
+          <w:numId w:val="91"/>
+        </w:numPr>
+        <w:spacing w:before="0" w:after="80" w:line="288" w:lineRule="auto"/>
+      </w:pPr>
+      <w:r>
+        <w:rPr>
+          <w:rFonts w:ascii="Calibri" w:hAnsi="Calibri" w:eastAsia="Calibri" w:cs="Calibri"/>
+          <w:color w:val="1F2937"/>
+          <w:sz w:val="21"/>
+        </w:rPr>
+        <w:t xml:space="preserve">The daily automation card and </w:t>
+      </w:r>
+      <w:r>
+        <w:rPr>
+          <w:rFonts w:ascii="Menlo" w:hAnsi="Menlo" w:eastAsia="Menlo" w:cs="Menlo"/>
+          <w:color w:val="1F4D78"/>
+          <w:sz w:val="19"/>
+        </w:rPr>
+        <w:t>AUTOMATIONS.md</w:t>
+      </w:r>
+      <w:r>
+        <w:rPr>
+          <w:rFonts w:ascii="Calibri" w:hAnsi="Calibri" w:eastAsia="Calibri" w:cs="Calibri"/>
+          <w:color w:val="1F2937"/>
+          <w:sz w:val="21"/>
+        </w:rPr>
+        <w:t xml:space="preserve"> show the same schedule and project.</w:t>
+      </w:r>
+    </w:p>
+    <w:p>
+      <w:pPr>
+        <w:numPr>
+          <w:ilvl w:val="0"/>
+          <w:numId w:val="91"/>
+        </w:numPr>
+        <w:spacing w:before="0" w:after="80" w:line="288" w:lineRule="auto"/>
+      </w:pPr>
+      <w:r>
+        <w:rPr>
+          <w:rFonts w:ascii="Calibri" w:hAnsi="Calibri" w:eastAsia="Calibri" w:cs="Calibri"/>
+          <w:color w:val="1F2937"/>
+          <w:sz w:val="21"/>
+        </w:rPr>
         <w:t>The workspace validator passed.</w:t>
       </w:r>
     </w:p>
@@ -4184,7 +4473,7 @@
           <w:color w:val="2E74B5"/>
           <w:sz w:val="32"/>
         </w:rPr>
-        <w:t>Project 2 - Drive Inventory AI Human</w:t>
+        <w:t>Project 2 - Drive Master Index AI Human</w:t>
       </w:r>
     </w:p>
     <w:p>
@@ -4732,7 +5021,7 @@
           <w:color w:val="0B2545"/>
           <w:sz w:val="21"/>
         </w:rPr>
-        <w:t xml:space="preserve">, asks you to choose </w:t>
+        <w:t xml:space="preserve">, visibly asks you to choose </w:t>
       </w:r>
       <w:r>
         <w:rPr>
@@ -4765,6 +5054,123 @@
           <w:sz w:val="21"/>
         </w:rPr>
         <w:t>, and never processes more than 25 items before a checkpoint.</w:t>
+      </w:r>
+    </w:p>
+    <w:p>
+      <w:pPr>
+        <w:spacing w:before="0" w:after="120" w:line="288" w:lineRule="auto"/>
+      </w:pPr>
+      <w:r>
+        <w:rPr>
+          <w:rFonts w:ascii="Calibri" w:hAnsi="Calibri" w:eastAsia="Calibri" w:cs="Calibri"/>
+          <w:color w:val="1F2937"/>
+          <w:sz w:val="21"/>
+        </w:rPr>
+        <w:t xml:space="preserve">If you chose </w:t>
+      </w:r>
+      <w:r>
+        <w:rPr>
+          <w:rFonts w:ascii="Menlo" w:hAnsi="Menlo" w:eastAsia="Menlo" w:cs="Menlo"/>
+          <w:color w:val="1F4D78"/>
+          <w:sz w:val="19"/>
+        </w:rPr>
+        <w:t>FULL DRIVE INDEX</w:t>
+      </w:r>
+      <w:r>
+        <w:rPr>
+          <w:rFonts w:ascii="Calibri" w:hAnsi="Calibri" w:eastAsia="Calibri" w:cs="Calibri"/>
+          <w:color w:val="1F2937"/>
+          <w:sz w:val="21"/>
+        </w:rPr>
+        <w:t xml:space="preserve"> and both registers reconcile, Codex asks whether to </w:t>
+      </w:r>
+      <w:r>
+        <w:rPr>
+          <w:rFonts w:ascii="Menlo" w:hAnsi="Menlo" w:eastAsia="Menlo" w:cs="Menlo"/>
+          <w:color w:val="1F4D78"/>
+          <w:sz w:val="19"/>
+        </w:rPr>
+        <w:t>SET WEEKLY REFRESH</w:t>
+      </w:r>
+      <w:r>
+        <w:rPr>
+          <w:rFonts w:ascii="Calibri" w:hAnsi="Calibri" w:eastAsia="Calibri" w:cs="Calibri"/>
+          <w:color w:val="1F2937"/>
+          <w:sz w:val="21"/>
+        </w:rPr>
+        <w:t xml:space="preserve"> or choose </w:t>
+      </w:r>
+      <w:r>
+        <w:rPr>
+          <w:rFonts w:ascii="Menlo" w:hAnsi="Menlo" w:eastAsia="Menlo" w:cs="Menlo"/>
+          <w:color w:val="1F4D78"/>
+          <w:sz w:val="19"/>
+        </w:rPr>
+        <w:t>NOT NOW</w:t>
+      </w:r>
+      <w:r>
+        <w:rPr>
+          <w:rFonts w:ascii="Calibri" w:hAnsi="Calibri" w:eastAsia="Calibri" w:cs="Calibri"/>
+          <w:color w:val="1F2937"/>
+          <w:sz w:val="21"/>
+        </w:rPr>
+        <w:t xml:space="preserve">. If you set it, give the day, exact local time within your preferred window and time zone. Sunday night may be suggested, but Codex must not invent a time. Verify the visible automation card. If you decline, Codex records </w:t>
+      </w:r>
+      <w:r>
+        <w:rPr>
+          <w:rFonts w:ascii="Menlo" w:hAnsi="Menlo" w:eastAsia="Menlo" w:cs="Menlo"/>
+          <w:color w:val="1F4D78"/>
+          <w:sz w:val="19"/>
+        </w:rPr>
+        <w:t>NOT ENABLED BY CHOICE</w:t>
+      </w:r>
+      <w:r>
+        <w:rPr>
+          <w:rFonts w:ascii="Calibri" w:hAnsi="Calibri" w:eastAsia="Calibri" w:cs="Calibri"/>
+          <w:color w:val="1F2937"/>
+          <w:sz w:val="21"/>
+        </w:rPr>
+        <w:t>; you may add it later.</w:t>
+      </w:r>
+    </w:p>
+    <w:p>
+      <w:pPr>
+        <w:spacing w:before="60" w:after="180" w:line="288" w:lineRule="auto"/>
+        <w:ind w:left="173"/>
+        <w:shd w:fill="FFF8E8"/>
+      </w:pPr>
+      <w:r>
+        <w:rPr>
+          <w:rFonts w:ascii="Calibri" w:hAnsi="Calibri" w:eastAsia="Calibri" w:cs="Calibri"/>
+          <w:b/>
+          <w:color w:val="0B2545"/>
+          <w:sz w:val="21"/>
+        </w:rPr>
+        <w:t>DONE WHEN:</w:t>
+      </w:r>
+      <w:r>
+        <w:rPr>
+          <w:rFonts w:ascii="Calibri" w:hAnsi="Calibri" w:eastAsia="Calibri" w:cs="Calibri"/>
+          <w:color w:val="0B2545"/>
+          <w:sz w:val="21"/>
+        </w:rPr>
+        <w:t xml:space="preserve"> The card's day, time, time zone, Drive project and </w:t>
+      </w:r>
+      <w:r>
+        <w:rPr>
+          <w:rFonts w:ascii="Menlo" w:hAnsi="Menlo" w:eastAsia="Menlo" w:cs="Menlo"/>
+          <w:color w:val="1F4D78"/>
+          <w:sz w:val="19"/>
+        </w:rPr>
+        <w:t>WEEKLY-DRIVE-REFRESH-PROMPT.md</w:t>
+      </w:r>
+      <w:r>
+        <w:rPr>
+          <w:rFonts w:ascii="Calibri" w:hAnsi="Calibri" w:eastAsia="Calibri" w:cs="Calibri"/>
+          <w:color w:val="0B2545"/>
+          <w:sz w:val="21"/>
+        </w:rPr>
+        <w:t xml:space="preserve"> agree, or the decline is visible.</w:t>
       </w:r>
     </w:p>
     <w:p>
@@ -4823,7 +5229,7 @@
           <w:color w:val="1F4D78"/>
           <w:sz w:val="19"/>
         </w:rPr>
-        <w:t>DRIVE-REGISTER.csv</w:t>
+        <w:t>DRIVE-INDEX.md</w:t>
       </w:r>
       <w:r>
         <w:rPr>
@@ -4839,7 +5245,7 @@
           <w:color w:val="1F4D78"/>
           <w:sz w:val="19"/>
         </w:rPr>
-        <w:t>DRIVE-INDEX.md</w:t>
+        <w:t>DRIVE-INDEX-RECEIPT.json</w:t>
       </w:r>
       <w:r>
         <w:rPr>
@@ -4855,7 +5261,7 @@
           <w:color w:val="1F4D78"/>
           <w:sz w:val="19"/>
         </w:rPr>
-        <w:t>DRIVE-INDEX-RECEIPT.json</w:t>
+        <w:t>DRIVE-INDEX-CURSOR.json</w:t>
       </w:r>
       <w:r>
         <w:rPr>
@@ -4863,7 +5269,7 @@
           <w:color w:val="1F2937"/>
           <w:sz w:val="21"/>
         </w:rPr>
-        <w:t xml:space="preserve"> and </w:t>
+        <w:t xml:space="preserve"> and exactly one human register exist: an explicitly approved Google Sheet or otherwise </w:t>
       </w:r>
       <w:r>
         <w:rPr>
@@ -4871,7 +5277,7 @@
           <w:color w:val="1F4D78"/>
           <w:sz w:val="19"/>
         </w:rPr>
-        <w:t>DRIVE-INDEX-CURSOR.json</w:t>
+        <w:t>DRIVE-REGISTER.csv</w:t>
       </w:r>
       <w:r>
         <w:rPr>
@@ -4879,7 +5285,7 @@
           <w:color w:val="1F2937"/>
           <w:sz w:val="21"/>
         </w:rPr>
-        <w:t xml:space="preserve"> exist and reopen.</w:t>
+        <w:t>.</w:t>
       </w:r>
     </w:p>
     <w:p>
@@ -4896,7 +5302,7 @@
           <w:color w:val="1F2937"/>
           <w:sz w:val="21"/>
         </w:rPr>
-        <w:t>One generation ID and unique-item count match in every output. Unique owned/created, shared-with, shared-by, overlap and unknown counts recalculate correctly.</w:t>
+        <w:t>JSONL and the human register were reopened; their generation ID, JSONL object/unique-ID count, human data-row count, and unique, owned-or-created, shared-with, shared-by, overlap, unknown and refresh totals agree with summary and cursor.</w:t>
       </w:r>
     </w:p>
     <w:p>
@@ -4913,7 +5319,7 @@
           <w:color w:val="1F2937"/>
           <w:sz w:val="21"/>
         </w:rPr>
-        <w:t>If you approved a Google Sheet mirror, its URL, generation ID and data-row count were read back. If Sheets was not connected or you said No, the CSV is the human register.</w:t>
+        <w:t>Every batch is no more than 25 items and has a durable checkpoint.</w:t>
       </w:r>
     </w:p>
     <w:p>
@@ -4926,11 +5332,35 @@
       </w:pPr>
       <w:r>
         <w:rPr>
+          <w:rFonts w:ascii="Menlo" w:hAnsi="Menlo" w:eastAsia="Menlo" w:cs="Menlo"/>
+          <w:color w:val="1F4D78"/>
+          <w:sz w:val="19"/>
+        </w:rPr>
+        <w:t>TEST 25</w:t>
+      </w:r>
+      <w:r>
+        <w:rPr>
           <w:rFonts w:ascii="Calibri" w:hAnsi="Calibri" w:eastAsia="Calibri" w:cs="Calibri"/>
           <w:color w:val="1F2937"/>
           <w:sz w:val="21"/>
         </w:rPr>
-        <w:t>Every batch is no more than 25 items and has a durable checkpoint.</w:t>
+        <w:t xml:space="preserve"> says the full Drive was not indexed. </w:t>
+      </w:r>
+      <w:r>
+        <w:rPr>
+          <w:rFonts w:ascii="Menlo" w:hAnsi="Menlo" w:eastAsia="Menlo" w:cs="Menlo"/>
+          <w:color w:val="1F4D78"/>
+          <w:sz w:val="19"/>
+        </w:rPr>
+        <w:t>FULL DRIVE INDEX</w:t>
+      </w:r>
+      <w:r>
+        <w:rPr>
+          <w:rFonts w:ascii="Calibri" w:hAnsi="Calibri" w:eastAsia="Calibri" w:cs="Calibri"/>
+          <w:color w:val="1F2937"/>
+          <w:sz w:val="21"/>
+        </w:rPr>
+        <w:t xml:space="preserve"> shows each connector-visible source scope has no next page, or names the coverage gap.</w:t>
       </w:r>
     </w:p>
     <w:p>
@@ -4943,35 +5373,11 @@
       </w:pPr>
       <w:r>
         <w:rPr>
-          <w:rFonts w:ascii="Menlo" w:hAnsi="Menlo" w:eastAsia="Menlo" w:cs="Menlo"/>
-          <w:color w:val="1F4D78"/>
-          <w:sz w:val="19"/>
-        </w:rPr>
-        <w:t>TEST 25</w:t>
-      </w:r>
-      <w:r>
-        <w:rPr>
           <w:rFonts w:ascii="Calibri" w:hAnsi="Calibri" w:eastAsia="Calibri" w:cs="Calibri"/>
           <w:color w:val="1F2937"/>
           <w:sz w:val="21"/>
         </w:rPr>
-        <w:t xml:space="preserve"> says the full Drive was not indexed. </w:t>
-      </w:r>
-      <w:r>
-        <w:rPr>
-          <w:rFonts w:ascii="Menlo" w:hAnsi="Menlo" w:eastAsia="Menlo" w:cs="Menlo"/>
-          <w:color w:val="1F4D78"/>
-          <w:sz w:val="19"/>
-        </w:rPr>
-        <w:t>FULL DRIVE INDEX</w:t>
-      </w:r>
-      <w:r>
-        <w:rPr>
-          <w:rFonts w:ascii="Calibri" w:hAnsi="Calibri" w:eastAsia="Calibri" w:cs="Calibri"/>
-          <w:color w:val="1F2937"/>
-          <w:sz w:val="21"/>
-        </w:rPr>
-        <w:t xml:space="preserve"> shows each connector-visible source scope has no next page, or names the coverage gap.</w:t>
+        <w:t>Stable item IDs prevent duplicate rows and let a new session resume.</w:t>
       </w:r>
     </w:p>
     <w:p>
@@ -4988,7 +5394,7 @@
           <w:color w:val="1F2937"/>
           <w:sz w:val="21"/>
         </w:rPr>
-        <w:t>Stable item IDs prevent duplicate rows and let a new session resume.</w:t>
+        <w:t>Missing fields say UNKNOWN; sensitive titles say HUMAN REVIEW.</w:t>
       </w:r>
     </w:p>
     <w:p>
@@ -5005,7 +5411,7 @@
           <w:color w:val="1F2937"/>
           <w:sz w:val="21"/>
         </w:rPr>
-        <w:t>Missing fields say UNKNOWN; sensitive titles say HUMAN REVIEW.</w:t>
+        <w:t>It says no Drive file content was opened or downloaded and no Drive item was created, edited, renamed, moved, shared, unshared, deleted or organized, except an explicitly approved human-register Sheet.</w:t>
       </w:r>
     </w:p>
     <w:p>
@@ -5022,7 +5428,40 @@
           <w:color w:val="1F2937"/>
           <w:sz w:val="21"/>
         </w:rPr>
-        <w:t>It says no Drive file content was opened or downloaded and no Drive item was created, edited, renamed, moved, shared, unshared, deleted or organized.</w:t>
+        <w:t xml:space="preserve">After full proof, the optional weekly refresh has a verified employee-chosen day, exact local time and time zone, or the decision says </w:t>
+      </w:r>
+      <w:r>
+        <w:rPr>
+          <w:rFonts w:ascii="Menlo" w:hAnsi="Menlo" w:eastAsia="Menlo" w:cs="Menlo"/>
+          <w:color w:val="1F4D78"/>
+          <w:sz w:val="19"/>
+        </w:rPr>
+        <w:t>NOT ENABLED BY CHOICE</w:t>
+      </w:r>
+      <w:r>
+        <w:rPr>
+          <w:rFonts w:ascii="Calibri" w:hAnsi="Calibri" w:eastAsia="Calibri" w:cs="Calibri"/>
+          <w:color w:val="1F2937"/>
+          <w:sz w:val="21"/>
+        </w:rPr>
+        <w:t>.</w:t>
+      </w:r>
+    </w:p>
+    <w:p>
+      <w:pPr>
+        <w:numPr>
+          <w:ilvl w:val="0"/>
+          <w:numId w:val="107"/>
+        </w:numPr>
+        <w:spacing w:before="0" w:after="80" w:line="288" w:lineRule="auto"/>
+      </w:pPr>
+      <w:r>
+        <w:rPr>
+          <w:rFonts w:ascii="Calibri" w:hAnsi="Calibri" w:eastAsia="Calibri" w:cs="Calibri"/>
+          <w:color w:val="1F2937"/>
+          <w:sz w:val="21"/>
+        </w:rPr>
+        <w:t>Pause, edit, remove and missed-run recovery are visible; a failed refresh does not advance the last-success cursor.</w:t>
       </w:r>
     </w:p>
     <w:p>
@@ -5988,45 +6427,7 @@
     </w:p>
     <w:p>
       <w:pPr>
-        <w:spacing w:before="0" w:after="120" w:line="288" w:lineRule="auto"/>
-      </w:pPr>
-      <w:r>
-        <w:rPr>
-          <w:rFonts w:ascii="Calibri" w:hAnsi="Calibri" w:eastAsia="Calibri" w:cs="Calibri"/>
-          <w:color w:val="1F2937"/>
-          <w:sz w:val="21"/>
-        </w:rPr>
-        <w:t>The weekly reminder works only while the computer is awake, ChatGPT is running and the local project remains available. It may control the approved local worker, then it stops. It does not access LinkedIn.</w:t>
-      </w:r>
-    </w:p>
-    <w:p>
-      <w:pPr>
-        <w:pStyle w:val="Heading1"/>
-      </w:pPr>
-      <w:r>
-        <w:rPr>
-          <w:rFonts w:ascii="Calibri" w:hAnsi="Calibri" w:eastAsia="Calibri" w:cs="Calibri"/>
-          <w:color w:val="2E74B5"/>
-          <w:sz w:val="32"/>
-        </w:rPr>
-        <w:t>What to bring back</w:t>
-      </w:r>
-    </w:p>
-    <w:p>
-      <w:pPr>
-        <w:spacing w:before="0" w:after="120" w:line="288" w:lineRule="auto"/>
-      </w:pPr>
-      <w:r>
-        <w:rPr>
-          <w:rFonts w:ascii="Calibri" w:hAnsi="Calibri" w:eastAsia="Calibri" w:cs="Calibri"/>
-          <w:color w:val="1F2937"/>
-          <w:sz w:val="21"/>
-        </w:rPr>
-        <w:t>Bring the laptop or screenshots that show:</w:t>
-      </w:r>
-    </w:p>
-    <w:p>
-      <w:pPr>
+        <w:keepNext/>
         <w:numPr>
           <w:ilvl w:val="0"/>
           <w:numId w:val="125"/>
@@ -6039,7 +6440,7 @@
           <w:color w:val="1F2937"/>
           <w:sz w:val="21"/>
         </w:rPr>
-        <w:t xml:space="preserve">Email project open with </w:t>
+        <w:t xml:space="preserve">Review the optional concise learning proposed from your manually supplied examples and confirmed outcomes. Approve only useful work relationship or tone context before it enters </w:t>
       </w:r>
       <w:r>
         <w:rPr>
@@ -6047,7 +6448,7 @@
           <w:color w:val="1F4D78"/>
           <w:sz w:val="19"/>
         </w:rPr>
-        <w:t>EMAIL-TRIAGE-REPORT.md</w:t>
+        <w:t>CONFIRMED-LINKEDIN-LEARNINGS.md</w:t>
       </w:r>
       <w:r>
         <w:rPr>
@@ -6055,24 +6456,7 @@
           <w:color w:val="1F2937"/>
           <w:sz w:val="21"/>
         </w:rPr>
-        <w:t>.</w:t>
-      </w:r>
-    </w:p>
-    <w:p>
-      <w:pPr>
-        <w:numPr>
-          <w:ilvl w:val="0"/>
-          <w:numId w:val="125"/>
-        </w:numPr>
-        <w:spacing w:before="0" w:after="80" w:line="288" w:lineRule="auto"/>
-      </w:pPr>
-      <w:r>
-        <w:rPr>
-          <w:rFonts w:ascii="Calibri" w:hAnsi="Calibri" w:eastAsia="Calibri" w:cs="Calibri"/>
-          <w:color w:val="1F2937"/>
-          <w:sz w:val="21"/>
-        </w:rPr>
-        <w:t xml:space="preserve">Drive project open with its human register, </w:t>
+        <w:t xml:space="preserve">. Reject private, sensitive or inferred traits. You may say </w:t>
       </w:r>
       <w:r>
         <w:rPr>
@@ -6080,7 +6464,7 @@
           <w:color w:val="1F4D78"/>
           <w:sz w:val="19"/>
         </w:rPr>
-        <w:t>DRIVE-INDEX.md</w:t>
+        <w:t>CORRECT LINKEDIN LEARNING &lt;ID&gt;</w:t>
       </w:r>
       <w:r>
         <w:rPr>
@@ -6088,58 +6472,7 @@
           <w:color w:val="1F2937"/>
           <w:sz w:val="21"/>
         </w:rPr>
-        <w:t>, receipt and saved cursor; optional weekly card only if the employee activated it.</w:t>
-      </w:r>
-    </w:p>
-    <w:p>
-      <w:pPr>
-        <w:numPr>
-          <w:ilvl w:val="0"/>
-          <w:numId w:val="125"/>
-        </w:numPr>
-        <w:spacing w:before="0" w:after="80" w:line="288" w:lineRule="auto"/>
-      </w:pPr>
-      <w:r>
-        <w:rPr>
-          <w:rFonts w:ascii="Calibri" w:hAnsi="Calibri" w:eastAsia="Calibri" w:cs="Calibri"/>
-          <w:color w:val="1F2937"/>
-          <w:sz w:val="21"/>
-        </w:rPr>
-        <w:t>The final evidence row and validator pass in each project.</w:t>
-      </w:r>
-    </w:p>
-    <w:p>
-      <w:pPr>
-        <w:numPr>
-          <w:ilvl w:val="0"/>
-          <w:numId w:val="125"/>
-        </w:numPr>
-        <w:spacing w:before="0" w:after="80" w:line="288" w:lineRule="auto"/>
-      </w:pPr>
-      <w:r>
-        <w:rPr>
-          <w:rFonts w:ascii="Calibri" w:hAnsi="Calibri" w:eastAsia="Calibri" w:cs="Calibri"/>
-          <w:color w:val="1F2937"/>
-          <w:sz w:val="21"/>
-        </w:rPr>
-        <w:t>Optional: approved Saturday schedule, tone/precedent file, numbered reply queue, cursor, employee-confirmed outcomes, and validator pass. Do not show message bodies.</w:t>
-      </w:r>
-    </w:p>
-    <w:p>
-      <w:pPr>
-        <w:numPr>
-          <w:ilvl w:val="0"/>
-          <w:numId w:val="125"/>
-        </w:numPr>
-        <w:spacing w:before="0" w:after="80" w:line="288" w:lineRule="auto"/>
-      </w:pPr>
-      <w:r>
-        <w:rPr>
-          <w:rFonts w:ascii="Calibri" w:hAnsi="Calibri" w:eastAsia="Calibri" w:cs="Calibri"/>
-          <w:color w:val="1F2937"/>
-          <w:sz w:val="21"/>
-        </w:rPr>
-        <w:t xml:space="preserve">The three-line final readback from </w:t>
+        <w:t xml:space="preserve"> or </w:t>
       </w:r>
       <w:r>
         <w:rPr>
@@ -6147,7 +6480,7 @@
           <w:color w:val="1F4D78"/>
           <w:sz w:val="19"/>
         </w:rPr>
-        <w:t>THREE-WORKER-GO-LIVE-CHECKLIST.md</w:t>
+        <w:t>FORGET LINKEDIN LEARNING &lt;ID&gt;</w:t>
       </w:r>
       <w:r>
         <w:rPr>
@@ -6155,72 +6488,48 @@
           <w:color w:val="1F2937"/>
           <w:sz w:val="21"/>
         </w:rPr>
-        <w:t xml:space="preserve">: Email and Drive are </w:t>
-      </w:r>
-      <w:r>
-        <w:rPr>
-          <w:rFonts w:ascii="Menlo" w:hAnsi="Menlo" w:eastAsia="Menlo" w:cs="Menlo"/>
-          <w:color w:val="1F4D78"/>
-          <w:sz w:val="19"/>
-        </w:rPr>
-        <w:t>LIVE FOR ME</w:t>
-      </w:r>
-      <w:r>
-        <w:rPr>
-          <w:rFonts w:ascii="Calibri" w:hAnsi="Calibri" w:eastAsia="Calibri" w:cs="Calibri"/>
-          <w:color w:val="1F2937"/>
-          <w:sz w:val="21"/>
-        </w:rPr>
-        <w:t xml:space="preserve"> or show an exact blocker; LinkedIn is </w:t>
-      </w:r>
-      <w:r>
-        <w:rPr>
-          <w:rFonts w:ascii="Menlo" w:hAnsi="Menlo" w:eastAsia="Menlo" w:cs="Menlo"/>
-          <w:color w:val="1F4D78"/>
-          <w:sz w:val="19"/>
-        </w:rPr>
-        <w:t>LIVE FOR ME, OPTIONAL</w:t>
-      </w:r>
-      <w:r>
-        <w:rPr>
-          <w:rFonts w:ascii="Calibri" w:hAnsi="Calibri" w:eastAsia="Calibri" w:cs="Calibri"/>
-          <w:color w:val="1F2937"/>
-          <w:sz w:val="21"/>
-        </w:rPr>
-        <w:t xml:space="preserve">, </w:t>
-      </w:r>
-      <w:r>
-        <w:rPr>
-          <w:rFonts w:ascii="Menlo" w:hAnsi="Menlo" w:eastAsia="Menlo" w:cs="Menlo"/>
-          <w:color w:val="1F4D78"/>
-          <w:sz w:val="19"/>
-        </w:rPr>
-        <w:t>NOT ENABLED BY CHOICE</w:t>
-      </w:r>
-      <w:r>
-        <w:rPr>
-          <w:rFonts w:ascii="Calibri" w:hAnsi="Calibri" w:eastAsia="Calibri" w:cs="Calibri"/>
-          <w:color w:val="1F2937"/>
-          <w:sz w:val="21"/>
-        </w:rPr>
-        <w:t>, or shows an exact blocker.</w:t>
+        <w:t xml:space="preserve"> at any time.</w:t>
       </w:r>
     </w:p>
     <w:p>
       <w:pPr>
-        <w:spacing w:before="0" w:after="120" w:line="288" w:lineRule="auto"/>
-      </w:pPr>
-      <w:r>
-        <w:rPr>
-          <w:rFonts w:ascii="Calibri" w:hAnsi="Calibri" w:eastAsia="Calibri" w:cs="Calibri"/>
-          <w:color w:val="1F2937"/>
-          <w:sz w:val="21"/>
-        </w:rPr>
-        <w:t>Do not bring email bodies, passwords, one-time codes, private HR details, banking information, or sensitive Drive content. Show the safe report headings and proof.</w:t>
+        <w:spacing w:before="60" w:after="180" w:line="288" w:lineRule="auto"/>
+        <w:ind w:left="173"/>
+        <w:shd w:fill="FFF8E8"/>
+      </w:pPr>
+      <w:r>
+        <w:rPr>
+          <w:rFonts w:ascii="Calibri" w:hAnsi="Calibri" w:eastAsia="Calibri" w:cs="Calibri"/>
+          <w:b/>
+          <w:color w:val="0B2545"/>
+          <w:sz w:val="21"/>
+        </w:rPr>
+        <w:t>DONE WHEN:</w:t>
+      </w:r>
+      <w:r>
+        <w:rPr>
+          <w:rFonts w:ascii="Calibri" w:hAnsi="Calibri" w:eastAsia="Calibri" w:cs="Calibri"/>
+          <w:color w:val="0B2545"/>
+          <w:sz w:val="21"/>
+        </w:rPr>
+        <w:t xml:space="preserve"> Every saved learning has an ID, source, date and your explicit confirmation; full conversations and hidden profiling are absent.</w:t>
       </w:r>
     </w:p>
     <w:p>
       <w:pPr>
+        <w:spacing w:before="0" w:after="120" w:line="288" w:lineRule="auto"/>
+      </w:pPr>
+      <w:r>
+        <w:rPr>
+          <w:rFonts w:ascii="Calibri" w:hAnsi="Calibri" w:eastAsia="Calibri" w:cs="Calibri"/>
+          <w:color w:val="1F2937"/>
+          <w:sz w:val="21"/>
+        </w:rPr>
+        <w:t>The weekly reminder works only while the computer is awake, ChatGPT is running and the local project remains available. It may control the approved local worker, then it stops. It does not access LinkedIn.</w:t>
+      </w:r>
+    </w:p>
+    <w:p>
+      <w:pPr>
         <w:pStyle w:val="Heading1"/>
       </w:pPr>
       <w:r>
@@ -6229,7 +6538,7 @@
           <w:color w:val="2E74B5"/>
           <w:sz w:val="32"/>
         </w:rPr>
-        <w:t>Stop rules</w:t>
+        <w:t>What to bring back</w:t>
       </w:r>
     </w:p>
     <w:p>
@@ -6242,7 +6551,7 @@
           <w:color w:val="1F2937"/>
           <w:sz w:val="21"/>
         </w:rPr>
-        <w:t>Stop and use the Setup Helper if:</w:t>
+        <w:t>Bring the laptop or screenshots that show:</w:t>
       </w:r>
     </w:p>
     <w:p>
@@ -6259,7 +6568,39 @@
           <w:color w:val="1F2937"/>
           <w:sz w:val="21"/>
         </w:rPr>
-        <w:t>the correct folder is not visible;</w:t>
+        <w:t xml:space="preserve">Email project open with </w:t>
+      </w:r>
+      <w:r>
+        <w:rPr>
+          <w:rFonts w:ascii="Menlo" w:hAnsi="Menlo" w:eastAsia="Menlo" w:cs="Menlo"/>
+          <w:color w:val="1F4D78"/>
+          <w:sz w:val="19"/>
+        </w:rPr>
+        <w:t>EMAIL-TRIAGE-REPORT.md</w:t>
+      </w:r>
+      <w:r>
+        <w:rPr>
+          <w:rFonts w:ascii="Calibri" w:hAnsi="Calibri" w:eastAsia="Calibri" w:cs="Calibri"/>
+          <w:color w:val="1F2937"/>
+          <w:sz w:val="21"/>
+        </w:rPr>
+        <w:t xml:space="preserve">, </w:t>
+      </w:r>
+      <w:r>
+        <w:rPr>
+          <w:rFonts w:ascii="Menlo" w:hAnsi="Menlo" w:eastAsia="Menlo" w:cs="Menlo"/>
+          <w:color w:val="1F4D78"/>
+          <w:sz w:val="19"/>
+        </w:rPr>
+        <w:t>PERSONAL-WORK-MEMORY.md</w:t>
+      </w:r>
+      <w:r>
+        <w:rPr>
+          <w:rFonts w:ascii="Calibri" w:hAnsi="Calibri" w:eastAsia="Calibri" w:cs="Calibri"/>
+          <w:color w:val="1F2937"/>
+          <w:sz w:val="21"/>
+        </w:rPr>
+        <w:t xml:space="preserve"> and the visible show/correct/exclude/forget controls.</w:t>
       </w:r>
     </w:p>
     <w:p>
@@ -6276,7 +6617,23 @@
           <w:color w:val="1F2937"/>
           <w:sz w:val="21"/>
         </w:rPr>
-        <w:t>the app or button names do not match;</w:t>
+        <w:t xml:space="preserve">Drive project open with </w:t>
+      </w:r>
+      <w:r>
+        <w:rPr>
+          <w:rFonts w:ascii="Menlo" w:hAnsi="Menlo" w:eastAsia="Menlo" w:cs="Menlo"/>
+          <w:color w:val="1F4D78"/>
+          <w:sz w:val="19"/>
+        </w:rPr>
+        <w:t>DRIVE-INDEX.md</w:t>
+      </w:r>
+      <w:r>
+        <w:rPr>
+          <w:rFonts w:ascii="Calibri" w:hAnsi="Calibri" w:eastAsia="Calibri" w:cs="Calibri"/>
+          <w:color w:val="1F2937"/>
+          <w:sz w:val="21"/>
+        </w:rPr>
+        <w:t>, its saved cursor, the shared generation ID and the reconciled JSONL-versus-human-register counts.</w:t>
       </w:r>
     </w:p>
     <w:p>
@@ -6293,7 +6650,7 @@
           <w:color w:val="1F2937"/>
           <w:sz w:val="21"/>
         </w:rPr>
-        <w:t>the company app cannot be enabled or connected;</w:t>
+        <w:t>The final evidence row and validator pass in each project.</w:t>
       </w:r>
     </w:p>
     <w:p>
@@ -6310,7 +6667,7 @@
           <w:color w:val="1F2937"/>
           <w:sz w:val="21"/>
         </w:rPr>
-        <w:t>the wrong account is connected;</w:t>
+        <w:t>Optional: approved Saturday schedule, tone/precedent file, numbered reply queue, cursor, employee-confirmed outcomes, confirmed learning IDs and validator pass. Do not show message bodies.</w:t>
       </w:r>
     </w:p>
     <w:p>
@@ -6327,16 +6684,76 @@
           <w:color w:val="1F2937"/>
           <w:sz w:val="21"/>
         </w:rPr>
-        <w:t>a permission asks for Full access;</w:t>
+        <w:t xml:space="preserve">The three-line final readback from </w:t>
+      </w:r>
+      <w:r>
+        <w:rPr>
+          <w:rFonts w:ascii="Menlo" w:hAnsi="Menlo" w:eastAsia="Menlo" w:cs="Menlo"/>
+          <w:color w:val="1F4D78"/>
+          <w:sz w:val="19"/>
+        </w:rPr>
+        <w:t>THREE-WORKER-GO-LIVE-CHECKLIST.md</w:t>
+      </w:r>
+      <w:r>
+        <w:rPr>
+          <w:rFonts w:ascii="Calibri" w:hAnsi="Calibri" w:eastAsia="Calibri" w:cs="Calibri"/>
+          <w:color w:val="1F2937"/>
+          <w:sz w:val="21"/>
+        </w:rPr>
+        <w:t xml:space="preserve">: Personal Memory + Email EA and Drive are </w:t>
+      </w:r>
+      <w:r>
+        <w:rPr>
+          <w:rFonts w:ascii="Menlo" w:hAnsi="Menlo" w:eastAsia="Menlo" w:cs="Menlo"/>
+          <w:color w:val="1F4D78"/>
+          <w:sz w:val="19"/>
+        </w:rPr>
+        <w:t>LIVE FOR ME</w:t>
+      </w:r>
+      <w:r>
+        <w:rPr>
+          <w:rFonts w:ascii="Calibri" w:hAnsi="Calibri" w:eastAsia="Calibri" w:cs="Calibri"/>
+          <w:color w:val="1F2937"/>
+          <w:sz w:val="21"/>
+        </w:rPr>
+        <w:t xml:space="preserve"> or show an exact blocker; LinkedIn is </w:t>
+      </w:r>
+      <w:r>
+        <w:rPr>
+          <w:rFonts w:ascii="Menlo" w:hAnsi="Menlo" w:eastAsia="Menlo" w:cs="Menlo"/>
+          <w:color w:val="1F4D78"/>
+          <w:sz w:val="19"/>
+        </w:rPr>
+        <w:t>LIVE FOR ME, OPTIONAL</w:t>
+      </w:r>
+      <w:r>
+        <w:rPr>
+          <w:rFonts w:ascii="Calibri" w:hAnsi="Calibri" w:eastAsia="Calibri" w:cs="Calibri"/>
+          <w:color w:val="1F2937"/>
+          <w:sz w:val="21"/>
+        </w:rPr>
+        <w:t xml:space="preserve">, </w:t>
+      </w:r>
+      <w:r>
+        <w:rPr>
+          <w:rFonts w:ascii="Menlo" w:hAnsi="Menlo" w:eastAsia="Menlo" w:cs="Menlo"/>
+          <w:color w:val="1F4D78"/>
+          <w:sz w:val="19"/>
+        </w:rPr>
+        <w:t>NOT ENABLED BY CHOICE</w:t>
+      </w:r>
+      <w:r>
+        <w:rPr>
+          <w:rFonts w:ascii="Calibri" w:hAnsi="Calibri" w:eastAsia="Calibri" w:cs="Calibri"/>
+          <w:color w:val="1F2937"/>
+          <w:sz w:val="21"/>
+        </w:rPr>
+        <w:t>, or shows an exact blocker.</w:t>
       </w:r>
     </w:p>
     <w:p>
       <w:pPr>
-        <w:numPr>
-          <w:ilvl w:val="0"/>
-          <w:numId w:val="127"/>
-        </w:numPr>
-        <w:spacing w:before="0" w:after="80" w:line="288" w:lineRule="auto"/>
+        <w:spacing w:before="0" w:after="120" w:line="288" w:lineRule="auto"/>
       </w:pPr>
       <w:r>
         <w:rPr>
@@ -6344,33 +6761,25 @@
           <w:color w:val="1F2937"/>
           <w:sz w:val="21"/>
         </w:rPr>
-        <w:t>a permission asks for Always allow, the whole computer or a screen outside this task;</w:t>
+        <w:t>Do not bring email bodies, passwords, one-time codes, private HR details, banking information, or sensitive Drive content. Show the safe report headings and proof.</w:t>
       </w:r>
     </w:p>
     <w:p>
       <w:pPr>
-        <w:numPr>
-          <w:ilvl w:val="0"/>
-          <w:numId w:val="127"/>
-        </w:numPr>
-        <w:spacing w:before="0" w:after="80" w:line="288" w:lineRule="auto"/>
-      </w:pPr>
-      <w:r>
-        <w:rPr>
-          <w:rFonts w:ascii="Calibri" w:hAnsi="Calibri" w:eastAsia="Calibri" w:cs="Calibri"/>
-          <w:color w:val="1F2937"/>
-          <w:sz w:val="21"/>
-        </w:rPr>
-        <w:t>Codex or Chrome remains in control when LinkedIn is about to open;</w:t>
+        <w:pStyle w:val="Heading1"/>
+      </w:pPr>
+      <w:r>
+        <w:rPr>
+          <w:rFonts w:ascii="Calibri" w:hAnsi="Calibri" w:eastAsia="Calibri" w:cs="Calibri"/>
+          <w:color w:val="2E74B5"/>
+          <w:sz w:val="32"/>
+        </w:rPr>
+        <w:t>Stop rules</w:t>
       </w:r>
     </w:p>
     <w:p>
       <w:pPr>
-        <w:numPr>
-          <w:ilvl w:val="0"/>
-          <w:numId w:val="127"/>
-        </w:numPr>
-        <w:spacing w:before="0" w:after="80" w:line="288" w:lineRule="auto"/>
+        <w:spacing w:before="0" w:after="120" w:line="288" w:lineRule="auto"/>
       </w:pPr>
       <w:r>
         <w:rPr>
@@ -6378,63 +6787,7 @@
           <w:color w:val="1F2937"/>
           <w:sz w:val="21"/>
         </w:rPr>
-        <w:t>the AI asks for a password, one-time code, Terminal, PowerShell, Command Prompt, Python, a CLI, Git or GitHub;</w:t>
-      </w:r>
-    </w:p>
-    <w:p>
-      <w:pPr>
-        <w:numPr>
-          <w:ilvl w:val="0"/>
-          <w:numId w:val="127"/>
-        </w:numPr>
-        <w:spacing w:before="0" w:after="80" w:line="288" w:lineRule="auto"/>
-      </w:pPr>
-      <w:r>
-        <w:rPr>
-          <w:rFonts w:ascii="Calibri" w:hAnsi="Calibri" w:eastAsia="Calibri" w:cs="Calibri"/>
-          <w:color w:val="1F2937"/>
-          <w:sz w:val="21"/>
-        </w:rPr>
-        <w:t>the task crosses an active local Gate 0 ID, asks for credentials, touches banking or personal HR, or presents another sensitive decision not covered by the confirmed profile.</w:t>
-      </w:r>
-    </w:p>
-    <w:p>
-      <w:pPr>
-        <w:spacing w:before="0" w:after="120" w:line="288" w:lineRule="auto"/>
-      </w:pPr>
-      <w:r>
-        <w:rPr>
-          <w:rFonts w:ascii="Calibri" w:hAnsi="Calibri" w:eastAsia="Calibri" w:cs="Calibri"/>
-          <w:color w:val="1F2937"/>
-          <w:sz w:val="21"/>
-        </w:rPr>
-        <w:t>Setup Helper resolves safe setup. Ambuj receives only an unavoidable company-access problem. The approval owner named beside the crossed gate receives that Gate 0 issue; Abhilash receives the owner decisions assigned to him.</w:t>
-      </w:r>
-    </w:p>
-    <w:p>
-      <w:pPr>
-        <w:pStyle w:val="Heading1"/>
-      </w:pPr>
-      <w:r>
-        <w:rPr>
-          <w:rFonts w:ascii="Calibri" w:hAnsi="Calibri" w:eastAsia="Calibri" w:cs="Calibri"/>
-          <w:color w:val="2E74B5"/>
-          <w:sz w:val="32"/>
-        </w:rPr>
-        <w:t>Managed update readback</w:t>
-      </w:r>
-    </w:p>
-    <w:p>
-      <w:pPr>
-        <w:spacing w:before="0" w:after="120" w:line="288" w:lineRule="auto"/>
-      </w:pPr>
-      <w:r>
-        <w:rPr>
-          <w:rFonts w:ascii="Calibri" w:hAnsi="Calibri" w:eastAsia="Calibri" w:cs="Calibri"/>
-          <w:color w:val="1F2937"/>
-          <w:sz w:val="21"/>
-        </w:rPr>
-        <w:t>For an announced release, bring back only this safe proof:</w:t>
+        <w:t>Stop and use the Setup Helper if:</w:t>
       </w:r>
     </w:p>
     <w:p>
@@ -6451,7 +6804,7 @@
           <w:color w:val="1F2937"/>
           <w:sz w:val="21"/>
         </w:rPr>
-        <w:t>announced version: ____________________</w:t>
+        <w:t>the correct folder is not visible;</w:t>
       </w:r>
     </w:p>
     <w:p>
@@ -6468,7 +6821,7 @@
           <w:color w:val="1F2937"/>
           <w:sz w:val="21"/>
         </w:rPr>
-        <w:t>installed version: ____________________</w:t>
+        <w:t>the app or button names do not match;</w:t>
       </w:r>
     </w:p>
     <w:p>
@@ -6485,55 +6838,7 @@
           <w:color w:val="1F2937"/>
           <w:sz w:val="21"/>
         </w:rPr>
-        <w:t xml:space="preserve">update status: </w:t>
-      </w:r>
-      <w:r>
-        <w:rPr>
-          <w:rFonts w:ascii="Menlo" w:hAnsi="Menlo" w:eastAsia="Menlo" w:cs="Menlo"/>
-          <w:color w:val="1F4D78"/>
-          <w:sz w:val="19"/>
-        </w:rPr>
-        <w:t>CURRENT</w:t>
-      </w:r>
-      <w:r>
-        <w:rPr>
-          <w:rFonts w:ascii="Calibri" w:hAnsi="Calibri" w:eastAsia="Calibri" w:cs="Calibri"/>
-          <w:color w:val="1F2937"/>
-          <w:sz w:val="21"/>
-        </w:rPr>
-        <w:t xml:space="preserve">, </w:t>
-      </w:r>
-      <w:r>
-        <w:rPr>
-          <w:rFonts w:ascii="Menlo" w:hAnsi="Menlo" w:eastAsia="Menlo" w:cs="Menlo"/>
-          <w:color w:val="1F4D78"/>
-          <w:sz w:val="19"/>
-        </w:rPr>
-        <w:t>UPDATED</w:t>
-      </w:r>
-      <w:r>
-        <w:rPr>
-          <w:rFonts w:ascii="Calibri" w:hAnsi="Calibri" w:eastAsia="Calibri" w:cs="Calibri"/>
-          <w:color w:val="1F2937"/>
-          <w:sz w:val="21"/>
-        </w:rPr>
-        <w:t xml:space="preserve"> or </w:t>
-      </w:r>
-      <w:r>
-        <w:rPr>
-          <w:rFonts w:ascii="Menlo" w:hAnsi="Menlo" w:eastAsia="Menlo" w:cs="Menlo"/>
-          <w:color w:val="1F4D78"/>
-          <w:sz w:val="19"/>
-        </w:rPr>
-        <w:t>DEFERRED</w:t>
-      </w:r>
-      <w:r>
-        <w:rPr>
-          <w:rFonts w:ascii="Calibri" w:hAnsi="Calibri" w:eastAsia="Calibri" w:cs="Calibri"/>
-          <w:color w:val="1F2937"/>
-          <w:sz w:val="21"/>
-        </w:rPr>
-        <w:t>: ____________________</w:t>
+        <w:t>the company app cannot be enabled or connected;</w:t>
       </w:r>
     </w:p>
     <w:p>
@@ -6550,7 +6855,7 @@
           <w:color w:val="1F2937"/>
           <w:sz w:val="21"/>
         </w:rPr>
-        <w:t>receipt and validation result: ____________________</w:t>
+        <w:t>the wrong account is connected;</w:t>
       </w:r>
     </w:p>
     <w:p>
@@ -6567,7 +6872,7 @@
           <w:color w:val="1F2937"/>
           <w:sz w:val="21"/>
         </w:rPr>
-        <w:t>preserved-state result: ____________________</w:t>
+        <w:t>a permission asks for Full access;</w:t>
       </w:r>
     </w:p>
     <w:p>
@@ -6584,12 +6889,16 @@
           <w:color w:val="1F2937"/>
           <w:sz w:val="21"/>
         </w:rPr>
-        <w:t>recovery location, if updated: ____________________</w:t>
+        <w:t>a permission asks for Always allow, the whole computer or a screen outside this task;</w:t>
       </w:r>
     </w:p>
     <w:p>
       <w:pPr>
-        <w:spacing w:before="0" w:after="120" w:line="288" w:lineRule="auto"/>
+        <w:numPr>
+          <w:ilvl w:val="0"/>
+          <w:numId w:val="129"/>
+        </w:numPr>
+        <w:spacing w:before="0" w:after="80" w:line="288" w:lineRule="auto"/>
       </w:pPr>
       <w:r>
         <w:rPr>
@@ -6597,11 +6906,58 @@
           <w:color w:val="1F2937"/>
           <w:sz w:val="21"/>
         </w:rPr>
-        <w:t>Do not paste employee work, secrets or credentials into a public release, portal or repository. Monitor reads this proof for the announced batch and reports drift; it does not rewrite the worker.</w:t>
+        <w:t>Codex or Chrome remains in control when LinkedIn is about to open;</w:t>
       </w:r>
     </w:p>
     <w:p>
       <w:pPr>
+        <w:numPr>
+          <w:ilvl w:val="0"/>
+          <w:numId w:val="129"/>
+        </w:numPr>
+        <w:spacing w:before="0" w:after="80" w:line="288" w:lineRule="auto"/>
+      </w:pPr>
+      <w:r>
+        <w:rPr>
+          <w:rFonts w:ascii="Calibri" w:hAnsi="Calibri" w:eastAsia="Calibri" w:cs="Calibri"/>
+          <w:color w:val="1F2937"/>
+          <w:sz w:val="21"/>
+        </w:rPr>
+        <w:t>the AI asks for a password, one-time code, Terminal, PowerShell, Command Prompt, Python, a CLI, Git or GitHub;</w:t>
+      </w:r>
+    </w:p>
+    <w:p>
+      <w:pPr>
+        <w:numPr>
+          <w:ilvl w:val="0"/>
+          <w:numId w:val="129"/>
+        </w:numPr>
+        <w:spacing w:before="0" w:after="80" w:line="288" w:lineRule="auto"/>
+      </w:pPr>
+      <w:r>
+        <w:rPr>
+          <w:rFonts w:ascii="Calibri" w:hAnsi="Calibri" w:eastAsia="Calibri" w:cs="Calibri"/>
+          <w:color w:val="1F2937"/>
+          <w:sz w:val="21"/>
+        </w:rPr>
+        <w:t>the task crosses an active local Gate 0 ID, asks for credentials, touches banking or personal HR, or presents another sensitive decision not covered by the confirmed profile.</w:t>
+      </w:r>
+    </w:p>
+    <w:p>
+      <w:pPr>
+        <w:spacing w:before="0" w:after="120" w:line="288" w:lineRule="auto"/>
+      </w:pPr>
+      <w:r>
+        <w:rPr>
+          <w:rFonts w:ascii="Calibri" w:hAnsi="Calibri" w:eastAsia="Calibri" w:cs="Calibri"/>
+          <w:color w:val="1F2937"/>
+          <w:sz w:val="21"/>
+        </w:rPr>
+        <w:t>Setup Helper resolves safe setup. Ambuj receives only an unavoidable company-access problem. The approval owner named beside the crossed gate receives that Gate 0 issue; Abhilash receives the owner decisions assigned to him.</w:t>
+      </w:r>
+    </w:p>
+    <w:p>
+      <w:pPr>
         <w:pStyle w:val="Heading1"/>
       </w:pPr>
       <w:r>
@@ -6610,7 +6966,20 @@
           <w:color w:val="2E74B5"/>
           <w:sz w:val="32"/>
         </w:rPr>
-        <w:t>Official screen references</w:t>
+        <w:t>Managed update readback</w:t>
+      </w:r>
+    </w:p>
+    <w:p>
+      <w:pPr>
+        <w:spacing w:before="0" w:after="120" w:line="288" w:lineRule="auto"/>
+      </w:pPr>
+      <w:r>
+        <w:rPr>
+          <w:rFonts w:ascii="Calibri" w:hAnsi="Calibri" w:eastAsia="Calibri" w:cs="Calibri"/>
+          <w:color w:val="1F2937"/>
+          <w:sz w:val="21"/>
+        </w:rPr>
+        <w:t>For an announced release, bring back only this safe proof:</w:t>
       </w:r>
     </w:p>
     <w:p>
@@ -6627,7 +6996,7 @@
           <w:color w:val="1F2937"/>
           <w:sz w:val="21"/>
         </w:rPr>
-        <w:t>Setup, desktop and projects: https://learn.chatgpt.com/docs/quickstart · https://learn.chatgpt.com/docs/app · https://learn.chatgpt.com/docs/projects</w:t>
+        <w:t>announced version: ____________________</w:t>
       </w:r>
     </w:p>
     <w:p>
@@ -6635,6 +7004,182 @@
         <w:numPr>
           <w:ilvl w:val="0"/>
           <w:numId w:val="131"/>
+        </w:numPr>
+        <w:spacing w:before="0" w:after="80" w:line="288" w:lineRule="auto"/>
+      </w:pPr>
+      <w:r>
+        <w:rPr>
+          <w:rFonts w:ascii="Calibri" w:hAnsi="Calibri" w:eastAsia="Calibri" w:cs="Calibri"/>
+          <w:color w:val="1F2937"/>
+          <w:sz w:val="21"/>
+        </w:rPr>
+        <w:t>installed version: ____________________</w:t>
+      </w:r>
+    </w:p>
+    <w:p>
+      <w:pPr>
+        <w:numPr>
+          <w:ilvl w:val="0"/>
+          <w:numId w:val="131"/>
+        </w:numPr>
+        <w:spacing w:before="0" w:after="80" w:line="288" w:lineRule="auto"/>
+      </w:pPr>
+      <w:r>
+        <w:rPr>
+          <w:rFonts w:ascii="Calibri" w:hAnsi="Calibri" w:eastAsia="Calibri" w:cs="Calibri"/>
+          <w:color w:val="1F2937"/>
+          <w:sz w:val="21"/>
+        </w:rPr>
+        <w:t xml:space="preserve">update status: </w:t>
+      </w:r>
+      <w:r>
+        <w:rPr>
+          <w:rFonts w:ascii="Menlo" w:hAnsi="Menlo" w:eastAsia="Menlo" w:cs="Menlo"/>
+          <w:color w:val="1F4D78"/>
+          <w:sz w:val="19"/>
+        </w:rPr>
+        <w:t>CURRENT</w:t>
+      </w:r>
+      <w:r>
+        <w:rPr>
+          <w:rFonts w:ascii="Calibri" w:hAnsi="Calibri" w:eastAsia="Calibri" w:cs="Calibri"/>
+          <w:color w:val="1F2937"/>
+          <w:sz w:val="21"/>
+        </w:rPr>
+        <w:t xml:space="preserve">, </w:t>
+      </w:r>
+      <w:r>
+        <w:rPr>
+          <w:rFonts w:ascii="Menlo" w:hAnsi="Menlo" w:eastAsia="Menlo" w:cs="Menlo"/>
+          <w:color w:val="1F4D78"/>
+          <w:sz w:val="19"/>
+        </w:rPr>
+        <w:t>UPDATED</w:t>
+      </w:r>
+      <w:r>
+        <w:rPr>
+          <w:rFonts w:ascii="Calibri" w:hAnsi="Calibri" w:eastAsia="Calibri" w:cs="Calibri"/>
+          <w:color w:val="1F2937"/>
+          <w:sz w:val="21"/>
+        </w:rPr>
+        <w:t xml:space="preserve"> or </w:t>
+      </w:r>
+      <w:r>
+        <w:rPr>
+          <w:rFonts w:ascii="Menlo" w:hAnsi="Menlo" w:eastAsia="Menlo" w:cs="Menlo"/>
+          <w:color w:val="1F4D78"/>
+          <w:sz w:val="19"/>
+        </w:rPr>
+        <w:t>DEFERRED</w:t>
+      </w:r>
+      <w:r>
+        <w:rPr>
+          <w:rFonts w:ascii="Calibri" w:hAnsi="Calibri" w:eastAsia="Calibri" w:cs="Calibri"/>
+          <w:color w:val="1F2937"/>
+          <w:sz w:val="21"/>
+        </w:rPr>
+        <w:t>: ____________________</w:t>
+      </w:r>
+    </w:p>
+    <w:p>
+      <w:pPr>
+        <w:numPr>
+          <w:ilvl w:val="0"/>
+          <w:numId w:val="131"/>
+        </w:numPr>
+        <w:spacing w:before="0" w:after="80" w:line="288" w:lineRule="auto"/>
+      </w:pPr>
+      <w:r>
+        <w:rPr>
+          <w:rFonts w:ascii="Calibri" w:hAnsi="Calibri" w:eastAsia="Calibri" w:cs="Calibri"/>
+          <w:color w:val="1F2937"/>
+          <w:sz w:val="21"/>
+        </w:rPr>
+        <w:t>receipt and validation result: ____________________</w:t>
+      </w:r>
+    </w:p>
+    <w:p>
+      <w:pPr>
+        <w:numPr>
+          <w:ilvl w:val="0"/>
+          <w:numId w:val="131"/>
+        </w:numPr>
+        <w:spacing w:before="0" w:after="80" w:line="288" w:lineRule="auto"/>
+      </w:pPr>
+      <w:r>
+        <w:rPr>
+          <w:rFonts w:ascii="Calibri" w:hAnsi="Calibri" w:eastAsia="Calibri" w:cs="Calibri"/>
+          <w:color w:val="1F2937"/>
+          <w:sz w:val="21"/>
+        </w:rPr>
+        <w:t>preserved-state result: ____________________</w:t>
+      </w:r>
+    </w:p>
+    <w:p>
+      <w:pPr>
+        <w:numPr>
+          <w:ilvl w:val="0"/>
+          <w:numId w:val="131"/>
+        </w:numPr>
+        <w:spacing w:before="0" w:after="80" w:line="288" w:lineRule="auto"/>
+      </w:pPr>
+      <w:r>
+        <w:rPr>
+          <w:rFonts w:ascii="Calibri" w:hAnsi="Calibri" w:eastAsia="Calibri" w:cs="Calibri"/>
+          <w:color w:val="1F2937"/>
+          <w:sz w:val="21"/>
+        </w:rPr>
+        <w:t>recovery location, if updated: ____________________</w:t>
+      </w:r>
+    </w:p>
+    <w:p>
+      <w:pPr>
+        <w:spacing w:before="0" w:after="120" w:line="288" w:lineRule="auto"/>
+      </w:pPr>
+      <w:r>
+        <w:rPr>
+          <w:rFonts w:ascii="Calibri" w:hAnsi="Calibri" w:eastAsia="Calibri" w:cs="Calibri"/>
+          <w:color w:val="1F2937"/>
+          <w:sz w:val="21"/>
+        </w:rPr>
+        <w:t>Do not paste employee work, secrets or credentials into a public release, portal or repository. Monitor reads this proof for the announced batch and reports drift; it does not rewrite the worker.</w:t>
+      </w:r>
+    </w:p>
+    <w:p>
+      <w:pPr>
+        <w:pStyle w:val="Heading1"/>
+      </w:pPr>
+      <w:r>
+        <w:rPr>
+          <w:rFonts w:ascii="Calibri" w:hAnsi="Calibri" w:eastAsia="Calibri" w:cs="Calibri"/>
+          <w:color w:val="2E74B5"/>
+          <w:sz w:val="32"/>
+        </w:rPr>
+        <w:t>Official screen references</w:t>
+      </w:r>
+    </w:p>
+    <w:p>
+      <w:pPr>
+        <w:numPr>
+          <w:ilvl w:val="0"/>
+          <w:numId w:val="133"/>
+        </w:numPr>
+        <w:spacing w:before="0" w:after="80" w:line="288" w:lineRule="auto"/>
+      </w:pPr>
+      <w:r>
+        <w:rPr>
+          <w:rFonts w:ascii="Calibri" w:hAnsi="Calibri" w:eastAsia="Calibri" w:cs="Calibri"/>
+          <w:color w:val="1F2937"/>
+          <w:sz w:val="21"/>
+        </w:rPr>
+        <w:t>Setup, desktop and projects: https://learn.chatgpt.com/docs/quickstart · https://learn.chatgpt.com/docs/app · https://learn.chatgpt.com/docs/projects</w:t>
+      </w:r>
+    </w:p>
+    <w:p>
+      <w:pPr>
+        <w:numPr>
+          <w:ilvl w:val="0"/>
+          <w:numId w:val="133"/>
         </w:numPr>
         <w:spacing w:before="0" w:after="80" w:line="288" w:lineRule="auto"/>
       </w:pPr>
@@ -8085,9 +8630,9 @@
   <w:abstractNum w:abstractNumId="124">
     <w:multiLevelType w:val="singleLevel"/>
     <w:lvl w:ilvl="0">
-      <w:start w:val="1"/>
-      <w:numFmt w:val="bullet"/>
-      <w:lvlText w:val="•"/>
+      <w:start w:val="9"/>
+      <w:numFmt w:val="decimal"/>
+      <w:lvlText w:val="%1."/>
       <w:suff w:val="tab"/>
       <w:pPr>
         <w:tabs>
@@ -8165,6 +8710,27 @@
   </w:abstractNum>
   <w:num w:numId="131">
     <w:abstractNumId w:val="130"/>
+  </w:num>
+  <w:abstractNum w:abstractNumId="132">
+    <w:multiLevelType w:val="singleLevel"/>
+    <w:lvl w:ilvl="0">
+      <w:start w:val="1"/>
+      <w:numFmt w:val="bullet"/>
+      <w:lvlText w:val="•"/>
+      <w:suff w:val="tab"/>
+      <w:pPr>
+        <w:tabs>
+          <w:tab w:val="num" w:pos="540"/>
+        </w:tabs>
+        <w:ind w:left="540" w:hanging="270"/>
+      </w:pPr>
+      <w:rPr>
+        <w:rFonts w:ascii="Calibri" w:hAnsi="Calibri"/>
+      </w:rPr>
+    </w:lvl>
+  </w:abstractNum>
+  <w:num w:numId="133">
+    <w:abstractNumId w:val="132"/>
   </w:num>
 </w:numbering>
 </file>

</xml_diff>